<commit_message>
(update): working on paper
</commit_message>
<xml_diff>
--- a/module_summary.docx
+++ b/module_summary.docx
@@ -170,12 +170,110 @@
       <w:r>
         <w:t>The idea behind planet detection in this context is that when an exoplanet passes between the Star and Earth, the flux we detect from that star will decrease as some of that flux has been blocked off by the exoplanet.</w:t>
       </w:r>
+      <w:r>
+        <w:t xml:space="preserve"> </w:t>
+      </w:r>
     </w:p>
     <w:p>
       <w:pPr>
         <w:spacing w:line="480" w:lineRule="auto"/>
         <w:ind w:firstLine="720"/>
       </w:pPr>
+      <w:r>
+        <w:lastRenderedPageBreak/>
+        <w:t>As we can see from figure 1, the flux data collected is extremely noisy. Much of our work in the next section will focus on cleaning up this noise to enable the Machine Learning Model to work effectively.</w:t>
+      </w:r>
+    </w:p>
+    <w:p>
+      <w:pPr>
+        <w:spacing w:line="480" w:lineRule="auto"/>
+        <w:ind w:firstLine="720"/>
+      </w:pPr>
+    </w:p>
+    <w:p>
+      <w:pPr>
+        <w:keepNext/>
+        <w:spacing w:line="480" w:lineRule="auto"/>
+        <w:ind w:firstLine="720"/>
+      </w:pPr>
+      <w:r>
+        <w:rPr>
+          <w:noProof/>
+        </w:rPr>
+        <w:drawing>
+          <wp:inline distT="0" distB="0" distL="0" distR="0" wp14:anchorId="13E0AED9" wp14:editId="23789CA6">
+            <wp:extent cx="5941060" cy="3169285"/>
+            <wp:effectExtent l="0" t="0" r="2540" b="0"/>
+            <wp:docPr id="838564194" name="Picture 3"/>
+            <wp:cNvGraphicFramePr>
+              <a:graphicFrameLocks xmlns:a="http://schemas.openxmlformats.org/drawingml/2006/main" noChangeAspect="1"/>
+            </wp:cNvGraphicFramePr>
+            <a:graphic xmlns:a="http://schemas.openxmlformats.org/drawingml/2006/main">
+              <a:graphicData uri="http://schemas.openxmlformats.org/drawingml/2006/picture">
+                <pic:pic xmlns:pic="http://schemas.openxmlformats.org/drawingml/2006/picture">
+                  <pic:nvPicPr>
+                    <pic:cNvPr id="0" name="Picture 3"/>
+                    <pic:cNvPicPr>
+                      <a:picLocks noChangeAspect="1" noChangeArrowheads="1"/>
+                    </pic:cNvPicPr>
+                  </pic:nvPicPr>
+                  <pic:blipFill>
+                    <a:blip r:embed="rId7" cstate="print">
+                      <a:extLst>
+                        <a:ext uri="{28A0092B-C50C-407E-A947-70E740481C1C}">
+                          <a14:useLocalDpi xmlns:a14="http://schemas.microsoft.com/office/drawing/2010/main" val="0"/>
+                        </a:ext>
+                      </a:extLst>
+                    </a:blip>
+                    <a:srcRect/>
+                    <a:stretch>
+                      <a:fillRect/>
+                    </a:stretch>
+                  </pic:blipFill>
+                  <pic:spPr bwMode="auto">
+                    <a:xfrm>
+                      <a:off x="0" y="0"/>
+                      <a:ext cx="5941060" cy="3169285"/>
+                    </a:xfrm>
+                    <a:prstGeom prst="rect">
+                      <a:avLst/>
+                    </a:prstGeom>
+                    <a:noFill/>
+                    <a:ln>
+                      <a:noFill/>
+                    </a:ln>
+                  </pic:spPr>
+                </pic:pic>
+              </a:graphicData>
+            </a:graphic>
+          </wp:inline>
+        </w:drawing>
+      </w:r>
+    </w:p>
+    <w:p>
+      <w:pPr>
+        <w:pStyle w:val="Caption"/>
+        <w:jc w:val="center"/>
+      </w:pPr>
+      <w:r>
+        <w:t xml:space="preserve">Figure </w:t>
+      </w:r>
+      <w:fldSimple w:instr=" SEQ Figure \* ARABIC ">
+        <w:r>
+          <w:rPr>
+            <w:noProof/>
+          </w:rPr>
+          <w:t>1</w:t>
+        </w:r>
+      </w:fldSimple>
+      <w:r>
+        <w:t xml:space="preserve"> Same of Planet vs. No Planet Observations</w:t>
+      </w:r>
+    </w:p>
+    <w:p>
+      <w:pPr>
+        <w:spacing w:line="480" w:lineRule="auto"/>
+      </w:pPr>
     </w:p>
     <w:p>
       <w:pPr>
@@ -198,7 +296,6 @@
         <w:ind w:firstLine="720"/>
       </w:pPr>
       <w:r>
-        <w:lastRenderedPageBreak/>
         <w:t>For our approach we focused on creating a reduced dimensional set of features for input into a Support Vector Machine. Our general idea was to find a way to encode the fact that planets induce a reduction in flux directly into our features. To this end, our preprocessing and feature engineering pipeline consisted of the following steps:</w:t>
       </w:r>
     </w:p>
@@ -212,7 +309,7 @@
         <w:spacing w:line="480" w:lineRule="auto"/>
       </w:pPr>
       <w:r>
-        <w:t>Detrending</w:t>
+        <w:t>Fast Fourier Transform (FFT)</w:t>
       </w:r>
       <w:r>
         <w:t xml:space="preserve">: </w:t>
@@ -230,6 +327,9 @@
       <w:r>
         <w:t>Binned Z-Scores</w:t>
       </w:r>
+      <w:r>
+        <w:t>:</w:t>
+      </w:r>
     </w:p>
     <w:p>
       <w:pPr>
@@ -243,6 +343,255 @@
       <w:r>
         <w:t>Standardization</w:t>
       </w:r>
+      <w:r>
+        <w:t>:</w:t>
+      </w:r>
+    </w:p>
+    <w:p>
+      <w:pPr>
+        <w:spacing w:line="480" w:lineRule="auto"/>
+      </w:pPr>
+    </w:p>
+    <w:p>
+      <w:pPr>
+        <w:spacing w:line="480" w:lineRule="auto"/>
+      </w:pPr>
+      <w:r>
+        <w:rPr>
+          <w:noProof/>
+        </w:rPr>
+        <w:drawing>
+          <wp:inline distT="0" distB="0" distL="0" distR="0" wp14:anchorId="1A972810" wp14:editId="269F0544">
+            <wp:extent cx="5941060" cy="2771140"/>
+            <wp:effectExtent l="0" t="0" r="2540" b="0"/>
+            <wp:docPr id="173774055" name="Picture 7"/>
+            <wp:cNvGraphicFramePr>
+              <a:graphicFrameLocks xmlns:a="http://schemas.openxmlformats.org/drawingml/2006/main" noChangeAspect="1"/>
+            </wp:cNvGraphicFramePr>
+            <a:graphic xmlns:a="http://schemas.openxmlformats.org/drawingml/2006/main">
+              <a:graphicData uri="http://schemas.openxmlformats.org/drawingml/2006/picture">
+                <pic:pic xmlns:pic="http://schemas.openxmlformats.org/drawingml/2006/picture">
+                  <pic:nvPicPr>
+                    <pic:cNvPr id="0" name="Picture 7"/>
+                    <pic:cNvPicPr>
+                      <a:picLocks noChangeAspect="1" noChangeArrowheads="1"/>
+                    </pic:cNvPicPr>
+                  </pic:nvPicPr>
+                  <pic:blipFill>
+                    <a:blip r:embed="rId8" cstate="print">
+                      <a:extLst>
+                        <a:ext uri="{28A0092B-C50C-407E-A947-70E740481C1C}">
+                          <a14:useLocalDpi xmlns:a14="http://schemas.microsoft.com/office/drawing/2010/main" val="0"/>
+                        </a:ext>
+                      </a:extLst>
+                    </a:blip>
+                    <a:srcRect/>
+                    <a:stretch>
+                      <a:fillRect/>
+                    </a:stretch>
+                  </pic:blipFill>
+                  <pic:spPr bwMode="auto">
+                    <a:xfrm>
+                      <a:off x="0" y="0"/>
+                      <a:ext cx="5941060" cy="2771140"/>
+                    </a:xfrm>
+                    <a:prstGeom prst="rect">
+                      <a:avLst/>
+                    </a:prstGeom>
+                    <a:noFill/>
+                    <a:ln>
+                      <a:noFill/>
+                    </a:ln>
+                  </pic:spPr>
+                </pic:pic>
+              </a:graphicData>
+            </a:graphic>
+          </wp:inline>
+        </w:drawing>
+      </w:r>
+    </w:p>
+    <w:p>
+      <w:pPr>
+        <w:spacing w:line="480" w:lineRule="auto"/>
+      </w:pPr>
+      <w:r>
+        <w:tab/>
+        <w:t>After testing the initial model with the transformed features, we fine-tuned the Support Vector Machine using Grid Search CV. We used the following parameters for our search:</w:t>
+      </w:r>
+    </w:p>
+    <w:tbl>
+      <w:tblPr>
+        <w:tblStyle w:val="GridTable1Light"/>
+        <w:tblW w:w="0" w:type="auto"/>
+        <w:tblLook w:val="04A0" w:firstRow="1" w:lastRow="0" w:firstColumn="1" w:lastColumn="0" w:noHBand="0" w:noVBand="1"/>
+      </w:tblPr>
+      <w:tblGrid>
+        <w:gridCol w:w="4675"/>
+        <w:gridCol w:w="4675"/>
+      </w:tblGrid>
+      <w:tr>
+        <w:trPr>
+          <w:cnfStyle w:val="100000000000" w:firstRow="1" w:lastRow="0" w:firstColumn="0" w:lastColumn="0" w:oddVBand="0" w:evenVBand="0" w:oddHBand="0" w:evenHBand="0" w:firstRowFirstColumn="0" w:firstRowLastColumn="0" w:lastRowFirstColumn="0" w:lastRowLastColumn="0"/>
+        </w:trPr>
+        <w:tc>
+          <w:tcPr>
+            <w:cnfStyle w:val="001000000000" w:firstRow="0" w:lastRow="0" w:firstColumn="1" w:lastColumn="0" w:oddVBand="0" w:evenVBand="0" w:oddHBand="0" w:evenHBand="0" w:firstRowFirstColumn="0" w:firstRowLastColumn="0" w:lastRowFirstColumn="0" w:lastRowLastColumn="0"/>
+            <w:tcW w:w="4675" w:type="dxa"/>
+          </w:tcPr>
+          <w:p>
+            <w:pPr>
+              <w:spacing w:line="480" w:lineRule="auto"/>
+            </w:pPr>
+            <w:r>
+              <w:t>Parameter</w:t>
+            </w:r>
+          </w:p>
+        </w:tc>
+        <w:tc>
+          <w:tcPr>
+            <w:tcW w:w="4675" w:type="dxa"/>
+          </w:tcPr>
+          <w:p>
+            <w:pPr>
+              <w:spacing w:line="480" w:lineRule="auto"/>
+              <w:cnfStyle w:val="100000000000" w:firstRow="1" w:lastRow="0" w:firstColumn="0" w:lastColumn="0" w:oddVBand="0" w:evenVBand="0" w:oddHBand="0" w:evenHBand="0" w:firstRowFirstColumn="0" w:firstRowLastColumn="0" w:lastRowFirstColumn="0" w:lastRowLastColumn="0"/>
+            </w:pPr>
+            <w:r>
+              <w:t>Values</w:t>
+            </w:r>
+          </w:p>
+        </w:tc>
+      </w:tr>
+      <w:tr>
+        <w:tc>
+          <w:tcPr>
+            <w:cnfStyle w:val="001000000000" w:firstRow="0" w:lastRow="0" w:firstColumn="1" w:lastColumn="0" w:oddVBand="0" w:evenVBand="0" w:oddHBand="0" w:evenHBand="0" w:firstRowFirstColumn="0" w:firstRowLastColumn="0" w:lastRowFirstColumn="0" w:lastRowLastColumn="0"/>
+            <w:tcW w:w="4675" w:type="dxa"/>
+          </w:tcPr>
+          <w:p>
+            <w:pPr>
+              <w:spacing w:line="480" w:lineRule="auto"/>
+            </w:pPr>
+            <w:r>
+              <w:t>C</w:t>
+            </w:r>
+          </w:p>
+        </w:tc>
+        <w:tc>
+          <w:tcPr>
+            <w:tcW w:w="4675" w:type="dxa"/>
+          </w:tcPr>
+          <w:p>
+            <w:pPr>
+              <w:spacing w:line="480" w:lineRule="auto"/>
+              <w:cnfStyle w:val="000000000000" w:firstRow="0" w:lastRow="0" w:firstColumn="0" w:lastColumn="0" w:oddVBand="0" w:evenVBand="0" w:oddHBand="0" w:evenHBand="0" w:firstRowFirstColumn="0" w:firstRowLastColumn="0" w:lastRowFirstColumn="0" w:lastRowLastColumn="0"/>
+            </w:pPr>
+          </w:p>
+        </w:tc>
+      </w:tr>
+      <w:tr>
+        <w:tc>
+          <w:tcPr>
+            <w:cnfStyle w:val="001000000000" w:firstRow="0" w:lastRow="0" w:firstColumn="1" w:lastColumn="0" w:oddVBand="0" w:evenVBand="0" w:oddHBand="0" w:evenHBand="0" w:firstRowFirstColumn="0" w:firstRowLastColumn="0" w:lastRowFirstColumn="0" w:lastRowLastColumn="0"/>
+            <w:tcW w:w="4675" w:type="dxa"/>
+          </w:tcPr>
+          <w:p>
+            <w:pPr>
+              <w:spacing w:line="480" w:lineRule="auto"/>
+            </w:pPr>
+            <w:r>
+              <w:t>gamma</w:t>
+            </w:r>
+          </w:p>
+        </w:tc>
+        <w:tc>
+          <w:tcPr>
+            <w:tcW w:w="4675" w:type="dxa"/>
+          </w:tcPr>
+          <w:p>
+            <w:pPr>
+              <w:spacing w:line="480" w:lineRule="auto"/>
+              <w:cnfStyle w:val="000000000000" w:firstRow="0" w:lastRow="0" w:firstColumn="0" w:lastColumn="0" w:oddVBand="0" w:evenVBand="0" w:oddHBand="0" w:evenHBand="0" w:firstRowFirstColumn="0" w:firstRowLastColumn="0" w:lastRowFirstColumn="0" w:lastRowLastColumn="0"/>
+            </w:pPr>
+          </w:p>
+        </w:tc>
+      </w:tr>
+      <w:tr>
+        <w:tc>
+          <w:tcPr>
+            <w:cnfStyle w:val="001000000000" w:firstRow="0" w:lastRow="0" w:firstColumn="1" w:lastColumn="0" w:oddVBand="0" w:evenVBand="0" w:oddHBand="0" w:evenHBand="0" w:firstRowFirstColumn="0" w:firstRowLastColumn="0" w:lastRowFirstColumn="0" w:lastRowLastColumn="0"/>
+            <w:tcW w:w="4675" w:type="dxa"/>
+          </w:tcPr>
+          <w:p>
+            <w:pPr>
+              <w:spacing w:line="480" w:lineRule="auto"/>
+            </w:pPr>
+            <w:proofErr w:type="spellStart"/>
+            <w:r>
+              <w:t>class_weight</w:t>
+            </w:r>
+            <w:proofErr w:type="spellEnd"/>
+          </w:p>
+        </w:tc>
+        <w:tc>
+          <w:tcPr>
+            <w:tcW w:w="4675" w:type="dxa"/>
+          </w:tcPr>
+          <w:p>
+            <w:pPr>
+              <w:spacing w:line="480" w:lineRule="auto"/>
+              <w:cnfStyle w:val="000000000000" w:firstRow="0" w:lastRow="0" w:firstColumn="0" w:lastColumn="0" w:oddVBand="0" w:evenVBand="0" w:oddHBand="0" w:evenHBand="0" w:firstRowFirstColumn="0" w:firstRowLastColumn="0" w:lastRowFirstColumn="0" w:lastRowLastColumn="0"/>
+            </w:pPr>
+          </w:p>
+        </w:tc>
+      </w:tr>
+    </w:tbl>
+    <w:p>
+      <w:pPr>
+        <w:spacing w:line="480" w:lineRule="auto"/>
+      </w:pPr>
+    </w:p>
+    <w:p>
+      <w:pPr>
+        <w:spacing w:line="480" w:lineRule="auto"/>
+      </w:pPr>
+      <w:r>
+        <w:tab/>
+        <w:t xml:space="preserve">To account for the extreme class imbalance seen in this dataset, we trained </w:t>
+      </w:r>
+      <w:proofErr w:type="spellStart"/>
+      <w:r>
+        <w:t>GridSearchCV</w:t>
+      </w:r>
+      <w:proofErr w:type="spellEnd"/>
+      <w:r>
+        <w:t xml:space="preserve"> using a </w:t>
+      </w:r>
+      <w:proofErr w:type="spellStart"/>
+      <w:r>
+        <w:t>StratifiedKFold</w:t>
+      </w:r>
+      <w:proofErr w:type="spellEnd"/>
+      <w:r>
+        <w:t xml:space="preserve"> strategy, which ensured each fold maintains the same class distribution as the original dataset. Otherwise, it was possible that some folds might not have any positive examples in them.</w:t>
+      </w:r>
+    </w:p>
+    <w:p>
+      <w:pPr>
+        <w:spacing w:line="480" w:lineRule="auto"/>
+      </w:pPr>
+      <w:r>
+        <w:tab/>
+        <w:t xml:space="preserve">We used an </w:t>
+      </w:r>
+      <w:proofErr w:type="spellStart"/>
+      <w:r>
+        <w:t>rbf</w:t>
+      </w:r>
+      <w:proofErr w:type="spellEnd"/>
+      <w:r>
+        <w:t xml:space="preserve"> kernel and precision score as the evaluation metric.</w:t>
+      </w:r>
     </w:p>
     <w:p>
       <w:pPr>
@@ -270,7 +619,73 @@
         <w:ind w:firstLine="720"/>
       </w:pPr>
       <w:r>
+        <w:lastRenderedPageBreak/>
         <w:t>The main body of your paper goes here, starting on page 3. (Or starting on page 2, if you’re not required to include an abstract.)</w:t>
+      </w:r>
+    </w:p>
+    <w:p>
+      <w:pPr>
+        <w:spacing w:line="480" w:lineRule="auto"/>
+        <w:ind w:firstLine="720"/>
+      </w:pPr>
+    </w:p>
+    <w:p>
+      <w:pPr>
+        <w:spacing w:line="480" w:lineRule="auto"/>
+        <w:ind w:firstLine="720"/>
+      </w:pPr>
+      <w:r>
+        <w:rPr>
+          <w:noProof/>
+        </w:rPr>
+        <w:drawing>
+          <wp:inline distT="0" distB="0" distL="0" distR="0" wp14:anchorId="09730C35" wp14:editId="4A4E83A7">
+            <wp:extent cx="5941060" cy="2226945"/>
+            <wp:effectExtent l="0" t="0" r="2540" b="1905"/>
+            <wp:docPr id="1971914620" name="Picture 2"/>
+            <wp:cNvGraphicFramePr>
+              <a:graphicFrameLocks xmlns:a="http://schemas.openxmlformats.org/drawingml/2006/main" noChangeAspect="1"/>
+            </wp:cNvGraphicFramePr>
+            <a:graphic xmlns:a="http://schemas.openxmlformats.org/drawingml/2006/main">
+              <a:graphicData uri="http://schemas.openxmlformats.org/drawingml/2006/picture">
+                <pic:pic xmlns:pic="http://schemas.openxmlformats.org/drawingml/2006/picture">
+                  <pic:nvPicPr>
+                    <pic:cNvPr id="0" name="Picture 2"/>
+                    <pic:cNvPicPr>
+                      <a:picLocks noChangeAspect="1" noChangeArrowheads="1"/>
+                    </pic:cNvPicPr>
+                  </pic:nvPicPr>
+                  <pic:blipFill>
+                    <a:blip r:embed="rId9" cstate="print">
+                      <a:extLst>
+                        <a:ext uri="{28A0092B-C50C-407E-A947-70E740481C1C}">
+                          <a14:useLocalDpi xmlns:a14="http://schemas.microsoft.com/office/drawing/2010/main" val="0"/>
+                        </a:ext>
+                      </a:extLst>
+                    </a:blip>
+                    <a:srcRect/>
+                    <a:stretch>
+                      <a:fillRect/>
+                    </a:stretch>
+                  </pic:blipFill>
+                  <pic:spPr bwMode="auto">
+                    <a:xfrm>
+                      <a:off x="0" y="0"/>
+                      <a:ext cx="5941060" cy="2226945"/>
+                    </a:xfrm>
+                    <a:prstGeom prst="rect">
+                      <a:avLst/>
+                    </a:prstGeom>
+                    <a:noFill/>
+                    <a:ln>
+                      <a:noFill/>
+                    </a:ln>
+                  </pic:spPr>
+                </pic:pic>
+              </a:graphicData>
+            </a:graphic>
+          </wp:inline>
+        </w:drawing>
       </w:r>
     </w:p>
     <w:p>
@@ -464,7 +879,7 @@
       <w:r>
         <w:t xml:space="preserve">See other </w:t>
       </w:r>
-      <w:hyperlink r:id="rId7">
+      <w:hyperlink r:id="rId10">
         <w:r>
           <w:rPr>
             <w:color w:val="0000FF"/>
@@ -484,9 +899,9 @@
       </w:pPr>
     </w:p>
     <w:sectPr>
-      <w:headerReference w:type="even" r:id="rId8"/>
-      <w:headerReference w:type="default" r:id="rId9"/>
-      <w:headerReference w:type="first" r:id="rId10"/>
+      <w:headerReference w:type="even" r:id="rId11"/>
+      <w:headerReference w:type="default" r:id="rId12"/>
+      <w:headerReference w:type="first" r:id="rId13"/>
       <w:pgSz w:w="12240" w:h="15840"/>
       <w:pgMar w:top="1440" w:right="1440" w:bottom="1440" w:left="1440" w:header="720" w:footer="1440" w:gutter="0"/>
       <w:pgNumType w:start="1"/>
@@ -1366,6 +1781,95 @@
       <w:contextualSpacing/>
     </w:pPr>
   </w:style>
+  <w:style w:type="paragraph" w:styleId="Caption">
+    <w:name w:val="caption"/>
+    <w:basedOn w:val="Normal"/>
+    <w:next w:val="Normal"/>
+    <w:uiPriority w:val="35"/>
+    <w:unhideWhenUsed/>
+    <w:qFormat/>
+    <w:rsid w:val="00047A16"/>
+    <w:pPr>
+      <w:spacing w:after="200"/>
+    </w:pPr>
+    <w:rPr>
+      <w:i/>
+      <w:iCs/>
+      <w:color w:val="1F497D" w:themeColor="text2"/>
+      <w:sz w:val="18"/>
+      <w:szCs w:val="18"/>
+    </w:rPr>
+  </w:style>
+  <w:style w:type="table" w:styleId="TableGrid">
+    <w:name w:val="Table Grid"/>
+    <w:basedOn w:val="TableNormal"/>
+    <w:uiPriority w:val="39"/>
+    <w:rsid w:val="00195125"/>
+    <w:tblPr>
+      <w:tblBorders>
+        <w:top w:val="single" w:sz="4" w:space="0" w:color="auto"/>
+        <w:left w:val="single" w:sz="4" w:space="0" w:color="auto"/>
+        <w:bottom w:val="single" w:sz="4" w:space="0" w:color="auto"/>
+        <w:right w:val="single" w:sz="4" w:space="0" w:color="auto"/>
+        <w:insideH w:val="single" w:sz="4" w:space="0" w:color="auto"/>
+        <w:insideV w:val="single" w:sz="4" w:space="0" w:color="auto"/>
+      </w:tblBorders>
+    </w:tblPr>
+  </w:style>
+  <w:style w:type="table" w:styleId="GridTable1Light">
+    <w:name w:val="Grid Table 1 Light"/>
+    <w:basedOn w:val="TableNormal"/>
+    <w:uiPriority w:val="46"/>
+    <w:rsid w:val="00195125"/>
+    <w:tblPr>
+      <w:tblStyleRowBandSize w:val="1"/>
+      <w:tblStyleColBandSize w:val="1"/>
+      <w:tblBorders>
+        <w:top w:val="single" w:sz="4" w:space="0" w:color="999999" w:themeColor="text1" w:themeTint="66"/>
+        <w:left w:val="single" w:sz="4" w:space="0" w:color="999999" w:themeColor="text1" w:themeTint="66"/>
+        <w:bottom w:val="single" w:sz="4" w:space="0" w:color="999999" w:themeColor="text1" w:themeTint="66"/>
+        <w:right w:val="single" w:sz="4" w:space="0" w:color="999999" w:themeColor="text1" w:themeTint="66"/>
+        <w:insideH w:val="single" w:sz="4" w:space="0" w:color="999999" w:themeColor="text1" w:themeTint="66"/>
+        <w:insideV w:val="single" w:sz="4" w:space="0" w:color="999999" w:themeColor="text1" w:themeTint="66"/>
+      </w:tblBorders>
+    </w:tblPr>
+    <w:tblStylePr w:type="firstRow">
+      <w:rPr>
+        <w:b/>
+        <w:bCs/>
+      </w:rPr>
+      <w:tblPr/>
+      <w:tcPr>
+        <w:tcBorders>
+          <w:bottom w:val="single" w:sz="12" w:space="0" w:color="666666" w:themeColor="text1" w:themeTint="99"/>
+        </w:tcBorders>
+      </w:tcPr>
+    </w:tblStylePr>
+    <w:tblStylePr w:type="lastRow">
+      <w:rPr>
+        <w:b/>
+        <w:bCs/>
+      </w:rPr>
+      <w:tblPr/>
+      <w:tcPr>
+        <w:tcBorders>
+          <w:top w:val="double" w:sz="2" w:space="0" w:color="666666" w:themeColor="text1" w:themeTint="99"/>
+        </w:tcBorders>
+      </w:tcPr>
+    </w:tblStylePr>
+    <w:tblStylePr w:type="firstCol">
+      <w:rPr>
+        <w:b/>
+        <w:bCs/>
+      </w:rPr>
+    </w:tblStylePr>
+    <w:tblStylePr w:type="lastCol">
+      <w:rPr>
+        <w:b/>
+        <w:bCs/>
+      </w:rPr>
+    </w:tblStylePr>
+  </w:style>
 </w:styles>
 </file>
 

</xml_diff>

<commit_message>
(update): editing final report; requirements.txt readme.md
</commit_message>
<xml_diff>
--- a/module_summary.docx
+++ b/module_summary.docx
@@ -1,13 +1,15 @@
 
 <file path=word/document.xml><?xml version="1.0" encoding="utf-8"?>
-<w:document xmlns:wpc="http://schemas.microsoft.com/office/word/2010/wordprocessingCanvas" xmlns:cx="http://schemas.microsoft.com/office/drawing/2014/chartex" xmlns:cx1="http://schemas.microsoft.com/office/drawing/2015/9/8/chartex" xmlns:cx2="http://schemas.microsoft.com/office/drawing/2015/10/21/chartex" xmlns:cx3="http://schemas.microsoft.com/office/drawing/2016/5/9/chartex" xmlns:cx4="http://schemas.microsoft.com/office/drawing/2016/5/10/chartex" xmlns:cx5="http://schemas.microsoft.com/office/drawing/2016/5/11/chartex" xmlns:cx6="http://schemas.microsoft.com/office/drawing/2016/5/12/chartex" xmlns:cx7="http://schemas.microsoft.com/office/drawing/2016/5/13/chartex" xmlns:cx8="http://schemas.microsoft.com/office/drawing/2016/5/14/chartex" xmlns:mc="http://schemas.openxmlformats.org/markup-compatibility/2006" xmlns:aink="http://schemas.microsoft.com/office/drawing/2016/ink" xmlns:am3d="http://schemas.microsoft.com/office/drawing/2017/model3d" xmlns:o="urn:schemas-microsoft-com:office:office" xmlns:oel="http://schemas.microsoft.com/office/2019/extlst" xmlns:r="http://schemas.openxmlformats.org/officeDocument/2006/relationships" xmlns:m="http://schemas.openxmlformats.org/officeDocument/2006/math" xmlns:v="urn:schemas-microsoft-com:vml" xmlns:wp14="http://schemas.microsoft.com/office/word/2010/wordprocessingDrawing" xmlns:wp="http://schemas.openxmlformats.org/drawingml/2006/wordprocessingDrawing" xmlns:w10="urn:schemas-microsoft-com:office:word" xmlns:w="http://schemas.openxmlformats.org/wordprocessingml/2006/main" xmlns:w14="http://schemas.microsoft.com/office/word/2010/wordml" xmlns:w15="http://schemas.microsoft.com/office/word/2012/wordml" xmlns:w16cex="http://schemas.microsoft.com/office/word/2018/wordml/cex" xmlns:w16cid="http://schemas.microsoft.com/office/word/2016/wordml/cid" xmlns:w16="http://schemas.microsoft.com/office/word/2018/wordml" xmlns:w16du="http://schemas.microsoft.com/office/word/2023/wordml/word16du" xmlns:w16sdtdh="http://schemas.microsoft.com/office/word/2020/wordml/sdtdatahash" xmlns:w16sdtfl="http://schemas.microsoft.com/office/word/2024/wordml/sdtformatlock" xmlns:w16se="http://schemas.microsoft.com/office/word/2015/wordml/symex" xmlns:wpg="http://schemas.microsoft.com/office/word/2010/wordprocessingGroup" xmlns:wpi="http://schemas.microsoft.com/office/word/2010/wordprocessingInk" xmlns:wne="http://schemas.microsoft.com/office/word/2006/wordml" xmlns:wps="http://schemas.microsoft.com/office/word/2010/wordprocessingShape" mc:Ignorable="w14 w15 w16se w16cid w16 w16cex w16sdtdh w16sdtfl w16du wp14">
+<w:document xmlns:o="urn:schemas-microsoft-com:office:office" xmlns:r="http://schemas.openxmlformats.org/officeDocument/2006/relationships" xmlns:v="urn:schemas-microsoft-com:vml" xmlns:w="http://schemas.openxmlformats.org/wordprocessingml/2006/main" xmlns:w10="urn:schemas-microsoft-com:office:word" xmlns:wp="http://schemas.openxmlformats.org/drawingml/2006/wordprocessingDrawing" xmlns:wps="http://schemas.microsoft.com/office/word/2010/wordprocessingShape" xmlns:wpg="http://schemas.microsoft.com/office/word/2010/wordprocessingGroup" xmlns:mc="http://schemas.openxmlformats.org/markup-compatibility/2006" xmlns:wp14="http://schemas.microsoft.com/office/word/2010/wordprocessingDrawing" xmlns:w14="http://schemas.microsoft.com/office/word/2010/wordml" xmlns:w15="http://schemas.microsoft.com/office/word/2012/wordml" mc:Ignorable="w14 wp14 w15">
   <w:body>
     <w:p>
       <w:pPr>
+        <w:pStyle w:val="Normal"/>
         <w:tabs>
-          <w:tab w:val="left" w:pos="1440"/>
+          <w:tab w:val="clear" w:pos="720"/>
+          <w:tab w:val="left" w:pos="1440" w:leader="none"/>
         </w:tabs>
-        <w:spacing w:before="3600" w:line="480" w:lineRule="auto"/>
+        <w:spacing w:lineRule="auto" w:line="480" w:before="3600" w:after="0"/>
         <w:jc w:val="center"/>
         <w:rPr>
           <w:b/>
@@ -17,39 +19,59 @@
         <w:rPr>
           <w:b/>
         </w:rPr>
-        <w:t>Searching for Exoplanets using the Random Forest Algorithm</w:t>
-      </w:r>
-    </w:p>
-    <w:p>
-      <w:pPr>
-        <w:spacing w:line="480" w:lineRule="auto"/>
+        <w:t xml:space="preserve">Searching for Exoplanets using </w:t>
+      </w:r>
+      <w:r>
+        <w:rPr>
+          <w:b/>
+        </w:rPr>
+        <w:t>a Support Vector Machine</w:t>
+      </w:r>
+    </w:p>
+    <w:p>
+      <w:pPr>
+        <w:pStyle w:val="Normal"/>
+        <w:spacing w:lineRule="auto" w:line="480"/>
         <w:jc w:val="center"/>
-      </w:pPr>
-    </w:p>
-    <w:p>
-      <w:pPr>
-        <w:spacing w:line="480" w:lineRule="auto"/>
+        <w:rPr/>
+      </w:pPr>
+      <w:r>
+        <w:rPr/>
+      </w:r>
+    </w:p>
+    <w:p>
+      <w:pPr>
+        <w:pStyle w:val="Normal"/>
+        <w:spacing w:lineRule="auto" w:line="480"/>
         <w:jc w:val="center"/>
-      </w:pPr>
-      <w:r>
+        <w:rPr/>
+      </w:pPr>
+      <w:r>
+        <w:rPr/>
         <w:t>Gene Foxwell</w:t>
       </w:r>
     </w:p>
     <w:p>
       <w:pPr>
-        <w:spacing w:line="480" w:lineRule="auto"/>
+        <w:pStyle w:val="Normal"/>
+        <w:spacing w:lineRule="auto" w:line="480"/>
         <w:jc w:val="center"/>
-      </w:pPr>
-      <w:r>
+        <w:rPr/>
+      </w:pPr>
+      <w:r>
+        <w:rPr/>
         <w:t>Wolf University / Udacity School of Artificial Intelligence</w:t>
       </w:r>
     </w:p>
     <w:p>
       <w:pPr>
-        <w:spacing w:line="480" w:lineRule="auto"/>
+        <w:pStyle w:val="Normal"/>
+        <w:spacing w:lineRule="auto" w:line="480"/>
         <w:jc w:val="center"/>
-      </w:pPr>
-      <w:r>
+        <w:rPr/>
+      </w:pPr>
+      <w:r>
+        <w:rPr/>
         <w:t>Applied Machine Learning</w:t>
       </w:r>
       <w:r>
@@ -58,7 +80,8 @@
     </w:p>
     <w:p>
       <w:pPr>
-        <w:spacing w:line="480" w:lineRule="auto"/>
+        <w:pStyle w:val="Normal"/>
+        <w:spacing w:lineRule="auto" w:line="480" w:before="0" w:after="0"/>
         <w:jc w:val="center"/>
         <w:rPr>
           <w:b/>
@@ -68,13 +91,13 @@
         <w:rPr>
           <w:b/>
         </w:rPr>
-        <w:lastRenderedPageBreak/>
         <w:t xml:space="preserve"> </w:t>
       </w:r>
     </w:p>
     <w:p>
       <w:pPr>
-        <w:spacing w:line="480" w:lineRule="auto"/>
+        <w:pStyle w:val="Normal"/>
+        <w:spacing w:lineRule="auto" w:line="480"/>
         <w:jc w:val="center"/>
         <w:rPr>
           <w:b/>
@@ -89,31 +112,35 @@
     </w:p>
     <w:p>
       <w:pPr>
-        <w:spacing w:line="480" w:lineRule="auto"/>
+        <w:pStyle w:val="Normal"/>
+        <w:spacing w:lineRule="auto" w:line="480"/>
         <w:ind w:firstLine="720"/>
-      </w:pPr>
-      <w:r>
-        <w:t xml:space="preserve">This project looks at building a Machine Learning Model for predicting if a Star has an Exoplanet based on flux observations from the Kepler Telescope. We will provide an overview of the problem and the dataset. Then we will go over other approaches to this problem. </w:t>
-      </w:r>
-      <w:r>
-        <w:t>Next,</w:t>
-      </w:r>
-      <w:r>
-        <w:t xml:space="preserve"> we will build a preprocessing pipeline aimed at performing dimensionality reduction. Finally, we will cover the training of the Support Vector Machine Model and discuss the results. </w:t>
-      </w:r>
-    </w:p>
-    <w:p>
-      <w:pPr>
-        <w:spacing w:line="480" w:lineRule="auto"/>
+        <w:rPr/>
+      </w:pPr>
+      <w:r>
+        <w:rPr/>
+        <w:t xml:space="preserve">This project looks at building a Machine Learning Model for predicting if a Star has an Exoplanet based on flux observations from the Kepler Telescope. We will provide an overview of the problem and the dataset. Then we will go over other approaches to this problem. Next, we will build a preprocessing pipeline aimed at performing dimensionality reduction. Finally, we will cover the training of the Support Vector Machine Model and discuss the results. </w:t>
+      </w:r>
+    </w:p>
+    <w:p>
+      <w:pPr>
+        <w:pStyle w:val="Normal"/>
+        <w:spacing w:lineRule="auto" w:line="480"/>
         <w:jc w:val="center"/>
         <w:rPr>
           <w:b/>
         </w:rPr>
       </w:pPr>
-    </w:p>
-    <w:p>
-      <w:pPr>
-        <w:spacing w:line="480" w:lineRule="auto"/>
+      <w:r>
+        <w:rPr>
+          <w:b/>
+        </w:rPr>
+      </w:r>
+    </w:p>
+    <w:p>
+      <w:pPr>
+        <w:pStyle w:val="Normal"/>
+        <w:spacing w:lineRule="auto" w:line="480"/>
         <w:jc w:val="center"/>
         <w:rPr>
           <w:b/>
@@ -128,71 +155,90 @@
     </w:p>
     <w:p>
       <w:pPr>
-        <w:spacing w:line="480" w:lineRule="auto"/>
+        <w:pStyle w:val="Normal"/>
+        <w:spacing w:lineRule="auto" w:line="480"/>
         <w:ind w:firstLine="720"/>
-      </w:pPr>
-      <w:r>
+        <w:rPr/>
+      </w:pPr>
+      <w:r>
+        <w:rPr/>
         <w:t>We are using the version of this dataset hosted by Kaggle.  The dataset is provided in two parts: A training dataset, and A test dataset. Both datasets are extremely unbalanced – the training dataset has 5087 rows of which only 37 represents planets. The test dataset has 571 rows, of which only 5 are planets! The challenges this present will be discussed later in this paper.</w:t>
       </w:r>
     </w:p>
     <w:p>
       <w:pPr>
-        <w:spacing w:line="480" w:lineRule="auto"/>
+        <w:pStyle w:val="Normal"/>
+        <w:spacing w:lineRule="auto" w:line="480"/>
         <w:ind w:firstLine="720"/>
-      </w:pPr>
-      <w:r>
+        <w:rPr/>
+      </w:pPr>
+      <w:r>
+        <w:rPr/>
         <w:t xml:space="preserve">Each row of the dataset has 3198 columns. The first column is the label. 1 -&gt; Low probability of a planet around the candidate star, 2 -&gt; High probability of planet around the candidate star. The remaining 3197 columns are the flux observations as recorded from the Kepler Telescope. </w:t>
       </w:r>
     </w:p>
     <w:p>
       <w:pPr>
-        <w:spacing w:line="480" w:lineRule="auto"/>
+        <w:pStyle w:val="Normal"/>
+        <w:spacing w:lineRule="auto" w:line="480"/>
         <w:ind w:firstLine="720"/>
-      </w:pPr>
-      <w:r>
+        <w:rPr/>
+      </w:pPr>
+      <w:r>
+        <w:rPr/>
         <w:t>Flux, in the context of astronomy, is defined as the amount of energy received from a celestial object per unit area, per unit time. It is effectively a way of measuring how much energy is received from the star.</w:t>
       </w:r>
     </w:p>
     <w:p>
       <w:pPr>
-        <w:spacing w:line="480" w:lineRule="auto"/>
+        <w:pStyle w:val="Normal"/>
+        <w:spacing w:lineRule="auto" w:line="480"/>
         <w:ind w:firstLine="720"/>
-      </w:pPr>
-      <w:r>
-        <w:lastRenderedPageBreak/>
+        <w:rPr/>
+      </w:pPr>
+      <w:r>
+        <w:rPr/>
         <w:t xml:space="preserve">The idea behind planet detection in this context is that when an exoplanet passes between the Star and Earth, the flux we detect from that star will decrease as some of that flux has been blocked off by the exoplanet. </w:t>
       </w:r>
     </w:p>
     <w:p>
       <w:pPr>
-        <w:spacing w:line="480" w:lineRule="auto"/>
+        <w:pStyle w:val="Normal"/>
+        <w:spacing w:lineRule="auto" w:line="480"/>
         <w:ind w:firstLine="720"/>
-      </w:pPr>
-      <w:r>
+        <w:rPr/>
+      </w:pPr>
+      <w:r>
+        <w:rPr/>
         <w:t>As we can see from figure 1, the flux data collected is extremely noisy. Much of our work in the next section will focus on cleaning up this noise to enable the Machine Learning Model to work effectively.</w:t>
       </w:r>
     </w:p>
     <w:p>
       <w:pPr>
-        <w:spacing w:line="480" w:lineRule="auto"/>
+        <w:pStyle w:val="Normal"/>
+        <w:spacing w:lineRule="auto" w:line="480"/>
         <w:ind w:firstLine="720"/>
-      </w:pPr>
-    </w:p>
-    <w:p>
-      <w:pPr>
-        <w:keepNext/>
-        <w:spacing w:line="480" w:lineRule="auto"/>
+        <w:rPr/>
+      </w:pPr>
+      <w:r>
+        <w:rPr/>
+      </w:r>
+    </w:p>
+    <w:p>
+      <w:pPr>
+        <w:pStyle w:val="Normal"/>
+        <w:keepNext w:val="true"/>
+        <w:spacing w:lineRule="auto" w:line="480"/>
         <w:ind w:firstLine="720"/>
-      </w:pPr>
-      <w:r>
-        <w:rPr>
-          <w:noProof/>
-        </w:rPr>
+        <w:rPr/>
+      </w:pPr>
+      <w:r>
+        <w:rPr/>
         <w:drawing>
-          <wp:inline distT="0" distB="0" distL="0" distR="0" wp14:anchorId="463E74D7" wp14:editId="65152862">
+          <wp:inline distT="0" distB="0" distL="0" distR="0">
             <wp:extent cx="5941060" cy="3169285"/>
             <wp:effectExtent l="0" t="0" r="0" b="0"/>
-            <wp:docPr id="1" name="Picture 3"/>
+            <wp:docPr id="1" name="Picture 3" descr=""/>
             <wp:cNvGraphicFramePr>
               <a:graphicFrameLocks xmlns:a="http://schemas.openxmlformats.org/drawingml/2006/main" noChangeAspect="1"/>
             </wp:cNvGraphicFramePr>
@@ -200,13 +246,13 @@
               <a:graphicData uri="http://schemas.openxmlformats.org/drawingml/2006/picture">
                 <pic:pic xmlns:pic="http://schemas.openxmlformats.org/drawingml/2006/picture">
                   <pic:nvPicPr>
-                    <pic:cNvPr id="1" name="Picture 3"/>
+                    <pic:cNvPr id="1" name="Picture 3" descr=""/>
                     <pic:cNvPicPr>
                       <a:picLocks noChangeAspect="1" noChangeArrowheads="1"/>
                     </pic:cNvPicPr>
                   </pic:nvPicPr>
                   <pic:blipFill>
-                    <a:blip r:embed="rId8"/>
+                    <a:blip r:embed="rId2"/>
                     <a:stretch>
                       <a:fillRect/>
                     </a:stretch>
@@ -231,34 +277,56 @@
       <w:pPr>
         <w:pStyle w:val="Caption"/>
         <w:jc w:val="center"/>
-      </w:pPr>
-      <w:r>
+        <w:rPr/>
+      </w:pPr>
+      <w:r>
+        <w:rPr/>
         <w:t xml:space="preserve">Figure </w:t>
       </w:r>
-      <w:fldSimple w:instr=" SEQ Figure \* ARABIC ">
-        <w:r>
-          <w:rPr>
-            <w:noProof/>
-          </w:rPr>
-          <w:t>1</w:t>
-        </w:r>
-      </w:fldSimple>
-      <w:r>
+      <w:r>
+        <w:rPr/>
+        <w:fldChar w:fldCharType="begin"/>
+      </w:r>
+      <w:r>
+        <w:rPr/>
+        <w:instrText xml:space="preserve"> SEQ Figure \* ARABIC </w:instrText>
+      </w:r>
+      <w:r>
+        <w:rPr/>
+        <w:fldChar w:fldCharType="separate"/>
+      </w:r>
+      <w:r>
+        <w:rPr/>
+        <w:t>1</w:t>
+      </w:r>
+      <w:r>
+        <w:rPr/>
+        <w:fldChar w:fldCharType="end"/>
+      </w:r>
+      <w:r>
+        <w:rPr/>
         <w:t xml:space="preserve"> Same of Planet vs. No Planet Observations</w:t>
       </w:r>
     </w:p>
     <w:p>
       <w:pPr>
-        <w:spacing w:line="480" w:lineRule="auto"/>
+        <w:pStyle w:val="Normal"/>
+        <w:spacing w:lineRule="auto" w:line="480"/>
         <w:jc w:val="center"/>
         <w:rPr>
           <w:b/>
         </w:rPr>
       </w:pPr>
-    </w:p>
-    <w:p>
-      <w:pPr>
-        <w:spacing w:line="480" w:lineRule="auto"/>
+      <w:r>
+        <w:rPr>
+          <w:b/>
+        </w:rPr>
+      </w:r>
+    </w:p>
+    <w:p>
+      <w:pPr>
+        <w:pStyle w:val="Normal"/>
+        <w:spacing w:lineRule="auto" w:line="480"/>
         <w:jc w:val="center"/>
         <w:rPr>
           <w:b/>
@@ -273,79 +341,53 @@
     </w:p>
     <w:p>
       <w:pPr>
-        <w:spacing w:line="480" w:lineRule="auto"/>
+        <w:pStyle w:val="Normal"/>
+        <w:spacing w:lineRule="auto" w:line="480"/>
         <w:ind w:firstLine="720"/>
         <w:rPr>
           <w:lang w:val="en-CA"/>
         </w:rPr>
       </w:pPr>
       <w:r>
+        <w:rPr/>
         <w:t>While researching this dataset, we came across two other approaches to the Kepler dataset. (</w:t>
       </w:r>
       <w:r>
         <w:rPr>
           <w:lang w:val="en-CA"/>
         </w:rPr>
-        <w:t>Airlangga, G. 2024</w:t>
+        <w:t xml:space="preserve">Airlangga, G. 2024) </w:t>
+      </w:r>
+      <w:r>
+        <w:rPr/>
+        <w:t>and (</w:t>
       </w:r>
       <w:r>
         <w:rPr>
           <w:lang w:val="en-CA"/>
         </w:rPr>
-        <w:t xml:space="preserve">) </w:t>
-      </w:r>
-      <w:r>
-        <w:t>and (</w:t>
-      </w:r>
-      <w:r>
-        <w:rPr>
-          <w:lang w:val="en-CA"/>
-        </w:rPr>
-        <w:t>Reihaneh Karimi et all</w:t>
-      </w:r>
-      <w:r>
-        <w:rPr>
-          <w:lang w:val="en-CA"/>
-        </w:rPr>
-        <w:t xml:space="preserve"> </w:t>
-      </w:r>
-      <w:r>
-        <w:rPr>
-          <w:lang w:val="en-CA"/>
-        </w:rPr>
-        <w:t>2025</w:t>
-      </w:r>
-      <w:r>
-        <w:t>) approach comparing the results of a variety of ML Models. It did not appear from either paper that they attempted dimensionality reduction akin to our approach here – although the precise details of the</w:t>
-      </w:r>
-      <w:r>
-        <w:t xml:space="preserve"> </w:t>
-      </w:r>
-      <w:r>
-        <w:lastRenderedPageBreak/>
-        <w:t>p</w:t>
-      </w:r>
-      <w:r>
-        <w:t xml:space="preserve">reprocessing done are shallow in both papers. Both mention the use of a Fast Fourier Transform (double check), an approach which we also take here, before preforming our </w:t>
-      </w:r>
-      <w:proofErr w:type="gramStart"/>
-      <w:r>
-        <w:t>dimensionality</w:t>
-      </w:r>
-      <w:proofErr w:type="gramEnd"/>
-      <w:r>
-        <w:t xml:space="preserve"> reducing operation.</w:t>
-      </w:r>
-    </w:p>
-    <w:p>
-      <w:pPr>
-        <w:spacing w:line="480" w:lineRule="auto"/>
+        <w:t>Reihaneh Karimi et all 2025</w:t>
+      </w:r>
+      <w:r>
+        <w:rPr/>
+        <w:t>) approach comparing the results of a variety of ML Models. It did not appear from either paper that they attempted dimensionality reduction akin to our approach here – although the precise details of the preprocessing done are shallow in both papers. Both mention the use of a Fast Fourier Transform (double check), an approach which we also take here, before preforming our dimensionality reducing operation.</w:t>
+      </w:r>
+    </w:p>
+    <w:p>
+      <w:pPr>
+        <w:pStyle w:val="Normal"/>
+        <w:spacing w:lineRule="auto" w:line="480"/>
         <w:ind w:firstLine="720"/>
-      </w:pPr>
-    </w:p>
-    <w:p>
-      <w:pPr>
-        <w:spacing w:line="480" w:lineRule="auto"/>
+        <w:rPr/>
+      </w:pPr>
+      <w:r>
+        <w:rPr/>
+      </w:r>
+    </w:p>
+    <w:p>
+      <w:pPr>
+        <w:pStyle w:val="Normal"/>
+        <w:spacing w:lineRule="auto" w:line="480"/>
         <w:jc w:val="center"/>
         <w:rPr>
           <w:b/>
@@ -360,10 +402,13 @@
     </w:p>
     <w:p>
       <w:pPr>
-        <w:spacing w:line="480" w:lineRule="auto"/>
+        <w:pStyle w:val="Normal"/>
+        <w:spacing w:lineRule="auto" w:line="480"/>
         <w:ind w:firstLine="720"/>
-      </w:pPr>
-      <w:r>
+        <w:rPr/>
+      </w:pPr>
+      <w:r>
+        <w:rPr/>
         <w:t>For our approach we focused on creating a reduced dimensional set of features for input into a Support Vector Machine. Our general idea was to find a way to encode the fact that planets induce a reduction in flux directly into our features. To this end, our prepossessing and feature engineering pipeline consisted of the following steps:</w:t>
       </w:r>
     </w:p>
@@ -374,7 +419,8 @@
           <w:ilvl w:val="0"/>
           <w:numId w:val="1"/>
         </w:numPr>
-        <w:spacing w:line="480" w:lineRule="auto"/>
+        <w:spacing w:lineRule="auto" w:line="480"/>
+        <w:rPr/>
       </w:pPr>
       <w:r>
         <w:rPr>
@@ -384,10 +430,8 @@
         <w:t>Fast Fourier Transform (FFT):</w:t>
       </w:r>
       <w:r>
-        <w:t xml:space="preserve"> </w:t>
-      </w:r>
-      <w:r>
-        <w:t>&lt;EXPLAIN! EXPLAIN!&gt;</w:t>
+        <w:rPr/>
+        <w:t xml:space="preserve"> &lt;EXPLAIN! EXPLAIN!&gt;</w:t>
       </w:r>
     </w:p>
     <w:p>
@@ -397,7 +441,8 @@
           <w:ilvl w:val="0"/>
           <w:numId w:val="1"/>
         </w:numPr>
-        <w:spacing w:line="480" w:lineRule="auto"/>
+        <w:spacing w:lineRule="auto" w:line="480"/>
+        <w:rPr/>
       </w:pPr>
       <w:r>
         <w:rPr>
@@ -407,7 +452,12 @@
         <w:t>Binned Z-Scores:</w:t>
       </w:r>
       <w:r>
-        <w:t xml:space="preserve"> &lt;EXPLAIN! EXPLAIN!&gt;</w:t>
+        <w:rPr/>
+        <w:t xml:space="preserve"> </w:t>
+      </w:r>
+      <w:r>
+        <w:rPr/>
+        <w:t>This was the primary means via which we reduced the dimensionality of the data. For each row we calculated the mean of the row. Then we divided the row into bins of 16 observations each. We returned a Z-Score for each bin. The Z-Score is the number of standard deviations a value is above or below the mean. This resulted in dimensionality reduction of 3197 features down to 100 features.</w:t>
       </w:r>
     </w:p>
     <w:p>
@@ -417,7 +467,8 @@
           <w:ilvl w:val="0"/>
           <w:numId w:val="1"/>
         </w:numPr>
-        <w:spacing w:line="480" w:lineRule="auto"/>
+        <w:spacing w:lineRule="auto" w:line="480"/>
+        <w:rPr/>
       </w:pPr>
       <w:r>
         <w:rPr>
@@ -427,26 +478,24 @@
         <w:t>Standardization:</w:t>
       </w:r>
       <w:r>
-        <w:t xml:space="preserve"> </w:t>
-      </w:r>
-      <w:r>
-        <w:t>This step transformed the data, so it has mean 0 and standard deviation 1. This was used to keep the data roughly in the same scale to avoid larger values biasing the model.</w:t>
-      </w:r>
-    </w:p>
-    <w:p>
-      <w:pPr>
-        <w:keepNext/>
-        <w:spacing w:line="480" w:lineRule="auto"/>
-      </w:pPr>
-      <w:r>
-        <w:rPr>
-          <w:noProof/>
-        </w:rPr>
+        <w:rPr/>
+        <w:t xml:space="preserve"> This step transformed the data, so it has mean 0 and standard deviation 1. This was used to keep the data roughly in the same scale to avoid larger values biasing the model.</w:t>
+      </w:r>
+    </w:p>
+    <w:p>
+      <w:pPr>
+        <w:pStyle w:val="Normal"/>
+        <w:keepNext w:val="true"/>
+        <w:spacing w:lineRule="auto" w:line="480"/>
+        <w:rPr/>
+      </w:pPr>
+      <w:r>
+        <w:rPr/>
         <w:drawing>
-          <wp:inline distT="0" distB="0" distL="0" distR="0" wp14:anchorId="77BB1974" wp14:editId="5FCC7FE2">
+          <wp:inline distT="0" distB="0" distL="0" distR="0">
             <wp:extent cx="5941060" cy="2771140"/>
             <wp:effectExtent l="0" t="0" r="0" b="0"/>
-            <wp:docPr id="2" name="Picture 7"/>
+            <wp:docPr id="2" name="Picture 7" descr=""/>
             <wp:cNvGraphicFramePr>
               <a:graphicFrameLocks xmlns:a="http://schemas.openxmlformats.org/drawingml/2006/main" noChangeAspect="1"/>
             </wp:cNvGraphicFramePr>
@@ -454,13 +503,13 @@
               <a:graphicData uri="http://schemas.openxmlformats.org/drawingml/2006/picture">
                 <pic:pic xmlns:pic="http://schemas.openxmlformats.org/drawingml/2006/picture">
                   <pic:nvPicPr>
-                    <pic:cNvPr id="2" name="Picture 7"/>
+                    <pic:cNvPr id="2" name="Picture 7" descr=""/>
                     <pic:cNvPicPr>
                       <a:picLocks noChangeAspect="1" noChangeArrowheads="1"/>
                     </pic:cNvPicPr>
                   </pic:nvPicPr>
                   <pic:blipFill>
-                    <a:blip r:embed="rId9"/>
+                    <a:blip r:embed="rId3"/>
                     <a:stretch>
                       <a:fillRect/>
                     </a:stretch>
@@ -485,45 +534,72 @@
       <w:pPr>
         <w:pStyle w:val="Caption"/>
         <w:jc w:val="center"/>
-      </w:pPr>
-      <w:r>
+        <w:rPr/>
+      </w:pPr>
+      <w:r>
+        <w:rPr/>
         <w:t xml:space="preserve">Figure </w:t>
       </w:r>
-      <w:fldSimple w:instr=" SEQ Figure \* ARABIC ">
-        <w:r>
-          <w:rPr>
-            <w:noProof/>
-          </w:rPr>
-          <w:t>2</w:t>
-        </w:r>
-      </w:fldSimple>
-      <w:r>
+      <w:r>
+        <w:rPr/>
+        <w:fldChar w:fldCharType="begin"/>
+      </w:r>
+      <w:r>
+        <w:rPr/>
+        <w:instrText xml:space="preserve"> SEQ Figure \* ARABIC </w:instrText>
+      </w:r>
+      <w:r>
+        <w:rPr/>
+        <w:fldChar w:fldCharType="separate"/>
+      </w:r>
+      <w:r>
+        <w:rPr/>
+        <w:t>2</w:t>
+      </w:r>
+      <w:r>
+        <w:rPr/>
+        <w:fldChar w:fldCharType="end"/>
+      </w:r>
+      <w:r>
+        <w:rPr/>
         <w:t xml:space="preserve"> Binned Z-Score Visualization</w:t>
       </w:r>
     </w:p>
     <w:p>
       <w:pPr>
-        <w:spacing w:line="480" w:lineRule="auto"/>
-      </w:pPr>
-      <w:r>
-        <w:lastRenderedPageBreak/>
+        <w:pStyle w:val="Normal"/>
+        <w:spacing w:lineRule="auto" w:line="480"/>
+        <w:rPr/>
+      </w:pPr>
+      <w:r>
+        <w:rPr/>
         <w:tab/>
       </w:r>
     </w:p>
     <w:p>
       <w:pPr>
-        <w:spacing w:line="480" w:lineRule="auto"/>
-      </w:pPr>
-      <w:r>
+        <w:pStyle w:val="Normal"/>
+        <w:spacing w:lineRule="auto" w:line="480"/>
+        <w:rPr/>
+      </w:pPr>
+      <w:r>
+        <w:rPr/>
         <w:tab/>
-        <w:t>Figure 2 provides a visualization of the features after prepossessing, showing results for a Star both with and without an Exoplanet.</w:t>
-      </w:r>
-    </w:p>
-    <w:p>
-      <w:pPr>
-        <w:spacing w:line="480" w:lineRule="auto"/>
-      </w:pPr>
-      <w:r>
+        <w:t xml:space="preserve">Figure 2 provides a visualization of the features after prepossessing, showing results for a Star both with and without an Exoplanet. </w:t>
+      </w:r>
+      <w:r>
+        <w:rPr/>
+        <w:t>We can see evidence of a “dip” two standard deviations below the mean right at the start of the observation. (Shown in green)</w:t>
+      </w:r>
+    </w:p>
+    <w:p>
+      <w:pPr>
+        <w:pStyle w:val="Normal"/>
+        <w:spacing w:lineRule="auto" w:line="480"/>
+        <w:rPr/>
+      </w:pPr>
+      <w:r>
+        <w:rPr/>
         <w:tab/>
         <w:t>After testing the initial model with the transformed features, we fine-tuned the Support Vector Machine using Grid Search CV. We used the following parameters for our search:</w:t>
       </w:r>
@@ -532,11 +608,19 @@
       <w:tblPr>
         <w:tblStyle w:val="GridTable1Light"/>
         <w:tblW w:w="9350" w:type="dxa"/>
+        <w:jc w:val="left"/>
+        <w:tblInd w:w="0" w:type="dxa"/>
         <w:tblLayout w:type="fixed"/>
-        <w:tblLook w:val="04A0" w:firstRow="1" w:lastRow="0" w:firstColumn="1" w:lastColumn="0" w:noHBand="0" w:noVBand="1"/>
+        <w:tblCellMar>
+          <w:top w:w="0" w:type="dxa"/>
+          <w:left w:w="108" w:type="dxa"/>
+          <w:bottom w:w="0" w:type="dxa"/>
+          <w:right w:w="108" w:type="dxa"/>
+        </w:tblCellMar>
+        <w:tblLook w:val="04a0" w:noHBand="0" w:noVBand="1" w:firstColumn="1" w:lastRow="0" w:lastColumn="0" w:firstRow="1"/>
       </w:tblPr>
       <w:tblGrid>
-        <w:gridCol w:w="4676"/>
+        <w:gridCol w:w="4675"/>
         <w:gridCol w:w="4674"/>
       </w:tblGrid>
       <w:tr>
@@ -545,17 +629,39 @@
         </w:trPr>
         <w:tc>
           <w:tcPr>
+            <w:tcW w:w="4675" w:type="dxa"/>
             <w:cnfStyle w:val="001000000000" w:firstRow="0" w:lastRow="0" w:firstColumn="1" w:lastColumn="0" w:oddVBand="0" w:evenVBand="0" w:oddHBand="0" w:evenHBand="0" w:firstRowFirstColumn="0" w:firstRowLastColumn="0" w:lastRowFirstColumn="0" w:lastRowLastColumn="0"/>
-            <w:tcW w:w="4675" w:type="dxa"/>
             <w:tcBorders>
               <w:bottom w:val="single" w:sz="12" w:space="0" w:color="666666"/>
             </w:tcBorders>
           </w:tcPr>
           <w:p>
             <w:pPr>
-              <w:spacing w:line="480" w:lineRule="auto"/>
+              <w:pStyle w:val="Normal"/>
+              <w:widowControl/>
+              <w:suppressAutoHyphens w:val="true"/>
+              <w:spacing w:lineRule="auto" w:line="480" w:before="0" w:after="0"/>
+              <w:jc w:val="left"/>
+              <w:rPr>
+                <w:rFonts w:ascii="Times New Roman" w:hAnsi="Times New Roman" w:eastAsia="Times New Roman" w:cs="Times New Roman"/>
+                <w:b/>
+                <w:bCs/>
+                <w:kern w:val="0"/>
+                <w:sz w:val="24"/>
+                <w:szCs w:val="24"/>
+                <w:lang w:val="en-US" w:eastAsia="ja-JP" w:bidi="ar-SA"/>
+              </w:rPr>
             </w:pPr>
             <w:r>
+              <w:rPr>
+                <w:rFonts w:eastAsia="Times New Roman" w:cs="Times New Roman"/>
+                <w:b/>
+                <w:bCs/>
+                <w:kern w:val="0"/>
+                <w:sz w:val="24"/>
+                <w:szCs w:val="24"/>
+                <w:lang w:val="en-US" w:eastAsia="ja-JP" w:bidi="ar-SA"/>
+              </w:rPr>
               <w:t>Parameter</w:t>
             </w:r>
           </w:p>
@@ -569,26 +675,72 @@
           </w:tcPr>
           <w:p>
             <w:pPr>
-              <w:spacing w:line="480" w:lineRule="auto"/>
+              <w:pStyle w:val="Normal"/>
+              <w:widowControl/>
+              <w:suppressAutoHyphens w:val="true"/>
+              <w:spacing w:lineRule="auto" w:line="480" w:before="0" w:after="0"/>
+              <w:jc w:val="left"/>
               <w:cnfStyle w:val="100000000000" w:firstRow="1" w:lastRow="0" w:firstColumn="0" w:lastColumn="0" w:oddVBand="0" w:evenVBand="0" w:oddHBand="0" w:evenHBand="0" w:firstRowFirstColumn="0" w:firstRowLastColumn="0" w:lastRowFirstColumn="0" w:lastRowLastColumn="0"/>
+              <w:rPr>
+                <w:rFonts w:ascii="Times New Roman" w:hAnsi="Times New Roman" w:eastAsia="Times New Roman" w:cs="Times New Roman"/>
+                <w:b/>
+                <w:bCs/>
+                <w:kern w:val="0"/>
+                <w:sz w:val="24"/>
+                <w:szCs w:val="24"/>
+                <w:lang w:val="en-US" w:eastAsia="ja-JP" w:bidi="ar-SA"/>
+              </w:rPr>
             </w:pPr>
             <w:r>
+              <w:rPr>
+                <w:rFonts w:eastAsia="Times New Roman" w:cs="Times New Roman"/>
+                <w:b/>
+                <w:bCs/>
+                <w:kern w:val="0"/>
+                <w:sz w:val="24"/>
+                <w:szCs w:val="24"/>
+                <w:lang w:val="en-US" w:eastAsia="ja-JP" w:bidi="ar-SA"/>
+              </w:rPr>
               <w:t>Values</w:t>
             </w:r>
           </w:p>
         </w:tc>
       </w:tr>
       <w:tr>
+        <w:trPr/>
         <w:tc>
           <w:tcPr>
+            <w:tcW w:w="4675" w:type="dxa"/>
             <w:cnfStyle w:val="001000000000" w:firstRow="0" w:lastRow="0" w:firstColumn="1" w:lastColumn="0" w:oddVBand="0" w:evenVBand="0" w:oddHBand="0" w:evenHBand="0" w:firstRowFirstColumn="0" w:firstRowLastColumn="0" w:lastRowFirstColumn="0" w:lastRowLastColumn="0"/>
-            <w:tcW w:w="4675" w:type="dxa"/>
+            <w:tcBorders/>
           </w:tcPr>
           <w:p>
             <w:pPr>
-              <w:spacing w:line="480" w:lineRule="auto"/>
+              <w:pStyle w:val="Normal"/>
+              <w:widowControl/>
+              <w:suppressAutoHyphens w:val="true"/>
+              <w:spacing w:lineRule="auto" w:line="480" w:before="0" w:after="0"/>
+              <w:jc w:val="left"/>
+              <w:rPr>
+                <w:rFonts w:ascii="Times New Roman" w:hAnsi="Times New Roman" w:eastAsia="Times New Roman" w:cs="Times New Roman"/>
+                <w:b/>
+                <w:bCs/>
+                <w:kern w:val="0"/>
+                <w:sz w:val="24"/>
+                <w:szCs w:val="24"/>
+                <w:lang w:val="en-US" w:eastAsia="ja-JP" w:bidi="ar-SA"/>
+              </w:rPr>
             </w:pPr>
             <w:r>
+              <w:rPr>
+                <w:rFonts w:eastAsia="Times New Roman" w:cs="Times New Roman"/>
+                <w:b/>
+                <w:bCs/>
+                <w:kern w:val="0"/>
+                <w:sz w:val="24"/>
+                <w:szCs w:val="24"/>
+                <w:lang w:val="en-US" w:eastAsia="ja-JP" w:bidi="ar-SA"/>
+              </w:rPr>
               <w:t>C</w:t>
             </w:r>
           </w:p>
@@ -596,29 +748,72 @@
         <w:tc>
           <w:tcPr>
             <w:tcW w:w="4674" w:type="dxa"/>
+            <w:tcBorders/>
           </w:tcPr>
           <w:p>
             <w:pPr>
-              <w:spacing w:line="480" w:lineRule="auto"/>
+              <w:pStyle w:val="Normal"/>
+              <w:widowControl/>
+              <w:suppressAutoHyphens w:val="true"/>
+              <w:spacing w:lineRule="auto" w:line="480" w:before="0" w:after="0"/>
+              <w:jc w:val="left"/>
               <w:cnfStyle w:val="000000000000" w:firstRow="0" w:lastRow="0" w:firstColumn="0" w:lastColumn="0" w:oddVBand="0" w:evenVBand="0" w:oddHBand="0" w:evenHBand="0" w:firstRowFirstColumn="0" w:firstRowLastColumn="0" w:lastRowFirstColumn="0" w:lastRowLastColumn="0"/>
+              <w:rPr>
+                <w:rFonts w:ascii="Times New Roman" w:hAnsi="Times New Roman" w:eastAsia="Times New Roman" w:cs="Times New Roman"/>
+                <w:kern w:val="0"/>
+                <w:sz w:val="24"/>
+                <w:szCs w:val="24"/>
+                <w:lang w:val="en-US" w:eastAsia="ja-JP" w:bidi="ar-SA"/>
+              </w:rPr>
             </w:pPr>
             <w:r>
+              <w:rPr>
+                <w:rFonts w:eastAsia="Times New Roman" w:cs="Times New Roman"/>
+                <w:kern w:val="0"/>
+                <w:sz w:val="24"/>
+                <w:szCs w:val="24"/>
+                <w:lang w:val="en-US" w:eastAsia="ja-JP" w:bidi="ar-SA"/>
+              </w:rPr>
               <w:t>1.0, 0.1, 0.05, 0.005, 0.001, 0.0001</w:t>
             </w:r>
           </w:p>
         </w:tc>
       </w:tr>
       <w:tr>
+        <w:trPr/>
         <w:tc>
           <w:tcPr>
+            <w:tcW w:w="4675" w:type="dxa"/>
             <w:cnfStyle w:val="001000000000" w:firstRow="0" w:lastRow="0" w:firstColumn="1" w:lastColumn="0" w:oddVBand="0" w:evenVBand="0" w:oddHBand="0" w:evenHBand="0" w:firstRowFirstColumn="0" w:firstRowLastColumn="0" w:lastRowFirstColumn="0" w:lastRowLastColumn="0"/>
-            <w:tcW w:w="4675" w:type="dxa"/>
+            <w:tcBorders/>
           </w:tcPr>
           <w:p>
             <w:pPr>
-              <w:spacing w:line="480" w:lineRule="auto"/>
+              <w:pStyle w:val="Normal"/>
+              <w:widowControl/>
+              <w:suppressAutoHyphens w:val="true"/>
+              <w:spacing w:lineRule="auto" w:line="480" w:before="0" w:after="0"/>
+              <w:jc w:val="left"/>
+              <w:rPr>
+                <w:rFonts w:ascii="Times New Roman" w:hAnsi="Times New Roman" w:eastAsia="Times New Roman" w:cs="Times New Roman"/>
+                <w:b/>
+                <w:bCs/>
+                <w:kern w:val="0"/>
+                <w:sz w:val="24"/>
+                <w:szCs w:val="24"/>
+                <w:lang w:val="en-US" w:eastAsia="ja-JP" w:bidi="ar-SA"/>
+              </w:rPr>
             </w:pPr>
             <w:r>
+              <w:rPr>
+                <w:rFonts w:eastAsia="Times New Roman" w:cs="Times New Roman"/>
+                <w:b/>
+                <w:bCs/>
+                <w:kern w:val="0"/>
+                <w:sz w:val="24"/>
+                <w:szCs w:val="24"/>
+                <w:lang w:val="en-US" w:eastAsia="ja-JP" w:bidi="ar-SA"/>
+              </w:rPr>
               <w:t>gamma</w:t>
             </w:r>
           </w:p>
@@ -626,22 +821,33 @@
         <w:tc>
           <w:tcPr>
             <w:tcW w:w="4674" w:type="dxa"/>
+            <w:tcBorders/>
           </w:tcPr>
           <w:p>
             <w:pPr>
-              <w:spacing w:line="480" w:lineRule="auto"/>
+              <w:pStyle w:val="Normal"/>
+              <w:widowControl/>
+              <w:suppressAutoHyphens w:val="true"/>
+              <w:spacing w:lineRule="auto" w:line="480" w:before="0" w:after="0"/>
+              <w:jc w:val="left"/>
               <w:cnfStyle w:val="000000000000" w:firstRow="0" w:lastRow="0" w:firstColumn="0" w:lastColumn="0" w:oddVBand="0" w:evenVBand="0" w:oddHBand="0" w:evenHBand="0" w:firstRowFirstColumn="0" w:firstRowLastColumn="0" w:lastRowFirstColumn="0" w:lastRowLastColumn="0"/>
+              <w:rPr>
+                <w:rFonts w:ascii="Times New Roman" w:hAnsi="Times New Roman" w:eastAsia="Times New Roman" w:cs="Times New Roman"/>
+                <w:kern w:val="0"/>
+                <w:sz w:val="24"/>
+                <w:szCs w:val="24"/>
+                <w:lang w:val="en-US" w:eastAsia="ja-JP" w:bidi="ar-SA"/>
+              </w:rPr>
             </w:pPr>
             <w:r>
-              <w:t xml:space="preserve">1.0, 0.1, 0.01, 0.001, </w:t>
-            </w:r>
-            <w:proofErr w:type="gramStart"/>
-            <w:r>
-              <w:t>0.0001, ‘</w:t>
-            </w:r>
-            <w:proofErr w:type="gramEnd"/>
-            <w:r>
-              <w:t>scale’</w:t>
+              <w:rPr>
+                <w:rFonts w:eastAsia="Times New Roman" w:cs="Times New Roman"/>
+                <w:kern w:val="0"/>
+                <w:sz w:val="24"/>
+                <w:szCs w:val="24"/>
+                <w:lang w:val="en-US" w:eastAsia="ja-JP" w:bidi="ar-SA"/>
+              </w:rPr>
+              <w:t>1.0, 0.1, 0.01, 0.001, 0.0001, ‘scale’</w:t>
             </w:r>
           </w:p>
         </w:tc>
@@ -649,102 +855,103 @@
     </w:tbl>
     <w:p>
       <w:pPr>
-        <w:spacing w:line="480" w:lineRule="auto"/>
-      </w:pPr>
-    </w:p>
-    <w:p>
-      <w:pPr>
-        <w:spacing w:line="480" w:lineRule="auto"/>
-      </w:pPr>
-      <w:r>
+        <w:pStyle w:val="Normal"/>
+        <w:spacing w:lineRule="auto" w:line="480"/>
+        <w:rPr/>
+      </w:pPr>
+      <w:r>
+        <w:rPr/>
+      </w:r>
+    </w:p>
+    <w:p>
+      <w:pPr>
+        <w:pStyle w:val="Normal"/>
+        <w:spacing w:lineRule="auto" w:line="480"/>
+        <w:rPr/>
+      </w:pPr>
+      <w:r>
+        <w:rPr/>
         <w:tab/>
         <w:t>To account for the extreme class imbalance seen in this dataset, we trained</w:t>
-      </w:r>
-      <w:r>
         <w:tab/>
+        <w:t xml:space="preserve"> GridSearchCV</w:t>
+      </w:r>
+      <w:r>
+        <w:rPr>
+          <w:rStyle w:val="FootnoteReference"/>
+        </w:rPr>
+        <w:footnoteReference w:id="2"/>
+      </w:r>
+      <w:r>
+        <w:rPr/>
+        <w:t xml:space="preserve"> using a StratifiedKFold</w:t>
+      </w:r>
+      <w:r>
+        <w:rPr>
+          <w:rStyle w:val="FootnoteReference"/>
+        </w:rPr>
+        <w:footnoteReference w:id="3"/>
+      </w:r>
+      <w:r>
+        <w:rPr/>
+        <w:t xml:space="preserve"> strategy, which ensured each fold maintains the same class distribution as the original dataset. Otherwise, it was possible that some folds might not have any positive examples in them.</w:t>
+      </w:r>
+    </w:p>
+    <w:p>
+      <w:pPr>
+        <w:pStyle w:val="Normal"/>
+        <w:spacing w:lineRule="auto" w:line="480"/>
+        <w:rPr/>
+      </w:pPr>
+      <w:r>
+        <w:rPr/>
+        <w:tab/>
+        <w:t>We used a rbf kernel and precision score as the evaluation metric. &lt;</w:t>
+      </w:r>
+      <w:r>
+        <w:rPr/>
+        <w:t>Why were these appropriate choices?&gt;</w:t>
+      </w:r>
+    </w:p>
+    <w:p>
+      <w:pPr>
+        <w:pStyle w:val="Normal"/>
+        <w:spacing w:lineRule="auto" w:line="480"/>
+        <w:rPr/>
+      </w:pPr>
+      <w:r>
+        <w:rPr/>
+      </w:r>
+    </w:p>
+    <w:p>
+      <w:pPr>
+        <w:pStyle w:val="Normal"/>
+        <w:spacing w:lineRule="auto" w:line="480"/>
+        <w:rPr/>
+      </w:pPr>
+      <w:r>
+        <w:rPr/>
         <w:t xml:space="preserve"> </w:t>
       </w:r>
-      <w:proofErr w:type="spellStart"/>
-      <w:r>
-        <w:t>GridSearchCV</w:t>
-      </w:r>
-      <w:proofErr w:type="spellEnd"/>
-      <w:r>
-        <w:rPr>
-          <w:rStyle w:val="FootnoteReference"/>
-        </w:rPr>
-        <w:footnoteReference w:id="1"/>
-      </w:r>
-      <w:r>
-        <w:t xml:space="preserve"> </w:t>
-      </w:r>
-      <w:r>
-        <w:t xml:space="preserve">using a </w:t>
-      </w:r>
-      <w:proofErr w:type="spellStart"/>
-      <w:r>
-        <w:t>StratifiedKFold</w:t>
-      </w:r>
-      <w:proofErr w:type="spellEnd"/>
-      <w:r>
-        <w:rPr>
-          <w:rStyle w:val="FootnoteReference"/>
-        </w:rPr>
-        <w:footnoteReference w:id="2"/>
-      </w:r>
-      <w:r>
-        <w:t xml:space="preserve"> strategy, which ensured each fold maintains the same class distribution as the original dataset. Otherwise, it was possible that some folds might not have any positive examples in them.</w:t>
-      </w:r>
-    </w:p>
-    <w:p>
-      <w:pPr>
-        <w:spacing w:line="480" w:lineRule="auto"/>
-      </w:pPr>
-      <w:r>
-        <w:tab/>
-        <w:t xml:space="preserve">We used </w:t>
-      </w:r>
-      <w:r>
-        <w:t>a</w:t>
-      </w:r>
-      <w:r>
-        <w:t xml:space="preserve"> </w:t>
-      </w:r>
-      <w:proofErr w:type="spellStart"/>
-      <w:r>
-        <w:t>rbf</w:t>
-      </w:r>
-      <w:proofErr w:type="spellEnd"/>
-      <w:r>
-        <w:t xml:space="preserve"> kernel and precision score as the evaluation metric. After Grid Search </w:t>
-      </w:r>
-      <w:r>
-        <w:t>was completed</w:t>
-      </w:r>
-      <w:r>
-        <w:t xml:space="preserve">, the </w:t>
-      </w:r>
-      <w:r>
-        <w:t>best-found</w:t>
-      </w:r>
-      <w:r>
-        <w:t xml:space="preserve"> parameters </w:t>
-      </w:r>
-      <w:r>
-        <w:t>were</w:t>
-      </w:r>
-      <w:r>
-        <w:t xml:space="preserve"> C: 0.1, gamma: 0.01. These parameters were used to generate the results discussed in the next section.</w:t>
-      </w:r>
-    </w:p>
-    <w:p>
-      <w:pPr>
-        <w:spacing w:line="480" w:lineRule="auto"/>
-      </w:pPr>
-    </w:p>
-    <w:p>
-      <w:pPr>
-        <w:spacing w:line="480" w:lineRule="auto"/>
+      <w:r>
+        <w:rPr/>
+        <w:t>After Grid Search was completed, the best-found parameters were C: 1, gamma: 0.01. These parameters were used to generate the results discussed in the next section.</w:t>
+      </w:r>
+    </w:p>
+    <w:p>
+      <w:pPr>
+        <w:pStyle w:val="Normal"/>
+        <w:spacing w:lineRule="auto" w:line="480"/>
+        <w:rPr/>
+      </w:pPr>
+      <w:r>
+        <w:rPr/>
+      </w:r>
+    </w:p>
+    <w:p>
+      <w:pPr>
+        <w:pStyle w:val="Normal"/>
+        <w:spacing w:lineRule="auto" w:line="480"/>
         <w:jc w:val="center"/>
         <w:rPr>
           <w:b/>
@@ -759,56 +966,69 @@
     </w:p>
     <w:p>
       <w:pPr>
-        <w:spacing w:line="480" w:lineRule="auto"/>
+        <w:pStyle w:val="Normal"/>
+        <w:spacing w:lineRule="auto" w:line="480"/>
         <w:ind w:firstLine="720"/>
-      </w:pPr>
-      <w:r>
-        <w:t>&lt;BLARG&gt;</w:t>
-      </w:r>
-    </w:p>
-    <w:p>
-      <w:pPr>
-        <w:spacing w:line="480" w:lineRule="auto"/>
+        <w:rPr/>
+      </w:pPr>
+      <w:r>
+        <w:rPr/>
+        <w:t>As seen in the final confusion matrix (figure 3) the system correctly identified all but two of the planets in the “No Planet” category of the test data. For stars with a high-probability of having an Exoplanet, the system correctly identified 4 out of 5 data points.</w:t>
+      </w:r>
+    </w:p>
+    <w:p>
+      <w:pPr>
+        <w:pStyle w:val="Normal"/>
+        <w:spacing w:lineRule="auto" w:line="480"/>
         <w:ind w:firstLine="720"/>
-      </w:pPr>
-      <w:r>
-        <w:t xml:space="preserve">Given the extreme imbalance of the dataset, the standard metrics, F1 Score, Accuracy, Precision, all appeared somewhat unreliable. For </w:t>
-      </w:r>
-      <w:r>
-        <w:t>example,</w:t>
-      </w:r>
-      <w:r>
-        <w:t xml:space="preserve"> it was possible to obtain a much </w:t>
-      </w:r>
-      <w:r>
-        <w:lastRenderedPageBreak/>
-        <w:t>higher F1 score by simply declaring all stars as having no planets. The same situation for accuracy and recall.</w:t>
-      </w:r>
-    </w:p>
-    <w:p>
-      <w:pPr>
-        <w:spacing w:line="480" w:lineRule="auto"/>
+        <w:rPr/>
+      </w:pPr>
+      <w:r>
+        <w:rPr/>
+        <w:t>Given the extreme imbalance of the dataset, the standard metrics, F1 Score, Accuracy, Precision, all appeared somewhat unreliable. For example, it was possible to obtain a much higher F1 score by simply declaring all stars as having no planets. The same situation for accuracy and recall.</w:t>
+      </w:r>
+    </w:p>
+    <w:p>
+      <w:pPr>
+        <w:pStyle w:val="Normal"/>
+        <w:spacing w:lineRule="auto" w:line="480"/>
         <w:ind w:firstLine="720"/>
-      </w:pPr>
-      <w:r>
+        <w:rPr/>
+      </w:pPr>
+      <w:r>
+        <w:rPr/>
         <w:t>The table below summarizes the metrics collected from the final model:</w:t>
       </w:r>
     </w:p>
     <w:p>
       <w:pPr>
-        <w:spacing w:line="480" w:lineRule="auto"/>
+        <w:pStyle w:val="Normal"/>
+        <w:spacing w:lineRule="auto" w:line="480"/>
         <w:ind w:firstLine="720"/>
-      </w:pPr>
+        <w:rPr/>
+      </w:pPr>
+      <w:r>
+        <w:rPr/>
+      </w:r>
     </w:p>
     <w:tbl>
       <w:tblPr>
         <w:tblStyle w:val="GridTable1Light"/>
-        <w:tblW w:w="0" w:type="auto"/>
-        <w:tblLook w:val="04A0" w:firstRow="1" w:lastRow="0" w:firstColumn="1" w:lastColumn="0" w:noHBand="0" w:noVBand="1"/>
+        <w:tblW w:w="9576" w:type="dxa"/>
+        <w:jc w:val="left"/>
+        <w:tblInd w:w="0" w:type="dxa"/>
+        <w:tblLayout w:type="fixed"/>
+        <w:tblCellMar>
+          <w:top w:w="0" w:type="dxa"/>
+          <w:left w:w="108" w:type="dxa"/>
+          <w:bottom w:w="0" w:type="dxa"/>
+          <w:right w:w="108" w:type="dxa"/>
+        </w:tblCellMar>
+        <w:tblLook w:val="04a0" w:noHBand="0" w:noVBand="1" w:firstColumn="1" w:lastRow="0" w:lastColumn="0" w:firstRow="1"/>
       </w:tblPr>
       <w:tblGrid>
         <w:gridCol w:w="4788"/>
-        <w:gridCol w:w="4788"/>
+        <w:gridCol w:w="4787"/>
       </w:tblGrid>
       <w:tr>
         <w:trPr>
@@ -816,157 +1036,370 @@
         </w:trPr>
         <w:tc>
           <w:tcPr>
+            <w:tcW w:w="4788" w:type="dxa"/>
             <w:cnfStyle w:val="001000000000" w:firstRow="0" w:lastRow="0" w:firstColumn="1" w:lastColumn="0" w:oddVBand="0" w:evenVBand="0" w:oddHBand="0" w:evenHBand="0" w:firstRowFirstColumn="0" w:firstRowLastColumn="0" w:lastRowFirstColumn="0" w:lastRowLastColumn="0"/>
-            <w:tcW w:w="4788" w:type="dxa"/>
+            <w:tcBorders>
+              <w:bottom w:val="single" w:sz="12" w:space="0" w:color="000000"/>
+            </w:tcBorders>
           </w:tcPr>
           <w:p>
             <w:pPr>
-              <w:spacing w:line="480" w:lineRule="auto"/>
+              <w:pStyle w:val="Normal"/>
+              <w:widowControl/>
+              <w:suppressAutoHyphens w:val="true"/>
+              <w:spacing w:lineRule="auto" w:line="480" w:before="0" w:after="0"/>
+              <w:jc w:val="left"/>
+              <w:rPr>
+                <w:rFonts w:ascii="Times New Roman" w:hAnsi="Times New Roman" w:eastAsia="Times New Roman" w:cs="Times New Roman"/>
+                <w:b/>
+                <w:bCs/>
+                <w:kern w:val="0"/>
+                <w:sz w:val="24"/>
+                <w:szCs w:val="24"/>
+                <w:lang w:val="en-US" w:eastAsia="ja-JP" w:bidi="ar-SA"/>
+              </w:rPr>
             </w:pPr>
             <w:r>
+              <w:rPr>
+                <w:rFonts w:eastAsia="Times New Roman" w:cs="Times New Roman"/>
+                <w:b/>
+                <w:bCs/>
+                <w:kern w:val="0"/>
+                <w:sz w:val="24"/>
+                <w:szCs w:val="24"/>
+                <w:lang w:val="en-US" w:eastAsia="ja-JP" w:bidi="ar-SA"/>
+              </w:rPr>
               <w:t>Metric</w:t>
             </w:r>
           </w:p>
         </w:tc>
         <w:tc>
           <w:tcPr>
-            <w:tcW w:w="4788" w:type="dxa"/>
+            <w:tcW w:w="4787" w:type="dxa"/>
+            <w:tcBorders>
+              <w:bottom w:val="single" w:sz="12" w:space="0" w:color="000000"/>
+            </w:tcBorders>
           </w:tcPr>
           <w:p>
             <w:pPr>
-              <w:spacing w:line="480" w:lineRule="auto"/>
+              <w:pStyle w:val="Normal"/>
+              <w:widowControl/>
+              <w:suppressAutoHyphens w:val="true"/>
+              <w:spacing w:lineRule="auto" w:line="480" w:before="0" w:after="0"/>
+              <w:jc w:val="left"/>
               <w:cnfStyle w:val="100000000000" w:firstRow="1" w:lastRow="0" w:firstColumn="0" w:lastColumn="0" w:oddVBand="0" w:evenVBand="0" w:oddHBand="0" w:evenHBand="0" w:firstRowFirstColumn="0" w:firstRowLastColumn="0" w:lastRowFirstColumn="0" w:lastRowLastColumn="0"/>
+              <w:rPr>
+                <w:rFonts w:ascii="Times New Roman" w:hAnsi="Times New Roman" w:eastAsia="Times New Roman" w:cs="Times New Roman"/>
+                <w:b/>
+                <w:bCs/>
+                <w:kern w:val="0"/>
+                <w:sz w:val="24"/>
+                <w:szCs w:val="24"/>
+                <w:lang w:val="en-US" w:eastAsia="ja-JP" w:bidi="ar-SA"/>
+              </w:rPr>
             </w:pPr>
             <w:r>
+              <w:rPr>
+                <w:rFonts w:eastAsia="Times New Roman" w:cs="Times New Roman"/>
+                <w:b/>
+                <w:bCs/>
+                <w:kern w:val="0"/>
+                <w:sz w:val="24"/>
+                <w:szCs w:val="24"/>
+                <w:lang w:val="en-US" w:eastAsia="ja-JP" w:bidi="ar-SA"/>
+              </w:rPr>
               <w:t>Score</w:t>
             </w:r>
           </w:p>
         </w:tc>
       </w:tr>
       <w:tr>
+        <w:trPr/>
         <w:tc>
           <w:tcPr>
+            <w:tcW w:w="4788" w:type="dxa"/>
             <w:cnfStyle w:val="001000000000" w:firstRow="0" w:lastRow="0" w:firstColumn="1" w:lastColumn="0" w:oddVBand="0" w:evenVBand="0" w:oddHBand="0" w:evenHBand="0" w:firstRowFirstColumn="0" w:firstRowLastColumn="0" w:lastRowFirstColumn="0" w:lastRowLastColumn="0"/>
-            <w:tcW w:w="4788" w:type="dxa"/>
+            <w:tcBorders/>
           </w:tcPr>
           <w:p>
             <w:pPr>
-              <w:spacing w:line="480" w:lineRule="auto"/>
+              <w:pStyle w:val="Normal"/>
+              <w:widowControl/>
+              <w:suppressAutoHyphens w:val="true"/>
+              <w:spacing w:lineRule="auto" w:line="480" w:before="0" w:after="0"/>
+              <w:jc w:val="left"/>
+              <w:rPr>
+                <w:rFonts w:ascii="Times New Roman" w:hAnsi="Times New Roman" w:eastAsia="Times New Roman" w:cs="Times New Roman"/>
+                <w:b/>
+                <w:bCs/>
+                <w:kern w:val="0"/>
+                <w:sz w:val="24"/>
+                <w:szCs w:val="24"/>
+                <w:lang w:val="en-US" w:eastAsia="ja-JP" w:bidi="ar-SA"/>
+              </w:rPr>
             </w:pPr>
             <w:r>
+              <w:rPr>
+                <w:rFonts w:eastAsia="Times New Roman" w:cs="Times New Roman"/>
+                <w:b/>
+                <w:bCs/>
+                <w:kern w:val="0"/>
+                <w:sz w:val="24"/>
+                <w:szCs w:val="24"/>
+                <w:lang w:val="en-US" w:eastAsia="ja-JP" w:bidi="ar-SA"/>
+              </w:rPr>
               <w:t>F1 Score</w:t>
             </w:r>
           </w:p>
         </w:tc>
         <w:tc>
           <w:tcPr>
-            <w:tcW w:w="4788" w:type="dxa"/>
+            <w:tcW w:w="4787" w:type="dxa"/>
+            <w:tcBorders/>
           </w:tcPr>
           <w:p>
             <w:pPr>
-              <w:spacing w:line="480" w:lineRule="auto"/>
+              <w:pStyle w:val="Normal"/>
+              <w:widowControl/>
+              <w:suppressAutoHyphens w:val="true"/>
+              <w:spacing w:lineRule="auto" w:line="480" w:before="0" w:after="0"/>
+              <w:jc w:val="left"/>
               <w:cnfStyle w:val="000000000000" w:firstRow="0" w:lastRow="0" w:firstColumn="0" w:lastColumn="0" w:oddVBand="0" w:evenVBand="0" w:oddHBand="0" w:evenHBand="0" w:firstRowFirstColumn="0" w:firstRowLastColumn="0" w:lastRowFirstColumn="0" w:lastRowLastColumn="0"/>
+              <w:rPr>
+                <w:rFonts w:ascii="Times New Roman" w:hAnsi="Times New Roman" w:eastAsia="Times New Roman" w:cs="Times New Roman"/>
+                <w:kern w:val="0"/>
+                <w:sz w:val="24"/>
+                <w:szCs w:val="24"/>
+                <w:lang w:val="en-US" w:eastAsia="ja-JP" w:bidi="ar-SA"/>
+              </w:rPr>
             </w:pPr>
             <w:r>
-              <w:t>0.</w:t>
-            </w:r>
-            <w:r>
-              <w:t>72</w:t>
+              <w:rPr>
+                <w:rFonts w:eastAsia="Times New Roman" w:cs="Times New Roman"/>
+                <w:kern w:val="0"/>
+                <w:sz w:val="24"/>
+                <w:szCs w:val="24"/>
+                <w:lang w:val="en-US" w:eastAsia="ja-JP" w:bidi="ar-SA"/>
+              </w:rPr>
+              <w:t>0.72</w:t>
             </w:r>
           </w:p>
         </w:tc>
       </w:tr>
       <w:tr>
+        <w:trPr/>
         <w:tc>
           <w:tcPr>
+            <w:tcW w:w="4788" w:type="dxa"/>
             <w:cnfStyle w:val="001000000000" w:firstRow="0" w:lastRow="0" w:firstColumn="1" w:lastColumn="0" w:oddVBand="0" w:evenVBand="0" w:oddHBand="0" w:evenHBand="0" w:firstRowFirstColumn="0" w:firstRowLastColumn="0" w:lastRowFirstColumn="0" w:lastRowLastColumn="0"/>
-            <w:tcW w:w="4788" w:type="dxa"/>
+            <w:tcBorders/>
           </w:tcPr>
           <w:p>
             <w:pPr>
-              <w:spacing w:line="480" w:lineRule="auto"/>
+              <w:pStyle w:val="Normal"/>
+              <w:widowControl/>
+              <w:suppressAutoHyphens w:val="true"/>
+              <w:spacing w:lineRule="auto" w:line="480" w:before="0" w:after="0"/>
+              <w:jc w:val="left"/>
+              <w:rPr>
+                <w:rFonts w:ascii="Times New Roman" w:hAnsi="Times New Roman" w:eastAsia="Times New Roman" w:cs="Times New Roman"/>
+                <w:b/>
+                <w:bCs/>
+                <w:kern w:val="0"/>
+                <w:sz w:val="24"/>
+                <w:szCs w:val="24"/>
+                <w:lang w:val="en-US" w:eastAsia="ja-JP" w:bidi="ar-SA"/>
+              </w:rPr>
             </w:pPr>
             <w:r>
+              <w:rPr>
+                <w:rFonts w:eastAsia="Times New Roman" w:cs="Times New Roman"/>
+                <w:b/>
+                <w:bCs/>
+                <w:kern w:val="0"/>
+                <w:sz w:val="24"/>
+                <w:szCs w:val="24"/>
+                <w:lang w:val="en-US" w:eastAsia="ja-JP" w:bidi="ar-SA"/>
+              </w:rPr>
               <w:t>Accuracy</w:t>
             </w:r>
           </w:p>
         </w:tc>
         <w:tc>
           <w:tcPr>
-            <w:tcW w:w="4788" w:type="dxa"/>
+            <w:tcW w:w="4787" w:type="dxa"/>
+            <w:tcBorders/>
           </w:tcPr>
           <w:p>
             <w:pPr>
-              <w:spacing w:line="480" w:lineRule="auto"/>
+              <w:pStyle w:val="Normal"/>
+              <w:widowControl/>
+              <w:suppressAutoHyphens w:val="true"/>
+              <w:spacing w:lineRule="auto" w:line="480" w:before="0" w:after="0"/>
+              <w:jc w:val="left"/>
               <w:cnfStyle w:val="000000000000" w:firstRow="0" w:lastRow="0" w:firstColumn="0" w:lastColumn="0" w:oddVBand="0" w:evenVBand="0" w:oddHBand="0" w:evenHBand="0" w:firstRowFirstColumn="0" w:firstRowLastColumn="0" w:lastRowFirstColumn="0" w:lastRowLastColumn="0"/>
+              <w:rPr>
+                <w:rFonts w:ascii="Times New Roman" w:hAnsi="Times New Roman" w:eastAsia="Times New Roman" w:cs="Times New Roman"/>
+                <w:kern w:val="0"/>
+                <w:sz w:val="24"/>
+                <w:szCs w:val="24"/>
+                <w:lang w:val="en-US" w:eastAsia="ja-JP" w:bidi="ar-SA"/>
+              </w:rPr>
             </w:pPr>
             <w:r>
-              <w:t>0.9</w:t>
-            </w:r>
-            <w:r>
-              <w:t>94</w:t>
+              <w:rPr>
+                <w:rFonts w:eastAsia="Times New Roman" w:cs="Times New Roman"/>
+                <w:kern w:val="0"/>
+                <w:sz w:val="24"/>
+                <w:szCs w:val="24"/>
+                <w:lang w:val="en-US" w:eastAsia="ja-JP" w:bidi="ar-SA"/>
+              </w:rPr>
+              <w:t>0.994</w:t>
             </w:r>
           </w:p>
         </w:tc>
       </w:tr>
       <w:tr>
+        <w:trPr/>
         <w:tc>
           <w:tcPr>
+            <w:tcW w:w="4788" w:type="dxa"/>
             <w:cnfStyle w:val="001000000000" w:firstRow="0" w:lastRow="0" w:firstColumn="1" w:lastColumn="0" w:oddVBand="0" w:evenVBand="0" w:oddHBand="0" w:evenHBand="0" w:firstRowFirstColumn="0" w:firstRowLastColumn="0" w:lastRowFirstColumn="0" w:lastRowLastColumn="0"/>
-            <w:tcW w:w="4788" w:type="dxa"/>
+            <w:tcBorders/>
           </w:tcPr>
           <w:p>
             <w:pPr>
-              <w:spacing w:line="480" w:lineRule="auto"/>
+              <w:pStyle w:val="Normal"/>
+              <w:widowControl/>
+              <w:suppressAutoHyphens w:val="true"/>
+              <w:spacing w:lineRule="auto" w:line="480" w:before="0" w:after="0"/>
+              <w:jc w:val="left"/>
+              <w:rPr>
+                <w:rFonts w:ascii="Times New Roman" w:hAnsi="Times New Roman" w:eastAsia="Times New Roman" w:cs="Times New Roman"/>
+                <w:b/>
+                <w:bCs/>
+                <w:kern w:val="0"/>
+                <w:sz w:val="24"/>
+                <w:szCs w:val="24"/>
+                <w:lang w:val="en-US" w:eastAsia="ja-JP" w:bidi="ar-SA"/>
+              </w:rPr>
             </w:pPr>
             <w:r>
+              <w:rPr>
+                <w:rFonts w:eastAsia="Times New Roman" w:cs="Times New Roman"/>
+                <w:b/>
+                <w:bCs/>
+                <w:kern w:val="0"/>
+                <w:sz w:val="24"/>
+                <w:szCs w:val="24"/>
+                <w:lang w:val="en-US" w:eastAsia="ja-JP" w:bidi="ar-SA"/>
+              </w:rPr>
               <w:t>Precision</w:t>
             </w:r>
           </w:p>
         </w:tc>
         <w:tc>
           <w:tcPr>
-            <w:tcW w:w="4788" w:type="dxa"/>
+            <w:tcW w:w="4787" w:type="dxa"/>
+            <w:tcBorders/>
           </w:tcPr>
           <w:p>
             <w:pPr>
-              <w:spacing w:line="480" w:lineRule="auto"/>
+              <w:pStyle w:val="Normal"/>
+              <w:widowControl/>
+              <w:suppressAutoHyphens w:val="true"/>
+              <w:spacing w:lineRule="auto" w:line="480" w:before="0" w:after="0"/>
+              <w:jc w:val="left"/>
               <w:cnfStyle w:val="000000000000" w:firstRow="0" w:lastRow="0" w:firstColumn="0" w:lastColumn="0" w:oddVBand="0" w:evenVBand="0" w:oddHBand="0" w:evenHBand="0" w:firstRowFirstColumn="0" w:firstRowLastColumn="0" w:lastRowFirstColumn="0" w:lastRowLastColumn="0"/>
+              <w:rPr>
+                <w:rFonts w:ascii="Times New Roman" w:hAnsi="Times New Roman" w:eastAsia="Times New Roman" w:cs="Times New Roman"/>
+                <w:kern w:val="0"/>
+                <w:sz w:val="24"/>
+                <w:szCs w:val="24"/>
+                <w:lang w:val="en-US" w:eastAsia="ja-JP" w:bidi="ar-SA"/>
+              </w:rPr>
             </w:pPr>
             <w:r>
-              <w:t>0.</w:t>
-            </w:r>
-            <w:r>
-              <w:t>67</w:t>
+              <w:rPr>
+                <w:rFonts w:eastAsia="Times New Roman" w:cs="Times New Roman"/>
+                <w:kern w:val="0"/>
+                <w:sz w:val="24"/>
+                <w:szCs w:val="24"/>
+                <w:lang w:val="en-US" w:eastAsia="ja-JP" w:bidi="ar-SA"/>
+              </w:rPr>
+              <w:t>0.67</w:t>
             </w:r>
           </w:p>
         </w:tc>
       </w:tr>
       <w:tr>
+        <w:trPr/>
         <w:tc>
           <w:tcPr>
+            <w:tcW w:w="4788" w:type="dxa"/>
             <w:cnfStyle w:val="001000000000" w:firstRow="0" w:lastRow="0" w:firstColumn="1" w:lastColumn="0" w:oddVBand="0" w:evenVBand="0" w:oddHBand="0" w:evenHBand="0" w:firstRowFirstColumn="0" w:firstRowLastColumn="0" w:lastRowFirstColumn="0" w:lastRowLastColumn="0"/>
-            <w:tcW w:w="4788" w:type="dxa"/>
+            <w:tcBorders/>
           </w:tcPr>
           <w:p>
             <w:pPr>
-              <w:spacing w:line="480" w:lineRule="auto"/>
+              <w:pStyle w:val="Normal"/>
+              <w:widowControl/>
+              <w:suppressAutoHyphens w:val="true"/>
+              <w:spacing w:lineRule="auto" w:line="480" w:before="0" w:after="0"/>
+              <w:jc w:val="left"/>
+              <w:rPr>
+                <w:rFonts w:ascii="Times New Roman" w:hAnsi="Times New Roman" w:eastAsia="Times New Roman" w:cs="Times New Roman"/>
+                <w:b/>
+                <w:bCs/>
+                <w:kern w:val="0"/>
+                <w:sz w:val="24"/>
+                <w:szCs w:val="24"/>
+                <w:lang w:val="en-US" w:eastAsia="ja-JP" w:bidi="ar-SA"/>
+              </w:rPr>
             </w:pPr>
             <w:r>
+              <w:rPr>
+                <w:rFonts w:eastAsia="Times New Roman" w:cs="Times New Roman"/>
+                <w:b/>
+                <w:bCs/>
+                <w:kern w:val="0"/>
+                <w:sz w:val="24"/>
+                <w:szCs w:val="24"/>
+                <w:lang w:val="en-US" w:eastAsia="ja-JP" w:bidi="ar-SA"/>
+              </w:rPr>
               <w:t>Recall</w:t>
             </w:r>
           </w:p>
         </w:tc>
         <w:tc>
           <w:tcPr>
-            <w:tcW w:w="4788" w:type="dxa"/>
+            <w:tcW w:w="4787" w:type="dxa"/>
+            <w:tcBorders/>
           </w:tcPr>
           <w:p>
             <w:pPr>
-              <w:spacing w:line="480" w:lineRule="auto"/>
+              <w:pStyle w:val="Normal"/>
+              <w:widowControl/>
+              <w:suppressAutoHyphens w:val="true"/>
+              <w:spacing w:lineRule="auto" w:line="480" w:before="0" w:after="0"/>
+              <w:jc w:val="left"/>
               <w:cnfStyle w:val="000000000000" w:firstRow="0" w:lastRow="0" w:firstColumn="0" w:lastColumn="0" w:oddVBand="0" w:evenVBand="0" w:oddHBand="0" w:evenHBand="0" w:firstRowFirstColumn="0" w:firstRowLastColumn="0" w:lastRowFirstColumn="0" w:lastRowLastColumn="0"/>
+              <w:rPr>
+                <w:rFonts w:ascii="Times New Roman" w:hAnsi="Times New Roman" w:eastAsia="Times New Roman" w:cs="Times New Roman"/>
+                <w:kern w:val="0"/>
+                <w:sz w:val="24"/>
+                <w:szCs w:val="24"/>
+                <w:lang w:val="en-US" w:eastAsia="ja-JP" w:bidi="ar-SA"/>
+              </w:rPr>
             </w:pPr>
             <w:r>
+              <w:rPr>
+                <w:rFonts w:eastAsia="Times New Roman" w:cs="Times New Roman"/>
+                <w:kern w:val="0"/>
+                <w:sz w:val="24"/>
+                <w:szCs w:val="24"/>
+                <w:lang w:val="en-US" w:eastAsia="ja-JP" w:bidi="ar-SA"/>
+              </w:rPr>
               <w:t>0.8</w:t>
             </w:r>
           </w:p>
@@ -975,38 +1408,53 @@
     </w:tbl>
     <w:p>
       <w:pPr>
-        <w:spacing w:line="480" w:lineRule="auto"/>
+        <w:pStyle w:val="Normal"/>
+        <w:spacing w:lineRule="auto" w:line="480"/>
         <w:ind w:firstLine="720"/>
-      </w:pPr>
-    </w:p>
-    <w:p>
-      <w:pPr>
-        <w:spacing w:line="480" w:lineRule="auto"/>
+        <w:rPr/>
+      </w:pPr>
+      <w:r>
+        <w:rPr/>
+      </w:r>
+    </w:p>
+    <w:p>
+      <w:pPr>
+        <w:pStyle w:val="Normal"/>
+        <w:spacing w:lineRule="auto" w:line="480"/>
         <w:ind w:firstLine="720"/>
-      </w:pPr>
-    </w:p>
-    <w:p>
-      <w:pPr>
-        <w:keepNext/>
-        <w:spacing w:line="480" w:lineRule="auto"/>
+        <w:rPr/>
+      </w:pPr>
+      <w:r>
+        <w:rPr/>
+      </w:r>
+    </w:p>
+    <w:p>
+      <w:pPr>
+        <w:pStyle w:val="Normal"/>
+        <w:keepNext w:val="true"/>
+        <w:spacing w:lineRule="auto" w:line="480"/>
         <w:ind w:firstLine="720"/>
-      </w:pPr>
-    </w:p>
-    <w:p>
-      <w:pPr>
-        <w:keepNext/>
-        <w:spacing w:line="480" w:lineRule="auto"/>
+        <w:rPr/>
+      </w:pPr>
+      <w:r>
+        <w:rPr/>
+      </w:r>
+    </w:p>
+    <w:p>
+      <w:pPr>
+        <w:pStyle w:val="Normal"/>
+        <w:keepNext w:val="true"/>
+        <w:spacing w:lineRule="auto" w:line="480"/>
         <w:ind w:firstLine="720"/>
-      </w:pPr>
-      <w:r>
-        <w:rPr>
-          <w:noProof/>
-        </w:rPr>
+        <w:rPr/>
+      </w:pPr>
+      <w:r>
+        <w:rPr/>
         <w:drawing>
-          <wp:inline distT="0" distB="0" distL="0" distR="0" wp14:anchorId="45623F97" wp14:editId="151D6E6C">
+          <wp:inline distT="0" distB="0" distL="0" distR="0">
             <wp:extent cx="5941060" cy="2226945"/>
             <wp:effectExtent l="0" t="0" r="0" b="0"/>
-            <wp:docPr id="1490759169" name="Picture 1"/>
+            <wp:docPr id="3" name="Picture 1" descr=""/>
             <wp:cNvGraphicFramePr>
               <a:graphicFrameLocks xmlns:a="http://schemas.openxmlformats.org/drawingml/2006/main" noChangeAspect="1"/>
             </wp:cNvGraphicFramePr>
@@ -1014,20 +1462,13 @@
               <a:graphicData uri="http://schemas.openxmlformats.org/drawingml/2006/picture">
                 <pic:pic xmlns:pic="http://schemas.openxmlformats.org/drawingml/2006/picture">
                   <pic:nvPicPr>
-                    <pic:cNvPr id="0" name="Picture 1"/>
+                    <pic:cNvPr id="3" name="Picture 1" descr=""/>
                     <pic:cNvPicPr>
                       <a:picLocks noChangeAspect="1" noChangeArrowheads="1"/>
                     </pic:cNvPicPr>
                   </pic:nvPicPr>
                   <pic:blipFill>
-                    <a:blip r:embed="rId10" cstate="print">
-                      <a:extLst>
-                        <a:ext uri="{28A0092B-C50C-407E-A947-70E740481C1C}">
-                          <a14:useLocalDpi xmlns:a14="http://schemas.microsoft.com/office/drawing/2010/main" val="0"/>
-                        </a:ext>
-                      </a:extLst>
-                    </a:blip>
-                    <a:srcRect/>
+                    <a:blip r:embed="rId4"/>
                     <a:stretch>
                       <a:fillRect/>
                     </a:stretch>
@@ -1040,10 +1481,6 @@
                     <a:prstGeom prst="rect">
                       <a:avLst/>
                     </a:prstGeom>
-                    <a:noFill/>
-                    <a:ln>
-                      <a:noFill/>
-                    </a:ln>
                   </pic:spPr>
                 </pic:pic>
               </a:graphicData>
@@ -1056,43 +1493,71 @@
       <w:pPr>
         <w:pStyle w:val="Caption"/>
         <w:jc w:val="center"/>
-      </w:pPr>
-      <w:r>
+        <w:rPr/>
+      </w:pPr>
+      <w:r>
+        <w:rPr/>
         <w:t xml:space="preserve">Figure </w:t>
       </w:r>
-      <w:fldSimple w:instr=" SEQ Figure \* ARABIC ">
-        <w:r>
-          <w:rPr>
-            <w:noProof/>
-          </w:rPr>
-          <w:t>3</w:t>
-        </w:r>
-      </w:fldSimple>
-      <w:r>
+      <w:r>
+        <w:rPr/>
+        <w:fldChar w:fldCharType="begin"/>
+      </w:r>
+      <w:r>
+        <w:rPr/>
+        <w:instrText xml:space="preserve"> SEQ Figure \* ARABIC </w:instrText>
+      </w:r>
+      <w:r>
+        <w:rPr/>
+        <w:fldChar w:fldCharType="separate"/>
+      </w:r>
+      <w:r>
+        <w:rPr/>
+        <w:t>3</w:t>
+      </w:r>
+      <w:r>
+        <w:rPr/>
+        <w:fldChar w:fldCharType="end"/>
+      </w:r>
+      <w:r>
+        <w:rPr/>
         <w:t xml:space="preserve"> Final Confusion Matrix</w:t>
       </w:r>
     </w:p>
     <w:p>
       <w:pPr>
-        <w:spacing w:line="480" w:lineRule="auto"/>
+        <w:pStyle w:val="Normal"/>
+        <w:spacing w:lineRule="auto" w:line="480"/>
         <w:jc w:val="center"/>
         <w:rPr>
           <w:b/>
         </w:rPr>
       </w:pPr>
-    </w:p>
-    <w:p>
-      <w:pPr>
-        <w:spacing w:line="480" w:lineRule="auto"/>
+      <w:r>
+        <w:rPr>
+          <w:b/>
+        </w:rPr>
+      </w:r>
+    </w:p>
+    <w:p>
+      <w:pPr>
+        <w:pStyle w:val="Normal"/>
+        <w:spacing w:lineRule="auto" w:line="480"/>
         <w:jc w:val="center"/>
         <w:rPr>
           <w:b/>
         </w:rPr>
       </w:pPr>
-    </w:p>
-    <w:p>
-      <w:pPr>
-        <w:spacing w:line="480" w:lineRule="auto"/>
+      <w:r>
+        <w:rPr>
+          <w:b/>
+        </w:rPr>
+      </w:r>
+    </w:p>
+    <w:p>
+      <w:pPr>
+        <w:pStyle w:val="Normal"/>
+        <w:spacing w:lineRule="auto" w:line="480"/>
         <w:jc w:val="center"/>
         <w:rPr>
           <w:b/>
@@ -1107,23 +1572,31 @@
     </w:p>
     <w:p>
       <w:pPr>
-        <w:spacing w:line="480" w:lineRule="auto"/>
+        <w:pStyle w:val="Normal"/>
+        <w:spacing w:lineRule="auto" w:line="480"/>
         <w:ind w:firstLine="720"/>
-      </w:pPr>
-      <w:r>
-        <w:lastRenderedPageBreak/>
-        <w:t>The main body of your paper goes here, starting on page 3. (Or starting on page 2, if you’re not required to include an abstract.)</w:t>
-      </w:r>
-    </w:p>
-    <w:p>
-      <w:pPr>
-        <w:spacing w:line="480" w:lineRule="auto"/>
+        <w:rPr/>
+      </w:pPr>
+      <w:r>
+        <w:rPr/>
+        <w:t xml:space="preserve">Science Stuff Science Stuff </w:t>
+      </w:r>
+    </w:p>
+    <w:p>
+      <w:pPr>
+        <w:pStyle w:val="Normal"/>
+        <w:spacing w:lineRule="auto" w:line="480"/>
         <w:ind w:firstLine="720"/>
-      </w:pPr>
-    </w:p>
-    <w:p>
-      <w:pPr>
-        <w:spacing w:line="480" w:lineRule="auto"/>
+        <w:rPr/>
+      </w:pPr>
+      <w:r>
+        <w:rPr/>
+      </w:r>
+    </w:p>
+    <w:p>
+      <w:pPr>
+        <w:pStyle w:val="Normal"/>
+        <w:spacing w:lineRule="auto" w:line="480"/>
         <w:jc w:val="center"/>
         <w:rPr>
           <w:b/>
@@ -1138,30 +1611,48 @@
     </w:p>
     <w:p>
       <w:pPr>
-        <w:spacing w:line="480" w:lineRule="auto"/>
+        <w:pStyle w:val="Normal"/>
+        <w:spacing w:lineRule="auto" w:line="480"/>
         <w:ind w:firstLine="720"/>
-      </w:pPr>
-      <w:r>
-        <w:t>The main body of your paper goes here, starting on page 3. (Or starting on page 2, if you’re not required to include an abstract.)</w:t>
-      </w:r>
-    </w:p>
-    <w:p>
-      <w:pPr>
-        <w:spacing w:line="480" w:lineRule="auto"/>
+        <w:rPr/>
+      </w:pPr>
+      <w:r>
+        <w:rPr/>
+        <w:t xml:space="preserve">As noted elsewhere in this paper, the dataset we worked with was extremely unbalanced.  </w:t>
+      </w:r>
+      <w:r>
+        <w:rPr/>
+        <w:t>This not only presented challenges in training out model, but in measuring its performance as well. With so few positive observations in the training and test set, it is difficult to be confident in the ability of the model to generalize to future measurements. With this in mind, this model should not be used as the final determination for declaring whether a star has an Exoplanet or not. Instead it would be better used as indicator for further investigation.</w:t>
+      </w:r>
+    </w:p>
+    <w:p>
+      <w:pPr>
+        <w:pStyle w:val="Normal"/>
+        <w:spacing w:lineRule="auto" w:line="480"/>
         <w:jc w:val="center"/>
-      </w:pPr>
-    </w:p>
-    <w:p>
-      <w:pPr>
-        <w:spacing w:line="480" w:lineRule="auto"/>
-      </w:pPr>
+        <w:rPr/>
+      </w:pPr>
+      <w:r>
+        <w:rPr/>
+      </w:r>
+    </w:p>
+    <w:p>
+      <w:pPr>
+        <w:pStyle w:val="Normal"/>
+        <w:spacing w:lineRule="auto" w:line="480"/>
+        <w:rPr/>
+      </w:pPr>
+      <w:r>
+        <w:rPr/>
+      </w:r>
       <w:r>
         <w:br w:type="page"/>
       </w:r>
     </w:p>
     <w:p>
       <w:pPr>
-        <w:spacing w:line="480" w:lineRule="auto"/>
+        <w:pStyle w:val="Normal"/>
+        <w:spacing w:lineRule="auto" w:line="480" w:before="0" w:after="0"/>
         <w:jc w:val="center"/>
         <w:rPr>
           <w:b/>
@@ -1171,13 +1662,13 @@
         <w:rPr>
           <w:b/>
         </w:rPr>
-        <w:lastRenderedPageBreak/>
         <w:t>References</w:t>
       </w:r>
     </w:p>
     <w:p>
       <w:pPr>
-        <w:spacing w:line="480" w:lineRule="auto"/>
+        <w:pStyle w:val="Normal"/>
+        <w:spacing w:lineRule="auto" w:line="480"/>
         <w:ind w:left="720"/>
         <w:rPr>
           <w:lang w:val="en-CA"/>
@@ -1217,7 +1708,7 @@
         </w:rPr>
         <w:t xml:space="preserve">(3), 753-763. </w:t>
       </w:r>
-      <w:hyperlink r:id="rId11" w:history="1">
+      <w:hyperlink r:id="rId5">
         <w:r>
           <w:rPr>
             <w:rStyle w:val="Hyperlink"/>
@@ -1229,16 +1720,23 @@
     </w:p>
     <w:p>
       <w:pPr>
-        <w:spacing w:line="480" w:lineRule="auto"/>
+        <w:pStyle w:val="Normal"/>
+        <w:spacing w:lineRule="auto" w:line="480"/>
         <w:ind w:left="720"/>
         <w:rPr>
           <w:lang w:val="en-CA"/>
         </w:rPr>
       </w:pPr>
-    </w:p>
-    <w:p>
-      <w:pPr>
-        <w:spacing w:line="480" w:lineRule="auto"/>
+      <w:r>
+        <w:rPr>
+          <w:lang w:val="en-CA"/>
+        </w:rPr>
+      </w:r>
+    </w:p>
+    <w:p>
+      <w:pPr>
+        <w:pStyle w:val="Normal"/>
+        <w:spacing w:lineRule="auto" w:line="480"/>
         <w:ind w:left="720"/>
         <w:rPr>
           <w:lang w:val="en-CA"/>
@@ -1253,61 +1751,61 @@
     </w:p>
     <w:p>
       <w:pPr>
-        <w:spacing w:line="480" w:lineRule="auto"/>
-        <w:ind w:left="720" w:hanging="720"/>
-      </w:pPr>
+        <w:pStyle w:val="Normal"/>
+        <w:spacing w:lineRule="auto" w:line="480"/>
+        <w:ind w:hanging="720" w:left="720"/>
+        <w:rPr/>
+      </w:pPr>
+      <w:r>
+        <w:rPr/>
+      </w:r>
     </w:p>
     <w:sectPr>
-      <w:headerReference w:type="even" r:id="rId12"/>
-      <w:headerReference w:type="default" r:id="rId13"/>
-      <w:headerReference w:type="first" r:id="rId14"/>
+      <w:headerReference w:type="even" r:id="rId6"/>
+      <w:headerReference w:type="default" r:id="rId7"/>
+      <w:headerReference w:type="first" r:id="rId8"/>
+      <w:footnotePr>
+        <w:numFmt w:val="decimal"/>
+      </w:footnotePr>
+      <w:type w:val="nextPage"/>
       <w:pgSz w:w="12240" w:h="15840"/>
-      <w:pgMar w:top="1440" w:right="1440" w:bottom="1440" w:left="1440" w:header="720" w:footer="0" w:gutter="0"/>
-      <w:pgNumType w:start="1"/>
-      <w:cols w:space="720"/>
-      <w:formProt w:val="0"/>
-      <w:docGrid w:linePitch="100"/>
+      <w:pgMar w:left="1440" w:right="1440" w:gutter="0" w:header="720" w:top="1440" w:footer="0" w:bottom="1440"/>
+      <w:pgNumType w:start="1" w:fmt="decimal"/>
+      <w:formProt w:val="false"/>
+      <w:textDirection w:val="lrTb"/>
+      <w:docGrid w:type="default" w:linePitch="100" w:charSpace="0"/>
     </w:sectPr>
   </w:body>
 </w:document>
 </file>
 
-<file path=word/endnotes.xml><?xml version="1.0" encoding="utf-8"?>
-<w:endnotes xmlns:wpc="http://schemas.microsoft.com/office/word/2010/wordprocessingCanvas" xmlns:cx="http://schemas.microsoft.com/office/drawing/2014/chartex" xmlns:cx1="http://schemas.microsoft.com/office/drawing/2015/9/8/chartex" xmlns:cx2="http://schemas.microsoft.com/office/drawing/2015/10/21/chartex" xmlns:cx3="http://schemas.microsoft.com/office/drawing/2016/5/9/chartex" xmlns:cx4="http://schemas.microsoft.com/office/drawing/2016/5/10/chartex" xmlns:cx5="http://schemas.microsoft.com/office/drawing/2016/5/11/chartex" xmlns:cx6="http://schemas.microsoft.com/office/drawing/2016/5/12/chartex" xmlns:cx7="http://schemas.microsoft.com/office/drawing/2016/5/13/chartex" xmlns:cx8="http://schemas.microsoft.com/office/drawing/2016/5/14/chartex" xmlns:mc="http://schemas.openxmlformats.org/markup-compatibility/2006" xmlns:aink="http://schemas.microsoft.com/office/drawing/2016/ink" xmlns:am3d="http://schemas.microsoft.com/office/drawing/2017/model3d" xmlns:o="urn:schemas-microsoft-com:office:office" xmlns:oel="http://schemas.microsoft.com/office/2019/extlst" xmlns:r="http://schemas.openxmlformats.org/officeDocument/2006/relationships" xmlns:m="http://schemas.openxmlformats.org/officeDocument/2006/math" xmlns:v="urn:schemas-microsoft-com:vml" xmlns:wp14="http://schemas.microsoft.com/office/word/2010/wordprocessingDrawing" xmlns:wp="http://schemas.openxmlformats.org/drawingml/2006/wordprocessingDrawing" xmlns:w10="urn:schemas-microsoft-com:office:word" xmlns:w="http://schemas.openxmlformats.org/wordprocessingml/2006/main" xmlns:w14="http://schemas.microsoft.com/office/word/2010/wordml" xmlns:w15="http://schemas.microsoft.com/office/word/2012/wordml" xmlns:w16cex="http://schemas.microsoft.com/office/word/2018/wordml/cex" xmlns:w16cid="http://schemas.microsoft.com/office/word/2016/wordml/cid" xmlns:w16="http://schemas.microsoft.com/office/word/2018/wordml" xmlns:w16du="http://schemas.microsoft.com/office/word/2023/wordml/word16du" xmlns:w16sdtdh="http://schemas.microsoft.com/office/word/2020/wordml/sdtdatahash" xmlns:w16sdtfl="http://schemas.microsoft.com/office/word/2024/wordml/sdtformatlock" xmlns:w16se="http://schemas.microsoft.com/office/word/2015/wordml/symex" xmlns:wpg="http://schemas.microsoft.com/office/word/2010/wordprocessingGroup" xmlns:wpi="http://schemas.microsoft.com/office/word/2010/wordprocessingInk" xmlns:wne="http://schemas.microsoft.com/office/word/2006/wordml" xmlns:wps="http://schemas.microsoft.com/office/word/2010/wordprocessingShape" mc:Ignorable="w14 w15 w16se w16cid w16 w16cex w16sdtdh w16sdtfl w16du wp14">
-  <w:endnote w:type="separator" w:id="-1">
-    <w:p>
+<file path=word/footnotes.xml><?xml version="1.0" encoding="utf-8"?>
+<w:footnotes xmlns:o="urn:schemas-microsoft-com:office:office" xmlns:r="http://schemas.openxmlformats.org/officeDocument/2006/relationships" xmlns:v="urn:schemas-microsoft-com:vml" xmlns:w="http://schemas.openxmlformats.org/wordprocessingml/2006/main" xmlns:w10="urn:schemas-microsoft-com:office:word" xmlns:wp="http://schemas.openxmlformats.org/drawingml/2006/wordprocessingDrawing" xmlns:wps="http://schemas.microsoft.com/office/word/2010/wordprocessingShape" xmlns:wpg="http://schemas.microsoft.com/office/word/2010/wordprocessingGroup" xmlns:mc="http://schemas.openxmlformats.org/markup-compatibility/2006" xmlns:wp14="http://schemas.microsoft.com/office/word/2010/wordprocessingDrawing" xmlns:w14="http://schemas.microsoft.com/office/word/2010/wordml" xmlns:w15="http://schemas.microsoft.com/office/word/2012/wordml" mc:Ignorable="w14 wp14 w15">
+  <w:footnote w:id="0" w:type="separator">
+    <w:p>
+      <w:pPr>
+        <w:rPr>
+          <w:sz w:val="12"/>
+        </w:rPr>
+      </w:pPr>
       <w:r>
         <w:separator/>
       </w:r>
     </w:p>
-  </w:endnote>
-  <w:endnote w:type="continuationSeparator" w:id="0">
-    <w:p>
+  </w:footnote>
+  <w:footnote w:id="1" w:type="continuationSeparator">
+    <w:p>
+      <w:pPr>
+        <w:rPr>
+          <w:sz w:val="12"/>
+        </w:rPr>
+      </w:pPr>
       <w:r>
         <w:continuationSeparator/>
       </w:r>
     </w:p>
-  </w:endnote>
-</w:endnotes>
-</file>
-
-<file path=word/footnotes.xml><?xml version="1.0" encoding="utf-8"?>
-<w:footnotes xmlns:wpc="http://schemas.microsoft.com/office/word/2010/wordprocessingCanvas" xmlns:cx="http://schemas.microsoft.com/office/drawing/2014/chartex" xmlns:cx1="http://schemas.microsoft.com/office/drawing/2015/9/8/chartex" xmlns:cx2="http://schemas.microsoft.com/office/drawing/2015/10/21/chartex" xmlns:cx3="http://schemas.microsoft.com/office/drawing/2016/5/9/chartex" xmlns:cx4="http://schemas.microsoft.com/office/drawing/2016/5/10/chartex" xmlns:cx5="http://schemas.microsoft.com/office/drawing/2016/5/11/chartex" xmlns:cx6="http://schemas.microsoft.com/office/drawing/2016/5/12/chartex" xmlns:cx7="http://schemas.microsoft.com/office/drawing/2016/5/13/chartex" xmlns:cx8="http://schemas.microsoft.com/office/drawing/2016/5/14/chartex" xmlns:mc="http://schemas.openxmlformats.org/markup-compatibility/2006" xmlns:aink="http://schemas.microsoft.com/office/drawing/2016/ink" xmlns:am3d="http://schemas.microsoft.com/office/drawing/2017/model3d" xmlns:o="urn:schemas-microsoft-com:office:office" xmlns:oel="http://schemas.microsoft.com/office/2019/extlst" xmlns:r="http://schemas.openxmlformats.org/officeDocument/2006/relationships" xmlns:m="http://schemas.openxmlformats.org/officeDocument/2006/math" xmlns:v="urn:schemas-microsoft-com:vml" xmlns:wp14="http://schemas.microsoft.com/office/word/2010/wordprocessingDrawing" xmlns:wp="http://schemas.openxmlformats.org/drawingml/2006/wordprocessingDrawing" xmlns:w10="urn:schemas-microsoft-com:office:word" xmlns:w="http://schemas.openxmlformats.org/wordprocessingml/2006/main" xmlns:w14="http://schemas.microsoft.com/office/word/2010/wordml" xmlns:w15="http://schemas.microsoft.com/office/word/2012/wordml" xmlns:w16cex="http://schemas.microsoft.com/office/word/2018/wordml/cex" xmlns:w16cid="http://schemas.microsoft.com/office/word/2016/wordml/cid" xmlns:w16="http://schemas.microsoft.com/office/word/2018/wordml" xmlns:w16du="http://schemas.microsoft.com/office/word/2023/wordml/word16du" xmlns:w16sdtdh="http://schemas.microsoft.com/office/word/2020/wordml/sdtdatahash" xmlns:w16sdtfl="http://schemas.microsoft.com/office/word/2024/wordml/sdtformatlock" xmlns:w16se="http://schemas.microsoft.com/office/word/2015/wordml/symex" xmlns:wpg="http://schemas.microsoft.com/office/word/2010/wordprocessingGroup" xmlns:wpi="http://schemas.microsoft.com/office/word/2010/wordprocessingInk" xmlns:wne="http://schemas.microsoft.com/office/word/2006/wordml" xmlns:wps="http://schemas.microsoft.com/office/word/2010/wordprocessingShape" mc:Ignorable="w14 w15 w16se w16cid w16 w16cex w16sdtdh w16sdtfl w16du wp14">
-  <w:footnote w:type="separator" w:id="-1">
-    <w:p>
-      <w:r>
-        <w:separator/>
-      </w:r>
-    </w:p>
   </w:footnote>
-  <w:footnote w:type="continuationSeparator" w:id="0">
-    <w:p>
-      <w:r>
-        <w:continuationSeparator/>
-      </w:r>
-    </w:p>
-  </w:footnote>
-  <w:footnote w:id="1">
+  <w:footnote w:id="2">
     <w:p>
       <w:pPr>
         <w:pStyle w:val="FootnoteText"/>
@@ -1317,62 +1815,48 @@
       </w:pPr>
       <w:r>
         <w:rPr>
-          <w:rStyle w:val="FootnoteReference"/>
+          <w:rStyle w:val="FootnoteCharacters"/>
         </w:rPr>
         <w:footnoteRef/>
       </w:r>
       <w:r>
+        <w:rPr/>
         <w:t xml:space="preserve"> </w:t>
       </w:r>
-      <w:hyperlink r:id="rId1" w:history="1">
-        <w:proofErr w:type="spellStart"/>
+      <w:hyperlink r:id="rId1">
         <w:r>
           <w:rPr>
             <w:rStyle w:val="Hyperlink"/>
           </w:rPr>
-          <w:t>GridSearchCV</w:t>
+          <w:t>GridSearchCV — scikit-learn 1.8.0 documentation</w:t>
         </w:r>
-        <w:proofErr w:type="spellEnd"/>
+      </w:hyperlink>
+    </w:p>
+  </w:footnote>
+  <w:footnote w:id="3">
+    <w:p>
+      <w:pPr>
+        <w:pStyle w:val="FootnoteText"/>
+        <w:rPr>
+          <w:lang w:val="en-CA"/>
+        </w:rPr>
+      </w:pPr>
+      <w:r>
+        <w:rPr>
+          <w:rStyle w:val="FootnoteCharacters"/>
+        </w:rPr>
+        <w:footnoteRef/>
+      </w:r>
+      <w:r>
+        <w:rPr/>
+        <w:t xml:space="preserve"> </w:t>
+      </w:r>
+      <w:hyperlink r:id="rId2">
         <w:r>
           <w:rPr>
             <w:rStyle w:val="Hyperlink"/>
           </w:rPr>
-          <w:t xml:space="preserve"> — scikit-learn 1.8.0 documentation</w:t>
-        </w:r>
-      </w:hyperlink>
-    </w:p>
-  </w:footnote>
-  <w:footnote w:id="2">
-    <w:p>
-      <w:pPr>
-        <w:pStyle w:val="FootnoteText"/>
-        <w:rPr>
-          <w:lang w:val="en-CA"/>
-        </w:rPr>
-      </w:pPr>
-      <w:r>
-        <w:rPr>
-          <w:rStyle w:val="FootnoteReference"/>
-        </w:rPr>
-        <w:footnoteRef/>
-      </w:r>
-      <w:r>
-        <w:t xml:space="preserve"> </w:t>
-      </w:r>
-      <w:hyperlink r:id="rId2" w:history="1">
-        <w:proofErr w:type="spellStart"/>
-        <w:r>
-          <w:rPr>
-            <w:rStyle w:val="Hyperlink"/>
-          </w:rPr>
-          <w:t>StratifiedKFold</w:t>
-        </w:r>
-        <w:proofErr w:type="spellEnd"/>
-        <w:r>
-          <w:rPr>
-            <w:rStyle w:val="Hyperlink"/>
-          </w:rPr>
-          <w:t xml:space="preserve"> — scikit-learn 1.8.0 documentation</w:t>
+          <w:t>StratifiedKFold — scikit-learn 1.8.0 documentation</w:t>
         </w:r>
       </w:hyperlink>
     </w:p>
@@ -1381,10 +1865,11 @@
 </file>
 
 <file path=word/header1.xml><?xml version="1.0" encoding="utf-8"?>
-<w:hdr xmlns:wpc="http://schemas.microsoft.com/office/word/2010/wordprocessingCanvas" xmlns:cx="http://schemas.microsoft.com/office/drawing/2014/chartex" xmlns:cx1="http://schemas.microsoft.com/office/drawing/2015/9/8/chartex" xmlns:cx2="http://schemas.microsoft.com/office/drawing/2015/10/21/chartex" xmlns:cx3="http://schemas.microsoft.com/office/drawing/2016/5/9/chartex" xmlns:cx4="http://schemas.microsoft.com/office/drawing/2016/5/10/chartex" xmlns:cx5="http://schemas.microsoft.com/office/drawing/2016/5/11/chartex" xmlns:cx6="http://schemas.microsoft.com/office/drawing/2016/5/12/chartex" xmlns:cx7="http://schemas.microsoft.com/office/drawing/2016/5/13/chartex" xmlns:cx8="http://schemas.microsoft.com/office/drawing/2016/5/14/chartex" xmlns:mc="http://schemas.openxmlformats.org/markup-compatibility/2006" xmlns:aink="http://schemas.microsoft.com/office/drawing/2016/ink" xmlns:am3d="http://schemas.microsoft.com/office/drawing/2017/model3d" xmlns:o="urn:schemas-microsoft-com:office:office" xmlns:oel="http://schemas.microsoft.com/office/2019/extlst" xmlns:r="http://schemas.openxmlformats.org/officeDocument/2006/relationships" xmlns:m="http://schemas.openxmlformats.org/officeDocument/2006/math" xmlns:v="urn:schemas-microsoft-com:vml" xmlns:wp14="http://schemas.microsoft.com/office/word/2010/wordprocessingDrawing" xmlns:wp="http://schemas.openxmlformats.org/drawingml/2006/wordprocessingDrawing" xmlns:w10="urn:schemas-microsoft-com:office:word" xmlns:w="http://schemas.openxmlformats.org/wordprocessingml/2006/main" xmlns:w14="http://schemas.microsoft.com/office/word/2010/wordml" xmlns:w15="http://schemas.microsoft.com/office/word/2012/wordml" xmlns:w16cex="http://schemas.microsoft.com/office/word/2018/wordml/cex" xmlns:w16cid="http://schemas.microsoft.com/office/word/2016/wordml/cid" xmlns:w16="http://schemas.microsoft.com/office/word/2018/wordml" xmlns:w16du="http://schemas.microsoft.com/office/word/2023/wordml/word16du" xmlns:w16sdtdh="http://schemas.microsoft.com/office/word/2020/wordml/sdtdatahash" xmlns:w16sdtfl="http://schemas.microsoft.com/office/word/2024/wordml/sdtformatlock" xmlns:w16se="http://schemas.microsoft.com/office/word/2015/wordml/symex" xmlns:wpg="http://schemas.microsoft.com/office/word/2010/wordprocessingGroup" xmlns:wpi="http://schemas.microsoft.com/office/word/2010/wordprocessingInk" xmlns:wne="http://schemas.microsoft.com/office/word/2006/wordml" xmlns:wps="http://schemas.microsoft.com/office/word/2010/wordprocessingShape" mc:Ignorable="w14 w15 w16se w16cid w16 w16cex w16sdtdh w16sdtfl w16du wp14">
+<w:hdr xmlns:o="urn:schemas-microsoft-com:office:office" xmlns:r="http://schemas.openxmlformats.org/officeDocument/2006/relationships" xmlns:v="urn:schemas-microsoft-com:vml" xmlns:w="http://schemas.openxmlformats.org/wordprocessingml/2006/main" xmlns:w10="urn:schemas-microsoft-com:office:word" xmlns:wp="http://schemas.openxmlformats.org/drawingml/2006/wordprocessingDrawing" xmlns:wps="http://schemas.microsoft.com/office/word/2010/wordprocessingShape" xmlns:wpg="http://schemas.microsoft.com/office/word/2010/wordprocessingGroup" xmlns:mc="http://schemas.openxmlformats.org/markup-compatibility/2006" xmlns:wp14="http://schemas.microsoft.com/office/word/2010/wordprocessingDrawing" xmlns:w14="http://schemas.microsoft.com/office/word/2010/wordml" xmlns:w15="http://schemas.microsoft.com/office/word/2012/wordml" mc:Ignorable="w14 wp14 w15">
   <w:p>
     <w:pPr>
-      <w:spacing w:line="480" w:lineRule="auto"/>
+      <w:pStyle w:val="Normal"/>
+      <w:spacing w:lineRule="auto" w:line="480"/>
       <w:rPr>
         <w:color w:val="000000"/>
       </w:rPr>
@@ -1422,23 +1907,31 @@
   </w:p>
   <w:p>
     <w:pPr>
-      <w:spacing w:line="480" w:lineRule="auto"/>
+      <w:pStyle w:val="Normal"/>
+      <w:spacing w:lineRule="auto" w:line="480"/>
       <w:rPr>
         <w:color w:val="000000"/>
       </w:rPr>
     </w:pPr>
+    <w:r>
+      <w:rPr>
+        <w:color w:val="000000"/>
+      </w:rPr>
+    </w:r>
   </w:p>
 </w:hdr>
 </file>
 
 <file path=word/header2.xml><?xml version="1.0" encoding="utf-8"?>
-<w:hdr xmlns:wpc="http://schemas.microsoft.com/office/word/2010/wordprocessingCanvas" xmlns:cx="http://schemas.microsoft.com/office/drawing/2014/chartex" xmlns:cx1="http://schemas.microsoft.com/office/drawing/2015/9/8/chartex" xmlns:cx2="http://schemas.microsoft.com/office/drawing/2015/10/21/chartex" xmlns:cx3="http://schemas.microsoft.com/office/drawing/2016/5/9/chartex" xmlns:cx4="http://schemas.microsoft.com/office/drawing/2016/5/10/chartex" xmlns:cx5="http://schemas.microsoft.com/office/drawing/2016/5/11/chartex" xmlns:cx6="http://schemas.microsoft.com/office/drawing/2016/5/12/chartex" xmlns:cx7="http://schemas.microsoft.com/office/drawing/2016/5/13/chartex" xmlns:cx8="http://schemas.microsoft.com/office/drawing/2016/5/14/chartex" xmlns:mc="http://schemas.openxmlformats.org/markup-compatibility/2006" xmlns:aink="http://schemas.microsoft.com/office/drawing/2016/ink" xmlns:am3d="http://schemas.microsoft.com/office/drawing/2017/model3d" xmlns:o="urn:schemas-microsoft-com:office:office" xmlns:oel="http://schemas.microsoft.com/office/2019/extlst" xmlns:r="http://schemas.openxmlformats.org/officeDocument/2006/relationships" xmlns:m="http://schemas.openxmlformats.org/officeDocument/2006/math" xmlns:v="urn:schemas-microsoft-com:vml" xmlns:wp14="http://schemas.microsoft.com/office/word/2010/wordprocessingDrawing" xmlns:wp="http://schemas.openxmlformats.org/drawingml/2006/wordprocessingDrawing" xmlns:w10="urn:schemas-microsoft-com:office:word" xmlns:w="http://schemas.openxmlformats.org/wordprocessingml/2006/main" xmlns:w14="http://schemas.microsoft.com/office/word/2010/wordml" xmlns:w15="http://schemas.microsoft.com/office/word/2012/wordml" xmlns:w16cex="http://schemas.microsoft.com/office/word/2018/wordml/cex" xmlns:w16cid="http://schemas.microsoft.com/office/word/2016/wordml/cid" xmlns:w16="http://schemas.microsoft.com/office/word/2018/wordml" xmlns:w16du="http://schemas.microsoft.com/office/word/2023/wordml/word16du" xmlns:w16sdtdh="http://schemas.microsoft.com/office/word/2020/wordml/sdtdatahash" xmlns:w16sdtfl="http://schemas.microsoft.com/office/word/2024/wordml/sdtformatlock" xmlns:w16se="http://schemas.microsoft.com/office/word/2015/wordml/symex" xmlns:wpg="http://schemas.microsoft.com/office/word/2010/wordprocessingGroup" xmlns:wpi="http://schemas.microsoft.com/office/word/2010/wordprocessingInk" xmlns:wne="http://schemas.microsoft.com/office/word/2006/wordml" xmlns:wps="http://schemas.microsoft.com/office/word/2010/wordprocessingShape" mc:Ignorable="w14 w15 w16se w16cid w16 w16cex w16sdtdh w16sdtfl w16du wp14">
+<w:hdr xmlns:o="urn:schemas-microsoft-com:office:office" xmlns:r="http://schemas.openxmlformats.org/officeDocument/2006/relationships" xmlns:v="urn:schemas-microsoft-com:vml" xmlns:w="http://schemas.openxmlformats.org/wordprocessingml/2006/main" xmlns:w10="urn:schemas-microsoft-com:office:word" xmlns:wp="http://schemas.openxmlformats.org/drawingml/2006/wordprocessingDrawing" xmlns:wps="http://schemas.microsoft.com/office/word/2010/wordprocessingShape" xmlns:wpg="http://schemas.microsoft.com/office/word/2010/wordprocessingGroup" xmlns:mc="http://schemas.openxmlformats.org/markup-compatibility/2006" xmlns:wp14="http://schemas.microsoft.com/office/word/2010/wordprocessingDrawing" xmlns:w14="http://schemas.microsoft.com/office/word/2010/wordml" xmlns:w15="http://schemas.microsoft.com/office/word/2012/wordml" mc:Ignorable="w14 wp14 w15">
   <w:p>
     <w:pPr>
+      <w:pStyle w:val="Normal"/>
       <w:tabs>
-        <w:tab w:val="right" w:pos="9360"/>
+        <w:tab w:val="clear" w:pos="720"/>
+        <w:tab w:val="right" w:pos="9360" w:leader="none"/>
       </w:tabs>
-      <w:spacing w:line="480" w:lineRule="auto"/>
+      <w:spacing w:lineRule="auto" w:line="480"/>
       <w:rPr>
         <w:color w:val="000000"/>
       </w:rPr>
@@ -1471,7 +1964,7 @@
       <w:rPr>
         <w:color w:val="000000"/>
       </w:rPr>
-      <w:t>8</w:t>
+      <w:t>9</w:t>
     </w:r>
     <w:r>
       <w:rPr>
@@ -1484,13 +1977,15 @@
 </file>
 
 <file path=word/header3.xml><?xml version="1.0" encoding="utf-8"?>
-<w:hdr xmlns:wpc="http://schemas.microsoft.com/office/word/2010/wordprocessingCanvas" xmlns:cx="http://schemas.microsoft.com/office/drawing/2014/chartex" xmlns:cx1="http://schemas.microsoft.com/office/drawing/2015/9/8/chartex" xmlns:cx2="http://schemas.microsoft.com/office/drawing/2015/10/21/chartex" xmlns:cx3="http://schemas.microsoft.com/office/drawing/2016/5/9/chartex" xmlns:cx4="http://schemas.microsoft.com/office/drawing/2016/5/10/chartex" xmlns:cx5="http://schemas.microsoft.com/office/drawing/2016/5/11/chartex" xmlns:cx6="http://schemas.microsoft.com/office/drawing/2016/5/12/chartex" xmlns:cx7="http://schemas.microsoft.com/office/drawing/2016/5/13/chartex" xmlns:cx8="http://schemas.microsoft.com/office/drawing/2016/5/14/chartex" xmlns:mc="http://schemas.openxmlformats.org/markup-compatibility/2006" xmlns:aink="http://schemas.microsoft.com/office/drawing/2016/ink" xmlns:am3d="http://schemas.microsoft.com/office/drawing/2017/model3d" xmlns:o="urn:schemas-microsoft-com:office:office" xmlns:oel="http://schemas.microsoft.com/office/2019/extlst" xmlns:r="http://schemas.openxmlformats.org/officeDocument/2006/relationships" xmlns:m="http://schemas.openxmlformats.org/officeDocument/2006/math" xmlns:v="urn:schemas-microsoft-com:vml" xmlns:wp14="http://schemas.microsoft.com/office/word/2010/wordprocessingDrawing" xmlns:wp="http://schemas.openxmlformats.org/drawingml/2006/wordprocessingDrawing" xmlns:w10="urn:schemas-microsoft-com:office:word" xmlns:w="http://schemas.openxmlformats.org/wordprocessingml/2006/main" xmlns:w14="http://schemas.microsoft.com/office/word/2010/wordml" xmlns:w15="http://schemas.microsoft.com/office/word/2012/wordml" xmlns:w16cex="http://schemas.microsoft.com/office/word/2018/wordml/cex" xmlns:w16cid="http://schemas.microsoft.com/office/word/2016/wordml/cid" xmlns:w16="http://schemas.microsoft.com/office/word/2018/wordml" xmlns:w16du="http://schemas.microsoft.com/office/word/2023/wordml/word16du" xmlns:w16sdtdh="http://schemas.microsoft.com/office/word/2020/wordml/sdtdatahash" xmlns:w16sdtfl="http://schemas.microsoft.com/office/word/2024/wordml/sdtformatlock" xmlns:w16se="http://schemas.microsoft.com/office/word/2015/wordml/symex" xmlns:wpg="http://schemas.microsoft.com/office/word/2010/wordprocessingGroup" xmlns:wpi="http://schemas.microsoft.com/office/word/2010/wordprocessingInk" xmlns:wne="http://schemas.microsoft.com/office/word/2006/wordml" xmlns:wps="http://schemas.microsoft.com/office/word/2010/wordprocessingShape" mc:Ignorable="w14 w15 w16se w16cid w16 w16cex w16sdtdh w16sdtfl w16du wp14">
+<w:hdr xmlns:o="urn:schemas-microsoft-com:office:office" xmlns:r="http://schemas.openxmlformats.org/officeDocument/2006/relationships" xmlns:v="urn:schemas-microsoft-com:vml" xmlns:w="http://schemas.openxmlformats.org/wordprocessingml/2006/main" xmlns:w10="urn:schemas-microsoft-com:office:word" xmlns:wp="http://schemas.openxmlformats.org/drawingml/2006/wordprocessingDrawing" xmlns:wps="http://schemas.microsoft.com/office/word/2010/wordprocessingShape" xmlns:wpg="http://schemas.microsoft.com/office/word/2010/wordprocessingGroup" xmlns:mc="http://schemas.openxmlformats.org/markup-compatibility/2006" xmlns:wp14="http://schemas.microsoft.com/office/word/2010/wordprocessingDrawing" xmlns:w14="http://schemas.microsoft.com/office/word/2010/wordml" xmlns:w15="http://schemas.microsoft.com/office/word/2012/wordml" mc:Ignorable="w14 wp14 w15">
   <w:p>
     <w:pPr>
+      <w:pStyle w:val="Normal"/>
       <w:tabs>
-        <w:tab w:val="right" w:pos="9360"/>
+        <w:tab w:val="clear" w:pos="720"/>
+        <w:tab w:val="right" w:pos="9360" w:leader="none"/>
       </w:tabs>
-      <w:spacing w:line="480" w:lineRule="auto"/>
+      <w:spacing w:lineRule="auto" w:line="480"/>
       <w:rPr>
         <w:color w:val="000000"/>
       </w:rPr>
@@ -1523,7 +2018,7 @@
       <w:rPr>
         <w:color w:val="000000"/>
       </w:rPr>
-      <w:t>8</w:t>
+      <w:t>9</w:t>
     </w:r>
     <w:r>
       <w:rPr>
@@ -1536,11 +2031,127 @@
 </file>
 
 <file path=word/numbering.xml><?xml version="1.0" encoding="utf-8"?>
-<w:numbering xmlns:wpc="http://schemas.microsoft.com/office/word/2010/wordprocessingCanvas" xmlns:cx="http://schemas.microsoft.com/office/drawing/2014/chartex" xmlns:cx1="http://schemas.microsoft.com/office/drawing/2015/9/8/chartex" xmlns:cx2="http://schemas.microsoft.com/office/drawing/2015/10/21/chartex" xmlns:cx3="http://schemas.microsoft.com/office/drawing/2016/5/9/chartex" xmlns:cx4="http://schemas.microsoft.com/office/drawing/2016/5/10/chartex" xmlns:cx5="http://schemas.microsoft.com/office/drawing/2016/5/11/chartex" xmlns:cx6="http://schemas.microsoft.com/office/drawing/2016/5/12/chartex" xmlns:cx7="http://schemas.microsoft.com/office/drawing/2016/5/13/chartex" xmlns:cx8="http://schemas.microsoft.com/office/drawing/2016/5/14/chartex" xmlns:mc="http://schemas.openxmlformats.org/markup-compatibility/2006" xmlns:aink="http://schemas.microsoft.com/office/drawing/2016/ink" xmlns:am3d="http://schemas.microsoft.com/office/drawing/2017/model3d" xmlns:o="urn:schemas-microsoft-com:office:office" xmlns:oel="http://schemas.microsoft.com/office/2019/extlst" xmlns:r="http://schemas.openxmlformats.org/officeDocument/2006/relationships" xmlns:m="http://schemas.openxmlformats.org/officeDocument/2006/math" xmlns:v="urn:schemas-microsoft-com:vml" xmlns:wp14="http://schemas.microsoft.com/office/word/2010/wordprocessingDrawing" xmlns:wp="http://schemas.openxmlformats.org/drawingml/2006/wordprocessingDrawing" xmlns:w10="urn:schemas-microsoft-com:office:word" xmlns:w="http://schemas.openxmlformats.org/wordprocessingml/2006/main" xmlns:w14="http://schemas.microsoft.com/office/word/2010/wordml" xmlns:w15="http://schemas.microsoft.com/office/word/2012/wordml" xmlns:w16cex="http://schemas.microsoft.com/office/word/2018/wordml/cex" xmlns:w16cid="http://schemas.microsoft.com/office/word/2016/wordml/cid" xmlns:w16="http://schemas.microsoft.com/office/word/2018/wordml" xmlns:w16du="http://schemas.microsoft.com/office/word/2023/wordml/word16du" xmlns:w16sdtdh="http://schemas.microsoft.com/office/word/2020/wordml/sdtdatahash" xmlns:w16sdtfl="http://schemas.microsoft.com/office/word/2024/wordml/sdtformatlock" xmlns:w16se="http://schemas.microsoft.com/office/word/2015/wordml/symex" xmlns:wpg="http://schemas.microsoft.com/office/word/2010/wordprocessingGroup" xmlns:wpi="http://schemas.microsoft.com/office/word/2010/wordprocessingInk" xmlns:wne="http://schemas.microsoft.com/office/word/2006/wordml" xmlns:wps="http://schemas.microsoft.com/office/word/2010/wordprocessingShape" mc:Ignorable="w14 w15 w16se w16cid w16 w16cex w16sdtdh w16sdtfl w16du wp14">
-  <w:abstractNum w:abstractNumId="0" w15:restartNumberingAfterBreak="0">
-    <w:nsid w:val="189413CD"/>
-    <w:multiLevelType w:val="multilevel"/>
-    <w:tmpl w:val="87625946"/>
+<w:numbering xmlns:w="http://schemas.openxmlformats.org/wordprocessingml/2006/main" xmlns:o="urn:schemas-microsoft-com:office:office" xmlns:r="http://schemas.openxmlformats.org/officeDocument/2006/relationships" xmlns:v="urn:schemas-microsoft-com:vml" xmlns:mc="http://schemas.openxmlformats.org/markup-compatibility/2006" xmlns:w14="http://schemas.microsoft.com/office/word/2010/wordml" mc:Ignorable="w14">
+  <w:abstractNum w:abstractNumId="1">
+    <w:lvl w:ilvl="0">
+      <w:start w:val="1"/>
+      <w:numFmt w:val="decimal"/>
+      <w:lvlText w:val="%1."/>
+      <w:lvlJc w:val="left"/>
+      <w:pPr>
+        <w:tabs>
+          <w:tab w:val="num" w:pos="0"/>
+        </w:tabs>
+        <w:ind w:left="1080" w:hanging="360"/>
+      </w:pPr>
+      <w:rPr/>
+    </w:lvl>
+    <w:lvl w:ilvl="1">
+      <w:start w:val="1"/>
+      <w:numFmt w:val="lowerLetter"/>
+      <w:lvlText w:val="%2."/>
+      <w:lvlJc w:val="left"/>
+      <w:pPr>
+        <w:tabs>
+          <w:tab w:val="num" w:pos="0"/>
+        </w:tabs>
+        <w:ind w:left="1800" w:hanging="360"/>
+      </w:pPr>
+      <w:rPr/>
+    </w:lvl>
+    <w:lvl w:ilvl="2">
+      <w:start w:val="1"/>
+      <w:numFmt w:val="lowerRoman"/>
+      <w:lvlText w:val="%3."/>
+      <w:lvlJc w:val="right"/>
+      <w:pPr>
+        <w:tabs>
+          <w:tab w:val="num" w:pos="0"/>
+        </w:tabs>
+        <w:ind w:left="2520" w:hanging="180"/>
+      </w:pPr>
+      <w:rPr/>
+    </w:lvl>
+    <w:lvl w:ilvl="3">
+      <w:start w:val="1"/>
+      <w:numFmt w:val="decimal"/>
+      <w:lvlText w:val="%4."/>
+      <w:lvlJc w:val="left"/>
+      <w:pPr>
+        <w:tabs>
+          <w:tab w:val="num" w:pos="0"/>
+        </w:tabs>
+        <w:ind w:left="3240" w:hanging="360"/>
+      </w:pPr>
+      <w:rPr/>
+    </w:lvl>
+    <w:lvl w:ilvl="4">
+      <w:start w:val="1"/>
+      <w:numFmt w:val="lowerLetter"/>
+      <w:lvlText w:val="%5."/>
+      <w:lvlJc w:val="left"/>
+      <w:pPr>
+        <w:tabs>
+          <w:tab w:val="num" w:pos="0"/>
+        </w:tabs>
+        <w:ind w:left="3960" w:hanging="360"/>
+      </w:pPr>
+      <w:rPr/>
+    </w:lvl>
+    <w:lvl w:ilvl="5">
+      <w:start w:val="1"/>
+      <w:numFmt w:val="lowerRoman"/>
+      <w:lvlText w:val="%6."/>
+      <w:lvlJc w:val="right"/>
+      <w:pPr>
+        <w:tabs>
+          <w:tab w:val="num" w:pos="0"/>
+        </w:tabs>
+        <w:ind w:left="4680" w:hanging="180"/>
+      </w:pPr>
+      <w:rPr/>
+    </w:lvl>
+    <w:lvl w:ilvl="6">
+      <w:start w:val="1"/>
+      <w:numFmt w:val="decimal"/>
+      <w:lvlText w:val="%7."/>
+      <w:lvlJc w:val="left"/>
+      <w:pPr>
+        <w:tabs>
+          <w:tab w:val="num" w:pos="0"/>
+        </w:tabs>
+        <w:ind w:left="5400" w:hanging="360"/>
+      </w:pPr>
+      <w:rPr/>
+    </w:lvl>
+    <w:lvl w:ilvl="7">
+      <w:start w:val="1"/>
+      <w:numFmt w:val="lowerLetter"/>
+      <w:lvlText w:val="%8."/>
+      <w:lvlJc w:val="left"/>
+      <w:pPr>
+        <w:tabs>
+          <w:tab w:val="num" w:pos="0"/>
+        </w:tabs>
+        <w:ind w:left="6120" w:hanging="360"/>
+      </w:pPr>
+      <w:rPr/>
+    </w:lvl>
+    <w:lvl w:ilvl="8">
+      <w:start w:val="1"/>
+      <w:numFmt w:val="lowerRoman"/>
+      <w:lvlText w:val="%9."/>
+      <w:lvlJc w:val="right"/>
+      <w:pPr>
+        <w:tabs>
+          <w:tab w:val="num" w:pos="0"/>
+        </w:tabs>
+        <w:ind w:left="6840" w:hanging="180"/>
+      </w:pPr>
+      <w:rPr/>
+    </w:lvl>
+  </w:abstractNum>
+  <w:abstractNum w:abstractNumId="2">
     <w:lvl w:ilvl="0">
       <w:start w:val="1"/>
       <w:numFmt w:val="none"/>
@@ -1551,7 +2162,7 @@
         <w:tabs>
           <w:tab w:val="num" w:pos="0"/>
         </w:tabs>
-        <w:ind w:left="0" w:firstLine="0"/>
+        <w:ind w:left="0" w:hanging="0"/>
       </w:pPr>
     </w:lvl>
     <w:lvl w:ilvl="1">
@@ -1564,7 +2175,7 @@
         <w:tabs>
           <w:tab w:val="num" w:pos="0"/>
         </w:tabs>
-        <w:ind w:left="0" w:firstLine="0"/>
+        <w:ind w:left="0" w:hanging="0"/>
       </w:pPr>
     </w:lvl>
     <w:lvl w:ilvl="2">
@@ -1577,7 +2188,7 @@
         <w:tabs>
           <w:tab w:val="num" w:pos="0"/>
         </w:tabs>
-        <w:ind w:left="0" w:firstLine="0"/>
+        <w:ind w:left="0" w:hanging="0"/>
       </w:pPr>
     </w:lvl>
     <w:lvl w:ilvl="3">
@@ -1590,7 +2201,7 @@
         <w:tabs>
           <w:tab w:val="num" w:pos="0"/>
         </w:tabs>
-        <w:ind w:left="0" w:firstLine="0"/>
+        <w:ind w:left="0" w:hanging="0"/>
       </w:pPr>
     </w:lvl>
     <w:lvl w:ilvl="4">
@@ -1603,7 +2214,7 @@
         <w:tabs>
           <w:tab w:val="num" w:pos="0"/>
         </w:tabs>
-        <w:ind w:left="0" w:firstLine="0"/>
+        <w:ind w:left="0" w:hanging="0"/>
       </w:pPr>
     </w:lvl>
     <w:lvl w:ilvl="5">
@@ -1616,7 +2227,7 @@
         <w:tabs>
           <w:tab w:val="num" w:pos="0"/>
         </w:tabs>
-        <w:ind w:left="0" w:firstLine="0"/>
+        <w:ind w:left="0" w:hanging="0"/>
       </w:pPr>
     </w:lvl>
     <w:lvl w:ilvl="6">
@@ -1629,7 +2240,7 @@
         <w:tabs>
           <w:tab w:val="num" w:pos="0"/>
         </w:tabs>
-        <w:ind w:left="0" w:firstLine="0"/>
+        <w:ind w:left="0" w:hanging="0"/>
       </w:pPr>
     </w:lvl>
     <w:lvl w:ilvl="7">
@@ -1642,7 +2253,7 @@
         <w:tabs>
           <w:tab w:val="num" w:pos="0"/>
         </w:tabs>
-        <w:ind w:left="0" w:firstLine="0"/>
+        <w:ind w:left="0" w:hanging="0"/>
       </w:pPr>
     </w:lvl>
     <w:lvl w:ilvl="8">
@@ -1655,138 +2266,25 @@
         <w:tabs>
           <w:tab w:val="num" w:pos="0"/>
         </w:tabs>
-        <w:ind w:left="0" w:firstLine="0"/>
+        <w:ind w:left="0" w:hanging="0"/>
       </w:pPr>
     </w:lvl>
   </w:abstractNum>
-  <w:abstractNum w:abstractNumId="1" w15:restartNumberingAfterBreak="0">
-    <w:nsid w:val="53C60888"/>
-    <w:multiLevelType w:val="multilevel"/>
-    <w:tmpl w:val="D0D410AC"/>
-    <w:lvl w:ilvl="0">
-      <w:start w:val="1"/>
-      <w:numFmt w:val="decimal"/>
-      <w:lvlText w:val="%1."/>
-      <w:lvlJc w:val="left"/>
-      <w:pPr>
-        <w:tabs>
-          <w:tab w:val="num" w:pos="0"/>
-        </w:tabs>
-        <w:ind w:left="1080" w:hanging="360"/>
-      </w:pPr>
-    </w:lvl>
-    <w:lvl w:ilvl="1">
-      <w:start w:val="1"/>
-      <w:numFmt w:val="lowerLetter"/>
-      <w:lvlText w:val="%2."/>
-      <w:lvlJc w:val="left"/>
-      <w:pPr>
-        <w:tabs>
-          <w:tab w:val="num" w:pos="0"/>
-        </w:tabs>
-        <w:ind w:left="1800" w:hanging="360"/>
-      </w:pPr>
-    </w:lvl>
-    <w:lvl w:ilvl="2">
-      <w:start w:val="1"/>
-      <w:numFmt w:val="lowerRoman"/>
-      <w:lvlText w:val="%3."/>
-      <w:lvlJc w:val="right"/>
-      <w:pPr>
-        <w:tabs>
-          <w:tab w:val="num" w:pos="0"/>
-        </w:tabs>
-        <w:ind w:left="2520" w:hanging="180"/>
-      </w:pPr>
-    </w:lvl>
-    <w:lvl w:ilvl="3">
-      <w:start w:val="1"/>
-      <w:numFmt w:val="decimal"/>
-      <w:lvlText w:val="%4."/>
-      <w:lvlJc w:val="left"/>
-      <w:pPr>
-        <w:tabs>
-          <w:tab w:val="num" w:pos="0"/>
-        </w:tabs>
-        <w:ind w:left="3240" w:hanging="360"/>
-      </w:pPr>
-    </w:lvl>
-    <w:lvl w:ilvl="4">
-      <w:start w:val="1"/>
-      <w:numFmt w:val="lowerLetter"/>
-      <w:lvlText w:val="%5."/>
-      <w:lvlJc w:val="left"/>
-      <w:pPr>
-        <w:tabs>
-          <w:tab w:val="num" w:pos="0"/>
-        </w:tabs>
-        <w:ind w:left="3960" w:hanging="360"/>
-      </w:pPr>
-    </w:lvl>
-    <w:lvl w:ilvl="5">
-      <w:start w:val="1"/>
-      <w:numFmt w:val="lowerRoman"/>
-      <w:lvlText w:val="%6."/>
-      <w:lvlJc w:val="right"/>
-      <w:pPr>
-        <w:tabs>
-          <w:tab w:val="num" w:pos="0"/>
-        </w:tabs>
-        <w:ind w:left="4680" w:hanging="180"/>
-      </w:pPr>
-    </w:lvl>
-    <w:lvl w:ilvl="6">
-      <w:start w:val="1"/>
-      <w:numFmt w:val="decimal"/>
-      <w:lvlText w:val="%7."/>
-      <w:lvlJc w:val="left"/>
-      <w:pPr>
-        <w:tabs>
-          <w:tab w:val="num" w:pos="0"/>
-        </w:tabs>
-        <w:ind w:left="5400" w:hanging="360"/>
-      </w:pPr>
-    </w:lvl>
-    <w:lvl w:ilvl="7">
-      <w:start w:val="1"/>
-      <w:numFmt w:val="lowerLetter"/>
-      <w:lvlText w:val="%8."/>
-      <w:lvlJc w:val="left"/>
-      <w:pPr>
-        <w:tabs>
-          <w:tab w:val="num" w:pos="0"/>
-        </w:tabs>
-        <w:ind w:left="6120" w:hanging="360"/>
-      </w:pPr>
-    </w:lvl>
-    <w:lvl w:ilvl="8">
-      <w:start w:val="1"/>
-      <w:numFmt w:val="lowerRoman"/>
-      <w:lvlText w:val="%9."/>
-      <w:lvlJc w:val="right"/>
-      <w:pPr>
-        <w:tabs>
-          <w:tab w:val="num" w:pos="0"/>
-        </w:tabs>
-        <w:ind w:left="6840" w:hanging="180"/>
-      </w:pPr>
-    </w:lvl>
-  </w:abstractNum>
-  <w:num w:numId="1" w16cid:durableId="97214339">
+  <w:num w:numId="1">
     <w:abstractNumId w:val="1"/>
   </w:num>
-  <w:num w:numId="2" w16cid:durableId="250429989">
-    <w:abstractNumId w:val="0"/>
+  <w:num w:numId="2">
+    <w:abstractNumId w:val="2"/>
   </w:num>
 </w:numbering>
 </file>
 
 <file path=word/styles.xml><?xml version="1.0" encoding="utf-8"?>
-<w:styles xmlns:mc="http://schemas.openxmlformats.org/markup-compatibility/2006" xmlns:r="http://schemas.openxmlformats.org/officeDocument/2006/relationships" xmlns:w="http://schemas.openxmlformats.org/wordprocessingml/2006/main" xmlns:w14="http://schemas.microsoft.com/office/word/2010/wordml" xmlns:w15="http://schemas.microsoft.com/office/word/2012/wordml" xmlns:w16cex="http://schemas.microsoft.com/office/word/2018/wordml/cex" xmlns:w16cid="http://schemas.microsoft.com/office/word/2016/wordml/cid" xmlns:w16="http://schemas.microsoft.com/office/word/2018/wordml" xmlns:w16du="http://schemas.microsoft.com/office/word/2023/wordml/word16du" xmlns:w16sdtdh="http://schemas.microsoft.com/office/word/2020/wordml/sdtdatahash" xmlns:w16sdtfl="http://schemas.microsoft.com/office/word/2024/wordml/sdtformatlock" xmlns:w16se="http://schemas.microsoft.com/office/word/2015/wordml/symex" mc:Ignorable="w14 w15 w16se w16cid w16 w16cex w16sdtdh w16sdtfl w16du">
+<w:styles xmlns:w="http://schemas.openxmlformats.org/wordprocessingml/2006/main" xmlns:w14="http://schemas.microsoft.com/office/word/2010/wordml" xmlns:mc="http://schemas.openxmlformats.org/markup-compatibility/2006" mc:Ignorable="w14">
   <w:docDefaults>
     <w:rPrDefault>
       <w:rPr>
-        <w:rFonts w:ascii="Times New Roman" w:eastAsia="Times New Roman" w:hAnsi="Times New Roman" w:cs="Times New Roman"/>
+        <w:rFonts w:ascii="Times New Roman" w:hAnsi="Times New Roman" w:eastAsia="Times New Roman" w:cs="Times New Roman"/>
         <w:sz w:val="24"/>
         <w:szCs w:val="24"/>
         <w:lang w:val="en-US" w:eastAsia="ja-JP" w:bidi="ar-SA"/>
@@ -1794,21 +2292,21 @@
     </w:rPrDefault>
     <w:pPrDefault>
       <w:pPr>
-        <w:suppressAutoHyphens/>
+        <w:suppressAutoHyphens w:val="true"/>
       </w:pPr>
     </w:pPrDefault>
   </w:docDefaults>
   <w:latentStyles w:defLockedState="0" w:defUIPriority="99" w:defSemiHidden="0" w:defUnhideWhenUsed="0" w:defQFormat="0" w:count="376">
     <w:lsdException w:name="Normal" w:uiPriority="0" w:qFormat="1"/>
     <w:lsdException w:name="heading 1" w:uiPriority="9" w:qFormat="1"/>
-    <w:lsdException w:name="heading 2" w:semiHidden="1" w:uiPriority="9" w:unhideWhenUsed="1" w:qFormat="1"/>
-    <w:lsdException w:name="heading 3" w:semiHidden="1" w:uiPriority="9" w:unhideWhenUsed="1" w:qFormat="1"/>
-    <w:lsdException w:name="heading 4" w:semiHidden="1" w:uiPriority="9" w:unhideWhenUsed="1" w:qFormat="1"/>
-    <w:lsdException w:name="heading 5" w:semiHidden="1" w:uiPriority="9" w:unhideWhenUsed="1" w:qFormat="1"/>
-    <w:lsdException w:name="heading 6" w:semiHidden="1" w:uiPriority="9" w:unhideWhenUsed="1" w:qFormat="1"/>
-    <w:lsdException w:name="heading 7" w:semiHidden="1" w:uiPriority="9" w:unhideWhenUsed="1" w:qFormat="1"/>
-    <w:lsdException w:name="heading 8" w:semiHidden="1" w:uiPriority="9" w:unhideWhenUsed="1" w:qFormat="1"/>
-    <w:lsdException w:name="heading 9" w:semiHidden="1" w:uiPriority="9" w:unhideWhenUsed="1" w:qFormat="1"/>
+    <w:lsdException w:name="heading 2" w:uiPriority="9" w:semiHidden="1" w:unhideWhenUsed="1" w:qFormat="1"/>
+    <w:lsdException w:name="heading 3" w:uiPriority="9" w:semiHidden="1" w:unhideWhenUsed="1" w:qFormat="1"/>
+    <w:lsdException w:name="heading 4" w:uiPriority="9" w:semiHidden="1" w:unhideWhenUsed="1" w:qFormat="1"/>
+    <w:lsdException w:name="heading 5" w:uiPriority="9" w:semiHidden="1" w:unhideWhenUsed="1" w:qFormat="1"/>
+    <w:lsdException w:name="heading 6" w:uiPriority="9" w:semiHidden="1" w:unhideWhenUsed="1" w:qFormat="1"/>
+    <w:lsdException w:name="heading 7" w:uiPriority="9" w:semiHidden="1" w:unhideWhenUsed="1" w:qFormat="1"/>
+    <w:lsdException w:name="heading 8" w:uiPriority="9" w:semiHidden="1" w:unhideWhenUsed="1" w:qFormat="1"/>
+    <w:lsdException w:name="heading 9" w:uiPriority="9" w:semiHidden="1" w:unhideWhenUsed="1" w:qFormat="1"/>
     <w:lsdException w:name="index 1" w:semiHidden="1" w:unhideWhenUsed="1"/>
     <w:lsdException w:name="index 2" w:semiHidden="1" w:unhideWhenUsed="1"/>
     <w:lsdException w:name="index 3" w:semiHidden="1" w:unhideWhenUsed="1"/>
@@ -1818,22 +2316,22 @@
     <w:lsdException w:name="index 7" w:semiHidden="1" w:unhideWhenUsed="1"/>
     <w:lsdException w:name="index 8" w:semiHidden="1" w:unhideWhenUsed="1"/>
     <w:lsdException w:name="index 9" w:semiHidden="1" w:unhideWhenUsed="1"/>
-    <w:lsdException w:name="toc 1" w:semiHidden="1" w:uiPriority="39" w:unhideWhenUsed="1"/>
-    <w:lsdException w:name="toc 2" w:semiHidden="1" w:uiPriority="39" w:unhideWhenUsed="1"/>
-    <w:lsdException w:name="toc 3" w:semiHidden="1" w:uiPriority="39" w:unhideWhenUsed="1"/>
-    <w:lsdException w:name="toc 4" w:semiHidden="1" w:uiPriority="39" w:unhideWhenUsed="1"/>
-    <w:lsdException w:name="toc 5" w:semiHidden="1" w:uiPriority="39" w:unhideWhenUsed="1"/>
-    <w:lsdException w:name="toc 6" w:semiHidden="1" w:uiPriority="39" w:unhideWhenUsed="1"/>
-    <w:lsdException w:name="toc 7" w:semiHidden="1" w:uiPriority="39" w:unhideWhenUsed="1"/>
-    <w:lsdException w:name="toc 8" w:semiHidden="1" w:uiPriority="39" w:unhideWhenUsed="1"/>
-    <w:lsdException w:name="toc 9" w:semiHidden="1" w:uiPriority="39" w:unhideWhenUsed="1"/>
+    <w:lsdException w:name="toc 1" w:uiPriority="39" w:semiHidden="1" w:unhideWhenUsed="1"/>
+    <w:lsdException w:name="toc 2" w:uiPriority="39" w:semiHidden="1" w:unhideWhenUsed="1"/>
+    <w:lsdException w:name="toc 3" w:uiPriority="39" w:semiHidden="1" w:unhideWhenUsed="1"/>
+    <w:lsdException w:name="toc 4" w:uiPriority="39" w:semiHidden="1" w:unhideWhenUsed="1"/>
+    <w:lsdException w:name="toc 5" w:uiPriority="39" w:semiHidden="1" w:unhideWhenUsed="1"/>
+    <w:lsdException w:name="toc 6" w:uiPriority="39" w:semiHidden="1" w:unhideWhenUsed="1"/>
+    <w:lsdException w:name="toc 7" w:uiPriority="39" w:semiHidden="1" w:unhideWhenUsed="1"/>
+    <w:lsdException w:name="toc 8" w:uiPriority="39" w:semiHidden="1" w:unhideWhenUsed="1"/>
+    <w:lsdException w:name="toc 9" w:uiPriority="39" w:semiHidden="1" w:unhideWhenUsed="1"/>
     <w:lsdException w:name="Normal Indent" w:semiHidden="1" w:unhideWhenUsed="1"/>
     <w:lsdException w:name="footnote text" w:semiHidden="1" w:unhideWhenUsed="1"/>
     <w:lsdException w:name="annotation text" w:semiHidden="1" w:unhideWhenUsed="1"/>
     <w:lsdException w:name="header" w:semiHidden="1" w:unhideWhenUsed="1"/>
     <w:lsdException w:name="footer" w:semiHidden="1" w:unhideWhenUsed="1"/>
     <w:lsdException w:name="index heading" w:semiHidden="1" w:unhideWhenUsed="1"/>
-    <w:lsdException w:name="caption" w:semiHidden="1" w:uiPriority="35" w:unhideWhenUsed="1" w:qFormat="1"/>
+    <w:lsdException w:name="caption" w:uiPriority="35" w:semiHidden="1" w:unhideWhenUsed="1" w:qFormat="1"/>
     <w:lsdException w:name="table of figures" w:semiHidden="1" w:unhideWhenUsed="1"/>
     <w:lsdException w:name="envelope address" w:semiHidden="1" w:unhideWhenUsed="1"/>
     <w:lsdException w:name="envelope return" w:semiHidden="1" w:unhideWhenUsed="1"/>
@@ -1864,7 +2362,7 @@
     <w:lsdException w:name="Title" w:uiPriority="10" w:qFormat="1"/>
     <w:lsdException w:name="Closing" w:semiHidden="1" w:unhideWhenUsed="1"/>
     <w:lsdException w:name="Signature" w:semiHidden="1" w:unhideWhenUsed="1"/>
-    <w:lsdException w:name="Default Paragraph Font" w:semiHidden="1" w:uiPriority="1" w:unhideWhenUsed="1"/>
+    <w:lsdException w:name="Default Paragraph Font" w:uiPriority="1" w:semiHidden="1" w:unhideWhenUsed="1"/>
     <w:lsdException w:name="Body Text" w:semiHidden="1" w:unhideWhenUsed="1"/>
     <w:lsdException w:name="Body Text Indent" w:semiHidden="1" w:unhideWhenUsed="1"/>
     <w:lsdException w:name="List Continue" w:semiHidden="1" w:unhideWhenUsed="1"/>
@@ -2064,8 +2562,8 @@
     <w:lsdException w:name="Subtle Reference" w:uiPriority="31" w:qFormat="1"/>
     <w:lsdException w:name="Intense Reference" w:uiPriority="32" w:qFormat="1"/>
     <w:lsdException w:name="Book Title" w:uiPriority="33" w:qFormat="1"/>
-    <w:lsdException w:name="Bibliography" w:semiHidden="1" w:uiPriority="37" w:unhideWhenUsed="1"/>
-    <w:lsdException w:name="TOC Heading" w:semiHidden="1" w:uiPriority="39" w:unhideWhenUsed="1" w:qFormat="1"/>
+    <w:lsdException w:name="Bibliography" w:uiPriority="37" w:semiHidden="1" w:unhideWhenUsed="1"/>
+    <w:lsdException w:name="TOC Heading" w:uiPriority="39" w:semiHidden="1" w:unhideWhenUsed="1" w:qFormat="1"/>
     <w:lsdException w:name="Plain Table 1" w:uiPriority="41"/>
     <w:lsdException w:name="Plain Table 2" w:uiPriority="42"/>
     <w:lsdException w:name="Plain Table 3" w:uiPriority="43"/>
@@ -2176,29 +2674,44 @@
     <w:lsdException w:name="Unresolved Mention" w:semiHidden="1" w:unhideWhenUsed="1"/>
     <w:lsdException w:name="Smart Link" w:semiHidden="1" w:unhideWhenUsed="1"/>
   </w:latentStyles>
-  <w:style w:type="paragraph" w:default="1" w:styleId="Normal">
+  <w:style w:type="paragraph" w:styleId="Normal" w:default="1">
     <w:name w:val="Normal"/>
     <w:qFormat/>
+    <w:pPr>
+      <w:widowControl/>
+      <w:suppressAutoHyphens w:val="true"/>
+      <w:bidi w:val="0"/>
+      <w:spacing w:before="0" w:after="0"/>
+      <w:jc w:val="left"/>
+    </w:pPr>
+    <w:rPr>
+      <w:rFonts w:ascii="Times New Roman" w:hAnsi="Times New Roman" w:eastAsia="Times New Roman" w:cs="Times New Roman"/>
+      <w:color w:val="auto"/>
+      <w:kern w:val="0"/>
+      <w:sz w:val="24"/>
+      <w:szCs w:val="24"/>
+      <w:lang w:val="en-US" w:eastAsia="ja-JP" w:bidi="ar-SA"/>
+    </w:rPr>
   </w:style>
   <w:style w:type="paragraph" w:styleId="Heading1">
-    <w:name w:val="heading 1"/>
+    <w:name w:val="Heading 1"/>
     <w:basedOn w:val="Normal"/>
     <w:next w:val="Normal"/>
     <w:uiPriority w:val="9"/>
     <w:qFormat/>
     <w:pPr>
-      <w:spacing w:after="167"/>
+      <w:spacing w:before="0" w:after="167"/>
       <w:outlineLvl w:val="0"/>
     </w:pPr>
     <w:rPr>
-      <w:rFonts w:ascii="Arial" w:eastAsia="Arial" w:hAnsi="Arial" w:cs="Arial"/>
+      <w:rFonts w:ascii="Arial" w:hAnsi="Arial" w:eastAsia="Arial" w:cs="Arial"/>
       <w:b/>
       <w:sz w:val="27"/>
       <w:szCs w:val="27"/>
     </w:rPr>
   </w:style>
   <w:style w:type="paragraph" w:styleId="Heading2">
-    <w:name w:val="heading 2"/>
+    <w:name w:val="Heading 2"/>
     <w:basedOn w:val="Normal"/>
     <w:next w:val="Normal"/>
     <w:uiPriority w:val="9"/>
@@ -2206,12 +2719,12 @@
     <w:unhideWhenUsed/>
     <w:qFormat/>
     <w:pPr>
-      <w:keepNext/>
+      <w:keepNext w:val="true"/>
       <w:spacing w:before="240" w:after="60"/>
       <w:outlineLvl w:val="1"/>
     </w:pPr>
     <w:rPr>
-      <w:rFonts w:ascii="Arial" w:eastAsia="Arial" w:hAnsi="Arial" w:cs="Arial"/>
+      <w:rFonts w:ascii="Arial" w:hAnsi="Arial" w:eastAsia="Arial" w:cs="Arial"/>
       <w:b/>
       <w:i/>
       <w:sz w:val="28"/>
@@ -2219,7 +2732,7 @@
     </w:rPr>
   </w:style>
   <w:style w:type="paragraph" w:styleId="Heading3">
-    <w:name w:val="heading 3"/>
+    <w:name w:val="Heading 3"/>
     <w:basedOn w:val="Normal"/>
     <w:next w:val="Normal"/>
     <w:uiPriority w:val="9"/>
@@ -2227,19 +2740,19 @@
     <w:unhideWhenUsed/>
     <w:qFormat/>
     <w:pPr>
-      <w:keepNext/>
+      <w:keepNext w:val="true"/>
       <w:spacing w:before="240" w:after="60"/>
       <w:outlineLvl w:val="2"/>
     </w:pPr>
     <w:rPr>
-      <w:rFonts w:ascii="Arial" w:eastAsia="Arial" w:hAnsi="Arial" w:cs="Arial"/>
+      <w:rFonts w:ascii="Arial" w:hAnsi="Arial" w:eastAsia="Arial" w:cs="Arial"/>
       <w:b/>
       <w:sz w:val="26"/>
       <w:szCs w:val="26"/>
     </w:rPr>
   </w:style>
   <w:style w:type="paragraph" w:styleId="Heading4">
-    <w:name w:val="heading 4"/>
+    <w:name w:val="Heading 4"/>
     <w:basedOn w:val="Normal"/>
     <w:next w:val="Normal"/>
     <w:uiPriority w:val="9"/>
@@ -2247,7 +2760,7 @@
     <w:unhideWhenUsed/>
     <w:qFormat/>
     <w:pPr>
-      <w:keepNext/>
+      <w:keepNext w:val="true"/>
       <w:keepLines/>
       <w:spacing w:before="240" w:after="40"/>
       <w:outlineLvl w:val="3"/>
@@ -2257,7 +2770,7 @@
     </w:rPr>
   </w:style>
   <w:style w:type="paragraph" w:styleId="Heading5">
-    <w:name w:val="heading 5"/>
+    <w:name w:val="Heading 5"/>
     <w:basedOn w:val="Normal"/>
     <w:next w:val="Normal"/>
     <w:uiPriority w:val="9"/>
@@ -2265,7 +2778,7 @@
     <w:unhideWhenUsed/>
     <w:qFormat/>
     <w:pPr>
-      <w:keepNext/>
+      <w:keepNext w:val="true"/>
       <w:keepLines/>
       <w:spacing w:before="220" w:after="40"/>
       <w:outlineLvl w:val="4"/>
@@ -2277,7 +2790,7 @@
     </w:rPr>
   </w:style>
   <w:style w:type="paragraph" w:styleId="Heading6">
-    <w:name w:val="heading 6"/>
+    <w:name w:val="Heading 6"/>
     <w:basedOn w:val="Normal"/>
     <w:next w:val="Normal"/>
     <w:uiPriority w:val="9"/>
@@ -2285,7 +2798,7 @@
     <w:unhideWhenUsed/>
     <w:qFormat/>
     <w:pPr>
-      <w:keepNext/>
+      <w:keepNext w:val="true"/>
       <w:keepLines/>
       <w:spacing w:before="200" w:after="40"/>
       <w:outlineLvl w:val="5"/>
@@ -2296,31 +2809,12 @@
       <w:szCs w:val="20"/>
     </w:rPr>
   </w:style>
-  <w:style w:type="character" w:default="1" w:styleId="DefaultParagraphFont">
+  <w:style w:type="character" w:styleId="DefaultParagraphFont" w:default="1">
     <w:name w:val="Default Paragraph Font"/>
     <w:uiPriority w:val="1"/>
     <w:unhideWhenUsed/>
-  </w:style>
-  <w:style w:type="table" w:default="1" w:styleId="TableNormal">
-    <w:name w:val="Normal Table"/>
-    <w:uiPriority w:val="99"/>
-    <w:semiHidden/>
-    <w:unhideWhenUsed/>
-    <w:tblPr>
-      <w:tblInd w:w="0" w:type="dxa"/>
-      <w:tblCellMar>
-        <w:top w:w="0" w:type="dxa"/>
-        <w:left w:w="108" w:type="dxa"/>
-        <w:bottom w:w="0" w:type="dxa"/>
-        <w:right w:w="108" w:type="dxa"/>
-      </w:tblCellMar>
-    </w:tblPr>
-  </w:style>
-  <w:style w:type="numbering" w:default="1" w:styleId="NoList">
-    <w:name w:val="No List"/>
-    <w:uiPriority w:val="99"/>
-    <w:semiHidden/>
-    <w:unhideWhenUsed/>
+    <w:qFormat/>
+    <w:rPr/>
   </w:style>
   <w:style w:type="character" w:styleId="Hyperlink">
     <w:name w:val="Hyperlink"/>
@@ -2329,17 +2823,72 @@
       <w:u w:val="single"/>
     </w:rPr>
   </w:style>
-  <w:style w:type="paragraph" w:customStyle="1" w:styleId="Heading">
+  <w:style w:type="character" w:styleId="FootnoteTextChar" w:customStyle="1">
+    <w:name w:val="Footnote Text Char"/>
+    <w:basedOn w:val="DefaultParagraphFont"/>
+    <w:link w:val="FootnoteText"/>
+    <w:uiPriority w:val="99"/>
+    <w:semiHidden/>
+    <w:qFormat/>
+    <w:rsid w:val="00531b2d"/>
+    <w:rPr>
+      <w:sz w:val="20"/>
+      <w:szCs w:val="20"/>
+    </w:rPr>
+  </w:style>
+  <w:style w:type="character" w:styleId="FootnoteCharacters">
+    <w:name w:val="Footnote Characters"/>
+    <w:basedOn w:val="DefaultParagraphFont"/>
+    <w:uiPriority w:val="99"/>
+    <w:semiHidden/>
+    <w:unhideWhenUsed/>
+    <w:qFormat/>
+    <w:rsid w:val="00531b2d"/>
+    <w:rPr>
+      <w:vertAlign w:val="superscript"/>
+    </w:rPr>
+  </w:style>
+  <w:style w:type="character" w:styleId="FootnoteReference">
+    <w:name w:val="Footnote Reference"/>
+    <w:rPr>
+      <w:vertAlign w:val="superscript"/>
+    </w:rPr>
+  </w:style>
+  <w:style w:type="character" w:styleId="UnresolvedMention">
+    <w:name w:val="Unresolved Mention"/>
+    <w:basedOn w:val="DefaultParagraphFont"/>
+    <w:uiPriority w:val="99"/>
+    <w:semiHidden/>
+    <w:unhideWhenUsed/>
+    <w:qFormat/>
+    <w:rsid w:val="00531b2d"/>
+    <w:rPr>
+      <w:color w:val="605E5C"/>
+      <w:shd w:fill="E1DFDD" w:val="clear"/>
+    </w:rPr>
+  </w:style>
+  <w:style w:type="character" w:styleId="EndnoteReference">
+    <w:name w:val="Endnote Reference"/>
+    <w:rPr>
+      <w:vertAlign w:val="superscript"/>
+    </w:rPr>
+  </w:style>
+  <w:style w:type="character" w:styleId="EndnoteCharacters">
+    <w:name w:val="Endnote Characters"/>
+    <w:qFormat/>
+    <w:rPr/>
+  </w:style>
+  <w:style w:type="paragraph" w:styleId="Heading" w:customStyle="1">
     <w:name w:val="Heading"/>
     <w:basedOn w:val="Normal"/>
     <w:next w:val="BodyText"/>
     <w:qFormat/>
     <w:pPr>
-      <w:keepNext/>
+      <w:keepNext w:val="true"/>
       <w:spacing w:before="240" w:after="120"/>
     </w:pPr>
     <w:rPr>
-      <w:rFonts w:ascii="Liberation Sans" w:eastAsia="Noto Sans CJK SC" w:hAnsi="Liberation Sans" w:cs="FreeSans"/>
+      <w:rFonts w:ascii="Liberation Sans" w:hAnsi="Liberation Sans" w:eastAsia="Noto Sans CJK SC" w:cs="FreeSans"/>
       <w:sz w:val="28"/>
       <w:szCs w:val="28"/>
     </w:rPr>
@@ -2348,36 +2897,38 @@
     <w:name w:val="Body Text"/>
     <w:basedOn w:val="Normal"/>
     <w:pPr>
-      <w:spacing w:after="140" w:line="276" w:lineRule="auto"/>
+      <w:spacing w:lineRule="auto" w:line="276" w:before="0" w:after="140"/>
     </w:pPr>
+    <w:rPr/>
   </w:style>
   <w:style w:type="paragraph" w:styleId="List">
     <w:name w:val="List"/>
     <w:basedOn w:val="BodyText"/>
+    <w:pPr/>
     <w:rPr>
       <w:rFonts w:cs="FreeSans"/>
     </w:rPr>
   </w:style>
   <w:style w:type="paragraph" w:styleId="Caption">
-    <w:name w:val="caption"/>
+    <w:name w:val="Caption"/>
     <w:basedOn w:val="Normal"/>
     <w:next w:val="Normal"/>
     <w:uiPriority w:val="35"/>
     <w:unhideWhenUsed/>
     <w:qFormat/>
-    <w:rsid w:val="00047A16"/>
+    <w:rsid w:val="00047a16"/>
     <w:pPr>
-      <w:spacing w:after="200"/>
+      <w:spacing w:before="0" w:after="200"/>
     </w:pPr>
     <w:rPr>
       <w:i/>
       <w:iCs/>
-      <w:color w:val="1F497D" w:themeColor="text2"/>
+      <w:color w:themeColor="text2" w:val="1F497D"/>
       <w:sz w:val="18"/>
       <w:szCs w:val="18"/>
     </w:rPr>
   </w:style>
-  <w:style w:type="paragraph" w:customStyle="1" w:styleId="Index">
+  <w:style w:type="paragraph" w:styleId="Index" w:customStyle="1">
     <w:name w:val="Index"/>
     <w:basedOn w:val="Normal"/>
     <w:qFormat/>
@@ -2395,7 +2946,7 @@
     <w:uiPriority w:val="10"/>
     <w:qFormat/>
     <w:pPr>
-      <w:keepNext/>
+      <w:keepNext w:val="true"/>
       <w:keepLines/>
       <w:spacing w:before="480" w:after="120"/>
     </w:pPr>
@@ -2412,12 +2963,12 @@
     <w:uiPriority w:val="11"/>
     <w:qFormat/>
     <w:pPr>
-      <w:keepNext/>
+      <w:keepNext w:val="true"/>
       <w:keepLines/>
       <w:spacing w:before="360" w:after="80"/>
     </w:pPr>
     <w:rPr>
-      <w:rFonts w:ascii="Georgia" w:eastAsia="Georgia" w:hAnsi="Georgia" w:cs="Georgia"/>
+      <w:rFonts w:ascii="Georgia" w:hAnsi="Georgia" w:eastAsia="Georgia" w:cs="Georgia"/>
       <w:i/>
       <w:color w:val="666666"/>
       <w:sz w:val="48"/>
@@ -2429,20 +2980,72 @@
     <w:basedOn w:val="Normal"/>
     <w:uiPriority w:val="34"/>
     <w:qFormat/>
-    <w:rsid w:val="000E1E2C"/>
+    <w:rsid w:val="000e1e2c"/>
     <w:pPr>
+      <w:spacing w:before="0" w:after="0"/>
       <w:ind w:left="720"/>
       <w:contextualSpacing/>
     </w:pPr>
+    <w:rPr/>
   </w:style>
-  <w:style w:type="paragraph" w:customStyle="1" w:styleId="HeaderandFooter">
+  <w:style w:type="paragraph" w:styleId="HeaderandFooter" w:customStyle="1">
     <w:name w:val="Header and Footer"/>
     <w:basedOn w:val="Normal"/>
     <w:qFormat/>
+    <w:pPr/>
+    <w:rPr/>
   </w:style>
   <w:style w:type="paragraph" w:styleId="Header">
-    <w:name w:val="header"/>
+    <w:name w:val="Header"/>
     <w:basedOn w:val="HeaderandFooter"/>
+    <w:pPr/>
+    <w:rPr/>
+  </w:style>
+  <w:style w:type="paragraph" w:styleId="FootnoteText">
+    <w:name w:val="Footnote Text"/>
+    <w:basedOn w:val="Normal"/>
+    <w:link w:val="FootnoteTextChar"/>
+    <w:uiPriority w:val="99"/>
+    <w:semiHidden/>
+    <w:unhideWhenUsed/>
+    <w:rsid w:val="00531b2d"/>
+    <w:pPr/>
+    <w:rPr>
+      <w:sz w:val="20"/>
+      <w:szCs w:val="20"/>
+    </w:rPr>
+  </w:style>
+  <w:style w:type="paragraph" w:styleId="NormalWeb">
+    <w:name w:val="Normal (Web)"/>
+    <w:basedOn w:val="Normal"/>
+    <w:uiPriority w:val="99"/>
+    <w:semiHidden/>
+    <w:unhideWhenUsed/>
+    <w:qFormat/>
+    <w:rsid w:val="00642e30"/>
+    <w:pPr/>
+    <w:rPr/>
+  </w:style>
+  <w:style w:type="numbering" w:styleId="NoList" w:default="1">
+    <w:name w:val="No List"/>
+    <w:uiPriority w:val="99"/>
+    <w:semiHidden/>
+    <w:unhideWhenUsed/>
+    <w:qFormat/>
+  </w:style>
+  <w:style w:type="table" w:default="1" w:styleId="TableNormal">
+    <w:name w:val="Normal Table"/>
+    <w:uiPriority w:val="99"/>
+    <w:semiHidden/>
+    <w:unhideWhenUsed/>
+    <w:tblPr>
+      <w:tblCellMar>
+        <w:top w:w="0" w:type="dxa"/>
+        <w:left w:w="108" w:type="dxa"/>
+        <w:bottom w:w="0" w:type="dxa"/>
+        <w:right w:w="108" w:type="dxa"/>
+      </w:tblCellMar>
+    </w:tblPr>
   </w:style>
   <w:style w:type="table" w:styleId="TableGrid">
     <w:name w:val="Table Grid"/>
@@ -2451,12 +3054,12 @@
     <w:rsid w:val="00195125"/>
     <w:tblPr>
       <w:tblBorders>
-        <w:top w:val="single" w:sz="4" w:space="0" w:color="auto"/>
-        <w:left w:val="single" w:sz="4" w:space="0" w:color="auto"/>
-        <w:bottom w:val="single" w:sz="4" w:space="0" w:color="auto"/>
-        <w:right w:val="single" w:sz="4" w:space="0" w:color="auto"/>
-        <w:insideH w:val="single" w:sz="4" w:space="0" w:color="auto"/>
-        <w:insideV w:val="single" w:sz="4" w:space="0" w:color="auto"/>
+        <w:top w:val="single" w:color="auto" w:sz="4" w:space="0"/>
+        <w:left w:val="single" w:color="auto" w:sz="4" w:space="0"/>
+        <w:bottom w:val="single" w:color="auto" w:sz="4" w:space="0"/>
+        <w:right w:val="single" w:color="auto" w:sz="4" w:space="0"/>
+        <w:insideH w:val="single" w:color="auto" w:sz="4" w:space="0"/>
+        <w:insideV w:val="single" w:color="auto" w:sz="4" w:space="0"/>
       </w:tblBorders>
     </w:tblPr>
   </w:style>
@@ -2469,12 +3072,12 @@
       <w:tblStyleRowBandSize w:val="1"/>
       <w:tblStyleColBandSize w:val="1"/>
       <w:tblBorders>
-        <w:top w:val="single" w:sz="4" w:space="0" w:color="999999" w:themeColor="text1" w:themeTint="66"/>
-        <w:left w:val="single" w:sz="4" w:space="0" w:color="999999" w:themeColor="text1" w:themeTint="66"/>
-        <w:bottom w:val="single" w:sz="4" w:space="0" w:color="999999" w:themeColor="text1" w:themeTint="66"/>
-        <w:right w:val="single" w:sz="4" w:space="0" w:color="999999" w:themeColor="text1" w:themeTint="66"/>
-        <w:insideH w:val="single" w:sz="4" w:space="0" w:color="999999" w:themeColor="text1" w:themeTint="66"/>
-        <w:insideV w:val="single" w:sz="4" w:space="0" w:color="999999" w:themeColor="text1" w:themeTint="66"/>
+        <w:top w:val="single" w:color="999999" w:themeColor="text1" w:themeTint="66" w:sz="4" w:space="0"/>
+        <w:left w:val="single" w:color="999999" w:themeColor="text1" w:themeTint="66" w:sz="4" w:space="0"/>
+        <w:bottom w:val="single" w:color="999999" w:themeColor="text1" w:themeTint="66" w:sz="4" w:space="0"/>
+        <w:right w:val="single" w:color="999999" w:themeColor="text1" w:themeTint="66" w:sz="4" w:space="0"/>
+        <w:insideH w:val="single" w:color="999999" w:themeColor="text1" w:themeTint="66" w:sz="4" w:space="0"/>
+        <w:insideV w:val="single" w:color="999999" w:themeColor="text1" w:themeTint="66" w:sz="4" w:space="0"/>
       </w:tblBorders>
     </w:tblPr>
     <w:tblStylePr w:type="firstRow">
@@ -2485,7 +3088,7 @@
       <w:tblPr/>
       <w:tcPr>
         <w:tcBorders>
-          <w:bottom w:val="single" w:sz="12" w:space="0" w:color="000000" w:themeColor="text1"/>
+          <w:bottom w:val="single" w:color="000000" w:themeColor="text1" w:sz="12" w:space="0"/>
         </w:tcBorders>
       </w:tcPr>
     </w:tblStylePr>
@@ -2497,7 +3100,7 @@
       <w:tblPr/>
       <w:tcPr>
         <w:tcBorders>
-          <w:top w:val="double" w:sz="2" w:space="0" w:color="000000" w:themeColor="text1"/>
+          <w:top w:val="double" w:color="000000" w:themeColor="text1" w:sz="2" w:space="0"/>
         </w:tcBorders>
       </w:tcPr>
     </w:tblStylePr>
@@ -2506,109 +3109,55 @@
         <w:b/>
         <w:bCs/>
       </w:rPr>
+      <w:tblPr/>
     </w:tblStylePr>
     <w:tblStylePr w:type="lastCol">
       <w:rPr>
         <w:b/>
         <w:bCs/>
       </w:rPr>
+      <w:tblPr/>
     </w:tblStylePr>
-  </w:style>
-  <w:style w:type="paragraph" w:styleId="FootnoteText">
-    <w:name w:val="footnote text"/>
-    <w:basedOn w:val="Normal"/>
-    <w:link w:val="FootnoteTextChar"/>
-    <w:uiPriority w:val="99"/>
-    <w:semiHidden/>
-    <w:unhideWhenUsed/>
-    <w:rsid w:val="00531B2D"/>
-    <w:rPr>
-      <w:sz w:val="20"/>
-      <w:szCs w:val="20"/>
-    </w:rPr>
-  </w:style>
-  <w:style w:type="character" w:customStyle="1" w:styleId="FootnoteTextChar">
-    <w:name w:val="Footnote Text Char"/>
-    <w:basedOn w:val="DefaultParagraphFont"/>
-    <w:link w:val="FootnoteText"/>
-    <w:uiPriority w:val="99"/>
-    <w:semiHidden/>
-    <w:rsid w:val="00531B2D"/>
-    <w:rPr>
-      <w:sz w:val="20"/>
-      <w:szCs w:val="20"/>
-    </w:rPr>
-  </w:style>
-  <w:style w:type="character" w:styleId="FootnoteReference">
-    <w:name w:val="footnote reference"/>
-    <w:basedOn w:val="DefaultParagraphFont"/>
-    <w:uiPriority w:val="99"/>
-    <w:semiHidden/>
-    <w:unhideWhenUsed/>
-    <w:rsid w:val="00531B2D"/>
-    <w:rPr>
-      <w:vertAlign w:val="superscript"/>
-    </w:rPr>
-  </w:style>
-  <w:style w:type="character" w:styleId="UnresolvedMention">
-    <w:name w:val="Unresolved Mention"/>
-    <w:basedOn w:val="DefaultParagraphFont"/>
-    <w:uiPriority w:val="99"/>
-    <w:semiHidden/>
-    <w:unhideWhenUsed/>
-    <w:rsid w:val="00531B2D"/>
-    <w:rPr>
-      <w:color w:val="605E5C"/>
-      <w:shd w:val="clear" w:color="auto" w:fill="E1DFDD"/>
-    </w:rPr>
-  </w:style>
-  <w:style w:type="paragraph" w:styleId="NormalWeb">
-    <w:name w:val="Normal (Web)"/>
-    <w:basedOn w:val="Normal"/>
-    <w:uiPriority w:val="99"/>
-    <w:semiHidden/>
-    <w:unhideWhenUsed/>
-    <w:rsid w:val="00642E30"/>
   </w:style>
 </w:styles>
 </file>
 
 <file path=word/theme/theme1.xml><?xml version="1.0" encoding="utf-8"?>
-<a:theme xmlns:a="http://schemas.openxmlformats.org/drawingml/2006/main" name="Office Theme">
+<a:theme xmlns:a="http://schemas.openxmlformats.org/drawingml/2006/main" xmlns:r="http://schemas.openxmlformats.org/officeDocument/2006/relationships" name="Office Theme">
   <a:themeElements>
     <a:clrScheme name="Office">
       <a:dk1>
         <a:srgbClr val="000000"/>
       </a:dk1>
       <a:lt1>
-        <a:srgbClr val="FFFFFF"/>
+        <a:srgbClr val="ffffff"/>
       </a:lt1>
       <a:dk2>
-        <a:srgbClr val="1F497D"/>
+        <a:srgbClr val="1f497d"/>
       </a:dk2>
       <a:lt2>
-        <a:srgbClr val="EEECE1"/>
+        <a:srgbClr val="eeece1"/>
       </a:lt2>
       <a:accent1>
-        <a:srgbClr val="4F81BD"/>
+        <a:srgbClr val="4f81bd"/>
       </a:accent1>
       <a:accent2>
-        <a:srgbClr val="C0504D"/>
+        <a:srgbClr val="c0504d"/>
       </a:accent2>
       <a:accent3>
-        <a:srgbClr val="9BBB59"/>
+        <a:srgbClr val="9bbb59"/>
       </a:accent3>
       <a:accent4>
-        <a:srgbClr val="8064A2"/>
+        <a:srgbClr val="8064a2"/>
       </a:accent4>
       <a:accent5>
-        <a:srgbClr val="4BACC6"/>
+        <a:srgbClr val="4bacc6"/>
       </a:accent5>
       <a:accent6>
-        <a:srgbClr val="F79646"/>
+        <a:srgbClr val="f79646"/>
       </a:accent6>
       <a:hlink>
-        <a:srgbClr val="0000FF"/>
+        <a:srgbClr val="0000ff"/>
       </a:hlink>
       <a:folHlink>
         <a:srgbClr val="800080"/>
@@ -2616,12 +3165,12 @@
     </a:clrScheme>
     <a:fontScheme name="Office">
       <a:majorFont>
-        <a:latin typeface="Calibri"/>
+        <a:latin typeface="Calibri" pitchFamily="0" charset="1"/>
         <a:ea typeface=""/>
         <a:cs typeface=""/>
       </a:majorFont>
       <a:minorFont>
-        <a:latin typeface="Cambria"/>
+        <a:latin typeface="Cambria" pitchFamily="0" charset="1"/>
         <a:ea typeface=""/>
         <a:cs typeface=""/>
       </a:minorFont>
@@ -2650,7 +3199,7 @@
             </a:gs>
           </a:gsLst>
           <a:lin ang="16200000" scaled="1"/>
-          <a:tileRect/>
+          <a:tileRect l="0" t="0" r="0" b="0"/>
         </a:gradFill>
         <a:gradFill>
           <a:gsLst>
@@ -2668,7 +3217,7 @@
             </a:gs>
           </a:gsLst>
           <a:lin ang="16200000" scaled="0"/>
-          <a:tileRect/>
+          <a:tileRect l="0" t="0" r="0" b="0"/>
         </a:gradFill>
       </a:fillStyleLst>
       <a:lnStyleLst>
@@ -2719,7 +3268,7 @@
           <a:path path="circle">
             <a:fillToRect l="50000" t="-80000" r="50000" b="180000"/>
           </a:path>
-          <a:tileRect/>
+          <a:tileRect l="0" t="0" r="0" b="0"/>
         </a:gradFill>
         <a:gradFill>
           <a:gsLst>
@@ -2737,13 +3286,11 @@
           <a:path path="circle">
             <a:fillToRect l="50000" t="50000" r="50000" b="50000"/>
           </a:path>
-          <a:tileRect/>
+          <a:tileRect l="0" t="0" r="0" b="0"/>
         </a:gradFill>
       </a:bgFillStyleLst>
     </a:fmtScheme>
   </a:themeElements>
-  <a:objectDefaults/>
-  <a:extraClrSchemeLst/>
 </a:theme>
 </file>
 

</xml_diff>

<commit_message>
(update): draft for review
</commit_message>
<xml_diff>
--- a/module_summary.docx
+++ b/module_summary.docx
@@ -1,13 +1,15 @@
 
 <file path=word/document.xml><?xml version="1.0" encoding="utf-8"?>
-<w:document xmlns:wpc="http://schemas.microsoft.com/office/word/2010/wordprocessingCanvas" xmlns:cx="http://schemas.microsoft.com/office/drawing/2014/chartex" xmlns:cx1="http://schemas.microsoft.com/office/drawing/2015/9/8/chartex" xmlns:cx2="http://schemas.microsoft.com/office/drawing/2015/10/21/chartex" xmlns:cx3="http://schemas.microsoft.com/office/drawing/2016/5/9/chartex" xmlns:cx4="http://schemas.microsoft.com/office/drawing/2016/5/10/chartex" xmlns:cx5="http://schemas.microsoft.com/office/drawing/2016/5/11/chartex" xmlns:cx6="http://schemas.microsoft.com/office/drawing/2016/5/12/chartex" xmlns:cx7="http://schemas.microsoft.com/office/drawing/2016/5/13/chartex" xmlns:cx8="http://schemas.microsoft.com/office/drawing/2016/5/14/chartex" xmlns:mc="http://schemas.openxmlformats.org/markup-compatibility/2006" xmlns:aink="http://schemas.microsoft.com/office/drawing/2016/ink" xmlns:am3d="http://schemas.microsoft.com/office/drawing/2017/model3d" xmlns:o="urn:schemas-microsoft-com:office:office" xmlns:oel="http://schemas.microsoft.com/office/2019/extlst" xmlns:r="http://schemas.openxmlformats.org/officeDocument/2006/relationships" xmlns:m="http://schemas.openxmlformats.org/officeDocument/2006/math" xmlns:v="urn:schemas-microsoft-com:vml" xmlns:wp14="http://schemas.microsoft.com/office/word/2010/wordprocessingDrawing" xmlns:wp="http://schemas.openxmlformats.org/drawingml/2006/wordprocessingDrawing" xmlns:w10="urn:schemas-microsoft-com:office:word" xmlns:w="http://schemas.openxmlformats.org/wordprocessingml/2006/main" xmlns:w14="http://schemas.microsoft.com/office/word/2010/wordml" xmlns:w15="http://schemas.microsoft.com/office/word/2012/wordml" xmlns:w16cex="http://schemas.microsoft.com/office/word/2018/wordml/cex" xmlns:w16cid="http://schemas.microsoft.com/office/word/2016/wordml/cid" xmlns:w16="http://schemas.microsoft.com/office/word/2018/wordml" xmlns:w16du="http://schemas.microsoft.com/office/word/2023/wordml/word16du" xmlns:w16sdtdh="http://schemas.microsoft.com/office/word/2020/wordml/sdtdatahash" xmlns:w16sdtfl="http://schemas.microsoft.com/office/word/2024/wordml/sdtformatlock" xmlns:w16se="http://schemas.microsoft.com/office/word/2015/wordml/symex" xmlns:wpg="http://schemas.microsoft.com/office/word/2010/wordprocessingGroup" xmlns:wpi="http://schemas.microsoft.com/office/word/2010/wordprocessingInk" xmlns:wne="http://schemas.microsoft.com/office/word/2006/wordml" xmlns:wps="http://schemas.microsoft.com/office/word/2010/wordprocessingShape" mc:Ignorable="w14 w15 w16se w16cid w16 w16cex w16sdtdh w16sdtfl w16du wp14">
+<w:document xmlns:o="urn:schemas-microsoft-com:office:office" xmlns:r="http://schemas.openxmlformats.org/officeDocument/2006/relationships" xmlns:v="urn:schemas-microsoft-com:vml" xmlns:w="http://schemas.openxmlformats.org/wordprocessingml/2006/main" xmlns:w10="urn:schemas-microsoft-com:office:word" xmlns:wp="http://schemas.openxmlformats.org/drawingml/2006/wordprocessingDrawing" xmlns:wps="http://schemas.microsoft.com/office/word/2010/wordprocessingShape" xmlns:wpg="http://schemas.microsoft.com/office/word/2010/wordprocessingGroup" xmlns:mc="http://schemas.openxmlformats.org/markup-compatibility/2006" xmlns:wp14="http://schemas.microsoft.com/office/word/2010/wordprocessingDrawing" xmlns:w14="http://schemas.microsoft.com/office/word/2010/wordml" xmlns:w15="http://schemas.microsoft.com/office/word/2012/wordml" mc:Ignorable="w14 wp14 w15">
   <w:body>
     <w:p>
       <w:pPr>
+        <w:pStyle w:val="Normal"/>
         <w:tabs>
-          <w:tab w:val="left" w:pos="1440"/>
+          <w:tab w:val="clear" w:pos="720"/>
+          <w:tab w:val="left" w:pos="1440" w:leader="none"/>
         </w:tabs>
-        <w:spacing w:before="3600" w:line="480" w:lineRule="auto"/>
+        <w:spacing w:lineRule="auto" w:line="480" w:before="3600" w:after="0"/>
         <w:jc w:val="center"/>
         <w:rPr>
           <w:b/>
@@ -22,34 +24,48 @@
     </w:p>
     <w:p>
       <w:pPr>
-        <w:spacing w:line="480" w:lineRule="auto"/>
+        <w:pStyle w:val="Normal"/>
+        <w:spacing w:lineRule="auto" w:line="480"/>
         <w:jc w:val="center"/>
-      </w:pPr>
-    </w:p>
-    <w:p>
-      <w:pPr>
-        <w:spacing w:line="480" w:lineRule="auto"/>
+        <w:rPr/>
+      </w:pPr>
+      <w:r>
+        <w:rPr/>
+      </w:r>
+    </w:p>
+    <w:p>
+      <w:pPr>
+        <w:pStyle w:val="Normal"/>
+        <w:spacing w:lineRule="auto" w:line="480"/>
         <w:jc w:val="center"/>
-      </w:pPr>
-      <w:r>
+        <w:rPr/>
+      </w:pPr>
+      <w:r>
+        <w:rPr/>
         <w:t>Gene Foxwell</w:t>
       </w:r>
     </w:p>
     <w:p>
       <w:pPr>
-        <w:spacing w:line="480" w:lineRule="auto"/>
+        <w:pStyle w:val="Normal"/>
+        <w:spacing w:lineRule="auto" w:line="480"/>
         <w:jc w:val="center"/>
-      </w:pPr>
-      <w:r>
+        <w:rPr/>
+      </w:pPr>
+      <w:r>
+        <w:rPr/>
         <w:t>Wolf University / Udacity School of Artificial Intelligence</w:t>
       </w:r>
     </w:p>
     <w:p>
       <w:pPr>
-        <w:spacing w:line="480" w:lineRule="auto"/>
+        <w:pStyle w:val="Normal"/>
+        <w:spacing w:lineRule="auto" w:line="480"/>
         <w:jc w:val="center"/>
-      </w:pPr>
-      <w:r>
+        <w:rPr/>
+      </w:pPr>
+      <w:r>
+        <w:rPr/>
         <w:t>Applied Machine Learning</w:t>
       </w:r>
       <w:r>
@@ -58,23 +74,49 @@
     </w:p>
     <w:p>
       <w:pPr>
-        <w:spacing w:line="480" w:lineRule="auto"/>
+        <w:pStyle w:val="Normal"/>
+        <w:spacing w:lineRule="auto" w:line="480" w:before="0" w:after="0"/>
         <w:jc w:val="center"/>
         <w:rPr>
           <w:b/>
         </w:rPr>
       </w:pPr>
       <w:r>
+        <w:rPr/>
+      </w:r>
+    </w:p>
+    <w:p>
+      <w:pPr>
+        <w:pStyle w:val="Normal"/>
+        <w:spacing w:lineRule="auto" w:line="480"/>
+        <w:jc w:val="center"/>
         <w:rPr>
           <w:b/>
         </w:rPr>
-        <w:lastRenderedPageBreak/>
-        <w:t xml:space="preserve"> </w:t>
-      </w:r>
-    </w:p>
-    <w:p>
-      <w:pPr>
-        <w:spacing w:line="480" w:lineRule="auto"/>
+      </w:pPr>
+      <w:r>
+        <w:rPr>
+          <w:b/>
+        </w:rPr>
+        <w:t>Overview</w:t>
+      </w:r>
+    </w:p>
+    <w:p>
+      <w:pPr>
+        <w:pStyle w:val="Normal"/>
+        <w:spacing w:lineRule="auto" w:line="480"/>
+        <w:ind w:firstLine="720"/>
+        <w:rPr/>
+      </w:pPr>
+      <w:r>
+        <w:rPr/>
+        <w:t xml:space="preserve">This project looks at building a Machine Learning Model for predicting if a Star has an Exoplanet based on flux observations from the Kepler Telescope. We will provide an overview of the problem and the dataset. Then we will go over other approaches to this problem. Next, we will build a preprocessing pipeline aimed at performing dimensionality reduction. Finally, we will cover the training of the Support Vector Machine Model and discuss the results. </w:t>
+      </w:r>
+    </w:p>
+    <w:p>
+      <w:pPr>
+        <w:pStyle w:val="Normal"/>
+        <w:spacing w:lineRule="auto" w:line="480"/>
         <w:jc w:val="center"/>
         <w:rPr>
           <w:b/>
@@ -84,109 +126,110 @@
         <w:rPr>
           <w:b/>
         </w:rPr>
-        <w:t>Overview</w:t>
-      </w:r>
-    </w:p>
-    <w:p>
-      <w:pPr>
-        <w:spacing w:line="480" w:lineRule="auto"/>
+      </w:r>
+    </w:p>
+    <w:p>
+      <w:pPr>
+        <w:pStyle w:val="Normal"/>
+        <w:spacing w:lineRule="auto" w:line="480"/>
+        <w:jc w:val="center"/>
+        <w:rPr>
+          <w:b/>
+        </w:rPr>
+      </w:pPr>
+      <w:r>
+        <w:rPr>
+          <w:b/>
+        </w:rPr>
+        <w:t>Dataset</w:t>
+      </w:r>
+    </w:p>
+    <w:p>
+      <w:pPr>
+        <w:pStyle w:val="Normal"/>
+        <w:spacing w:lineRule="auto" w:line="480"/>
         <w:ind w:firstLine="720"/>
-      </w:pPr>
-      <w:r>
-        <w:t xml:space="preserve">This project looks at building a Machine Learning Model for predicting if a Star has an Exoplanet based on flux observations from the Kepler Telescope. We will provide an overview of the problem and the dataset. Then we will go over other approaches to this problem. Next, we will build a preprocessing pipeline aimed at performing dimensionality reduction. Finally, we will cover the training of the Support Vector Machine Model and discuss the results. </w:t>
-      </w:r>
-    </w:p>
-    <w:p>
-      <w:pPr>
-        <w:spacing w:line="480" w:lineRule="auto"/>
-        <w:jc w:val="center"/>
-        <w:rPr>
-          <w:b/>
-        </w:rPr>
-      </w:pPr>
-    </w:p>
-    <w:p>
-      <w:pPr>
-        <w:spacing w:line="480" w:lineRule="auto"/>
-        <w:jc w:val="center"/>
-        <w:rPr>
-          <w:b/>
-        </w:rPr>
-      </w:pPr>
-      <w:r>
-        <w:rPr>
-          <w:b/>
-        </w:rPr>
-        <w:t>Dataset</w:t>
-      </w:r>
-    </w:p>
-    <w:p>
-      <w:pPr>
-        <w:spacing w:line="480" w:lineRule="auto"/>
+        <w:rPr/>
+      </w:pPr>
+      <w:r>
+        <w:rPr/>
+        <w:t>We are using the version of this dataset hosted by Kaggle.  The dataset is provided in two parts: A training dataset, and A test dataset. Both datasets are extremely unbalanced – the training dataset has 5087 rows of which only 37 represents planets. The test dataset has 571 rows, of which only 5 are planets! The challenges this present will be discussed later in this paper.</w:t>
+      </w:r>
+    </w:p>
+    <w:p>
+      <w:pPr>
+        <w:pStyle w:val="Normal"/>
+        <w:spacing w:lineRule="auto" w:line="480"/>
         <w:ind w:firstLine="720"/>
-      </w:pPr>
-      <w:r>
-        <w:t>We are using the version of this dataset hosted by Kaggle.  The dataset is provided in two parts: A training dataset, and A test dataset. Both datasets are extremely unbalanced – the training dataset has 5087 rows of which only 37 represents planets. The test dataset has 571 rows, of which only 5 are planets! The challenges this present will be discussed later in this paper.</w:t>
-      </w:r>
-    </w:p>
-    <w:p>
-      <w:pPr>
-        <w:spacing w:line="480" w:lineRule="auto"/>
+        <w:rPr/>
+      </w:pPr>
+      <w:r>
+        <w:rPr/>
+        <w:t xml:space="preserve">Each row of the dataset has 3198 columns. The first column is the label. 1 -&gt; Low probability of a planet around the candidate star, 2 -&gt; High probability of planet around the candidate star. The remaining 3197 columns are the flux observations as recorded from the Kepler Telescope. </w:t>
+      </w:r>
+    </w:p>
+    <w:p>
+      <w:pPr>
+        <w:pStyle w:val="Normal"/>
+        <w:spacing w:lineRule="auto" w:line="480"/>
         <w:ind w:firstLine="720"/>
-      </w:pPr>
-      <w:r>
-        <w:t xml:space="preserve">Each row of the dataset has 3198 columns. The first column is the label. 1 -&gt; Low probability of a planet around the candidate star, 2 -&gt; High probability of planet around the candidate star. The remaining 3197 columns are the flux observations as recorded from the Kepler Telescope. </w:t>
-      </w:r>
-    </w:p>
-    <w:p>
-      <w:pPr>
-        <w:spacing w:line="480" w:lineRule="auto"/>
+        <w:rPr/>
+      </w:pPr>
+      <w:r>
+        <w:rPr/>
+        <w:t>Flux, in the context of astronomy, is defined as the amount of energy received from a celestial object per unit area, per unit time. It is effectively a way of measuring how much energy is received from the star.</w:t>
+      </w:r>
+    </w:p>
+    <w:p>
+      <w:pPr>
+        <w:pStyle w:val="Normal"/>
+        <w:spacing w:lineRule="auto" w:line="480"/>
         <w:ind w:firstLine="720"/>
-      </w:pPr>
-      <w:r>
-        <w:t>Flux, in the context of astronomy, is defined as the amount of energy received from a celestial object per unit area, per unit time. It is effectively a way of measuring how much energy is received from the star.</w:t>
-      </w:r>
-    </w:p>
-    <w:p>
-      <w:pPr>
-        <w:spacing w:line="480" w:lineRule="auto"/>
+        <w:rPr/>
+      </w:pPr>
+      <w:r>
+        <w:rPr/>
+        <w:t xml:space="preserve">The idea behind planet detection in this context is that when an exoplanet passes between the Star and Earth, the flux we detect from that star will decrease as some of that flux has been blocked off by the exoplanet. </w:t>
+      </w:r>
+    </w:p>
+    <w:p>
+      <w:pPr>
+        <w:pStyle w:val="Normal"/>
+        <w:spacing w:lineRule="auto" w:line="480"/>
         <w:ind w:firstLine="720"/>
-      </w:pPr>
-      <w:r>
-        <w:lastRenderedPageBreak/>
-        <w:t xml:space="preserve">The idea behind planet detection in this context is that when an exoplanet passes between the Star and Earth, the flux we detect from that star will decrease as some of that flux has been blocked off by the exoplanet. </w:t>
-      </w:r>
-    </w:p>
-    <w:p>
-      <w:pPr>
-        <w:spacing w:line="480" w:lineRule="auto"/>
+        <w:rPr/>
+      </w:pPr>
+      <w:r>
+        <w:rPr/>
+        <w:t>As we can see from figure 1, the flux data collected is extremely noisy. Much of our work in the next section will focus on cleaning up this noise to enable the Machine Learning Model to work effectively.</w:t>
+      </w:r>
+    </w:p>
+    <w:p>
+      <w:pPr>
+        <w:pStyle w:val="Normal"/>
+        <w:spacing w:lineRule="auto" w:line="480"/>
         <w:ind w:firstLine="720"/>
-      </w:pPr>
-      <w:r>
-        <w:t>As we can see from figure 1, the flux data collected is extremely noisy. Much of our work in the next section will focus on cleaning up this noise to enable the Machine Learning Model to work effectively.</w:t>
-      </w:r>
-    </w:p>
-    <w:p>
-      <w:pPr>
-        <w:spacing w:line="480" w:lineRule="auto"/>
+        <w:rPr/>
+      </w:pPr>
+      <w:r>
+        <w:rPr/>
+      </w:r>
+    </w:p>
+    <w:p>
+      <w:pPr>
+        <w:pStyle w:val="Normal"/>
+        <w:keepNext w:val="true"/>
+        <w:spacing w:lineRule="auto" w:line="480"/>
         <w:ind w:firstLine="720"/>
-      </w:pPr>
-    </w:p>
-    <w:p>
-      <w:pPr>
-        <w:keepNext/>
-        <w:spacing w:line="480" w:lineRule="auto"/>
-        <w:ind w:firstLine="720"/>
-      </w:pPr>
-      <w:r>
-        <w:rPr>
-          <w:noProof/>
-        </w:rPr>
+        <w:rPr/>
+      </w:pPr>
+      <w:r>
+        <w:rPr/>
         <w:drawing>
-          <wp:inline distT="0" distB="0" distL="0" distR="0" wp14:anchorId="329E599E" wp14:editId="7FE0D3FE">
+          <wp:inline distT="0" distB="0" distL="0" distR="0">
             <wp:extent cx="5941060" cy="3169285"/>
             <wp:effectExtent l="0" t="0" r="0" b="0"/>
-            <wp:docPr id="1" name="Picture 3"/>
+            <wp:docPr id="1" name="Picture 3" descr=""/>
             <wp:cNvGraphicFramePr>
               <a:graphicFrameLocks xmlns:a="http://schemas.openxmlformats.org/drawingml/2006/main" noChangeAspect="1"/>
             </wp:cNvGraphicFramePr>
@@ -194,13 +237,13 @@
               <a:graphicData uri="http://schemas.openxmlformats.org/drawingml/2006/picture">
                 <pic:pic xmlns:pic="http://schemas.openxmlformats.org/drawingml/2006/picture">
                   <pic:nvPicPr>
-                    <pic:cNvPr id="1" name="Picture 3"/>
+                    <pic:cNvPr id="1" name="Picture 3" descr=""/>
                     <pic:cNvPicPr>
                       <a:picLocks noChangeAspect="1" noChangeArrowheads="1"/>
                     </pic:cNvPicPr>
                   </pic:nvPicPr>
                   <pic:blipFill>
-                    <a:blip r:embed="rId8"/>
+                    <a:blip r:embed="rId2"/>
                     <a:stretch>
                       <a:fillRect/>
                     </a:stretch>
@@ -225,31 +268,56 @@
       <w:pPr>
         <w:pStyle w:val="Caption"/>
         <w:jc w:val="center"/>
-      </w:pPr>
-      <w:r>
+        <w:rPr/>
+      </w:pPr>
+      <w:r>
+        <w:rPr/>
         <w:t xml:space="preserve">Figure </w:t>
       </w:r>
-      <w:fldSimple w:instr=" SEQ Figure \* ARABIC ">
-        <w:r>
-          <w:t>1</w:t>
-        </w:r>
-      </w:fldSimple>
-      <w:r>
+      <w:r>
+        <w:rPr/>
+        <w:fldChar w:fldCharType="begin"/>
+      </w:r>
+      <w:r>
+        <w:rPr/>
+        <w:instrText xml:space="preserve"> SEQ Figure \* ARABIC </w:instrText>
+      </w:r>
+      <w:r>
+        <w:rPr/>
+        <w:fldChar w:fldCharType="separate"/>
+      </w:r>
+      <w:r>
+        <w:rPr/>
+        <w:t>1</w:t>
+      </w:r>
+      <w:r>
+        <w:rPr/>
+        <w:fldChar w:fldCharType="end"/>
+      </w:r>
+      <w:r>
+        <w:rPr/>
         <w:t xml:space="preserve"> Same of Planet vs. No Planet Observations</w:t>
       </w:r>
     </w:p>
     <w:p>
       <w:pPr>
-        <w:spacing w:line="480" w:lineRule="auto"/>
+        <w:pStyle w:val="Normal"/>
+        <w:spacing w:lineRule="auto" w:line="480"/>
         <w:jc w:val="center"/>
         <w:rPr>
           <w:b/>
         </w:rPr>
       </w:pPr>
-    </w:p>
-    <w:p>
-      <w:pPr>
-        <w:spacing w:line="480" w:lineRule="auto"/>
+      <w:r>
+        <w:rPr>
+          <w:b/>
+        </w:rPr>
+      </w:r>
+    </w:p>
+    <w:p>
+      <w:pPr>
+        <w:pStyle w:val="Normal"/>
+        <w:spacing w:lineRule="auto" w:line="480"/>
         <w:jc w:val="center"/>
         <w:rPr>
           <w:b/>
@@ -264,13 +332,15 @@
     </w:p>
     <w:p>
       <w:pPr>
-        <w:spacing w:line="480" w:lineRule="auto"/>
+        <w:pStyle w:val="Normal"/>
+        <w:spacing w:lineRule="auto" w:line="480"/>
         <w:ind w:firstLine="720"/>
         <w:rPr>
           <w:lang w:val="en-CA"/>
         </w:rPr>
       </w:pPr>
       <w:r>
+        <w:rPr/>
         <w:t>While researching this dataset, we came across two other approaches to the Kepler dataset. (</w:t>
       </w:r>
       <w:r>
@@ -280,6 +350,7 @@
         <w:t xml:space="preserve">Airlangga, G. 2024) </w:t>
       </w:r>
       <w:r>
+        <w:rPr/>
         <w:t>and (</w:t>
       </w:r>
       <w:r>
@@ -289,30 +360,25 @@
         <w:t>Reihaneh Karimi et all 2025</w:t>
       </w:r>
       <w:r>
-        <w:t xml:space="preserve">) approach comparing the results of a variety of ML Models. It did not appear from either paper that they attempted dimensionality reduction akin to our approach here – although the precise details of the </w:t>
-      </w:r>
-      <w:r>
-        <w:lastRenderedPageBreak/>
-        <w:t xml:space="preserve">preprocessing done are shallow in both papers. Both mention the use of a Fast Fourier Transform (double check), an approach which we also take here, before preforming our </w:t>
-      </w:r>
-      <w:proofErr w:type="gramStart"/>
-      <w:r>
-        <w:t>dimensionality</w:t>
-      </w:r>
-      <w:proofErr w:type="gramEnd"/>
-      <w:r>
-        <w:t xml:space="preserve"> reducing operation.</w:t>
-      </w:r>
-    </w:p>
-    <w:p>
-      <w:pPr>
-        <w:spacing w:line="480" w:lineRule="auto"/>
+        <w:rPr/>
+        <w:t>) approach comparing the results of a variety of ML Models. It did not appear from either paper that they attempted dimensionality reduction akin to our approach here – although the precise details of the preprocessing done are shallow in both papers. Both mention the use of a Fast Fourier Transform (double check), an approach which we also take here, before preforming our dimensionality reducing operation.</w:t>
+      </w:r>
+    </w:p>
+    <w:p>
+      <w:pPr>
+        <w:pStyle w:val="Normal"/>
+        <w:spacing w:lineRule="auto" w:line="480"/>
         <w:ind w:firstLine="720"/>
-      </w:pPr>
-    </w:p>
-    <w:p>
-      <w:pPr>
-        <w:spacing w:line="480" w:lineRule="auto"/>
+        <w:rPr/>
+      </w:pPr>
+      <w:r>
+        <w:rPr/>
+      </w:r>
+    </w:p>
+    <w:p>
+      <w:pPr>
+        <w:pStyle w:val="Normal"/>
+        <w:spacing w:lineRule="auto" w:line="480"/>
         <w:jc w:val="center"/>
         <w:rPr>
           <w:b/>
@@ -327,17 +393,14 @@
     </w:p>
     <w:p>
       <w:pPr>
-        <w:spacing w:line="480" w:lineRule="auto"/>
+        <w:pStyle w:val="Normal"/>
+        <w:spacing w:lineRule="auto" w:line="480"/>
         <w:ind w:firstLine="720"/>
-      </w:pPr>
-      <w:r>
-        <w:t>For our approach we focused on creating a reduced dimensional set of features for input into a Support Vector Machine</w:t>
-      </w:r>
-      <w:r>
-        <w:t xml:space="preserve"> (Cortes 1995)</w:t>
-      </w:r>
-      <w:r>
-        <w:t>. Our general idea was to find a way to encode the fact that planets induce a reduction in flux directly into our features. To this end, our prepossessing and feature engineering pipeline consisted of the following steps:</w:t>
+        <w:rPr/>
+      </w:pPr>
+      <w:r>
+        <w:rPr/>
+        <w:t>For our approach we focused on creating a reduced dimensional set of features for input into a Support Vector Machine (Cortes 1995). Our general idea was to find a way to encode the fact that planets induce a reduction in flux directly into our features. To this end, our prepossessing and feature engineering pipeline consisted of the following steps:</w:t>
       </w:r>
     </w:p>
     <w:p>
@@ -347,56 +410,19 @@
           <w:ilvl w:val="0"/>
           <w:numId w:val="1"/>
         </w:numPr>
-        <w:spacing w:line="480" w:lineRule="auto"/>
+        <w:spacing w:lineRule="auto" w:line="480"/>
+        <w:rPr/>
       </w:pPr>
       <w:r>
         <w:rPr>
           <w:i/>
           <w:iCs/>
         </w:rPr>
-        <w:t>Fast Fourier Transform (FFT</w:t>
-      </w:r>
-      <w:r>
-        <w:rPr>
-          <w:i/>
-          <w:iCs/>
-        </w:rPr>
-        <w:t>)</w:t>
-      </w:r>
-      <w:r>
-        <w:rPr>
-          <w:i/>
-          <w:iCs/>
-        </w:rPr>
-        <w:t>:</w:t>
-      </w:r>
-      <w:r>
-        <w:t xml:space="preserve"> </w:t>
-      </w:r>
-      <w:r>
-        <w:t xml:space="preserve">We used </w:t>
-      </w:r>
-      <w:proofErr w:type="spellStart"/>
-      <w:r>
-        <w:t>scipy’s</w:t>
-      </w:r>
-      <w:proofErr w:type="spellEnd"/>
-      <w:r>
-        <w:t xml:space="preserve"> </w:t>
-      </w:r>
-      <w:proofErr w:type="spellStart"/>
-      <w:r>
-        <w:t>rfft</w:t>
-      </w:r>
-      <w:proofErr w:type="spellEnd"/>
-      <w:r>
-        <w:t xml:space="preserve"> function to compute a 1-D Fast Fourier Transform</w:t>
-      </w:r>
-      <w:r>
-        <w:t xml:space="preserve"> (Cooley 1965)</w:t>
-      </w:r>
-      <w:r>
-        <w:t xml:space="preserve"> for each row. This effectively converted our domain to the frequency domain. The idea here is that a consistent “dip” in flux measurements would show up as change in the frequency response.</w:t>
+        <w:t>Fast Fourier Transform (FFT):</w:t>
+      </w:r>
+      <w:r>
+        <w:rPr/>
+        <w:t xml:space="preserve"> We used scipy’s rfft function to compute a 1-D Fast Fourier Transform (Cooley 1965) for each row. This effectively converted our domain to the frequency domain. The idea here is that a consistent “dip” in flux measurements would show up as change in the frequency response.</w:t>
       </w:r>
     </w:p>
     <w:p>
@@ -406,7 +432,8 @@
           <w:ilvl w:val="0"/>
           <w:numId w:val="1"/>
         </w:numPr>
-        <w:spacing w:line="480" w:lineRule="auto"/>
+        <w:spacing w:lineRule="auto" w:line="480"/>
+        <w:rPr/>
       </w:pPr>
       <w:r>
         <w:rPr>
@@ -416,23 +443,8 @@
         <w:t>Binned Z-Scores:</w:t>
       </w:r>
       <w:r>
-        <w:t xml:space="preserve"> This was the primary means via which we reduced the dimensionality of the data. For each row we calculated the </w:t>
-      </w:r>
-      <w:proofErr w:type="gramStart"/>
-      <w:r>
-        <w:t>mean</w:t>
-      </w:r>
-      <w:proofErr w:type="gramEnd"/>
-      <w:r>
-        <w:t xml:space="preserve"> of the row. Then we divided the row into bins of 16 observations each. We returned a Z-Score for each bin. The Z-Score is the number of standard deviations a value is above or below the </w:t>
-      </w:r>
-      <w:proofErr w:type="gramStart"/>
-      <w:r>
-        <w:t>mean</w:t>
-      </w:r>
-      <w:proofErr w:type="gramEnd"/>
-      <w:r>
-        <w:t>. This resulted in dimensionality reduction of 3197 features down to 100 features.</w:t>
+        <w:rPr/>
+        <w:t xml:space="preserve"> This was the primary means via which we reduced the dimensionality of the data. For each row we calculated the mean of the row. Then we divided the row into bins of 16 observations each. We returned a Z-Score for each bin. The Z-Score is the number of standard deviations a value is above or below the mean. This resulted in dimensionality reduction of 3197 features down to 100 features.</w:t>
       </w:r>
     </w:p>
     <w:p>
@@ -442,7 +454,8 @@
           <w:ilvl w:val="0"/>
           <w:numId w:val="1"/>
         </w:numPr>
-        <w:spacing w:line="480" w:lineRule="auto"/>
+        <w:spacing w:lineRule="auto" w:line="480"/>
+        <w:rPr/>
       </w:pPr>
       <w:r>
         <w:rPr>
@@ -452,49 +465,35 @@
         <w:t>Standardization:</w:t>
       </w:r>
       <w:r>
-        <w:t xml:space="preserve"> This step transformed the data, so it has mean 0 and standard deviation 1. This was used to keep the data roughly in the same scale to avoid larger values biasing the model.</w:t>
-      </w:r>
-      <w:r>
-        <w:t xml:space="preserve"> </w:t>
-      </w:r>
-    </w:p>
-    <w:p>
-      <w:pPr>
-        <w:spacing w:line="480" w:lineRule="auto"/>
-      </w:pPr>
-      <w:r>
-        <w:lastRenderedPageBreak/>
-        <w:t xml:space="preserve">Note: Scaling and Standardization combined have been shown to improve classification accuracy in machine learning models.  </w:t>
-      </w:r>
-      <w:r>
-        <w:t>Cao</w:t>
-      </w:r>
-      <w:r>
-        <w:t xml:space="preserve"> 2016 provides an example of </w:t>
-      </w:r>
-      <w:proofErr w:type="gramStart"/>
-      <w:r>
-        <w:t>this as</w:t>
-      </w:r>
-      <w:proofErr w:type="gramEnd"/>
-      <w:r>
-        <w:t xml:space="preserve"> applied to bio-medical data.</w:t>
-      </w:r>
-    </w:p>
-    <w:p>
-      <w:pPr>
-        <w:keepNext/>
-        <w:spacing w:line="480" w:lineRule="auto"/>
-      </w:pPr>
-      <w:r>
-        <w:rPr>
-          <w:noProof/>
-        </w:rPr>
+        <w:rPr/>
+        <w:t xml:space="preserve"> This step transformed the data, so it has mean 0 and standard deviation 1. This was used to keep the data roughly in the same scale to avoid larger values biasing the model. </w:t>
+      </w:r>
+    </w:p>
+    <w:p>
+      <w:pPr>
+        <w:pStyle w:val="Normal"/>
+        <w:spacing w:lineRule="auto" w:line="480"/>
+        <w:rPr/>
+      </w:pPr>
+      <w:r>
+        <w:rPr/>
+        <w:t>Note: Scaling and Standardization combined have been shown to improve classification accuracy in machine learning models.  Cao 2016 provides an example of this as applied to bio-medical data.</w:t>
+      </w:r>
+    </w:p>
+    <w:p>
+      <w:pPr>
+        <w:pStyle w:val="Normal"/>
+        <w:keepNext w:val="true"/>
+        <w:spacing w:lineRule="auto" w:line="480"/>
+        <w:rPr/>
+      </w:pPr>
+      <w:r>
+        <w:rPr/>
         <w:drawing>
-          <wp:inline distT="0" distB="0" distL="0" distR="0" wp14:anchorId="6F31B00E" wp14:editId="603C01CB">
+          <wp:inline distT="0" distB="0" distL="0" distR="0">
             <wp:extent cx="5941060" cy="2771140"/>
             <wp:effectExtent l="0" t="0" r="0" b="0"/>
-            <wp:docPr id="2" name="Picture 7"/>
+            <wp:docPr id="2" name="Picture 7" descr=""/>
             <wp:cNvGraphicFramePr>
               <a:graphicFrameLocks xmlns:a="http://schemas.openxmlformats.org/drawingml/2006/main" noChangeAspect="1"/>
             </wp:cNvGraphicFramePr>
@@ -502,13 +501,13 @@
               <a:graphicData uri="http://schemas.openxmlformats.org/drawingml/2006/picture">
                 <pic:pic xmlns:pic="http://schemas.openxmlformats.org/drawingml/2006/picture">
                   <pic:nvPicPr>
-                    <pic:cNvPr id="2" name="Picture 7"/>
+                    <pic:cNvPr id="2" name="Picture 7" descr=""/>
                     <pic:cNvPicPr>
                       <a:picLocks noChangeAspect="1" noChangeArrowheads="1"/>
                     </pic:cNvPicPr>
                   </pic:nvPicPr>
                   <pic:blipFill>
-                    <a:blip r:embed="rId9"/>
+                    <a:blip r:embed="rId3"/>
                     <a:stretch>
                       <a:fillRect/>
                     </a:stretch>
@@ -533,41 +532,68 @@
       <w:pPr>
         <w:pStyle w:val="Caption"/>
         <w:jc w:val="center"/>
-      </w:pPr>
-      <w:r>
+        <w:rPr/>
+      </w:pPr>
+      <w:r>
+        <w:rPr/>
         <w:t xml:space="preserve">Figure </w:t>
       </w:r>
-      <w:fldSimple w:instr=" SEQ Figure \* ARABIC ">
-        <w:r>
-          <w:t>2</w:t>
-        </w:r>
-      </w:fldSimple>
-      <w:r>
+      <w:r>
+        <w:rPr/>
+        <w:fldChar w:fldCharType="begin"/>
+      </w:r>
+      <w:r>
+        <w:rPr/>
+        <w:instrText xml:space="preserve"> SEQ Figure \* ARABIC </w:instrText>
+      </w:r>
+      <w:r>
+        <w:rPr/>
+        <w:fldChar w:fldCharType="separate"/>
+      </w:r>
+      <w:r>
+        <w:rPr/>
+        <w:t>2</w:t>
+      </w:r>
+      <w:r>
+        <w:rPr/>
+        <w:fldChar w:fldCharType="end"/>
+      </w:r>
+      <w:r>
+        <w:rPr/>
         <w:t xml:space="preserve"> Binned Z-Score Visualization</w:t>
       </w:r>
     </w:p>
     <w:p>
       <w:pPr>
-        <w:spacing w:line="480" w:lineRule="auto"/>
-      </w:pPr>
-      <w:r>
+        <w:pStyle w:val="Normal"/>
+        <w:spacing w:lineRule="auto" w:line="480"/>
+        <w:rPr/>
+      </w:pPr>
+      <w:r>
+        <w:rPr/>
         <w:tab/>
       </w:r>
     </w:p>
     <w:p>
       <w:pPr>
-        <w:spacing w:line="480" w:lineRule="auto"/>
-      </w:pPr>
-      <w:r>
+        <w:pStyle w:val="Normal"/>
+        <w:spacing w:lineRule="auto" w:line="480"/>
+        <w:rPr/>
+      </w:pPr>
+      <w:r>
+        <w:rPr/>
         <w:tab/>
         <w:t>Figure 2 provides a visualization of the features after prepossessing, showing results for a Star both with and without an Exoplanet. We can see evidence of a “dip” two standard deviations below the mean right at the start of the observation. (Shown in green)</w:t>
       </w:r>
     </w:p>
     <w:p>
       <w:pPr>
-        <w:spacing w:line="480" w:lineRule="auto"/>
-      </w:pPr>
-      <w:r>
+        <w:pStyle w:val="Normal"/>
+        <w:spacing w:lineRule="auto" w:line="480"/>
+        <w:rPr/>
+      </w:pPr>
+      <w:r>
+        <w:rPr/>
         <w:tab/>
         <w:t>After testing the initial model with the transformed features, we fine-tuned the Support Vector Machine using Grid Search CV. We used the following parameters for our search:</w:t>
       </w:r>
@@ -576,11 +602,19 @@
       <w:tblPr>
         <w:tblStyle w:val="GridTable1Light"/>
         <w:tblW w:w="9350" w:type="dxa"/>
+        <w:jc w:val="left"/>
+        <w:tblInd w:w="0" w:type="dxa"/>
         <w:tblLayout w:type="fixed"/>
-        <w:tblLook w:val="04A0" w:firstRow="1" w:lastRow="0" w:firstColumn="1" w:lastColumn="0" w:noHBand="0" w:noVBand="1"/>
+        <w:tblCellMar>
+          <w:top w:w="0" w:type="dxa"/>
+          <w:left w:w="108" w:type="dxa"/>
+          <w:bottom w:w="0" w:type="dxa"/>
+          <w:right w:w="108" w:type="dxa"/>
+        </w:tblCellMar>
+        <w:tblLook w:val="04a0" w:noHBand="0" w:noVBand="1" w:firstColumn="1" w:lastRow="0" w:lastColumn="0" w:firstRow="1"/>
       </w:tblPr>
       <w:tblGrid>
-        <w:gridCol w:w="4676"/>
+        <w:gridCol w:w="4675"/>
         <w:gridCol w:w="4674"/>
       </w:tblGrid>
       <w:tr>
@@ -589,17 +623,39 @@
         </w:trPr>
         <w:tc>
           <w:tcPr>
+            <w:tcW w:w="4675" w:type="dxa"/>
             <w:cnfStyle w:val="001000000000" w:firstRow="0" w:lastRow="0" w:firstColumn="1" w:lastColumn="0" w:oddVBand="0" w:evenVBand="0" w:oddHBand="0" w:evenHBand="0" w:firstRowFirstColumn="0" w:firstRowLastColumn="0" w:lastRowFirstColumn="0" w:lastRowLastColumn="0"/>
-            <w:tcW w:w="4675" w:type="dxa"/>
             <w:tcBorders>
               <w:bottom w:val="single" w:sz="12" w:space="0" w:color="666666"/>
             </w:tcBorders>
           </w:tcPr>
           <w:p>
             <w:pPr>
-              <w:spacing w:line="480" w:lineRule="auto"/>
+              <w:pStyle w:val="Normal"/>
+              <w:widowControl/>
+              <w:suppressAutoHyphens w:val="true"/>
+              <w:spacing w:lineRule="auto" w:line="480" w:before="0" w:after="0"/>
+              <w:jc w:val="left"/>
+              <w:rPr>
+                <w:rFonts w:ascii="Times New Roman" w:hAnsi="Times New Roman" w:eastAsia="Times New Roman" w:cs="Times New Roman"/>
+                <w:b/>
+                <w:bCs/>
+                <w:kern w:val="0"/>
+                <w:sz w:val="24"/>
+                <w:szCs w:val="24"/>
+                <w:lang w:val="en-US" w:eastAsia="ja-JP" w:bidi="ar-SA"/>
+              </w:rPr>
             </w:pPr>
             <w:r>
+              <w:rPr>
+                <w:rFonts w:eastAsia="Times New Roman" w:cs="Times New Roman"/>
+                <w:b/>
+                <w:bCs/>
+                <w:kern w:val="0"/>
+                <w:sz w:val="24"/>
+                <w:szCs w:val="24"/>
+                <w:lang w:val="en-US" w:eastAsia="ja-JP" w:bidi="ar-SA"/>
+              </w:rPr>
               <w:t>Parameter</w:t>
             </w:r>
           </w:p>
@@ -613,26 +669,72 @@
           </w:tcPr>
           <w:p>
             <w:pPr>
-              <w:spacing w:line="480" w:lineRule="auto"/>
+              <w:pStyle w:val="Normal"/>
+              <w:widowControl/>
+              <w:suppressAutoHyphens w:val="true"/>
+              <w:spacing w:lineRule="auto" w:line="480" w:before="0" w:after="0"/>
+              <w:jc w:val="left"/>
               <w:cnfStyle w:val="100000000000" w:firstRow="1" w:lastRow="0" w:firstColumn="0" w:lastColumn="0" w:oddVBand="0" w:evenVBand="0" w:oddHBand="0" w:evenHBand="0" w:firstRowFirstColumn="0" w:firstRowLastColumn="0" w:lastRowFirstColumn="0" w:lastRowLastColumn="0"/>
+              <w:rPr>
+                <w:rFonts w:ascii="Times New Roman" w:hAnsi="Times New Roman" w:eastAsia="Times New Roman" w:cs="Times New Roman"/>
+                <w:b/>
+                <w:bCs/>
+                <w:kern w:val="0"/>
+                <w:sz w:val="24"/>
+                <w:szCs w:val="24"/>
+                <w:lang w:val="en-US" w:eastAsia="ja-JP" w:bidi="ar-SA"/>
+              </w:rPr>
             </w:pPr>
             <w:r>
+              <w:rPr>
+                <w:rFonts w:eastAsia="Times New Roman" w:cs="Times New Roman"/>
+                <w:b/>
+                <w:bCs/>
+                <w:kern w:val="0"/>
+                <w:sz w:val="24"/>
+                <w:szCs w:val="24"/>
+                <w:lang w:val="en-US" w:eastAsia="ja-JP" w:bidi="ar-SA"/>
+              </w:rPr>
               <w:t>Values</w:t>
             </w:r>
           </w:p>
         </w:tc>
       </w:tr>
       <w:tr>
+        <w:trPr/>
         <w:tc>
           <w:tcPr>
+            <w:tcW w:w="4675" w:type="dxa"/>
             <w:cnfStyle w:val="001000000000" w:firstRow="0" w:lastRow="0" w:firstColumn="1" w:lastColumn="0" w:oddVBand="0" w:evenVBand="0" w:oddHBand="0" w:evenHBand="0" w:firstRowFirstColumn="0" w:firstRowLastColumn="0" w:lastRowFirstColumn="0" w:lastRowLastColumn="0"/>
-            <w:tcW w:w="4675" w:type="dxa"/>
+            <w:tcBorders/>
           </w:tcPr>
           <w:p>
             <w:pPr>
-              <w:spacing w:line="480" w:lineRule="auto"/>
+              <w:pStyle w:val="Normal"/>
+              <w:widowControl/>
+              <w:suppressAutoHyphens w:val="true"/>
+              <w:spacing w:lineRule="auto" w:line="480" w:before="0" w:after="0"/>
+              <w:jc w:val="left"/>
+              <w:rPr>
+                <w:rFonts w:ascii="Times New Roman" w:hAnsi="Times New Roman" w:eastAsia="Times New Roman" w:cs="Times New Roman"/>
+                <w:b/>
+                <w:bCs/>
+                <w:kern w:val="0"/>
+                <w:sz w:val="24"/>
+                <w:szCs w:val="24"/>
+                <w:lang w:val="en-US" w:eastAsia="ja-JP" w:bidi="ar-SA"/>
+              </w:rPr>
             </w:pPr>
             <w:r>
+              <w:rPr>
+                <w:rFonts w:eastAsia="Times New Roman" w:cs="Times New Roman"/>
+                <w:b/>
+                <w:bCs/>
+                <w:kern w:val="0"/>
+                <w:sz w:val="24"/>
+                <w:szCs w:val="24"/>
+                <w:lang w:val="en-US" w:eastAsia="ja-JP" w:bidi="ar-SA"/>
+              </w:rPr>
               <w:t>C</w:t>
             </w:r>
           </w:p>
@@ -640,29 +742,72 @@
         <w:tc>
           <w:tcPr>
             <w:tcW w:w="4674" w:type="dxa"/>
+            <w:tcBorders/>
           </w:tcPr>
           <w:p>
             <w:pPr>
-              <w:spacing w:line="480" w:lineRule="auto"/>
+              <w:pStyle w:val="Normal"/>
+              <w:widowControl/>
+              <w:suppressAutoHyphens w:val="true"/>
+              <w:spacing w:lineRule="auto" w:line="480" w:before="0" w:after="0"/>
+              <w:jc w:val="left"/>
               <w:cnfStyle w:val="000000000000" w:firstRow="0" w:lastRow="0" w:firstColumn="0" w:lastColumn="0" w:oddVBand="0" w:evenVBand="0" w:oddHBand="0" w:evenHBand="0" w:firstRowFirstColumn="0" w:firstRowLastColumn="0" w:lastRowFirstColumn="0" w:lastRowLastColumn="0"/>
+              <w:rPr>
+                <w:rFonts w:ascii="Times New Roman" w:hAnsi="Times New Roman" w:eastAsia="Times New Roman" w:cs="Times New Roman"/>
+                <w:kern w:val="0"/>
+                <w:sz w:val="24"/>
+                <w:szCs w:val="24"/>
+                <w:lang w:val="en-US" w:eastAsia="ja-JP" w:bidi="ar-SA"/>
+              </w:rPr>
             </w:pPr>
             <w:r>
+              <w:rPr>
+                <w:rFonts w:eastAsia="Times New Roman" w:cs="Times New Roman"/>
+                <w:kern w:val="0"/>
+                <w:sz w:val="24"/>
+                <w:szCs w:val="24"/>
+                <w:lang w:val="en-US" w:eastAsia="ja-JP" w:bidi="ar-SA"/>
+              </w:rPr>
               <w:t>1.0, 0.1, 0.05, 0.005, 0.001, 0.0001</w:t>
             </w:r>
           </w:p>
         </w:tc>
       </w:tr>
       <w:tr>
+        <w:trPr/>
         <w:tc>
           <w:tcPr>
+            <w:tcW w:w="4675" w:type="dxa"/>
             <w:cnfStyle w:val="001000000000" w:firstRow="0" w:lastRow="0" w:firstColumn="1" w:lastColumn="0" w:oddVBand="0" w:evenVBand="0" w:oddHBand="0" w:evenHBand="0" w:firstRowFirstColumn="0" w:firstRowLastColumn="0" w:lastRowFirstColumn="0" w:lastRowLastColumn="0"/>
-            <w:tcW w:w="4675" w:type="dxa"/>
+            <w:tcBorders/>
           </w:tcPr>
           <w:p>
             <w:pPr>
-              <w:spacing w:line="480" w:lineRule="auto"/>
+              <w:pStyle w:val="Normal"/>
+              <w:widowControl/>
+              <w:suppressAutoHyphens w:val="true"/>
+              <w:spacing w:lineRule="auto" w:line="480" w:before="0" w:after="0"/>
+              <w:jc w:val="left"/>
+              <w:rPr>
+                <w:rFonts w:ascii="Times New Roman" w:hAnsi="Times New Roman" w:eastAsia="Times New Roman" w:cs="Times New Roman"/>
+                <w:b/>
+                <w:bCs/>
+                <w:kern w:val="0"/>
+                <w:sz w:val="24"/>
+                <w:szCs w:val="24"/>
+                <w:lang w:val="en-US" w:eastAsia="ja-JP" w:bidi="ar-SA"/>
+              </w:rPr>
             </w:pPr>
             <w:r>
+              <w:rPr>
+                <w:rFonts w:eastAsia="Times New Roman" w:cs="Times New Roman"/>
+                <w:b/>
+                <w:bCs/>
+                <w:kern w:val="0"/>
+                <w:sz w:val="24"/>
+                <w:szCs w:val="24"/>
+                <w:lang w:val="en-US" w:eastAsia="ja-JP" w:bidi="ar-SA"/>
+              </w:rPr>
               <w:t>gamma</w:t>
             </w:r>
           </w:p>
@@ -670,22 +815,33 @@
         <w:tc>
           <w:tcPr>
             <w:tcW w:w="4674" w:type="dxa"/>
+            <w:tcBorders/>
           </w:tcPr>
           <w:p>
             <w:pPr>
-              <w:spacing w:line="480" w:lineRule="auto"/>
+              <w:pStyle w:val="Normal"/>
+              <w:widowControl/>
+              <w:suppressAutoHyphens w:val="true"/>
+              <w:spacing w:lineRule="auto" w:line="480" w:before="0" w:after="0"/>
+              <w:jc w:val="left"/>
               <w:cnfStyle w:val="000000000000" w:firstRow="0" w:lastRow="0" w:firstColumn="0" w:lastColumn="0" w:oddVBand="0" w:evenVBand="0" w:oddHBand="0" w:evenHBand="0" w:firstRowFirstColumn="0" w:firstRowLastColumn="0" w:lastRowFirstColumn="0" w:lastRowLastColumn="0"/>
+              <w:rPr>
+                <w:rFonts w:ascii="Times New Roman" w:hAnsi="Times New Roman" w:eastAsia="Times New Roman" w:cs="Times New Roman"/>
+                <w:kern w:val="0"/>
+                <w:sz w:val="24"/>
+                <w:szCs w:val="24"/>
+                <w:lang w:val="en-US" w:eastAsia="ja-JP" w:bidi="ar-SA"/>
+              </w:rPr>
             </w:pPr>
             <w:r>
-              <w:t xml:space="preserve">1.0, 0.1, 0.01, 0.001, </w:t>
-            </w:r>
-            <w:proofErr w:type="gramStart"/>
-            <w:r>
-              <w:t>0.0001, ‘</w:t>
-            </w:r>
-            <w:proofErr w:type="gramEnd"/>
-            <w:r>
-              <w:t>scale’</w:t>
+              <w:rPr>
+                <w:rFonts w:eastAsia="Times New Roman" w:cs="Times New Roman"/>
+                <w:kern w:val="0"/>
+                <w:sz w:val="24"/>
+                <w:szCs w:val="24"/>
+                <w:lang w:val="en-US" w:eastAsia="ja-JP" w:bidi="ar-SA"/>
+              </w:rPr>
+              <w:t>1.0, 0.1, 0.01, 0.001, 0.0001, ‘scale’</w:t>
             </w:r>
           </w:p>
         </w:tc>
@@ -693,95 +849,102 @@
     </w:tbl>
     <w:p>
       <w:pPr>
-        <w:spacing w:line="480" w:lineRule="auto"/>
-      </w:pPr>
-    </w:p>
-    <w:p>
-      <w:pPr>
-        <w:spacing w:line="480" w:lineRule="auto"/>
-      </w:pPr>
-      <w:r>
-        <w:lastRenderedPageBreak/>
+        <w:pStyle w:val="Normal"/>
+        <w:spacing w:lineRule="auto" w:line="480"/>
+        <w:rPr/>
+      </w:pPr>
+      <w:r>
+        <w:rPr/>
+      </w:r>
+    </w:p>
+    <w:p>
+      <w:pPr>
+        <w:pStyle w:val="Normal"/>
+        <w:spacing w:lineRule="auto" w:line="480"/>
+        <w:rPr/>
+      </w:pPr>
+      <w:r>
+        <w:rPr/>
         <w:tab/>
         <w:t>To account for the extreme class imbalance seen in this dataset, we trained</w:t>
-      </w:r>
-      <w:r>
         <w:tab/>
-        <w:t xml:space="preserve"> </w:t>
-      </w:r>
-      <w:proofErr w:type="spellStart"/>
-      <w:r>
-        <w:t>GridSearchCV</w:t>
-      </w:r>
-      <w:proofErr w:type="spellEnd"/>
+        <w:t xml:space="preserve"> GridSearchCV</w:t>
+      </w:r>
       <w:r>
         <w:rPr>
           <w:rStyle w:val="FootnoteReference"/>
         </w:rPr>
-        <w:footnoteReference w:id="1"/>
-      </w:r>
-      <w:r>
-        <w:t xml:space="preserve"> using a </w:t>
-      </w:r>
-      <w:proofErr w:type="spellStart"/>
-      <w:r>
-        <w:t>StratifiedKFold</w:t>
-      </w:r>
-      <w:proofErr w:type="spellEnd"/>
+        <w:footnoteReference w:id="2"/>
+      </w:r>
+      <w:r>
+        <w:rPr/>
+        <w:t xml:space="preserve"> using a StratifiedKFold</w:t>
+      </w:r>
       <w:r>
         <w:rPr>
           <w:rStyle w:val="FootnoteReference"/>
         </w:rPr>
-        <w:footnoteReference w:id="2"/>
-      </w:r>
-      <w:r>
+        <w:footnoteReference w:id="3"/>
+      </w:r>
+      <w:r>
+        <w:rPr/>
         <w:t xml:space="preserve"> strategy, which ensured each fold maintains the same class distribution as the original dataset. Otherwise, it was possible that some folds might not have any positive examples in them.</w:t>
       </w:r>
     </w:p>
     <w:p>
       <w:pPr>
-        <w:spacing w:line="480" w:lineRule="auto"/>
-      </w:pPr>
-      <w:r>
+        <w:pStyle w:val="Normal"/>
+        <w:spacing w:lineRule="auto" w:line="480"/>
+        <w:rPr/>
+      </w:pPr>
+      <w:r>
+        <w:rPr/>
         <w:tab/>
         <w:t xml:space="preserve">We used a </w:t>
       </w:r>
-      <w:proofErr w:type="spellStart"/>
-      <w:r>
-        <w:t>rbf</w:t>
-      </w:r>
-      <w:proofErr w:type="spellEnd"/>
-      <w:r>
-        <w:t xml:space="preserve"> kernel and precision score as the evaluation metric. &lt;Why were these appropriate choices?</w:t>
-      </w:r>
-      <w:r>
-        <w:t xml:space="preserve"> (Du 2024)</w:t>
-      </w:r>
-      <w:r>
-        <w:t>&gt;</w:t>
-      </w:r>
-    </w:p>
-    <w:p>
-      <w:pPr>
-        <w:spacing w:line="480" w:lineRule="auto"/>
-      </w:pPr>
-    </w:p>
-    <w:p>
-      <w:pPr>
-        <w:spacing w:line="480" w:lineRule="auto"/>
-      </w:pPr>
-      <w:r>
-        <w:t xml:space="preserve"> After Grid Search was completed, the best-found parameters were C: 1, gamma: 0.01. These parameters were used to generate the results discussed in the next section.</w:t>
-      </w:r>
-    </w:p>
-    <w:p>
-      <w:pPr>
-        <w:spacing w:line="480" w:lineRule="auto"/>
-      </w:pPr>
-    </w:p>
-    <w:p>
-      <w:pPr>
-        <w:spacing w:line="480" w:lineRule="auto"/>
+      <w:r>
+        <w:rPr/>
+        <w:t>RBF</w:t>
+      </w:r>
+      <w:r>
+        <w:rPr/>
+        <w:t xml:space="preserve"> kernel and precision score as the evaluation metric.  </w:t>
+      </w:r>
+      <w:r>
+        <w:rPr/>
+        <w:t>The use of RBF is recommended as a starting point in Hsu 2016 due to its ability to handle non-linear relationship between features and labels.</w:t>
+      </w:r>
+    </w:p>
+    <w:p>
+      <w:pPr>
+        <w:pStyle w:val="Normal"/>
+        <w:spacing w:lineRule="auto" w:line="480"/>
+        <w:rPr/>
+      </w:pPr>
+      <w:r>
+        <w:rPr/>
+        <w:t xml:space="preserve"> </w:t>
+      </w:r>
+      <w:r>
+        <w:rPr/>
+        <w:tab/>
+        <w:t>After Grid Search was completed, the best-found parameters were C: 1, gamma: 0.01. These parameters were used to generate the results discussed in the next section.</w:t>
+      </w:r>
+    </w:p>
+    <w:p>
+      <w:pPr>
+        <w:pStyle w:val="Normal"/>
+        <w:spacing w:lineRule="auto" w:line="480"/>
+        <w:rPr/>
+      </w:pPr>
+      <w:r>
+        <w:rPr/>
+      </w:r>
+    </w:p>
+    <w:p>
+      <w:pPr>
+        <w:pStyle w:val="Normal"/>
+        <w:spacing w:lineRule="auto" w:line="480"/>
         <w:jc w:val="center"/>
         <w:rPr>
           <w:b/>
@@ -796,52 +959,68 @@
     </w:p>
     <w:p>
       <w:pPr>
-        <w:spacing w:line="480" w:lineRule="auto"/>
+        <w:pStyle w:val="Normal"/>
+        <w:spacing w:lineRule="auto" w:line="480"/>
         <w:ind w:firstLine="720"/>
-      </w:pPr>
-      <w:r>
-        <w:t xml:space="preserve">As seen in the final confusion matrix (figure 3) the system correctly identified all but two of the planets in the “No Planet” category of the test data. For stars with a </w:t>
-      </w:r>
-      <w:r>
-        <w:t>high probability</w:t>
-      </w:r>
-      <w:r>
-        <w:t xml:space="preserve"> of having an Exoplanet, the system correctly identified 4 out of 5 data points.</w:t>
-      </w:r>
-    </w:p>
-    <w:p>
-      <w:pPr>
-        <w:spacing w:line="480" w:lineRule="auto"/>
+        <w:rPr/>
+      </w:pPr>
+      <w:r>
+        <w:rPr/>
+        <w:t>As seen in the final confusion matrix (figure 3) the system correctly identified all but two of the planets in the “No Planet” category of the test data. For stars with a high probability of having an Exoplanet, the system correctly identified 4 out of 5 data points.</w:t>
+      </w:r>
+    </w:p>
+    <w:p>
+      <w:pPr>
+        <w:pStyle w:val="Normal"/>
+        <w:spacing w:lineRule="auto" w:line="480"/>
         <w:ind w:firstLine="720"/>
-      </w:pPr>
-      <w:r>
+        <w:rPr/>
+      </w:pPr>
+      <w:r>
+        <w:rPr/>
         <w:t>Given the extreme imbalance of the dataset, the standard metrics, F1 Score, Accuracy, Precision, all appeared somewhat unreliable. For example, it was possible to obtain a much higher F1 score by simply declaring all stars as having no planets. The same situation for accuracy and recall.</w:t>
       </w:r>
     </w:p>
     <w:p>
       <w:pPr>
-        <w:spacing w:line="480" w:lineRule="auto"/>
+        <w:pStyle w:val="Normal"/>
+        <w:spacing w:lineRule="auto" w:line="480"/>
         <w:ind w:firstLine="720"/>
-      </w:pPr>
-      <w:r>
+        <w:rPr/>
+      </w:pPr>
+      <w:r>
+        <w:rPr/>
         <w:t>The table below summarizes the metrics collected from the final model:</w:t>
       </w:r>
     </w:p>
     <w:p>
       <w:pPr>
-        <w:spacing w:line="480" w:lineRule="auto"/>
+        <w:pStyle w:val="Normal"/>
+        <w:spacing w:lineRule="auto" w:line="480"/>
         <w:ind w:firstLine="720"/>
-      </w:pPr>
+        <w:rPr/>
+      </w:pPr>
+      <w:r>
+        <w:rPr/>
+      </w:r>
     </w:p>
     <w:tbl>
       <w:tblPr>
         <w:tblStyle w:val="GridTable1Light"/>
         <w:tblW w:w="9576" w:type="dxa"/>
+        <w:jc w:val="left"/>
+        <w:tblInd w:w="0" w:type="dxa"/>
         <w:tblLayout w:type="fixed"/>
-        <w:tblLook w:val="04A0" w:firstRow="1" w:lastRow="0" w:firstColumn="1" w:lastColumn="0" w:noHBand="0" w:noVBand="1"/>
+        <w:tblCellMar>
+          <w:top w:w="0" w:type="dxa"/>
+          <w:left w:w="108" w:type="dxa"/>
+          <w:bottom w:w="0" w:type="dxa"/>
+          <w:right w:w="108" w:type="dxa"/>
+        </w:tblCellMar>
+        <w:tblLook w:val="04a0" w:noHBand="0" w:noVBand="1" w:firstColumn="1" w:lastRow="0" w:lastColumn="0" w:firstRow="1"/>
       </w:tblPr>
       <w:tblGrid>
-        <w:gridCol w:w="4789"/>
+        <w:gridCol w:w="4788"/>
         <w:gridCol w:w="4787"/>
       </w:tblGrid>
       <w:tr>
@@ -850,17 +1029,39 @@
         </w:trPr>
         <w:tc>
           <w:tcPr>
+            <w:tcW w:w="4788" w:type="dxa"/>
             <w:cnfStyle w:val="001000000000" w:firstRow="0" w:lastRow="0" w:firstColumn="1" w:lastColumn="0" w:oddVBand="0" w:evenVBand="0" w:oddHBand="0" w:evenHBand="0" w:firstRowFirstColumn="0" w:firstRowLastColumn="0" w:lastRowFirstColumn="0" w:lastRowLastColumn="0"/>
-            <w:tcW w:w="4788" w:type="dxa"/>
             <w:tcBorders>
               <w:bottom w:val="single" w:sz="12" w:space="0" w:color="000000"/>
             </w:tcBorders>
           </w:tcPr>
           <w:p>
             <w:pPr>
-              <w:spacing w:line="480" w:lineRule="auto"/>
+              <w:pStyle w:val="Normal"/>
+              <w:widowControl/>
+              <w:suppressAutoHyphens w:val="true"/>
+              <w:spacing w:lineRule="auto" w:line="480" w:before="0" w:after="0"/>
+              <w:jc w:val="left"/>
+              <w:rPr>
+                <w:rFonts w:ascii="Times New Roman" w:hAnsi="Times New Roman" w:eastAsia="Times New Roman" w:cs="Times New Roman"/>
+                <w:b/>
+                <w:bCs/>
+                <w:kern w:val="0"/>
+                <w:sz w:val="24"/>
+                <w:szCs w:val="24"/>
+                <w:lang w:val="en-US" w:eastAsia="ja-JP" w:bidi="ar-SA"/>
+              </w:rPr>
             </w:pPr>
             <w:r>
+              <w:rPr>
+                <w:rFonts w:eastAsia="Times New Roman" w:cs="Times New Roman"/>
+                <w:b/>
+                <w:bCs/>
+                <w:kern w:val="0"/>
+                <w:sz w:val="24"/>
+                <w:szCs w:val="24"/>
+                <w:lang w:val="en-US" w:eastAsia="ja-JP" w:bidi="ar-SA"/>
+              </w:rPr>
               <w:t>Metric</w:t>
             </w:r>
           </w:p>
@@ -874,26 +1075,72 @@
           </w:tcPr>
           <w:p>
             <w:pPr>
-              <w:spacing w:line="480" w:lineRule="auto"/>
+              <w:pStyle w:val="Normal"/>
+              <w:widowControl/>
+              <w:suppressAutoHyphens w:val="true"/>
+              <w:spacing w:lineRule="auto" w:line="480" w:before="0" w:after="0"/>
+              <w:jc w:val="left"/>
               <w:cnfStyle w:val="100000000000" w:firstRow="1" w:lastRow="0" w:firstColumn="0" w:lastColumn="0" w:oddVBand="0" w:evenVBand="0" w:oddHBand="0" w:evenHBand="0" w:firstRowFirstColumn="0" w:firstRowLastColumn="0" w:lastRowFirstColumn="0" w:lastRowLastColumn="0"/>
+              <w:rPr>
+                <w:rFonts w:ascii="Times New Roman" w:hAnsi="Times New Roman" w:eastAsia="Times New Roman" w:cs="Times New Roman"/>
+                <w:b/>
+                <w:bCs/>
+                <w:kern w:val="0"/>
+                <w:sz w:val="24"/>
+                <w:szCs w:val="24"/>
+                <w:lang w:val="en-US" w:eastAsia="ja-JP" w:bidi="ar-SA"/>
+              </w:rPr>
             </w:pPr>
             <w:r>
+              <w:rPr>
+                <w:rFonts w:eastAsia="Times New Roman" w:cs="Times New Roman"/>
+                <w:b/>
+                <w:bCs/>
+                <w:kern w:val="0"/>
+                <w:sz w:val="24"/>
+                <w:szCs w:val="24"/>
+                <w:lang w:val="en-US" w:eastAsia="ja-JP" w:bidi="ar-SA"/>
+              </w:rPr>
               <w:t>Score</w:t>
             </w:r>
           </w:p>
         </w:tc>
       </w:tr>
       <w:tr>
+        <w:trPr/>
         <w:tc>
           <w:tcPr>
+            <w:tcW w:w="4788" w:type="dxa"/>
             <w:cnfStyle w:val="001000000000" w:firstRow="0" w:lastRow="0" w:firstColumn="1" w:lastColumn="0" w:oddVBand="0" w:evenVBand="0" w:oddHBand="0" w:evenHBand="0" w:firstRowFirstColumn="0" w:firstRowLastColumn="0" w:lastRowFirstColumn="0" w:lastRowLastColumn="0"/>
-            <w:tcW w:w="4788" w:type="dxa"/>
+            <w:tcBorders/>
           </w:tcPr>
           <w:p>
             <w:pPr>
-              <w:spacing w:line="480" w:lineRule="auto"/>
+              <w:pStyle w:val="Normal"/>
+              <w:widowControl/>
+              <w:suppressAutoHyphens w:val="true"/>
+              <w:spacing w:lineRule="auto" w:line="480" w:before="0" w:after="0"/>
+              <w:jc w:val="left"/>
+              <w:rPr>
+                <w:rFonts w:ascii="Times New Roman" w:hAnsi="Times New Roman" w:eastAsia="Times New Roman" w:cs="Times New Roman"/>
+                <w:b/>
+                <w:bCs/>
+                <w:kern w:val="0"/>
+                <w:sz w:val="24"/>
+                <w:szCs w:val="24"/>
+                <w:lang w:val="en-US" w:eastAsia="ja-JP" w:bidi="ar-SA"/>
+              </w:rPr>
             </w:pPr>
             <w:r>
+              <w:rPr>
+                <w:rFonts w:eastAsia="Times New Roman" w:cs="Times New Roman"/>
+                <w:b/>
+                <w:bCs/>
+                <w:kern w:val="0"/>
+                <w:sz w:val="24"/>
+                <w:szCs w:val="24"/>
+                <w:lang w:val="en-US" w:eastAsia="ja-JP" w:bidi="ar-SA"/>
+              </w:rPr>
               <w:t>F1 Score</w:t>
             </w:r>
           </w:p>
@@ -901,30 +1148,72 @@
         <w:tc>
           <w:tcPr>
             <w:tcW w:w="4787" w:type="dxa"/>
+            <w:tcBorders/>
           </w:tcPr>
           <w:p>
             <w:pPr>
-              <w:spacing w:line="480" w:lineRule="auto"/>
+              <w:pStyle w:val="Normal"/>
+              <w:widowControl/>
+              <w:suppressAutoHyphens w:val="true"/>
+              <w:spacing w:lineRule="auto" w:line="480" w:before="0" w:after="0"/>
+              <w:jc w:val="left"/>
               <w:cnfStyle w:val="000000000000" w:firstRow="0" w:lastRow="0" w:firstColumn="0" w:lastColumn="0" w:oddVBand="0" w:evenVBand="0" w:oddHBand="0" w:evenHBand="0" w:firstRowFirstColumn="0" w:firstRowLastColumn="0" w:lastRowFirstColumn="0" w:lastRowLastColumn="0"/>
+              <w:rPr>
+                <w:rFonts w:ascii="Times New Roman" w:hAnsi="Times New Roman" w:eastAsia="Times New Roman" w:cs="Times New Roman"/>
+                <w:kern w:val="0"/>
+                <w:sz w:val="24"/>
+                <w:szCs w:val="24"/>
+                <w:lang w:val="en-US" w:eastAsia="ja-JP" w:bidi="ar-SA"/>
+              </w:rPr>
             </w:pPr>
             <w:r>
+              <w:rPr>
+                <w:rFonts w:eastAsia="Times New Roman" w:cs="Times New Roman"/>
+                <w:kern w:val="0"/>
+                <w:sz w:val="24"/>
+                <w:szCs w:val="24"/>
+                <w:lang w:val="en-US" w:eastAsia="ja-JP" w:bidi="ar-SA"/>
+              </w:rPr>
               <w:t>0.72</w:t>
             </w:r>
           </w:p>
         </w:tc>
       </w:tr>
       <w:tr>
+        <w:trPr/>
         <w:tc>
           <w:tcPr>
+            <w:tcW w:w="4788" w:type="dxa"/>
             <w:cnfStyle w:val="001000000000" w:firstRow="0" w:lastRow="0" w:firstColumn="1" w:lastColumn="0" w:oddVBand="0" w:evenVBand="0" w:oddHBand="0" w:evenHBand="0" w:firstRowFirstColumn="0" w:firstRowLastColumn="0" w:lastRowFirstColumn="0" w:lastRowLastColumn="0"/>
-            <w:tcW w:w="4788" w:type="dxa"/>
+            <w:tcBorders/>
           </w:tcPr>
           <w:p>
             <w:pPr>
-              <w:spacing w:line="480" w:lineRule="auto"/>
+              <w:pStyle w:val="Normal"/>
+              <w:widowControl/>
+              <w:suppressAutoHyphens w:val="true"/>
+              <w:spacing w:lineRule="auto" w:line="480" w:before="0" w:after="0"/>
+              <w:jc w:val="left"/>
+              <w:rPr>
+                <w:rFonts w:ascii="Times New Roman" w:hAnsi="Times New Roman" w:eastAsia="Times New Roman" w:cs="Times New Roman"/>
+                <w:b/>
+                <w:bCs/>
+                <w:kern w:val="0"/>
+                <w:sz w:val="24"/>
+                <w:szCs w:val="24"/>
+                <w:lang w:val="en-US" w:eastAsia="ja-JP" w:bidi="ar-SA"/>
+              </w:rPr>
             </w:pPr>
             <w:r>
-              <w:lastRenderedPageBreak/>
+              <w:rPr>
+                <w:rFonts w:eastAsia="Times New Roman" w:cs="Times New Roman"/>
+                <w:b/>
+                <w:bCs/>
+                <w:kern w:val="0"/>
+                <w:sz w:val="24"/>
+                <w:szCs w:val="24"/>
+                <w:lang w:val="en-US" w:eastAsia="ja-JP" w:bidi="ar-SA"/>
+              </w:rPr>
               <w:t>Accuracy</w:t>
             </w:r>
           </w:p>
@@ -932,29 +1221,72 @@
         <w:tc>
           <w:tcPr>
             <w:tcW w:w="4787" w:type="dxa"/>
+            <w:tcBorders/>
           </w:tcPr>
           <w:p>
             <w:pPr>
-              <w:spacing w:line="480" w:lineRule="auto"/>
+              <w:pStyle w:val="Normal"/>
+              <w:widowControl/>
+              <w:suppressAutoHyphens w:val="true"/>
+              <w:spacing w:lineRule="auto" w:line="480" w:before="0" w:after="0"/>
+              <w:jc w:val="left"/>
               <w:cnfStyle w:val="000000000000" w:firstRow="0" w:lastRow="0" w:firstColumn="0" w:lastColumn="0" w:oddVBand="0" w:evenVBand="0" w:oddHBand="0" w:evenHBand="0" w:firstRowFirstColumn="0" w:firstRowLastColumn="0" w:lastRowFirstColumn="0" w:lastRowLastColumn="0"/>
+              <w:rPr>
+                <w:rFonts w:ascii="Times New Roman" w:hAnsi="Times New Roman" w:eastAsia="Times New Roman" w:cs="Times New Roman"/>
+                <w:kern w:val="0"/>
+                <w:sz w:val="24"/>
+                <w:szCs w:val="24"/>
+                <w:lang w:val="en-US" w:eastAsia="ja-JP" w:bidi="ar-SA"/>
+              </w:rPr>
             </w:pPr>
             <w:r>
+              <w:rPr>
+                <w:rFonts w:eastAsia="Times New Roman" w:cs="Times New Roman"/>
+                <w:kern w:val="0"/>
+                <w:sz w:val="24"/>
+                <w:szCs w:val="24"/>
+                <w:lang w:val="en-US" w:eastAsia="ja-JP" w:bidi="ar-SA"/>
+              </w:rPr>
               <w:t>0.994</w:t>
             </w:r>
           </w:p>
         </w:tc>
       </w:tr>
       <w:tr>
+        <w:trPr/>
         <w:tc>
           <w:tcPr>
+            <w:tcW w:w="4788" w:type="dxa"/>
             <w:cnfStyle w:val="001000000000" w:firstRow="0" w:lastRow="0" w:firstColumn="1" w:lastColumn="0" w:oddVBand="0" w:evenVBand="0" w:oddHBand="0" w:evenHBand="0" w:firstRowFirstColumn="0" w:firstRowLastColumn="0" w:lastRowFirstColumn="0" w:lastRowLastColumn="0"/>
-            <w:tcW w:w="4788" w:type="dxa"/>
+            <w:tcBorders/>
           </w:tcPr>
           <w:p>
             <w:pPr>
-              <w:spacing w:line="480" w:lineRule="auto"/>
+              <w:pStyle w:val="Normal"/>
+              <w:widowControl/>
+              <w:suppressAutoHyphens w:val="true"/>
+              <w:spacing w:lineRule="auto" w:line="480" w:before="0" w:after="0"/>
+              <w:jc w:val="left"/>
+              <w:rPr>
+                <w:rFonts w:ascii="Times New Roman" w:hAnsi="Times New Roman" w:eastAsia="Times New Roman" w:cs="Times New Roman"/>
+                <w:b/>
+                <w:bCs/>
+                <w:kern w:val="0"/>
+                <w:sz w:val="24"/>
+                <w:szCs w:val="24"/>
+                <w:lang w:val="en-US" w:eastAsia="ja-JP" w:bidi="ar-SA"/>
+              </w:rPr>
             </w:pPr>
             <w:r>
+              <w:rPr>
+                <w:rFonts w:eastAsia="Times New Roman" w:cs="Times New Roman"/>
+                <w:b/>
+                <w:bCs/>
+                <w:kern w:val="0"/>
+                <w:sz w:val="24"/>
+                <w:szCs w:val="24"/>
+                <w:lang w:val="en-US" w:eastAsia="ja-JP" w:bidi="ar-SA"/>
+              </w:rPr>
               <w:t>Precision</w:t>
             </w:r>
           </w:p>
@@ -962,29 +1294,72 @@
         <w:tc>
           <w:tcPr>
             <w:tcW w:w="4787" w:type="dxa"/>
+            <w:tcBorders/>
           </w:tcPr>
           <w:p>
             <w:pPr>
-              <w:spacing w:line="480" w:lineRule="auto"/>
+              <w:pStyle w:val="Normal"/>
+              <w:widowControl/>
+              <w:suppressAutoHyphens w:val="true"/>
+              <w:spacing w:lineRule="auto" w:line="480" w:before="0" w:after="0"/>
+              <w:jc w:val="left"/>
               <w:cnfStyle w:val="000000000000" w:firstRow="0" w:lastRow="0" w:firstColumn="0" w:lastColumn="0" w:oddVBand="0" w:evenVBand="0" w:oddHBand="0" w:evenHBand="0" w:firstRowFirstColumn="0" w:firstRowLastColumn="0" w:lastRowFirstColumn="0" w:lastRowLastColumn="0"/>
+              <w:rPr>
+                <w:rFonts w:ascii="Times New Roman" w:hAnsi="Times New Roman" w:eastAsia="Times New Roman" w:cs="Times New Roman"/>
+                <w:kern w:val="0"/>
+                <w:sz w:val="24"/>
+                <w:szCs w:val="24"/>
+                <w:lang w:val="en-US" w:eastAsia="ja-JP" w:bidi="ar-SA"/>
+              </w:rPr>
             </w:pPr>
             <w:r>
+              <w:rPr>
+                <w:rFonts w:eastAsia="Times New Roman" w:cs="Times New Roman"/>
+                <w:kern w:val="0"/>
+                <w:sz w:val="24"/>
+                <w:szCs w:val="24"/>
+                <w:lang w:val="en-US" w:eastAsia="ja-JP" w:bidi="ar-SA"/>
+              </w:rPr>
               <w:t>0.67</w:t>
             </w:r>
           </w:p>
         </w:tc>
       </w:tr>
       <w:tr>
+        <w:trPr/>
         <w:tc>
           <w:tcPr>
+            <w:tcW w:w="4788" w:type="dxa"/>
             <w:cnfStyle w:val="001000000000" w:firstRow="0" w:lastRow="0" w:firstColumn="1" w:lastColumn="0" w:oddVBand="0" w:evenVBand="0" w:oddHBand="0" w:evenHBand="0" w:firstRowFirstColumn="0" w:firstRowLastColumn="0" w:lastRowFirstColumn="0" w:lastRowLastColumn="0"/>
-            <w:tcW w:w="4788" w:type="dxa"/>
+            <w:tcBorders/>
           </w:tcPr>
           <w:p>
             <w:pPr>
-              <w:spacing w:line="480" w:lineRule="auto"/>
+              <w:pStyle w:val="Normal"/>
+              <w:widowControl/>
+              <w:suppressAutoHyphens w:val="true"/>
+              <w:spacing w:lineRule="auto" w:line="480" w:before="0" w:after="0"/>
+              <w:jc w:val="left"/>
+              <w:rPr>
+                <w:rFonts w:ascii="Times New Roman" w:hAnsi="Times New Roman" w:eastAsia="Times New Roman" w:cs="Times New Roman"/>
+                <w:b/>
+                <w:bCs/>
+                <w:kern w:val="0"/>
+                <w:sz w:val="24"/>
+                <w:szCs w:val="24"/>
+                <w:lang w:val="en-US" w:eastAsia="ja-JP" w:bidi="ar-SA"/>
+              </w:rPr>
             </w:pPr>
             <w:r>
+              <w:rPr>
+                <w:rFonts w:eastAsia="Times New Roman" w:cs="Times New Roman"/>
+                <w:b/>
+                <w:bCs/>
+                <w:kern w:val="0"/>
+                <w:sz w:val="24"/>
+                <w:szCs w:val="24"/>
+                <w:lang w:val="en-US" w:eastAsia="ja-JP" w:bidi="ar-SA"/>
+              </w:rPr>
               <w:t>Recall</w:t>
             </w:r>
           </w:p>
@@ -992,13 +1367,32 @@
         <w:tc>
           <w:tcPr>
             <w:tcW w:w="4787" w:type="dxa"/>
+            <w:tcBorders/>
           </w:tcPr>
           <w:p>
             <w:pPr>
-              <w:spacing w:line="480" w:lineRule="auto"/>
+              <w:pStyle w:val="Normal"/>
+              <w:widowControl/>
+              <w:suppressAutoHyphens w:val="true"/>
+              <w:spacing w:lineRule="auto" w:line="480" w:before="0" w:after="0"/>
+              <w:jc w:val="left"/>
               <w:cnfStyle w:val="000000000000" w:firstRow="0" w:lastRow="0" w:firstColumn="0" w:lastColumn="0" w:oddVBand="0" w:evenVBand="0" w:oddHBand="0" w:evenHBand="0" w:firstRowFirstColumn="0" w:firstRowLastColumn="0" w:lastRowFirstColumn="0" w:lastRowLastColumn="0"/>
+              <w:rPr>
+                <w:rFonts w:ascii="Times New Roman" w:hAnsi="Times New Roman" w:eastAsia="Times New Roman" w:cs="Times New Roman"/>
+                <w:kern w:val="0"/>
+                <w:sz w:val="24"/>
+                <w:szCs w:val="24"/>
+                <w:lang w:val="en-US" w:eastAsia="ja-JP" w:bidi="ar-SA"/>
+              </w:rPr>
             </w:pPr>
             <w:r>
+              <w:rPr>
+                <w:rFonts w:eastAsia="Times New Roman" w:cs="Times New Roman"/>
+                <w:kern w:val="0"/>
+                <w:sz w:val="24"/>
+                <w:szCs w:val="24"/>
+                <w:lang w:val="en-US" w:eastAsia="ja-JP" w:bidi="ar-SA"/>
+              </w:rPr>
               <w:t>0.8</w:t>
             </w:r>
           </w:p>
@@ -1007,38 +1401,53 @@
     </w:tbl>
     <w:p>
       <w:pPr>
-        <w:spacing w:line="480" w:lineRule="auto"/>
+        <w:pStyle w:val="Normal"/>
+        <w:spacing w:lineRule="auto" w:line="480"/>
         <w:ind w:firstLine="720"/>
-      </w:pPr>
-    </w:p>
-    <w:p>
-      <w:pPr>
-        <w:spacing w:line="480" w:lineRule="auto"/>
+        <w:rPr/>
+      </w:pPr>
+      <w:r>
+        <w:rPr/>
+      </w:r>
+    </w:p>
+    <w:p>
+      <w:pPr>
+        <w:pStyle w:val="Normal"/>
+        <w:spacing w:lineRule="auto" w:line="480"/>
         <w:ind w:firstLine="720"/>
-      </w:pPr>
-    </w:p>
-    <w:p>
-      <w:pPr>
-        <w:keepNext/>
-        <w:spacing w:line="480" w:lineRule="auto"/>
+        <w:rPr/>
+      </w:pPr>
+      <w:r>
+        <w:rPr/>
+      </w:r>
+    </w:p>
+    <w:p>
+      <w:pPr>
+        <w:pStyle w:val="Normal"/>
+        <w:keepNext w:val="true"/>
+        <w:spacing w:lineRule="auto" w:line="480"/>
         <w:ind w:firstLine="720"/>
-      </w:pPr>
-    </w:p>
-    <w:p>
-      <w:pPr>
-        <w:keepNext/>
-        <w:spacing w:line="480" w:lineRule="auto"/>
+        <w:rPr/>
+      </w:pPr>
+      <w:r>
+        <w:rPr/>
+      </w:r>
+    </w:p>
+    <w:p>
+      <w:pPr>
+        <w:pStyle w:val="Normal"/>
+        <w:keepNext w:val="true"/>
+        <w:spacing w:lineRule="auto" w:line="480"/>
         <w:ind w:firstLine="720"/>
-      </w:pPr>
-      <w:r>
-        <w:rPr>
-          <w:noProof/>
-        </w:rPr>
+        <w:rPr/>
+      </w:pPr>
+      <w:r>
+        <w:rPr/>
         <w:drawing>
-          <wp:inline distT="0" distB="0" distL="0" distR="0" wp14:anchorId="791DBA8F" wp14:editId="048AFCC9">
+          <wp:inline distT="0" distB="0" distL="0" distR="0">
             <wp:extent cx="5941060" cy="2226945"/>
             <wp:effectExtent l="0" t="0" r="0" b="0"/>
-            <wp:docPr id="3" name="Picture 1"/>
+            <wp:docPr id="3" name="Picture 1" descr=""/>
             <wp:cNvGraphicFramePr>
               <a:graphicFrameLocks xmlns:a="http://schemas.openxmlformats.org/drawingml/2006/main" noChangeAspect="1"/>
             </wp:cNvGraphicFramePr>
@@ -1046,13 +1455,13 @@
               <a:graphicData uri="http://schemas.openxmlformats.org/drawingml/2006/picture">
                 <pic:pic xmlns:pic="http://schemas.openxmlformats.org/drawingml/2006/picture">
                   <pic:nvPicPr>
-                    <pic:cNvPr id="3" name="Picture 1"/>
+                    <pic:cNvPr id="3" name="Picture 1" descr=""/>
                     <pic:cNvPicPr>
                       <a:picLocks noChangeAspect="1" noChangeArrowheads="1"/>
                     </pic:cNvPicPr>
                   </pic:nvPicPr>
                   <pic:blipFill>
-                    <a:blip r:embed="rId10"/>
+                    <a:blip r:embed="rId4"/>
                     <a:stretch>
                       <a:fillRect/>
                     </a:stretch>
@@ -1077,40 +1486,71 @@
       <w:pPr>
         <w:pStyle w:val="Caption"/>
         <w:jc w:val="center"/>
-      </w:pPr>
-      <w:r>
+        <w:rPr/>
+      </w:pPr>
+      <w:r>
+        <w:rPr/>
         <w:t xml:space="preserve">Figure </w:t>
       </w:r>
-      <w:fldSimple w:instr=" SEQ Figure \* ARABIC ">
-        <w:r>
-          <w:t>3</w:t>
-        </w:r>
-      </w:fldSimple>
-      <w:r>
+      <w:r>
+        <w:rPr/>
+        <w:fldChar w:fldCharType="begin"/>
+      </w:r>
+      <w:r>
+        <w:rPr/>
+        <w:instrText xml:space="preserve"> SEQ Figure \* ARABIC </w:instrText>
+      </w:r>
+      <w:r>
+        <w:rPr/>
+        <w:fldChar w:fldCharType="separate"/>
+      </w:r>
+      <w:r>
+        <w:rPr/>
+        <w:t>3</w:t>
+      </w:r>
+      <w:r>
+        <w:rPr/>
+        <w:fldChar w:fldCharType="end"/>
+      </w:r>
+      <w:r>
+        <w:rPr/>
         <w:t xml:space="preserve"> Final Confusion Matrix</w:t>
       </w:r>
     </w:p>
     <w:p>
       <w:pPr>
-        <w:spacing w:line="480" w:lineRule="auto"/>
+        <w:pStyle w:val="Normal"/>
+        <w:spacing w:lineRule="auto" w:line="480"/>
         <w:jc w:val="center"/>
         <w:rPr>
           <w:b/>
         </w:rPr>
       </w:pPr>
-    </w:p>
-    <w:p>
-      <w:pPr>
-        <w:spacing w:line="480" w:lineRule="auto"/>
+      <w:r>
+        <w:rPr>
+          <w:b/>
+        </w:rPr>
+      </w:r>
+    </w:p>
+    <w:p>
+      <w:pPr>
+        <w:pStyle w:val="Normal"/>
+        <w:spacing w:lineRule="auto" w:line="480"/>
         <w:jc w:val="center"/>
         <w:rPr>
           <w:b/>
         </w:rPr>
       </w:pPr>
-    </w:p>
-    <w:p>
-      <w:pPr>
-        <w:spacing w:line="480" w:lineRule="auto"/>
+      <w:r>
+        <w:rPr>
+          <w:b/>
+        </w:rPr>
+      </w:r>
+    </w:p>
+    <w:p>
+      <w:pPr>
+        <w:pStyle w:val="Normal"/>
+        <w:spacing w:lineRule="auto" w:line="480"/>
         <w:jc w:val="center"/>
         <w:rPr>
           <w:b/>
@@ -1125,22 +1565,54 @@
     </w:p>
     <w:p>
       <w:pPr>
-        <w:spacing w:line="480" w:lineRule="auto"/>
+        <w:pStyle w:val="Normal"/>
+        <w:spacing w:lineRule="auto" w:line="480"/>
         <w:ind w:firstLine="720"/>
-      </w:pPr>
-      <w:r>
-        <w:t xml:space="preserve">Science Stuff Science Stuff </w:t>
-      </w:r>
-    </w:p>
-    <w:p>
-      <w:pPr>
-        <w:spacing w:line="480" w:lineRule="auto"/>
+        <w:rPr/>
+      </w:pPr>
+      <w:r>
+        <w:rPr/>
+        <w:t>We built a model capable of predicting if a star has a high probability of having an exoplanet based on observations from the Kepler telescope. Due to there being so few known exoplanets at the time our data was sourced, we had very few examples to work with. As a result, we had trouble providing a reliable measurement of the models effectiveness. Despite this, our model was shown to be able to recognize 80% of the exoplanets in our training data.</w:t>
+      </w:r>
+    </w:p>
+    <w:p>
+      <w:pPr>
+        <w:pStyle w:val="Normal"/>
+        <w:spacing w:lineRule="auto" w:line="480"/>
         <w:ind w:firstLine="720"/>
-      </w:pPr>
-    </w:p>
-    <w:p>
-      <w:pPr>
-        <w:spacing w:line="480" w:lineRule="auto"/>
+        <w:rPr/>
+      </w:pPr>
+      <w:r>
+        <w:rPr/>
+        <w:t>As far as determine stars that did not have an exoplanet, our model achieved a near perfect result – mistaking only two entries in the dataset for having an exoplanet when they did not.</w:t>
+      </w:r>
+    </w:p>
+    <w:p>
+      <w:pPr>
+        <w:pStyle w:val="Normal"/>
+        <w:spacing w:lineRule="auto" w:line="480"/>
+        <w:ind w:firstLine="720"/>
+        <w:rPr/>
+      </w:pPr>
+      <w:r>
+        <w:rPr/>
+      </w:r>
+    </w:p>
+    <w:p>
+      <w:pPr>
+        <w:pStyle w:val="Normal"/>
+        <w:spacing w:lineRule="auto" w:line="480"/>
+        <w:ind w:firstLine="720"/>
+        <w:rPr/>
+      </w:pPr>
+      <w:r>
+        <w:rPr/>
+      </w:r>
+    </w:p>
+    <w:p>
+      <w:pPr>
+        <w:pStyle w:val="Normal"/>
+        <w:spacing w:lineRule="auto" w:line="480"/>
         <w:jc w:val="center"/>
         <w:rPr>
           <w:b/>
@@ -1155,46 +1627,44 @@
     </w:p>
     <w:p>
       <w:pPr>
-        <w:spacing w:line="480" w:lineRule="auto"/>
+        <w:pStyle w:val="Normal"/>
+        <w:spacing w:lineRule="auto" w:line="480"/>
         <w:ind w:firstLine="720"/>
-      </w:pPr>
-      <w:r>
-        <w:t xml:space="preserve">As noted elsewhere in this paper, the dataset we worked with was extremely unbalanced.  This not only presented challenges in training out model, but in measuring its performance as well. With so few positive observations in the training and test set, it is difficult to be confident in the ability of the model to generalize to future measurements. </w:t>
-      </w:r>
-      <w:r>
-        <w:t>This</w:t>
-      </w:r>
-      <w:r>
-        <w:t xml:space="preserve"> model should not be used </w:t>
-      </w:r>
-      <w:r>
-        <w:lastRenderedPageBreak/>
-        <w:t xml:space="preserve">as the final determination for declaring whether a star has an Exoplanet or not. </w:t>
-      </w:r>
-      <w:r>
-        <w:t>Instead,</w:t>
-      </w:r>
-      <w:r>
-        <w:t xml:space="preserve"> it would be better used as indicator for further investigation.</w:t>
-      </w:r>
-    </w:p>
-    <w:p>
-      <w:pPr>
-        <w:spacing w:line="480" w:lineRule="auto"/>
+        <w:rPr/>
+      </w:pPr>
+      <w:r>
+        <w:rPr/>
+        <w:t>As noted elsewhere in this paper, the dataset we worked with was extremely unbalanced.  This not only presented challenges in training out model, but in measuring its performance as well. With so few positive observations in the training and test set, it is difficult to be confident in the ability of the model to generalize to future measurements. This model should not be used as the final determination for declaring whether a star has an Exoplanet or not. Instead, it would be better used as indicator for further investigation.</w:t>
+      </w:r>
+    </w:p>
+    <w:p>
+      <w:pPr>
+        <w:pStyle w:val="Normal"/>
+        <w:spacing w:lineRule="auto" w:line="480"/>
         <w:jc w:val="center"/>
-      </w:pPr>
-    </w:p>
-    <w:p>
-      <w:pPr>
-        <w:spacing w:line="480" w:lineRule="auto"/>
-      </w:pPr>
+        <w:rPr/>
+      </w:pPr>
+      <w:r>
+        <w:rPr/>
+      </w:r>
+    </w:p>
+    <w:p>
+      <w:pPr>
+        <w:pStyle w:val="Normal"/>
+        <w:spacing w:lineRule="auto" w:line="480"/>
+        <w:rPr/>
+      </w:pPr>
+      <w:r>
+        <w:rPr/>
+      </w:r>
       <w:r>
         <w:br w:type="page"/>
       </w:r>
     </w:p>
     <w:p>
       <w:pPr>
-        <w:spacing w:line="480" w:lineRule="auto"/>
+        <w:pStyle w:val="Normal"/>
+        <w:spacing w:lineRule="auto" w:line="480" w:before="0" w:after="0"/>
         <w:jc w:val="center"/>
         <w:rPr>
           <w:b/>
@@ -1204,13 +1674,13 @@
         <w:rPr>
           <w:b/>
         </w:rPr>
-        <w:lastRenderedPageBreak/>
         <w:t>References</w:t>
       </w:r>
     </w:p>
     <w:p>
       <w:pPr>
-        <w:spacing w:line="480" w:lineRule="auto"/>
+        <w:pStyle w:val="Normal"/>
+        <w:spacing w:lineRule="auto" w:line="480"/>
         <w:ind w:left="720"/>
         <w:rPr>
           <w:lang w:val="en-CA"/>
@@ -1250,7 +1720,7 @@
         </w:rPr>
         <w:t xml:space="preserve">(3), 753-763. </w:t>
       </w:r>
-      <w:hyperlink r:id="rId11">
+      <w:hyperlink r:id="rId5">
         <w:r>
           <w:rPr>
             <w:rStyle w:val="Hyperlink"/>
@@ -1262,50 +1732,58 @@
     </w:p>
     <w:p>
       <w:pPr>
-        <w:spacing w:line="480" w:lineRule="auto"/>
+        <w:pStyle w:val="Normal"/>
+        <w:spacing w:lineRule="auto" w:line="480"/>
         <w:ind w:left="720"/>
         <w:rPr>
           <w:lang w:val="en-CA"/>
         </w:rPr>
       </w:pPr>
-    </w:p>
-    <w:p>
-      <w:pPr>
-        <w:spacing w:line="480" w:lineRule="auto"/>
+      <w:r>
+        <w:rPr>
+          <w:lang w:val="en-CA"/>
+        </w:rPr>
+      </w:r>
+    </w:p>
+    <w:p>
+      <w:pPr>
+        <w:pStyle w:val="Normal"/>
+        <w:spacing w:lineRule="auto" w:line="480"/>
         <w:ind w:left="720"/>
         <w:rPr>
           <w:lang w:val="en-CA"/>
         </w:rPr>
       </w:pPr>
       <w:r>
-        <w:t xml:space="preserve">Cao XH, Stojkovic I, Obradovic Z. A robust data scaling algorithm to improve classification accuracies in biomedical data. BMC Bioinformatics. 2016 Sep 9;17(1):359. </w:t>
-      </w:r>
-      <w:proofErr w:type="spellStart"/>
-      <w:r>
-        <w:t>doi</w:t>
-      </w:r>
-      <w:proofErr w:type="spellEnd"/>
-      <w:r>
-        <w:t>: 10.1186/s12859-016-1236-x. PMID: 27612635; PMCID: PMC5016890.</w:t>
-      </w:r>
-    </w:p>
-    <w:p>
-      <w:pPr>
-        <w:spacing w:line="480" w:lineRule="auto"/>
+        <w:rPr/>
+        <w:t>Cao XH, Stojkovic I, Obradovic Z. A robust data scaling algorithm to improve classification accuracies in biomedical data. BMC Bioinformatics. 2016 Sep 9;17(1):359. doi: 10.1186/s12859-016-1236-x. PMID: 27612635; PMCID: PMC5016890.</w:t>
+      </w:r>
+    </w:p>
+    <w:p>
+      <w:pPr>
+        <w:pStyle w:val="Normal"/>
+        <w:spacing w:lineRule="auto" w:line="480"/>
         <w:rPr>
           <w:lang w:val="en-CA"/>
         </w:rPr>
       </w:pPr>
-    </w:p>
-    <w:p>
-      <w:pPr>
-        <w:spacing w:line="480" w:lineRule="auto"/>
+      <w:r>
+        <w:rPr>
+          <w:lang w:val="en-CA"/>
+        </w:rPr>
+      </w:r>
+    </w:p>
+    <w:p>
+      <w:pPr>
+        <w:pStyle w:val="Normal"/>
+        <w:spacing w:lineRule="auto" w:line="480"/>
         <w:ind w:left="720"/>
         <w:rPr>
           <w:lang w:val="en-CA"/>
         </w:rPr>
       </w:pPr>
       <w:r>
+        <w:rPr/>
         <w:t xml:space="preserve">Cooley, J. W., &amp; Tukey, J. W. (1965). An algorithm for the machine calculation of complex Fourier series. </w:t>
       </w:r>
       <w:r>
@@ -1316,12 +1794,10 @@
         <w:t>Mathematics of Computation, 19</w:t>
       </w:r>
       <w:r>
-        <w:t>(90), 297–301.</w:t>
-      </w:r>
-      <w:r>
-        <w:t xml:space="preserve"> </w:t>
-      </w:r>
-      <w:hyperlink r:id="rId12" w:history="1">
+        <w:rPr/>
+        <w:t xml:space="preserve">(90), 297–301. </w:t>
+      </w:r>
+      <w:hyperlink r:id="rId6">
         <w:r>
           <w:rPr>
             <w:rStyle w:val="Hyperlink"/>
@@ -1332,28 +1808,31 @@
     </w:p>
     <w:p>
       <w:pPr>
-        <w:spacing w:line="480" w:lineRule="auto"/>
+        <w:pStyle w:val="Normal"/>
+        <w:spacing w:lineRule="auto" w:line="480"/>
         <w:ind w:left="720"/>
         <w:rPr>
           <w:lang w:val="en-CA"/>
         </w:rPr>
       </w:pPr>
-    </w:p>
-    <w:p>
-      <w:pPr>
-        <w:spacing w:line="480" w:lineRule="auto"/>
+      <w:r>
+        <w:rPr>
+          <w:lang w:val="en-CA"/>
+        </w:rPr>
+      </w:r>
+    </w:p>
+    <w:p>
+      <w:pPr>
+        <w:pStyle w:val="Normal"/>
+        <w:spacing w:lineRule="auto" w:line="480"/>
         <w:ind w:left="720"/>
-      </w:pPr>
-      <w:r>
-        <w:t xml:space="preserve">Cortes, C., &amp; </w:t>
-      </w:r>
-      <w:proofErr w:type="spellStart"/>
-      <w:r>
-        <w:t>Vapnik</w:t>
-      </w:r>
-      <w:proofErr w:type="spellEnd"/>
-      <w:r>
-        <w:t>, V.N. (1995). Support-Vector Networks. </w:t>
+        <w:rPr>
+          <w:rStyle w:val="Hyperlink"/>
+        </w:rPr>
+      </w:pPr>
+      <w:r>
+        <w:rPr/>
+        <w:t>Cortes, C., &amp; Vapnik, V.N. (1995). Support-Vector Networks. </w:t>
       </w:r>
       <w:r>
         <w:rPr>
@@ -1363,12 +1842,10 @@
         <w:t>Machine Learning, 20</w:t>
       </w:r>
       <w:r>
-        <w:t>, 273-297.</w:t>
-      </w:r>
-      <w:r>
-        <w:t xml:space="preserve"> </w:t>
-      </w:r>
-      <w:hyperlink r:id="rId13" w:history="1">
+        <w:rPr/>
+        <w:t xml:space="preserve">, 273-297. </w:t>
+      </w:r>
+      <w:hyperlink r:id="rId8">
         <w:r>
           <w:rPr>
             <w:rStyle w:val="Hyperlink"/>
@@ -1379,76 +1856,100 @@
     </w:p>
     <w:p>
       <w:pPr>
-        <w:spacing w:line="480" w:lineRule="auto"/>
+        <w:pStyle w:val="Normal"/>
+        <w:spacing w:lineRule="auto" w:line="480"/>
         <w:rPr>
           <w:lang w:val="en-CA"/>
         </w:rPr>
       </w:pPr>
-    </w:p>
-    <w:p>
-      <w:pPr>
-        <w:spacing w:line="480" w:lineRule="auto"/>
-        <w:ind w:left="720"/>
+      <w:r>
         <w:rPr>
           <w:lang w:val="en-CA"/>
         </w:rPr>
-      </w:pPr>
-      <w:r>
-        <w:t>Du, K.-L., Jiang, B., Lu, J., Hua, J., &amp; Swamy, M. N. S. (2024). Exploring Kernel Machines and Support Vector Machines: Principles, Techniques, and Future Directions. </w:t>
-      </w:r>
-      <w:r>
-        <w:rPr>
-          <w:i/>
-          <w:iCs/>
-        </w:rPr>
-        <w:t>Mathematics</w:t>
-      </w:r>
-      <w:r>
-        <w:t>, </w:t>
-      </w:r>
-      <w:r>
-        <w:rPr>
-          <w:i/>
-          <w:iCs/>
-        </w:rPr>
-        <w:t>12</w:t>
-      </w:r>
-      <w:r>
-        <w:t xml:space="preserve">(24), 3935. </w:t>
-      </w:r>
-      <w:hyperlink r:id="rId14" w:history="1">
+      </w:r>
+    </w:p>
+    <w:p>
+      <w:pPr>
+        <w:pStyle w:val="Normal"/>
+        <w:spacing w:lineRule="auto" w:line="480"/>
+        <w:rPr>
+          <w:lang w:val="en-CA"/>
+        </w:rPr>
+      </w:pPr>
+      <w:r>
+        <w:rPr>
+          <w:lang w:val="en-CA"/>
+        </w:rPr>
+        <w:tab/>
+      </w:r>
+      <w:r>
+        <w:rPr/>
+        <w:t xml:space="preserve">Hsu, C.-W., Chang, C.-C., &amp; Lin, C.-J. (2016). </w:t>
+      </w:r>
+      <w:r>
+        <w:rPr>
+          <w:rStyle w:val="Emphasis"/>
+        </w:rPr>
+        <w:t xml:space="preserve">A practical guide to support vector </w:t>
+        <w:tab/>
+        <w:t>classification</w:t>
+      </w:r>
+      <w:r>
+        <w:rPr/>
+        <w:t xml:space="preserve">. Department of Computer Science, National Taiwan University. </w:t>
+        <w:tab/>
+      </w:r>
+      <w:hyperlink r:id="rId9">
         <w:r>
           <w:rPr>
             <w:rStyle w:val="Hyperlink"/>
           </w:rPr>
-          <w:t>https://doi.org/10.3390/math12243935</w:t>
+          <w:t>https://www.csie.ntu.edu.tw/~cjlin/papers/guide/guide.pdf</w:t>
         </w:r>
       </w:hyperlink>
     </w:p>
     <w:p>
       <w:pPr>
-        <w:spacing w:line="480" w:lineRule="auto"/>
+        <w:pStyle w:val="Normal"/>
+        <w:spacing w:lineRule="auto" w:line="480"/>
         <w:rPr>
           <w:lang w:val="en-CA"/>
         </w:rPr>
       </w:pPr>
-    </w:p>
-    <w:p>
-      <w:pPr>
-        <w:spacing w:line="480" w:lineRule="auto"/>
-        <w:ind w:left="720"/>
+      <w:r>
         <w:rPr>
           <w:lang w:val="en-CA"/>
         </w:rPr>
-      </w:pPr>
-      <w:r>
+        <w:tab/>
+      </w:r>
+    </w:p>
+    <w:p>
+      <w:pPr>
+        <w:pStyle w:val="Normal"/>
+        <w:spacing w:lineRule="auto" w:line="480"/>
         <w:rPr>
           <w:lang w:val="en-CA"/>
         </w:rPr>
-        <w:lastRenderedPageBreak/>
+      </w:pPr>
+      <w:r>
+        <w:rPr/>
+      </w:r>
+    </w:p>
+    <w:p>
+      <w:pPr>
+        <w:pStyle w:val="Normal"/>
+        <w:spacing w:lineRule="auto" w:line="480"/>
+        <w:rPr>
+          <w:lang w:val="en-CA"/>
+        </w:rPr>
+      </w:pPr>
+      <w:r>
+        <w:rPr>
+          <w:lang w:val="en-CA"/>
+        </w:rPr>
         <w:t xml:space="preserve">Reihaneh Karimi et all (2025), A Comparative Analysis Using Kepler Data, </w:t>
       </w:r>
-      <w:hyperlink r:id="rId15" w:history="1">
+      <w:hyperlink r:id="rId10">
         <w:r>
           <w:rPr>
             <w:rStyle w:val="Hyperlink"/>
@@ -1460,74 +1961,65 @@
     </w:p>
     <w:p>
       <w:pPr>
-        <w:spacing w:line="480" w:lineRule="auto"/>
+        <w:pStyle w:val="Normal"/>
+        <w:spacing w:lineRule="auto" w:line="480"/>
         <w:ind w:left="720"/>
         <w:rPr>
           <w:lang w:val="en-CA"/>
         </w:rPr>
       </w:pPr>
+      <w:r>
+        <w:rPr>
+          <w:lang w:val="en-CA"/>
+        </w:rPr>
+      </w:r>
     </w:p>
     <w:sectPr>
-      <w:headerReference w:type="even" r:id="rId16"/>
-      <w:headerReference w:type="default" r:id="rId17"/>
-      <w:headerReference w:type="first" r:id="rId18"/>
+      <w:headerReference w:type="even" r:id="rId11"/>
+      <w:headerReference w:type="default" r:id="rId12"/>
+      <w:headerReference w:type="first" r:id="rId13"/>
+      <w:footnotePr>
+        <w:numFmt w:val="decimal"/>
+      </w:footnotePr>
+      <w:type w:val="nextPage"/>
       <w:pgSz w:w="12240" w:h="15840"/>
-      <w:pgMar w:top="1440" w:right="1440" w:bottom="1440" w:left="1440" w:header="720" w:footer="0" w:gutter="0"/>
-      <w:pgNumType w:start="1"/>
-      <w:cols w:space="720"/>
-      <w:formProt w:val="0"/>
-      <w:docGrid w:linePitch="100"/>
+      <w:pgMar w:left="1440" w:right="1440" w:gutter="0" w:header="720" w:top="1440" w:footer="0" w:bottom="1440"/>
+      <w:pgNumType w:start="1" w:fmt="decimal"/>
+      <w:formProt w:val="false"/>
+      <w:textDirection w:val="lrTb"/>
+      <w:docGrid w:type="default" w:linePitch="100" w:charSpace="0"/>
     </w:sectPr>
   </w:body>
 </w:document>
 </file>
 
-<file path=word/endnotes.xml><?xml version="1.0" encoding="utf-8"?>
-<w:endnotes xmlns:wpc="http://schemas.microsoft.com/office/word/2010/wordprocessingCanvas" xmlns:cx="http://schemas.microsoft.com/office/drawing/2014/chartex" xmlns:cx1="http://schemas.microsoft.com/office/drawing/2015/9/8/chartex" xmlns:cx2="http://schemas.microsoft.com/office/drawing/2015/10/21/chartex" xmlns:cx3="http://schemas.microsoft.com/office/drawing/2016/5/9/chartex" xmlns:cx4="http://schemas.microsoft.com/office/drawing/2016/5/10/chartex" xmlns:cx5="http://schemas.microsoft.com/office/drawing/2016/5/11/chartex" xmlns:cx6="http://schemas.microsoft.com/office/drawing/2016/5/12/chartex" xmlns:cx7="http://schemas.microsoft.com/office/drawing/2016/5/13/chartex" xmlns:cx8="http://schemas.microsoft.com/office/drawing/2016/5/14/chartex" xmlns:mc="http://schemas.openxmlformats.org/markup-compatibility/2006" xmlns:aink="http://schemas.microsoft.com/office/drawing/2016/ink" xmlns:am3d="http://schemas.microsoft.com/office/drawing/2017/model3d" xmlns:o="urn:schemas-microsoft-com:office:office" xmlns:oel="http://schemas.microsoft.com/office/2019/extlst" xmlns:r="http://schemas.openxmlformats.org/officeDocument/2006/relationships" xmlns:m="http://schemas.openxmlformats.org/officeDocument/2006/math" xmlns:v="urn:schemas-microsoft-com:vml" xmlns:wp14="http://schemas.microsoft.com/office/word/2010/wordprocessingDrawing" xmlns:wp="http://schemas.openxmlformats.org/drawingml/2006/wordprocessingDrawing" xmlns:w10="urn:schemas-microsoft-com:office:word" xmlns:w="http://schemas.openxmlformats.org/wordprocessingml/2006/main" xmlns:w14="http://schemas.microsoft.com/office/word/2010/wordml" xmlns:w15="http://schemas.microsoft.com/office/word/2012/wordml" xmlns:w16cex="http://schemas.microsoft.com/office/word/2018/wordml/cex" xmlns:w16cid="http://schemas.microsoft.com/office/word/2016/wordml/cid" xmlns:w16="http://schemas.microsoft.com/office/word/2018/wordml" xmlns:w16du="http://schemas.microsoft.com/office/word/2023/wordml/word16du" xmlns:w16sdtdh="http://schemas.microsoft.com/office/word/2020/wordml/sdtdatahash" xmlns:w16sdtfl="http://schemas.microsoft.com/office/word/2024/wordml/sdtformatlock" xmlns:w16se="http://schemas.microsoft.com/office/word/2015/wordml/symex" xmlns:wpg="http://schemas.microsoft.com/office/word/2010/wordprocessingGroup" xmlns:wpi="http://schemas.microsoft.com/office/word/2010/wordprocessingInk" xmlns:wne="http://schemas.microsoft.com/office/word/2006/wordml" xmlns:wps="http://schemas.microsoft.com/office/word/2010/wordprocessingShape" mc:Ignorable="w14 w15 w16se w16cid w16 w16cex w16sdtdh w16sdtfl w16du wp14">
-  <w:endnote w:type="separator" w:id="-1">
-    <w:p>
+<file path=word/footnotes.xml><?xml version="1.0" encoding="utf-8"?>
+<w:footnotes xmlns:o="urn:schemas-microsoft-com:office:office" xmlns:r="http://schemas.openxmlformats.org/officeDocument/2006/relationships" xmlns:v="urn:schemas-microsoft-com:vml" xmlns:w="http://schemas.openxmlformats.org/wordprocessingml/2006/main" xmlns:w10="urn:schemas-microsoft-com:office:word" xmlns:wp="http://schemas.openxmlformats.org/drawingml/2006/wordprocessingDrawing" xmlns:wps="http://schemas.microsoft.com/office/word/2010/wordprocessingShape" xmlns:wpg="http://schemas.microsoft.com/office/word/2010/wordprocessingGroup" xmlns:mc="http://schemas.openxmlformats.org/markup-compatibility/2006" xmlns:wp14="http://schemas.microsoft.com/office/word/2010/wordprocessingDrawing" xmlns:w14="http://schemas.microsoft.com/office/word/2010/wordml" xmlns:w15="http://schemas.microsoft.com/office/word/2012/wordml" mc:Ignorable="w14 wp14 w15">
+  <w:footnote w:id="0" w:type="separator">
+    <w:p>
+      <w:pPr>
+        <w:rPr>
+          <w:sz w:val="12"/>
+        </w:rPr>
+      </w:pPr>
       <w:r>
         <w:separator/>
       </w:r>
     </w:p>
-  </w:endnote>
-  <w:endnote w:type="continuationSeparator" w:id="0">
-    <w:p>
+  </w:footnote>
+  <w:footnote w:id="1" w:type="continuationSeparator">
+    <w:p>
+      <w:pPr>
+        <w:rPr>
+          <w:sz w:val="12"/>
+        </w:rPr>
+      </w:pPr>
       <w:r>
         <w:continuationSeparator/>
       </w:r>
     </w:p>
-  </w:endnote>
-</w:endnotes>
-</file>
-
-<file path=word/footnotes.xml><?xml version="1.0" encoding="utf-8"?>
-<w:footnotes xmlns:wpc="http://schemas.microsoft.com/office/word/2010/wordprocessingCanvas" xmlns:cx="http://schemas.microsoft.com/office/drawing/2014/chartex" xmlns:cx1="http://schemas.microsoft.com/office/drawing/2015/9/8/chartex" xmlns:cx2="http://schemas.microsoft.com/office/drawing/2015/10/21/chartex" xmlns:cx3="http://schemas.microsoft.com/office/drawing/2016/5/9/chartex" xmlns:cx4="http://schemas.microsoft.com/office/drawing/2016/5/10/chartex" xmlns:cx5="http://schemas.microsoft.com/office/drawing/2016/5/11/chartex" xmlns:cx6="http://schemas.microsoft.com/office/drawing/2016/5/12/chartex" xmlns:cx7="http://schemas.microsoft.com/office/drawing/2016/5/13/chartex" xmlns:cx8="http://schemas.microsoft.com/office/drawing/2016/5/14/chartex" xmlns:mc="http://schemas.openxmlformats.org/markup-compatibility/2006" xmlns:aink="http://schemas.microsoft.com/office/drawing/2016/ink" xmlns:am3d="http://schemas.microsoft.com/office/drawing/2017/model3d" xmlns:o="urn:schemas-microsoft-com:office:office" xmlns:oel="http://schemas.microsoft.com/office/2019/extlst" xmlns:r="http://schemas.openxmlformats.org/officeDocument/2006/relationships" xmlns:m="http://schemas.openxmlformats.org/officeDocument/2006/math" xmlns:v="urn:schemas-microsoft-com:vml" xmlns:wp14="http://schemas.microsoft.com/office/word/2010/wordprocessingDrawing" xmlns:wp="http://schemas.openxmlformats.org/drawingml/2006/wordprocessingDrawing" xmlns:w10="urn:schemas-microsoft-com:office:word" xmlns:w="http://schemas.openxmlformats.org/wordprocessingml/2006/main" xmlns:w14="http://schemas.microsoft.com/office/word/2010/wordml" xmlns:w15="http://schemas.microsoft.com/office/word/2012/wordml" xmlns:w16cex="http://schemas.microsoft.com/office/word/2018/wordml/cex" xmlns:w16cid="http://schemas.microsoft.com/office/word/2016/wordml/cid" xmlns:w16="http://schemas.microsoft.com/office/word/2018/wordml" xmlns:w16du="http://schemas.microsoft.com/office/word/2023/wordml/word16du" xmlns:w16sdtdh="http://schemas.microsoft.com/office/word/2020/wordml/sdtdatahash" xmlns:w16sdtfl="http://schemas.microsoft.com/office/word/2024/wordml/sdtformatlock" xmlns:w16se="http://schemas.microsoft.com/office/word/2015/wordml/symex" xmlns:wpg="http://schemas.microsoft.com/office/word/2010/wordprocessingGroup" xmlns:wpi="http://schemas.microsoft.com/office/word/2010/wordprocessingInk" xmlns:wne="http://schemas.microsoft.com/office/word/2006/wordml" xmlns:wps="http://schemas.microsoft.com/office/word/2010/wordprocessingShape" mc:Ignorable="w14 w15 w16se w16cid w16 w16cex w16sdtdh w16sdtfl w16du wp14">
-  <w:footnote w:type="separator" w:id="-1">
-    <w:p>
-      <w:pPr>
-        <w:rPr>
-          <w:sz w:val="12"/>
-        </w:rPr>
-      </w:pPr>
-      <w:r>
-        <w:separator/>
-      </w:r>
-    </w:p>
   </w:footnote>
-  <w:footnote w:type="continuationSeparator" w:id="0">
-    <w:p>
-      <w:pPr>
-        <w:rPr>
-          <w:sz w:val="12"/>
-        </w:rPr>
-      </w:pPr>
-      <w:r>
-        <w:continuationSeparator/>
-      </w:r>
-    </w:p>
-  </w:footnote>
-  <w:footnote w:id="1">
+  <w:footnote w:id="2">
     <w:p>
       <w:pPr>
         <w:pStyle w:val="FootnoteText"/>
@@ -1542,57 +2034,43 @@
         <w:footnoteRef/>
       </w:r>
       <w:r>
+        <w:rPr/>
         <w:t xml:space="preserve"> </w:t>
       </w:r>
       <w:hyperlink r:id="rId1">
-        <w:proofErr w:type="spellStart"/>
         <w:r>
           <w:rPr>
             <w:rStyle w:val="Hyperlink"/>
           </w:rPr>
-          <w:t>GridSearchCV</w:t>
+          <w:t>GridSearchCV — scikit-learn 1.8.0 documentation</w:t>
         </w:r>
-        <w:proofErr w:type="spellEnd"/>
+      </w:hyperlink>
+    </w:p>
+  </w:footnote>
+  <w:footnote w:id="3">
+    <w:p>
+      <w:pPr>
+        <w:pStyle w:val="FootnoteText"/>
+        <w:rPr>
+          <w:lang w:val="en-CA"/>
+        </w:rPr>
+      </w:pPr>
+      <w:r>
+        <w:rPr>
+          <w:rStyle w:val="FootnoteCharacters"/>
+        </w:rPr>
+        <w:footnoteRef/>
+      </w:r>
+      <w:r>
+        <w:rPr/>
+        <w:t xml:space="preserve"> </w:t>
+      </w:r>
+      <w:hyperlink r:id="rId2">
         <w:r>
           <w:rPr>
             <w:rStyle w:val="Hyperlink"/>
           </w:rPr>
-          <w:t xml:space="preserve"> — scikit-learn 1.8.0 documentation</w:t>
-        </w:r>
-      </w:hyperlink>
-    </w:p>
-  </w:footnote>
-  <w:footnote w:id="2">
-    <w:p>
-      <w:pPr>
-        <w:pStyle w:val="FootnoteText"/>
-        <w:rPr>
-          <w:lang w:val="en-CA"/>
-        </w:rPr>
-      </w:pPr>
-      <w:r>
-        <w:rPr>
-          <w:rStyle w:val="FootnoteCharacters"/>
-        </w:rPr>
-        <w:footnoteRef/>
-      </w:r>
-      <w:r>
-        <w:t xml:space="preserve"> </w:t>
-      </w:r>
-      <w:hyperlink r:id="rId2">
-        <w:proofErr w:type="spellStart"/>
-        <w:r>
-          <w:rPr>
-            <w:rStyle w:val="Hyperlink"/>
-          </w:rPr>
-          <w:t>StratifiedKFold</w:t>
-        </w:r>
-        <w:proofErr w:type="spellEnd"/>
-        <w:r>
-          <w:rPr>
-            <w:rStyle w:val="Hyperlink"/>
-          </w:rPr>
-          <w:t xml:space="preserve"> — scikit-learn 1.8.0 documentation</w:t>
+          <w:t>StratifiedKFold — scikit-learn 1.8.0 documentation</w:t>
         </w:r>
       </w:hyperlink>
     </w:p>
@@ -1601,10 +2079,11 @@
 </file>
 
 <file path=word/header1.xml><?xml version="1.0" encoding="utf-8"?>
-<w:hdr xmlns:wpc="http://schemas.microsoft.com/office/word/2010/wordprocessingCanvas" xmlns:cx="http://schemas.microsoft.com/office/drawing/2014/chartex" xmlns:cx1="http://schemas.microsoft.com/office/drawing/2015/9/8/chartex" xmlns:cx2="http://schemas.microsoft.com/office/drawing/2015/10/21/chartex" xmlns:cx3="http://schemas.microsoft.com/office/drawing/2016/5/9/chartex" xmlns:cx4="http://schemas.microsoft.com/office/drawing/2016/5/10/chartex" xmlns:cx5="http://schemas.microsoft.com/office/drawing/2016/5/11/chartex" xmlns:cx6="http://schemas.microsoft.com/office/drawing/2016/5/12/chartex" xmlns:cx7="http://schemas.microsoft.com/office/drawing/2016/5/13/chartex" xmlns:cx8="http://schemas.microsoft.com/office/drawing/2016/5/14/chartex" xmlns:mc="http://schemas.openxmlformats.org/markup-compatibility/2006" xmlns:aink="http://schemas.microsoft.com/office/drawing/2016/ink" xmlns:am3d="http://schemas.microsoft.com/office/drawing/2017/model3d" xmlns:o="urn:schemas-microsoft-com:office:office" xmlns:oel="http://schemas.microsoft.com/office/2019/extlst" xmlns:r="http://schemas.openxmlformats.org/officeDocument/2006/relationships" xmlns:m="http://schemas.openxmlformats.org/officeDocument/2006/math" xmlns:v="urn:schemas-microsoft-com:vml" xmlns:wp14="http://schemas.microsoft.com/office/word/2010/wordprocessingDrawing" xmlns:wp="http://schemas.openxmlformats.org/drawingml/2006/wordprocessingDrawing" xmlns:w10="urn:schemas-microsoft-com:office:word" xmlns:w="http://schemas.openxmlformats.org/wordprocessingml/2006/main" xmlns:w14="http://schemas.microsoft.com/office/word/2010/wordml" xmlns:w15="http://schemas.microsoft.com/office/word/2012/wordml" xmlns:w16cex="http://schemas.microsoft.com/office/word/2018/wordml/cex" xmlns:w16cid="http://schemas.microsoft.com/office/word/2016/wordml/cid" xmlns:w16="http://schemas.microsoft.com/office/word/2018/wordml" xmlns:w16du="http://schemas.microsoft.com/office/word/2023/wordml/word16du" xmlns:w16sdtdh="http://schemas.microsoft.com/office/word/2020/wordml/sdtdatahash" xmlns:w16sdtfl="http://schemas.microsoft.com/office/word/2024/wordml/sdtformatlock" xmlns:w16se="http://schemas.microsoft.com/office/word/2015/wordml/symex" xmlns:wpg="http://schemas.microsoft.com/office/word/2010/wordprocessingGroup" xmlns:wpi="http://schemas.microsoft.com/office/word/2010/wordprocessingInk" xmlns:wne="http://schemas.microsoft.com/office/word/2006/wordml" xmlns:wps="http://schemas.microsoft.com/office/word/2010/wordprocessingShape" mc:Ignorable="w14 w15 w16se w16cid w16 w16cex w16sdtdh w16sdtfl w16du wp14">
+<w:hdr xmlns:o="urn:schemas-microsoft-com:office:office" xmlns:r="http://schemas.openxmlformats.org/officeDocument/2006/relationships" xmlns:v="urn:schemas-microsoft-com:vml" xmlns:w="http://schemas.openxmlformats.org/wordprocessingml/2006/main" xmlns:w10="urn:schemas-microsoft-com:office:word" xmlns:wp="http://schemas.openxmlformats.org/drawingml/2006/wordprocessingDrawing" xmlns:wps="http://schemas.microsoft.com/office/word/2010/wordprocessingShape" xmlns:wpg="http://schemas.microsoft.com/office/word/2010/wordprocessingGroup" xmlns:mc="http://schemas.openxmlformats.org/markup-compatibility/2006" xmlns:wp14="http://schemas.microsoft.com/office/word/2010/wordprocessingDrawing" xmlns:w14="http://schemas.microsoft.com/office/word/2010/wordml" xmlns:w15="http://schemas.microsoft.com/office/word/2012/wordml" mc:Ignorable="w14 wp14 w15">
   <w:p>
     <w:pPr>
-      <w:spacing w:line="480" w:lineRule="auto"/>
+      <w:pStyle w:val="Normal"/>
+      <w:spacing w:lineRule="auto" w:line="480"/>
       <w:rPr>
         <w:color w:val="000000"/>
       </w:rPr>
@@ -1642,23 +2121,31 @@
   </w:p>
   <w:p>
     <w:pPr>
-      <w:spacing w:line="480" w:lineRule="auto"/>
+      <w:pStyle w:val="Normal"/>
+      <w:spacing w:lineRule="auto" w:line="480"/>
       <w:rPr>
         <w:color w:val="000000"/>
       </w:rPr>
     </w:pPr>
+    <w:r>
+      <w:rPr>
+        <w:color w:val="000000"/>
+      </w:rPr>
+    </w:r>
   </w:p>
 </w:hdr>
 </file>
 
 <file path=word/header2.xml><?xml version="1.0" encoding="utf-8"?>
-<w:hdr xmlns:wpc="http://schemas.microsoft.com/office/word/2010/wordprocessingCanvas" xmlns:cx="http://schemas.microsoft.com/office/drawing/2014/chartex" xmlns:cx1="http://schemas.microsoft.com/office/drawing/2015/9/8/chartex" xmlns:cx2="http://schemas.microsoft.com/office/drawing/2015/10/21/chartex" xmlns:cx3="http://schemas.microsoft.com/office/drawing/2016/5/9/chartex" xmlns:cx4="http://schemas.microsoft.com/office/drawing/2016/5/10/chartex" xmlns:cx5="http://schemas.microsoft.com/office/drawing/2016/5/11/chartex" xmlns:cx6="http://schemas.microsoft.com/office/drawing/2016/5/12/chartex" xmlns:cx7="http://schemas.microsoft.com/office/drawing/2016/5/13/chartex" xmlns:cx8="http://schemas.microsoft.com/office/drawing/2016/5/14/chartex" xmlns:mc="http://schemas.openxmlformats.org/markup-compatibility/2006" xmlns:aink="http://schemas.microsoft.com/office/drawing/2016/ink" xmlns:am3d="http://schemas.microsoft.com/office/drawing/2017/model3d" xmlns:o="urn:schemas-microsoft-com:office:office" xmlns:oel="http://schemas.microsoft.com/office/2019/extlst" xmlns:r="http://schemas.openxmlformats.org/officeDocument/2006/relationships" xmlns:m="http://schemas.openxmlformats.org/officeDocument/2006/math" xmlns:v="urn:schemas-microsoft-com:vml" xmlns:wp14="http://schemas.microsoft.com/office/word/2010/wordprocessingDrawing" xmlns:wp="http://schemas.openxmlformats.org/drawingml/2006/wordprocessingDrawing" xmlns:w10="urn:schemas-microsoft-com:office:word" xmlns:w="http://schemas.openxmlformats.org/wordprocessingml/2006/main" xmlns:w14="http://schemas.microsoft.com/office/word/2010/wordml" xmlns:w15="http://schemas.microsoft.com/office/word/2012/wordml" xmlns:w16cex="http://schemas.microsoft.com/office/word/2018/wordml/cex" xmlns:w16cid="http://schemas.microsoft.com/office/word/2016/wordml/cid" xmlns:w16="http://schemas.microsoft.com/office/word/2018/wordml" xmlns:w16du="http://schemas.microsoft.com/office/word/2023/wordml/word16du" xmlns:w16sdtdh="http://schemas.microsoft.com/office/word/2020/wordml/sdtdatahash" xmlns:w16sdtfl="http://schemas.microsoft.com/office/word/2024/wordml/sdtformatlock" xmlns:w16se="http://schemas.microsoft.com/office/word/2015/wordml/symex" xmlns:wpg="http://schemas.microsoft.com/office/word/2010/wordprocessingGroup" xmlns:wpi="http://schemas.microsoft.com/office/word/2010/wordprocessingInk" xmlns:wne="http://schemas.microsoft.com/office/word/2006/wordml" xmlns:wps="http://schemas.microsoft.com/office/word/2010/wordprocessingShape" mc:Ignorable="w14 w15 w16se w16cid w16 w16cex w16sdtdh w16sdtfl w16du wp14">
+<w:hdr xmlns:o="urn:schemas-microsoft-com:office:office" xmlns:r="http://schemas.openxmlformats.org/officeDocument/2006/relationships" xmlns:v="urn:schemas-microsoft-com:vml" xmlns:w="http://schemas.openxmlformats.org/wordprocessingml/2006/main" xmlns:w10="urn:schemas-microsoft-com:office:word" xmlns:wp="http://schemas.openxmlformats.org/drawingml/2006/wordprocessingDrawing" xmlns:wps="http://schemas.microsoft.com/office/word/2010/wordprocessingShape" xmlns:wpg="http://schemas.microsoft.com/office/word/2010/wordprocessingGroup" xmlns:mc="http://schemas.openxmlformats.org/markup-compatibility/2006" xmlns:wp14="http://schemas.microsoft.com/office/word/2010/wordprocessingDrawing" xmlns:w14="http://schemas.microsoft.com/office/word/2010/wordml" xmlns:w15="http://schemas.microsoft.com/office/word/2012/wordml" mc:Ignorable="w14 wp14 w15">
   <w:p>
     <w:pPr>
+      <w:pStyle w:val="Normal"/>
       <w:tabs>
-        <w:tab w:val="right" w:pos="9360"/>
+        <w:tab w:val="clear" w:pos="720"/>
+        <w:tab w:val="right" w:pos="9360" w:leader="none"/>
       </w:tabs>
-      <w:spacing w:line="480" w:lineRule="auto"/>
+      <w:spacing w:lineRule="auto" w:line="480"/>
       <w:rPr>
         <w:color w:val="000000"/>
       </w:rPr>
@@ -1691,7 +2178,7 @@
       <w:rPr>
         <w:color w:val="000000"/>
       </w:rPr>
-      <w:t>9</w:t>
+      <w:t>10</w:t>
     </w:r>
     <w:r>
       <w:rPr>
@@ -1704,13 +2191,15 @@
 </file>
 
 <file path=word/header3.xml><?xml version="1.0" encoding="utf-8"?>
-<w:hdr xmlns:wpc="http://schemas.microsoft.com/office/word/2010/wordprocessingCanvas" xmlns:cx="http://schemas.microsoft.com/office/drawing/2014/chartex" xmlns:cx1="http://schemas.microsoft.com/office/drawing/2015/9/8/chartex" xmlns:cx2="http://schemas.microsoft.com/office/drawing/2015/10/21/chartex" xmlns:cx3="http://schemas.microsoft.com/office/drawing/2016/5/9/chartex" xmlns:cx4="http://schemas.microsoft.com/office/drawing/2016/5/10/chartex" xmlns:cx5="http://schemas.microsoft.com/office/drawing/2016/5/11/chartex" xmlns:cx6="http://schemas.microsoft.com/office/drawing/2016/5/12/chartex" xmlns:cx7="http://schemas.microsoft.com/office/drawing/2016/5/13/chartex" xmlns:cx8="http://schemas.microsoft.com/office/drawing/2016/5/14/chartex" xmlns:mc="http://schemas.openxmlformats.org/markup-compatibility/2006" xmlns:aink="http://schemas.microsoft.com/office/drawing/2016/ink" xmlns:am3d="http://schemas.microsoft.com/office/drawing/2017/model3d" xmlns:o="urn:schemas-microsoft-com:office:office" xmlns:oel="http://schemas.microsoft.com/office/2019/extlst" xmlns:r="http://schemas.openxmlformats.org/officeDocument/2006/relationships" xmlns:m="http://schemas.openxmlformats.org/officeDocument/2006/math" xmlns:v="urn:schemas-microsoft-com:vml" xmlns:wp14="http://schemas.microsoft.com/office/word/2010/wordprocessingDrawing" xmlns:wp="http://schemas.openxmlformats.org/drawingml/2006/wordprocessingDrawing" xmlns:w10="urn:schemas-microsoft-com:office:word" xmlns:w="http://schemas.openxmlformats.org/wordprocessingml/2006/main" xmlns:w14="http://schemas.microsoft.com/office/word/2010/wordml" xmlns:w15="http://schemas.microsoft.com/office/word/2012/wordml" xmlns:w16cex="http://schemas.microsoft.com/office/word/2018/wordml/cex" xmlns:w16cid="http://schemas.microsoft.com/office/word/2016/wordml/cid" xmlns:w16="http://schemas.microsoft.com/office/word/2018/wordml" xmlns:w16du="http://schemas.microsoft.com/office/word/2023/wordml/word16du" xmlns:w16sdtdh="http://schemas.microsoft.com/office/word/2020/wordml/sdtdatahash" xmlns:w16sdtfl="http://schemas.microsoft.com/office/word/2024/wordml/sdtformatlock" xmlns:w16se="http://schemas.microsoft.com/office/word/2015/wordml/symex" xmlns:wpg="http://schemas.microsoft.com/office/word/2010/wordprocessingGroup" xmlns:wpi="http://schemas.microsoft.com/office/word/2010/wordprocessingInk" xmlns:wne="http://schemas.microsoft.com/office/word/2006/wordml" xmlns:wps="http://schemas.microsoft.com/office/word/2010/wordprocessingShape" mc:Ignorable="w14 w15 w16se w16cid w16 w16cex w16sdtdh w16sdtfl w16du wp14">
+<w:hdr xmlns:o="urn:schemas-microsoft-com:office:office" xmlns:r="http://schemas.openxmlformats.org/officeDocument/2006/relationships" xmlns:v="urn:schemas-microsoft-com:vml" xmlns:w="http://schemas.openxmlformats.org/wordprocessingml/2006/main" xmlns:w10="urn:schemas-microsoft-com:office:word" xmlns:wp="http://schemas.openxmlformats.org/drawingml/2006/wordprocessingDrawing" xmlns:wps="http://schemas.microsoft.com/office/word/2010/wordprocessingShape" xmlns:wpg="http://schemas.microsoft.com/office/word/2010/wordprocessingGroup" xmlns:mc="http://schemas.openxmlformats.org/markup-compatibility/2006" xmlns:wp14="http://schemas.microsoft.com/office/word/2010/wordprocessingDrawing" xmlns:w14="http://schemas.microsoft.com/office/word/2010/wordml" xmlns:w15="http://schemas.microsoft.com/office/word/2012/wordml" mc:Ignorable="w14 wp14 w15">
   <w:p>
     <w:pPr>
+      <w:pStyle w:val="Normal"/>
       <w:tabs>
-        <w:tab w:val="right" w:pos="9360"/>
+        <w:tab w:val="clear" w:pos="720"/>
+        <w:tab w:val="right" w:pos="9360" w:leader="none"/>
       </w:tabs>
-      <w:spacing w:line="480" w:lineRule="auto"/>
+      <w:spacing w:lineRule="auto" w:line="480"/>
       <w:rPr>
         <w:color w:val="000000"/>
       </w:rPr>
@@ -1743,7 +2232,7 @@
       <w:rPr>
         <w:color w:val="000000"/>
       </w:rPr>
-      <w:t>9</w:t>
+      <w:t>10</w:t>
     </w:r>
     <w:r>
       <w:rPr>
@@ -1756,11 +2245,127 @@
 </file>
 
 <file path=word/numbering.xml><?xml version="1.0" encoding="utf-8"?>
-<w:numbering xmlns:wpc="http://schemas.microsoft.com/office/word/2010/wordprocessingCanvas" xmlns:cx="http://schemas.microsoft.com/office/drawing/2014/chartex" xmlns:cx1="http://schemas.microsoft.com/office/drawing/2015/9/8/chartex" xmlns:cx2="http://schemas.microsoft.com/office/drawing/2015/10/21/chartex" xmlns:cx3="http://schemas.microsoft.com/office/drawing/2016/5/9/chartex" xmlns:cx4="http://schemas.microsoft.com/office/drawing/2016/5/10/chartex" xmlns:cx5="http://schemas.microsoft.com/office/drawing/2016/5/11/chartex" xmlns:cx6="http://schemas.microsoft.com/office/drawing/2016/5/12/chartex" xmlns:cx7="http://schemas.microsoft.com/office/drawing/2016/5/13/chartex" xmlns:cx8="http://schemas.microsoft.com/office/drawing/2016/5/14/chartex" xmlns:mc="http://schemas.openxmlformats.org/markup-compatibility/2006" xmlns:aink="http://schemas.microsoft.com/office/drawing/2016/ink" xmlns:am3d="http://schemas.microsoft.com/office/drawing/2017/model3d" xmlns:o="urn:schemas-microsoft-com:office:office" xmlns:oel="http://schemas.microsoft.com/office/2019/extlst" xmlns:r="http://schemas.openxmlformats.org/officeDocument/2006/relationships" xmlns:m="http://schemas.openxmlformats.org/officeDocument/2006/math" xmlns:v="urn:schemas-microsoft-com:vml" xmlns:wp14="http://schemas.microsoft.com/office/word/2010/wordprocessingDrawing" xmlns:wp="http://schemas.openxmlformats.org/drawingml/2006/wordprocessingDrawing" xmlns:w10="urn:schemas-microsoft-com:office:word" xmlns:w="http://schemas.openxmlformats.org/wordprocessingml/2006/main" xmlns:w14="http://schemas.microsoft.com/office/word/2010/wordml" xmlns:w15="http://schemas.microsoft.com/office/word/2012/wordml" xmlns:w16cex="http://schemas.microsoft.com/office/word/2018/wordml/cex" xmlns:w16cid="http://schemas.microsoft.com/office/word/2016/wordml/cid" xmlns:w16="http://schemas.microsoft.com/office/word/2018/wordml" xmlns:w16du="http://schemas.microsoft.com/office/word/2023/wordml/word16du" xmlns:w16sdtdh="http://schemas.microsoft.com/office/word/2020/wordml/sdtdatahash" xmlns:w16sdtfl="http://schemas.microsoft.com/office/word/2024/wordml/sdtformatlock" xmlns:w16se="http://schemas.microsoft.com/office/word/2015/wordml/symex" xmlns:wpg="http://schemas.microsoft.com/office/word/2010/wordprocessingGroup" xmlns:wpi="http://schemas.microsoft.com/office/word/2010/wordprocessingInk" xmlns:wne="http://schemas.microsoft.com/office/word/2006/wordml" xmlns:wps="http://schemas.microsoft.com/office/word/2010/wordprocessingShape" mc:Ignorable="w14 w15 w16se w16cid w16 w16cex w16sdtdh w16sdtfl w16du wp14">
-  <w:abstractNum w:abstractNumId="0" w15:restartNumberingAfterBreak="0">
-    <w:nsid w:val="004A539C"/>
-    <w:multiLevelType w:val="multilevel"/>
-    <w:tmpl w:val="83721556"/>
+<w:numbering xmlns:w="http://schemas.openxmlformats.org/wordprocessingml/2006/main" xmlns:o="urn:schemas-microsoft-com:office:office" xmlns:r="http://schemas.openxmlformats.org/officeDocument/2006/relationships" xmlns:v="urn:schemas-microsoft-com:vml" xmlns:mc="http://schemas.openxmlformats.org/markup-compatibility/2006" xmlns:w14="http://schemas.microsoft.com/office/word/2010/wordml" mc:Ignorable="w14">
+  <w:abstractNum w:abstractNumId="1">
+    <w:lvl w:ilvl="0">
+      <w:start w:val="1"/>
+      <w:numFmt w:val="decimal"/>
+      <w:lvlText w:val="%1."/>
+      <w:lvlJc w:val="left"/>
+      <w:pPr>
+        <w:tabs>
+          <w:tab w:val="num" w:pos="0"/>
+        </w:tabs>
+        <w:ind w:left="1080" w:hanging="360"/>
+      </w:pPr>
+      <w:rPr/>
+    </w:lvl>
+    <w:lvl w:ilvl="1">
+      <w:start w:val="1"/>
+      <w:numFmt w:val="lowerLetter"/>
+      <w:lvlText w:val="%2."/>
+      <w:lvlJc w:val="left"/>
+      <w:pPr>
+        <w:tabs>
+          <w:tab w:val="num" w:pos="0"/>
+        </w:tabs>
+        <w:ind w:left="1800" w:hanging="360"/>
+      </w:pPr>
+      <w:rPr/>
+    </w:lvl>
+    <w:lvl w:ilvl="2">
+      <w:start w:val="1"/>
+      <w:numFmt w:val="lowerRoman"/>
+      <w:lvlText w:val="%3."/>
+      <w:lvlJc w:val="right"/>
+      <w:pPr>
+        <w:tabs>
+          <w:tab w:val="num" w:pos="0"/>
+        </w:tabs>
+        <w:ind w:left="2520" w:hanging="180"/>
+      </w:pPr>
+      <w:rPr/>
+    </w:lvl>
+    <w:lvl w:ilvl="3">
+      <w:start w:val="1"/>
+      <w:numFmt w:val="decimal"/>
+      <w:lvlText w:val="%4."/>
+      <w:lvlJc w:val="left"/>
+      <w:pPr>
+        <w:tabs>
+          <w:tab w:val="num" w:pos="0"/>
+        </w:tabs>
+        <w:ind w:left="3240" w:hanging="360"/>
+      </w:pPr>
+      <w:rPr/>
+    </w:lvl>
+    <w:lvl w:ilvl="4">
+      <w:start w:val="1"/>
+      <w:numFmt w:val="lowerLetter"/>
+      <w:lvlText w:val="%5."/>
+      <w:lvlJc w:val="left"/>
+      <w:pPr>
+        <w:tabs>
+          <w:tab w:val="num" w:pos="0"/>
+        </w:tabs>
+        <w:ind w:left="3960" w:hanging="360"/>
+      </w:pPr>
+      <w:rPr/>
+    </w:lvl>
+    <w:lvl w:ilvl="5">
+      <w:start w:val="1"/>
+      <w:numFmt w:val="lowerRoman"/>
+      <w:lvlText w:val="%6."/>
+      <w:lvlJc w:val="right"/>
+      <w:pPr>
+        <w:tabs>
+          <w:tab w:val="num" w:pos="0"/>
+        </w:tabs>
+        <w:ind w:left="4680" w:hanging="180"/>
+      </w:pPr>
+      <w:rPr/>
+    </w:lvl>
+    <w:lvl w:ilvl="6">
+      <w:start w:val="1"/>
+      <w:numFmt w:val="decimal"/>
+      <w:lvlText w:val="%7."/>
+      <w:lvlJc w:val="left"/>
+      <w:pPr>
+        <w:tabs>
+          <w:tab w:val="num" w:pos="0"/>
+        </w:tabs>
+        <w:ind w:left="5400" w:hanging="360"/>
+      </w:pPr>
+      <w:rPr/>
+    </w:lvl>
+    <w:lvl w:ilvl="7">
+      <w:start w:val="1"/>
+      <w:numFmt w:val="lowerLetter"/>
+      <w:lvlText w:val="%8."/>
+      <w:lvlJc w:val="left"/>
+      <w:pPr>
+        <w:tabs>
+          <w:tab w:val="num" w:pos="0"/>
+        </w:tabs>
+        <w:ind w:left="6120" w:hanging="360"/>
+      </w:pPr>
+      <w:rPr/>
+    </w:lvl>
+    <w:lvl w:ilvl="8">
+      <w:start w:val="1"/>
+      <w:numFmt w:val="lowerRoman"/>
+      <w:lvlText w:val="%9."/>
+      <w:lvlJc w:val="right"/>
+      <w:pPr>
+        <w:tabs>
+          <w:tab w:val="num" w:pos="0"/>
+        </w:tabs>
+        <w:ind w:left="6840" w:hanging="180"/>
+      </w:pPr>
+      <w:rPr/>
+    </w:lvl>
+  </w:abstractNum>
+  <w:abstractNum w:abstractNumId="2">
     <w:lvl w:ilvl="0">
       <w:start w:val="1"/>
       <w:numFmt w:val="none"/>
@@ -1771,7 +2376,7 @@
         <w:tabs>
           <w:tab w:val="num" w:pos="0"/>
         </w:tabs>
-        <w:ind w:left="0" w:firstLine="0"/>
+        <w:ind w:left="0" w:hanging="0"/>
       </w:pPr>
     </w:lvl>
     <w:lvl w:ilvl="1">
@@ -1784,7 +2389,7 @@
         <w:tabs>
           <w:tab w:val="num" w:pos="0"/>
         </w:tabs>
-        <w:ind w:left="0" w:firstLine="0"/>
+        <w:ind w:left="0" w:hanging="0"/>
       </w:pPr>
     </w:lvl>
     <w:lvl w:ilvl="2">
@@ -1797,7 +2402,7 @@
         <w:tabs>
           <w:tab w:val="num" w:pos="0"/>
         </w:tabs>
-        <w:ind w:left="0" w:firstLine="0"/>
+        <w:ind w:left="0" w:hanging="0"/>
       </w:pPr>
     </w:lvl>
     <w:lvl w:ilvl="3">
@@ -1810,7 +2415,7 @@
         <w:tabs>
           <w:tab w:val="num" w:pos="0"/>
         </w:tabs>
-        <w:ind w:left="0" w:firstLine="0"/>
+        <w:ind w:left="0" w:hanging="0"/>
       </w:pPr>
     </w:lvl>
     <w:lvl w:ilvl="4">
@@ -1823,7 +2428,7 @@
         <w:tabs>
           <w:tab w:val="num" w:pos="0"/>
         </w:tabs>
-        <w:ind w:left="0" w:firstLine="0"/>
+        <w:ind w:left="0" w:hanging="0"/>
       </w:pPr>
     </w:lvl>
     <w:lvl w:ilvl="5">
@@ -1836,7 +2441,7 @@
         <w:tabs>
           <w:tab w:val="num" w:pos="0"/>
         </w:tabs>
-        <w:ind w:left="0" w:firstLine="0"/>
+        <w:ind w:left="0" w:hanging="0"/>
       </w:pPr>
     </w:lvl>
     <w:lvl w:ilvl="6">
@@ -1849,7 +2454,7 @@
         <w:tabs>
           <w:tab w:val="num" w:pos="0"/>
         </w:tabs>
-        <w:ind w:left="0" w:firstLine="0"/>
+        <w:ind w:left="0" w:hanging="0"/>
       </w:pPr>
     </w:lvl>
     <w:lvl w:ilvl="7">
@@ -1862,7 +2467,7 @@
         <w:tabs>
           <w:tab w:val="num" w:pos="0"/>
         </w:tabs>
-        <w:ind w:left="0" w:firstLine="0"/>
+        <w:ind w:left="0" w:hanging="0"/>
       </w:pPr>
     </w:lvl>
     <w:lvl w:ilvl="8">
@@ -1875,138 +2480,25 @@
         <w:tabs>
           <w:tab w:val="num" w:pos="0"/>
         </w:tabs>
-        <w:ind w:left="0" w:firstLine="0"/>
+        <w:ind w:left="0" w:hanging="0"/>
       </w:pPr>
     </w:lvl>
   </w:abstractNum>
-  <w:abstractNum w:abstractNumId="1" w15:restartNumberingAfterBreak="0">
-    <w:nsid w:val="7F68064D"/>
-    <w:multiLevelType w:val="multilevel"/>
-    <w:tmpl w:val="20467E28"/>
-    <w:lvl w:ilvl="0">
-      <w:start w:val="1"/>
-      <w:numFmt w:val="decimal"/>
-      <w:lvlText w:val="%1."/>
-      <w:lvlJc w:val="left"/>
-      <w:pPr>
-        <w:tabs>
-          <w:tab w:val="num" w:pos="0"/>
-        </w:tabs>
-        <w:ind w:left="1080" w:hanging="360"/>
-      </w:pPr>
-    </w:lvl>
-    <w:lvl w:ilvl="1">
-      <w:start w:val="1"/>
-      <w:numFmt w:val="lowerLetter"/>
-      <w:lvlText w:val="%2."/>
-      <w:lvlJc w:val="left"/>
-      <w:pPr>
-        <w:tabs>
-          <w:tab w:val="num" w:pos="0"/>
-        </w:tabs>
-        <w:ind w:left="1800" w:hanging="360"/>
-      </w:pPr>
-    </w:lvl>
-    <w:lvl w:ilvl="2">
-      <w:start w:val="1"/>
-      <w:numFmt w:val="lowerRoman"/>
-      <w:lvlText w:val="%3."/>
-      <w:lvlJc w:val="right"/>
-      <w:pPr>
-        <w:tabs>
-          <w:tab w:val="num" w:pos="0"/>
-        </w:tabs>
-        <w:ind w:left="2520" w:hanging="180"/>
-      </w:pPr>
-    </w:lvl>
-    <w:lvl w:ilvl="3">
-      <w:start w:val="1"/>
-      <w:numFmt w:val="decimal"/>
-      <w:lvlText w:val="%4."/>
-      <w:lvlJc w:val="left"/>
-      <w:pPr>
-        <w:tabs>
-          <w:tab w:val="num" w:pos="0"/>
-        </w:tabs>
-        <w:ind w:left="3240" w:hanging="360"/>
-      </w:pPr>
-    </w:lvl>
-    <w:lvl w:ilvl="4">
-      <w:start w:val="1"/>
-      <w:numFmt w:val="lowerLetter"/>
-      <w:lvlText w:val="%5."/>
-      <w:lvlJc w:val="left"/>
-      <w:pPr>
-        <w:tabs>
-          <w:tab w:val="num" w:pos="0"/>
-        </w:tabs>
-        <w:ind w:left="3960" w:hanging="360"/>
-      </w:pPr>
-    </w:lvl>
-    <w:lvl w:ilvl="5">
-      <w:start w:val="1"/>
-      <w:numFmt w:val="lowerRoman"/>
-      <w:lvlText w:val="%6."/>
-      <w:lvlJc w:val="right"/>
-      <w:pPr>
-        <w:tabs>
-          <w:tab w:val="num" w:pos="0"/>
-        </w:tabs>
-        <w:ind w:left="4680" w:hanging="180"/>
-      </w:pPr>
-    </w:lvl>
-    <w:lvl w:ilvl="6">
-      <w:start w:val="1"/>
-      <w:numFmt w:val="decimal"/>
-      <w:lvlText w:val="%7."/>
-      <w:lvlJc w:val="left"/>
-      <w:pPr>
-        <w:tabs>
-          <w:tab w:val="num" w:pos="0"/>
-        </w:tabs>
-        <w:ind w:left="5400" w:hanging="360"/>
-      </w:pPr>
-    </w:lvl>
-    <w:lvl w:ilvl="7">
-      <w:start w:val="1"/>
-      <w:numFmt w:val="lowerLetter"/>
-      <w:lvlText w:val="%8."/>
-      <w:lvlJc w:val="left"/>
-      <w:pPr>
-        <w:tabs>
-          <w:tab w:val="num" w:pos="0"/>
-        </w:tabs>
-        <w:ind w:left="6120" w:hanging="360"/>
-      </w:pPr>
-    </w:lvl>
-    <w:lvl w:ilvl="8">
-      <w:start w:val="1"/>
-      <w:numFmt w:val="lowerRoman"/>
-      <w:lvlText w:val="%9."/>
-      <w:lvlJc w:val="right"/>
-      <w:pPr>
-        <w:tabs>
-          <w:tab w:val="num" w:pos="0"/>
-        </w:tabs>
-        <w:ind w:left="6840" w:hanging="180"/>
-      </w:pPr>
-    </w:lvl>
-  </w:abstractNum>
-  <w:num w:numId="1" w16cid:durableId="1184856377">
+  <w:num w:numId="1">
     <w:abstractNumId w:val="1"/>
   </w:num>
-  <w:num w:numId="2" w16cid:durableId="1268077892">
-    <w:abstractNumId w:val="0"/>
+  <w:num w:numId="2">
+    <w:abstractNumId w:val="2"/>
   </w:num>
 </w:numbering>
 </file>
 
 <file path=word/styles.xml><?xml version="1.0" encoding="utf-8"?>
-<w:styles xmlns:mc="http://schemas.openxmlformats.org/markup-compatibility/2006" xmlns:r="http://schemas.openxmlformats.org/officeDocument/2006/relationships" xmlns:w="http://schemas.openxmlformats.org/wordprocessingml/2006/main" xmlns:w14="http://schemas.microsoft.com/office/word/2010/wordml" xmlns:w15="http://schemas.microsoft.com/office/word/2012/wordml" xmlns:w16cex="http://schemas.microsoft.com/office/word/2018/wordml/cex" xmlns:w16cid="http://schemas.microsoft.com/office/word/2016/wordml/cid" xmlns:w16="http://schemas.microsoft.com/office/word/2018/wordml" xmlns:w16du="http://schemas.microsoft.com/office/word/2023/wordml/word16du" xmlns:w16sdtdh="http://schemas.microsoft.com/office/word/2020/wordml/sdtdatahash" xmlns:w16sdtfl="http://schemas.microsoft.com/office/word/2024/wordml/sdtformatlock" xmlns:w16se="http://schemas.microsoft.com/office/word/2015/wordml/symex" mc:Ignorable="w14 w15 w16se w16cid w16 w16cex w16sdtdh w16sdtfl w16du">
+<w:styles xmlns:w="http://schemas.openxmlformats.org/wordprocessingml/2006/main" xmlns:w14="http://schemas.microsoft.com/office/word/2010/wordml" xmlns:mc="http://schemas.openxmlformats.org/markup-compatibility/2006" mc:Ignorable="w14">
   <w:docDefaults>
     <w:rPrDefault>
       <w:rPr>
-        <w:rFonts w:ascii="Times New Roman" w:eastAsia="Times New Roman" w:hAnsi="Times New Roman" w:cs="Times New Roman"/>
+        <w:rFonts w:ascii="Times New Roman" w:hAnsi="Times New Roman" w:eastAsia="Times New Roman" w:cs="Times New Roman"/>
         <w:sz w:val="24"/>
         <w:szCs w:val="24"/>
         <w:lang w:val="en-US" w:eastAsia="ja-JP" w:bidi="ar-SA"/>
@@ -2014,21 +2506,21 @@
     </w:rPrDefault>
     <w:pPrDefault>
       <w:pPr>
-        <w:suppressAutoHyphens/>
+        <w:suppressAutoHyphens w:val="true"/>
       </w:pPr>
     </w:pPrDefault>
   </w:docDefaults>
   <w:latentStyles w:defLockedState="0" w:defUIPriority="99" w:defSemiHidden="0" w:defUnhideWhenUsed="0" w:defQFormat="0" w:count="376">
     <w:lsdException w:name="Normal" w:uiPriority="0" w:qFormat="1"/>
     <w:lsdException w:name="heading 1" w:uiPriority="9" w:qFormat="1"/>
-    <w:lsdException w:name="heading 2" w:semiHidden="1" w:uiPriority="9" w:unhideWhenUsed="1" w:qFormat="1"/>
-    <w:lsdException w:name="heading 3" w:semiHidden="1" w:uiPriority="9" w:unhideWhenUsed="1" w:qFormat="1"/>
-    <w:lsdException w:name="heading 4" w:semiHidden="1" w:uiPriority="9" w:unhideWhenUsed="1" w:qFormat="1"/>
-    <w:lsdException w:name="heading 5" w:semiHidden="1" w:uiPriority="9" w:unhideWhenUsed="1" w:qFormat="1"/>
-    <w:lsdException w:name="heading 6" w:semiHidden="1" w:uiPriority="9" w:unhideWhenUsed="1" w:qFormat="1"/>
-    <w:lsdException w:name="heading 7" w:semiHidden="1" w:uiPriority="9" w:unhideWhenUsed="1" w:qFormat="1"/>
-    <w:lsdException w:name="heading 8" w:semiHidden="1" w:uiPriority="9" w:unhideWhenUsed="1" w:qFormat="1"/>
-    <w:lsdException w:name="heading 9" w:semiHidden="1" w:uiPriority="9" w:unhideWhenUsed="1" w:qFormat="1"/>
+    <w:lsdException w:name="heading 2" w:uiPriority="9" w:semiHidden="1" w:unhideWhenUsed="1" w:qFormat="1"/>
+    <w:lsdException w:name="heading 3" w:uiPriority="9" w:semiHidden="1" w:unhideWhenUsed="1" w:qFormat="1"/>
+    <w:lsdException w:name="heading 4" w:uiPriority="9" w:semiHidden="1" w:unhideWhenUsed="1" w:qFormat="1"/>
+    <w:lsdException w:name="heading 5" w:uiPriority="9" w:semiHidden="1" w:unhideWhenUsed="1" w:qFormat="1"/>
+    <w:lsdException w:name="heading 6" w:uiPriority="9" w:semiHidden="1" w:unhideWhenUsed="1" w:qFormat="1"/>
+    <w:lsdException w:name="heading 7" w:uiPriority="9" w:semiHidden="1" w:unhideWhenUsed="1" w:qFormat="1"/>
+    <w:lsdException w:name="heading 8" w:uiPriority="9" w:semiHidden="1" w:unhideWhenUsed="1" w:qFormat="1"/>
+    <w:lsdException w:name="heading 9" w:uiPriority="9" w:semiHidden="1" w:unhideWhenUsed="1" w:qFormat="1"/>
     <w:lsdException w:name="index 1" w:semiHidden="1" w:unhideWhenUsed="1"/>
     <w:lsdException w:name="index 2" w:semiHidden="1" w:unhideWhenUsed="1"/>
     <w:lsdException w:name="index 3" w:semiHidden="1" w:unhideWhenUsed="1"/>
@@ -2038,22 +2530,22 @@
     <w:lsdException w:name="index 7" w:semiHidden="1" w:unhideWhenUsed="1"/>
     <w:lsdException w:name="index 8" w:semiHidden="1" w:unhideWhenUsed="1"/>
     <w:lsdException w:name="index 9" w:semiHidden="1" w:unhideWhenUsed="1"/>
-    <w:lsdException w:name="toc 1" w:semiHidden="1" w:uiPriority="39" w:unhideWhenUsed="1"/>
-    <w:lsdException w:name="toc 2" w:semiHidden="1" w:uiPriority="39" w:unhideWhenUsed="1"/>
-    <w:lsdException w:name="toc 3" w:semiHidden="1" w:uiPriority="39" w:unhideWhenUsed="1"/>
-    <w:lsdException w:name="toc 4" w:semiHidden="1" w:uiPriority="39" w:unhideWhenUsed="1"/>
-    <w:lsdException w:name="toc 5" w:semiHidden="1" w:uiPriority="39" w:unhideWhenUsed="1"/>
-    <w:lsdException w:name="toc 6" w:semiHidden="1" w:uiPriority="39" w:unhideWhenUsed="1"/>
-    <w:lsdException w:name="toc 7" w:semiHidden="1" w:uiPriority="39" w:unhideWhenUsed="1"/>
-    <w:lsdException w:name="toc 8" w:semiHidden="1" w:uiPriority="39" w:unhideWhenUsed="1"/>
-    <w:lsdException w:name="toc 9" w:semiHidden="1" w:uiPriority="39" w:unhideWhenUsed="1"/>
+    <w:lsdException w:name="toc 1" w:uiPriority="39" w:semiHidden="1" w:unhideWhenUsed="1"/>
+    <w:lsdException w:name="toc 2" w:uiPriority="39" w:semiHidden="1" w:unhideWhenUsed="1"/>
+    <w:lsdException w:name="toc 3" w:uiPriority="39" w:semiHidden="1" w:unhideWhenUsed="1"/>
+    <w:lsdException w:name="toc 4" w:uiPriority="39" w:semiHidden="1" w:unhideWhenUsed="1"/>
+    <w:lsdException w:name="toc 5" w:uiPriority="39" w:semiHidden="1" w:unhideWhenUsed="1"/>
+    <w:lsdException w:name="toc 6" w:uiPriority="39" w:semiHidden="1" w:unhideWhenUsed="1"/>
+    <w:lsdException w:name="toc 7" w:uiPriority="39" w:semiHidden="1" w:unhideWhenUsed="1"/>
+    <w:lsdException w:name="toc 8" w:uiPriority="39" w:semiHidden="1" w:unhideWhenUsed="1"/>
+    <w:lsdException w:name="toc 9" w:uiPriority="39" w:semiHidden="1" w:unhideWhenUsed="1"/>
     <w:lsdException w:name="Normal Indent" w:semiHidden="1" w:unhideWhenUsed="1"/>
     <w:lsdException w:name="footnote text" w:semiHidden="1" w:unhideWhenUsed="1"/>
     <w:lsdException w:name="annotation text" w:semiHidden="1" w:unhideWhenUsed="1"/>
     <w:lsdException w:name="header" w:semiHidden="1" w:unhideWhenUsed="1"/>
     <w:lsdException w:name="footer" w:semiHidden="1" w:unhideWhenUsed="1"/>
     <w:lsdException w:name="index heading" w:semiHidden="1" w:unhideWhenUsed="1"/>
-    <w:lsdException w:name="caption" w:semiHidden="1" w:uiPriority="35" w:unhideWhenUsed="1" w:qFormat="1"/>
+    <w:lsdException w:name="caption" w:uiPriority="35" w:semiHidden="1" w:unhideWhenUsed="1" w:qFormat="1"/>
     <w:lsdException w:name="table of figures" w:semiHidden="1" w:unhideWhenUsed="1"/>
     <w:lsdException w:name="envelope address" w:semiHidden="1" w:unhideWhenUsed="1"/>
     <w:lsdException w:name="envelope return" w:semiHidden="1" w:unhideWhenUsed="1"/>
@@ -2084,7 +2576,7 @@
     <w:lsdException w:name="Title" w:uiPriority="10" w:qFormat="1"/>
     <w:lsdException w:name="Closing" w:semiHidden="1" w:unhideWhenUsed="1"/>
     <w:lsdException w:name="Signature" w:semiHidden="1" w:unhideWhenUsed="1"/>
-    <w:lsdException w:name="Default Paragraph Font" w:semiHidden="1" w:uiPriority="1" w:unhideWhenUsed="1"/>
+    <w:lsdException w:name="Default Paragraph Font" w:uiPriority="1" w:semiHidden="1" w:unhideWhenUsed="1"/>
     <w:lsdException w:name="Body Text" w:semiHidden="1" w:unhideWhenUsed="1"/>
     <w:lsdException w:name="Body Text Indent" w:semiHidden="1" w:unhideWhenUsed="1"/>
     <w:lsdException w:name="List Continue" w:semiHidden="1" w:unhideWhenUsed="1"/>
@@ -2284,8 +2776,8 @@
     <w:lsdException w:name="Subtle Reference" w:uiPriority="31" w:qFormat="1"/>
     <w:lsdException w:name="Intense Reference" w:uiPriority="32" w:qFormat="1"/>
     <w:lsdException w:name="Book Title" w:uiPriority="33" w:qFormat="1"/>
-    <w:lsdException w:name="Bibliography" w:semiHidden="1" w:uiPriority="37" w:unhideWhenUsed="1"/>
-    <w:lsdException w:name="TOC Heading" w:semiHidden="1" w:uiPriority="39" w:unhideWhenUsed="1" w:qFormat="1"/>
+    <w:lsdException w:name="Bibliography" w:uiPriority="37" w:semiHidden="1" w:unhideWhenUsed="1"/>
+    <w:lsdException w:name="TOC Heading" w:uiPriority="39" w:semiHidden="1" w:unhideWhenUsed="1" w:qFormat="1"/>
     <w:lsdException w:name="Plain Table 1" w:uiPriority="41"/>
     <w:lsdException w:name="Plain Table 2" w:uiPriority="42"/>
     <w:lsdException w:name="Plain Table 3" w:uiPriority="43"/>
@@ -2396,29 +2888,44 @@
     <w:lsdException w:name="Unresolved Mention" w:semiHidden="1" w:unhideWhenUsed="1"/>
     <w:lsdException w:name="Smart Link" w:semiHidden="1" w:unhideWhenUsed="1"/>
   </w:latentStyles>
-  <w:style w:type="paragraph" w:default="1" w:styleId="Normal">
+  <w:style w:type="paragraph" w:styleId="Normal" w:default="1">
     <w:name w:val="Normal"/>
     <w:qFormat/>
+    <w:pPr>
+      <w:widowControl/>
+      <w:suppressAutoHyphens w:val="true"/>
+      <w:bidi w:val="0"/>
+      <w:spacing w:before="0" w:after="0"/>
+      <w:jc w:val="left"/>
+    </w:pPr>
+    <w:rPr>
+      <w:rFonts w:ascii="Times New Roman" w:hAnsi="Times New Roman" w:eastAsia="Times New Roman" w:cs="Times New Roman"/>
+      <w:color w:val="auto"/>
+      <w:kern w:val="0"/>
+      <w:sz w:val="24"/>
+      <w:szCs w:val="24"/>
+      <w:lang w:val="en-US" w:eastAsia="ja-JP" w:bidi="ar-SA"/>
+    </w:rPr>
   </w:style>
   <w:style w:type="paragraph" w:styleId="Heading1">
-    <w:name w:val="heading 1"/>
+    <w:name w:val="Heading 1"/>
     <w:basedOn w:val="Normal"/>
     <w:next w:val="Normal"/>
     <w:uiPriority w:val="9"/>
     <w:qFormat/>
     <w:pPr>
-      <w:spacing w:after="167"/>
+      <w:spacing w:before="0" w:after="167"/>
       <w:outlineLvl w:val="0"/>
     </w:pPr>
     <w:rPr>
-      <w:rFonts w:ascii="Arial" w:eastAsia="Arial" w:hAnsi="Arial" w:cs="Arial"/>
+      <w:rFonts w:ascii="Arial" w:hAnsi="Arial" w:eastAsia="Arial" w:cs="Arial"/>
       <w:b/>
       <w:sz w:val="27"/>
       <w:szCs w:val="27"/>
     </w:rPr>
   </w:style>
   <w:style w:type="paragraph" w:styleId="Heading2">
-    <w:name w:val="heading 2"/>
+    <w:name w:val="Heading 2"/>
     <w:basedOn w:val="Normal"/>
     <w:next w:val="Normal"/>
     <w:uiPriority w:val="9"/>
@@ -2426,12 +2933,12 @@
     <w:unhideWhenUsed/>
     <w:qFormat/>
     <w:pPr>
-      <w:keepNext/>
+      <w:keepNext w:val="true"/>
       <w:spacing w:before="240" w:after="60"/>
       <w:outlineLvl w:val="1"/>
     </w:pPr>
     <w:rPr>
-      <w:rFonts w:ascii="Arial" w:eastAsia="Arial" w:hAnsi="Arial" w:cs="Arial"/>
+      <w:rFonts w:ascii="Arial" w:hAnsi="Arial" w:eastAsia="Arial" w:cs="Arial"/>
       <w:b/>
       <w:i/>
       <w:sz w:val="28"/>
@@ -2439,7 +2946,7 @@
     </w:rPr>
   </w:style>
   <w:style w:type="paragraph" w:styleId="Heading3">
-    <w:name w:val="heading 3"/>
+    <w:name w:val="Heading 3"/>
     <w:basedOn w:val="Normal"/>
     <w:next w:val="Normal"/>
     <w:uiPriority w:val="9"/>
@@ -2447,19 +2954,19 @@
     <w:unhideWhenUsed/>
     <w:qFormat/>
     <w:pPr>
-      <w:keepNext/>
+      <w:keepNext w:val="true"/>
       <w:spacing w:before="240" w:after="60"/>
       <w:outlineLvl w:val="2"/>
     </w:pPr>
     <w:rPr>
-      <w:rFonts w:ascii="Arial" w:eastAsia="Arial" w:hAnsi="Arial" w:cs="Arial"/>
+      <w:rFonts w:ascii="Arial" w:hAnsi="Arial" w:eastAsia="Arial" w:cs="Arial"/>
       <w:b/>
       <w:sz w:val="26"/>
       <w:szCs w:val="26"/>
     </w:rPr>
   </w:style>
   <w:style w:type="paragraph" w:styleId="Heading4">
-    <w:name w:val="heading 4"/>
+    <w:name w:val="Heading 4"/>
     <w:basedOn w:val="Normal"/>
     <w:next w:val="Normal"/>
     <w:uiPriority w:val="9"/>
@@ -2467,7 +2974,7 @@
     <w:unhideWhenUsed/>
     <w:qFormat/>
     <w:pPr>
-      <w:keepNext/>
+      <w:keepNext w:val="true"/>
       <w:keepLines/>
       <w:spacing w:before="240" w:after="40"/>
       <w:outlineLvl w:val="3"/>
@@ -2477,7 +2984,7 @@
     </w:rPr>
   </w:style>
   <w:style w:type="paragraph" w:styleId="Heading5">
-    <w:name w:val="heading 5"/>
+    <w:name w:val="Heading 5"/>
     <w:basedOn w:val="Normal"/>
     <w:next w:val="Normal"/>
     <w:uiPriority w:val="9"/>
@@ -2485,7 +2992,7 @@
     <w:unhideWhenUsed/>
     <w:qFormat/>
     <w:pPr>
-      <w:keepNext/>
+      <w:keepNext w:val="true"/>
       <w:keepLines/>
       <w:spacing w:before="220" w:after="40"/>
       <w:outlineLvl w:val="4"/>
@@ -2497,7 +3004,7 @@
     </w:rPr>
   </w:style>
   <w:style w:type="paragraph" w:styleId="Heading6">
-    <w:name w:val="heading 6"/>
+    <w:name w:val="Heading 6"/>
     <w:basedOn w:val="Normal"/>
     <w:next w:val="Normal"/>
     <w:uiPriority w:val="9"/>
@@ -2505,7 +3012,7 @@
     <w:unhideWhenUsed/>
     <w:qFormat/>
     <w:pPr>
-      <w:keepNext/>
+      <w:keepNext w:val="true"/>
       <w:keepLines/>
       <w:spacing w:before="200" w:after="40"/>
       <w:outlineLvl w:val="5"/>
@@ -2516,31 +3023,12 @@
       <w:szCs w:val="20"/>
     </w:rPr>
   </w:style>
-  <w:style w:type="character" w:default="1" w:styleId="DefaultParagraphFont">
+  <w:style w:type="character" w:styleId="DefaultParagraphFont" w:default="1">
     <w:name w:val="Default Paragraph Font"/>
     <w:uiPriority w:val="1"/>
     <w:unhideWhenUsed/>
-  </w:style>
-  <w:style w:type="table" w:default="1" w:styleId="TableNormal">
-    <w:name w:val="Normal Table"/>
-    <w:uiPriority w:val="99"/>
-    <w:semiHidden/>
-    <w:unhideWhenUsed/>
-    <w:tblPr>
-      <w:tblInd w:w="0" w:type="dxa"/>
-      <w:tblCellMar>
-        <w:top w:w="0" w:type="dxa"/>
-        <w:left w:w="108" w:type="dxa"/>
-        <w:bottom w:w="0" w:type="dxa"/>
-        <w:right w:w="108" w:type="dxa"/>
-      </w:tblCellMar>
-    </w:tblPr>
-  </w:style>
-  <w:style w:type="numbering" w:default="1" w:styleId="NoList">
-    <w:name w:val="No List"/>
-    <w:uiPriority w:val="99"/>
-    <w:semiHidden/>
-    <w:unhideWhenUsed/>
+    <w:qFormat/>
+    <w:rPr/>
   </w:style>
   <w:style w:type="character" w:styleId="Hyperlink">
     <w:name w:val="Hyperlink"/>
@@ -2549,33 +3037,32 @@
       <w:u w:val="single"/>
     </w:rPr>
   </w:style>
-  <w:style w:type="character" w:customStyle="1" w:styleId="FootnoteTextChar">
+  <w:style w:type="character" w:styleId="FootnoteTextChar" w:customStyle="1">
     <w:name w:val="Footnote Text Char"/>
     <w:basedOn w:val="DefaultParagraphFont"/>
     <w:link w:val="FootnoteText"/>
     <w:uiPriority w:val="99"/>
     <w:semiHidden/>
     <w:qFormat/>
-    <w:rsid w:val="00531B2D"/>
+    <w:rsid w:val="00531b2d"/>
     <w:rPr>
       <w:sz w:val="20"/>
       <w:szCs w:val="20"/>
     </w:rPr>
   </w:style>
-  <w:style w:type="character" w:customStyle="1" w:styleId="FootnoteCharacters">
+  <w:style w:type="character" w:styleId="FootnoteCharacters" w:customStyle="1">
     <w:name w:val="Footnote Characters"/>
-    <w:basedOn w:val="DefaultParagraphFont"/>
     <w:uiPriority w:val="99"/>
     <w:semiHidden/>
     <w:unhideWhenUsed/>
     <w:qFormat/>
-    <w:rsid w:val="00531B2D"/>
+    <w:rsid w:val="00531b2d"/>
     <w:rPr>
       <w:vertAlign w:val="superscript"/>
     </w:rPr>
   </w:style>
   <w:style w:type="character" w:styleId="FootnoteReference">
-    <w:name w:val="footnote reference"/>
+    <w:name w:val="Footnote Reference"/>
     <w:rPr>
       <w:vertAlign w:val="superscript"/>
     </w:rPr>
@@ -2587,33 +3074,42 @@
     <w:semiHidden/>
     <w:unhideWhenUsed/>
     <w:qFormat/>
-    <w:rsid w:val="00531B2D"/>
+    <w:rsid w:val="00531b2d"/>
     <w:rPr>
       <w:color w:val="605E5C"/>
-      <w:shd w:val="clear" w:color="auto" w:fill="E1DFDD"/>
+      <w:shd w:fill="E1DFDD" w:val="clear"/>
     </w:rPr>
   </w:style>
+  <w:style w:type="character" w:styleId="EndnoteCharacters" w:customStyle="1">
+    <w:name w:val="Endnote Characters"/>
+    <w:qFormat/>
+    <w:rPr/>
+  </w:style>
   <w:style w:type="character" w:styleId="EndnoteReference">
-    <w:name w:val="endnote reference"/>
+    <w:name w:val="Endnote Reference"/>
     <w:rPr>
       <w:vertAlign w:val="superscript"/>
     </w:rPr>
   </w:style>
-  <w:style w:type="character" w:customStyle="1" w:styleId="EndnoteCharacters">
-    <w:name w:val="Endnote Characters"/>
+  <w:style w:type="character" w:styleId="Emphasis">
+    <w:name w:val="Emphasis"/>
     <w:qFormat/>
+    <w:rPr>
+      <w:i/>
+      <w:iCs/>
+    </w:rPr>
   </w:style>
-  <w:style w:type="paragraph" w:customStyle="1" w:styleId="Heading">
+  <w:style w:type="paragraph" w:styleId="Heading" w:customStyle="1">
     <w:name w:val="Heading"/>
     <w:basedOn w:val="Normal"/>
     <w:next w:val="BodyText"/>
     <w:qFormat/>
     <w:pPr>
-      <w:keepNext/>
+      <w:keepNext w:val="true"/>
       <w:spacing w:before="240" w:after="120"/>
     </w:pPr>
     <w:rPr>
-      <w:rFonts w:ascii="Liberation Sans" w:eastAsia="Noto Sans CJK SC" w:hAnsi="Liberation Sans" w:cs="FreeSans"/>
+      <w:rFonts w:ascii="Liberation Sans" w:hAnsi="Liberation Sans" w:eastAsia="Noto Sans CJK SC" w:cs="FreeSans"/>
       <w:sz w:val="28"/>
       <w:szCs w:val="28"/>
     </w:rPr>
@@ -2622,36 +3118,38 @@
     <w:name w:val="Body Text"/>
     <w:basedOn w:val="Normal"/>
     <w:pPr>
-      <w:spacing w:after="140" w:line="276" w:lineRule="auto"/>
+      <w:spacing w:lineRule="auto" w:line="276" w:before="0" w:after="140"/>
     </w:pPr>
+    <w:rPr/>
   </w:style>
   <w:style w:type="paragraph" w:styleId="List">
     <w:name w:val="List"/>
     <w:basedOn w:val="BodyText"/>
+    <w:pPr/>
     <w:rPr>
       <w:rFonts w:cs="FreeSans"/>
     </w:rPr>
   </w:style>
   <w:style w:type="paragraph" w:styleId="Caption">
-    <w:name w:val="caption"/>
+    <w:name w:val="Caption"/>
     <w:basedOn w:val="Normal"/>
     <w:next w:val="Normal"/>
     <w:uiPriority w:val="35"/>
     <w:unhideWhenUsed/>
     <w:qFormat/>
-    <w:rsid w:val="00047A16"/>
+    <w:rsid w:val="00047a16"/>
     <w:pPr>
-      <w:spacing w:after="200"/>
+      <w:spacing w:before="0" w:after="200"/>
     </w:pPr>
     <w:rPr>
       <w:i/>
       <w:iCs/>
-      <w:color w:val="1F497D" w:themeColor="text2"/>
+      <w:color w:themeColor="text2" w:val="1F497D"/>
       <w:sz w:val="18"/>
       <w:szCs w:val="18"/>
     </w:rPr>
   </w:style>
-  <w:style w:type="paragraph" w:customStyle="1" w:styleId="Index">
+  <w:style w:type="paragraph" w:styleId="Index" w:customStyle="1">
     <w:name w:val="Index"/>
     <w:basedOn w:val="Normal"/>
     <w:qFormat/>
@@ -2669,7 +3167,7 @@
     <w:uiPriority w:val="10"/>
     <w:qFormat/>
     <w:pPr>
-      <w:keepNext/>
+      <w:keepNext w:val="true"/>
       <w:keepLines/>
       <w:spacing w:before="480" w:after="120"/>
     </w:pPr>
@@ -2686,12 +3184,12 @@
     <w:uiPriority w:val="11"/>
     <w:qFormat/>
     <w:pPr>
-      <w:keepNext/>
+      <w:keepNext w:val="true"/>
       <w:keepLines/>
       <w:spacing w:before="360" w:after="80"/>
     </w:pPr>
     <w:rPr>
-      <w:rFonts w:ascii="Georgia" w:eastAsia="Georgia" w:hAnsi="Georgia" w:cs="Georgia"/>
+      <w:rFonts w:ascii="Georgia" w:hAnsi="Georgia" w:eastAsia="Georgia" w:cs="Georgia"/>
       <w:i/>
       <w:color w:val="666666"/>
       <w:sz w:val="48"/>
@@ -2703,29 +3201,36 @@
     <w:basedOn w:val="Normal"/>
     <w:uiPriority w:val="34"/>
     <w:qFormat/>
-    <w:rsid w:val="000E1E2C"/>
+    <w:rsid w:val="000e1e2c"/>
     <w:pPr>
+      <w:spacing w:before="0" w:after="0"/>
       <w:ind w:left="720"/>
       <w:contextualSpacing/>
     </w:pPr>
+    <w:rPr/>
   </w:style>
-  <w:style w:type="paragraph" w:customStyle="1" w:styleId="HeaderandFooter">
+  <w:style w:type="paragraph" w:styleId="HeaderandFooter" w:customStyle="1">
     <w:name w:val="Header and Footer"/>
     <w:basedOn w:val="Normal"/>
     <w:qFormat/>
+    <w:pPr/>
+    <w:rPr/>
   </w:style>
   <w:style w:type="paragraph" w:styleId="Header">
-    <w:name w:val="header"/>
+    <w:name w:val="Header"/>
     <w:basedOn w:val="HeaderandFooter"/>
+    <w:pPr/>
+    <w:rPr/>
   </w:style>
   <w:style w:type="paragraph" w:styleId="FootnoteText">
-    <w:name w:val="footnote text"/>
+    <w:name w:val="Footnote Text"/>
     <w:basedOn w:val="Normal"/>
     <w:link w:val="FootnoteTextChar"/>
     <w:uiPriority w:val="99"/>
     <w:semiHidden/>
     <w:unhideWhenUsed/>
-    <w:rsid w:val="00531B2D"/>
+    <w:rsid w:val="00531b2d"/>
+    <w:pPr/>
     <w:rPr>
       <w:sz w:val="20"/>
       <w:szCs w:val="20"/>
@@ -2738,7 +3243,30 @@
     <w:semiHidden/>
     <w:unhideWhenUsed/>
     <w:qFormat/>
-    <w:rsid w:val="00642E30"/>
+    <w:rsid w:val="00642e30"/>
+    <w:pPr/>
+    <w:rPr/>
+  </w:style>
+  <w:style w:type="numbering" w:styleId="NoList" w:default="1">
+    <w:name w:val="No List"/>
+    <w:uiPriority w:val="99"/>
+    <w:semiHidden/>
+    <w:unhideWhenUsed/>
+    <w:qFormat/>
+  </w:style>
+  <w:style w:type="table" w:default="1" w:styleId="TableNormal">
+    <w:name w:val="Normal Table"/>
+    <w:uiPriority w:val="99"/>
+    <w:semiHidden/>
+    <w:unhideWhenUsed/>
+    <w:tblPr>
+      <w:tblCellMar>
+        <w:top w:w="0" w:type="dxa"/>
+        <w:left w:w="108" w:type="dxa"/>
+        <w:bottom w:w="0" w:type="dxa"/>
+        <w:right w:w="108" w:type="dxa"/>
+      </w:tblCellMar>
+    </w:tblPr>
   </w:style>
   <w:style w:type="table" w:styleId="TableGrid">
     <w:name w:val="Table Grid"/>
@@ -2747,12 +3275,12 @@
     <w:rsid w:val="00195125"/>
     <w:tblPr>
       <w:tblBorders>
-        <w:top w:val="single" w:sz="4" w:space="0" w:color="auto"/>
-        <w:left w:val="single" w:sz="4" w:space="0" w:color="auto"/>
-        <w:bottom w:val="single" w:sz="4" w:space="0" w:color="auto"/>
-        <w:right w:val="single" w:sz="4" w:space="0" w:color="auto"/>
-        <w:insideH w:val="single" w:sz="4" w:space="0" w:color="auto"/>
-        <w:insideV w:val="single" w:sz="4" w:space="0" w:color="auto"/>
+        <w:top w:val="single" w:color="auto" w:sz="4" w:space="0"/>
+        <w:left w:val="single" w:color="auto" w:sz="4" w:space="0"/>
+        <w:bottom w:val="single" w:color="auto" w:sz="4" w:space="0"/>
+        <w:right w:val="single" w:color="auto" w:sz="4" w:space="0"/>
+        <w:insideH w:val="single" w:color="auto" w:sz="4" w:space="0"/>
+        <w:insideV w:val="single" w:color="auto" w:sz="4" w:space="0"/>
       </w:tblBorders>
     </w:tblPr>
   </w:style>
@@ -2765,12 +3293,12 @@
       <w:tblStyleRowBandSize w:val="1"/>
       <w:tblStyleColBandSize w:val="1"/>
       <w:tblBorders>
-        <w:top w:val="single" w:sz="4" w:space="0" w:color="999999" w:themeColor="text1" w:themeTint="66"/>
-        <w:left w:val="single" w:sz="4" w:space="0" w:color="999999" w:themeColor="text1" w:themeTint="66"/>
-        <w:bottom w:val="single" w:sz="4" w:space="0" w:color="999999" w:themeColor="text1" w:themeTint="66"/>
-        <w:right w:val="single" w:sz="4" w:space="0" w:color="999999" w:themeColor="text1" w:themeTint="66"/>
-        <w:insideH w:val="single" w:sz="4" w:space="0" w:color="999999" w:themeColor="text1" w:themeTint="66"/>
-        <w:insideV w:val="single" w:sz="4" w:space="0" w:color="999999" w:themeColor="text1" w:themeTint="66"/>
+        <w:top w:val="single" w:color="999999" w:themeColor="text1" w:themeTint="66" w:sz="4" w:space="0"/>
+        <w:left w:val="single" w:color="999999" w:themeColor="text1" w:themeTint="66" w:sz="4" w:space="0"/>
+        <w:bottom w:val="single" w:color="999999" w:themeColor="text1" w:themeTint="66" w:sz="4" w:space="0"/>
+        <w:right w:val="single" w:color="999999" w:themeColor="text1" w:themeTint="66" w:sz="4" w:space="0"/>
+        <w:insideH w:val="single" w:color="999999" w:themeColor="text1" w:themeTint="66" w:sz="4" w:space="0"/>
+        <w:insideV w:val="single" w:color="999999" w:themeColor="text1" w:themeTint="66" w:sz="4" w:space="0"/>
       </w:tblBorders>
     </w:tblPr>
     <w:tblStylePr w:type="firstRow">
@@ -2781,7 +3309,7 @@
       <w:tblPr/>
       <w:tcPr>
         <w:tcBorders>
-          <w:bottom w:val="single" w:sz="12" w:space="0" w:color="000000" w:themeColor="text1"/>
+          <w:bottom w:val="single" w:color="000000" w:themeColor="text1" w:sz="12" w:space="0"/>
         </w:tcBorders>
       </w:tcPr>
     </w:tblStylePr>
@@ -2793,7 +3321,7 @@
       <w:tblPr/>
       <w:tcPr>
         <w:tcBorders>
-          <w:top w:val="double" w:sz="2" w:space="0" w:color="000000" w:themeColor="text1"/>
+          <w:top w:val="double" w:color="000000" w:themeColor="text1" w:sz="2" w:space="0"/>
         </w:tcBorders>
       </w:tcPr>
     </w:tblStylePr>
@@ -2802,53 +3330,55 @@
         <w:b/>
         <w:bCs/>
       </w:rPr>
+      <w:tblPr/>
     </w:tblStylePr>
     <w:tblStylePr w:type="lastCol">
       <w:rPr>
         <w:b/>
         <w:bCs/>
       </w:rPr>
+      <w:tblPr/>
     </w:tblStylePr>
   </w:style>
 </w:styles>
 </file>
 
 <file path=word/theme/theme1.xml><?xml version="1.0" encoding="utf-8"?>
-<a:theme xmlns:a="http://schemas.openxmlformats.org/drawingml/2006/main" name="Office Theme">
+<a:theme xmlns:a="http://schemas.openxmlformats.org/drawingml/2006/main" xmlns:r="http://schemas.openxmlformats.org/officeDocument/2006/relationships" name="Office Theme">
   <a:themeElements>
     <a:clrScheme name="Office">
       <a:dk1>
         <a:srgbClr val="000000"/>
       </a:dk1>
       <a:lt1>
-        <a:srgbClr val="FFFFFF"/>
+        <a:srgbClr val="ffffff"/>
       </a:lt1>
       <a:dk2>
-        <a:srgbClr val="1F497D"/>
+        <a:srgbClr val="1f497d"/>
       </a:dk2>
       <a:lt2>
-        <a:srgbClr val="EEECE1"/>
+        <a:srgbClr val="eeece1"/>
       </a:lt2>
       <a:accent1>
-        <a:srgbClr val="4F81BD"/>
+        <a:srgbClr val="4f81bd"/>
       </a:accent1>
       <a:accent2>
-        <a:srgbClr val="C0504D"/>
+        <a:srgbClr val="c0504d"/>
       </a:accent2>
       <a:accent3>
-        <a:srgbClr val="9BBB59"/>
+        <a:srgbClr val="9bbb59"/>
       </a:accent3>
       <a:accent4>
-        <a:srgbClr val="8064A2"/>
+        <a:srgbClr val="8064a2"/>
       </a:accent4>
       <a:accent5>
-        <a:srgbClr val="4BACC6"/>
+        <a:srgbClr val="4bacc6"/>
       </a:accent5>
       <a:accent6>
-        <a:srgbClr val="F79646"/>
+        <a:srgbClr val="f79646"/>
       </a:accent6>
       <a:hlink>
-        <a:srgbClr val="0000FF"/>
+        <a:srgbClr val="0000ff"/>
       </a:hlink>
       <a:folHlink>
         <a:srgbClr val="800080"/>
@@ -2856,12 +3386,12 @@
     </a:clrScheme>
     <a:fontScheme name="Office">
       <a:majorFont>
-        <a:latin typeface="Calibri"/>
+        <a:latin typeface="Calibri" pitchFamily="0" charset="1"/>
         <a:ea typeface=""/>
         <a:cs typeface=""/>
       </a:majorFont>
       <a:minorFont>
-        <a:latin typeface="Cambria"/>
+        <a:latin typeface="Cambria" pitchFamily="0" charset="1"/>
         <a:ea typeface=""/>
         <a:cs typeface=""/>
       </a:minorFont>
@@ -2890,7 +3420,7 @@
             </a:gs>
           </a:gsLst>
           <a:lin ang="16200000" scaled="1"/>
-          <a:tileRect/>
+          <a:tileRect l="0" t="0" r="0" b="0"/>
         </a:gradFill>
         <a:gradFill>
           <a:gsLst>
@@ -2908,7 +3438,7 @@
             </a:gs>
           </a:gsLst>
           <a:lin ang="16200000" scaled="0"/>
-          <a:tileRect/>
+          <a:tileRect l="0" t="0" r="0" b="0"/>
         </a:gradFill>
       </a:fillStyleLst>
       <a:lnStyleLst>
@@ -2959,7 +3489,7 @@
           <a:path path="circle">
             <a:fillToRect l="50000" t="-80000" r="50000" b="180000"/>
           </a:path>
-          <a:tileRect/>
+          <a:tileRect l="0" t="0" r="0" b="0"/>
         </a:gradFill>
         <a:gradFill>
           <a:gsLst>
@@ -2977,13 +3507,11 @@
           <a:path path="circle">
             <a:fillToRect l="50000" t="50000" r="50000" b="50000"/>
           </a:path>
-          <a:tileRect/>
+          <a:tileRect l="0" t="0" r="0" b="0"/>
         </a:gradFill>
       </a:bgFillStyleLst>
     </a:fmtScheme>
   </a:themeElements>
-  <a:objectDefaults/>
-  <a:extraClrSchemeLst/>
 </a:theme>
 </file>
 

</xml_diff>

<commit_message>
(update): final draft, just need to clean up chart and requirements.txt
</commit_message>
<xml_diff>
--- a/module_summary.docx
+++ b/module_summary.docx
@@ -112,7 +112,7 @@
       </w:pPr>
       <w:r>
         <w:rPr/>
-        <w:t xml:space="preserve">This project looks at building a Machine Learning Model for predicting if a Star has an Exoplanet based on flux observations from the Kepler Telescope. We will provide an overview of the problem and the dataset. Then we will go over other approaches to this problem. Next, we will build a preprocessing pipeline aimed at performing dimensionality reduction. Finally, we will cover the training of the Support Vector Machine Model and discuss the results. </w:t>
+        <w:t xml:space="preserve">This project looks at building a Machine Learning Model for predicting if a Star has an Exoplanet based on flux observations from the Kepler Telescope. We will provide an overview of the problem and the dataset. Next, we will build a preprocessing pipeline aimed at performing dimensionality reduction. Finally, we will cover the training of the Support Vector Machine Model and discuss the results. </w:t>
       </w:r>
     </w:p>
     <w:p>
@@ -326,60 +326,59 @@
         </w:rPr>
       </w:pPr>
       <w:r>
+        <w:rPr/>
+      </w:r>
+    </w:p>
+    <w:p>
+      <w:pPr>
+        <w:pStyle w:val="Normal"/>
+        <w:spacing w:lineRule="auto" w:line="480"/>
+        <w:ind w:firstLine="720"/>
+        <w:rPr>
+          <w:lang w:val="en-CA"/>
+        </w:rPr>
+      </w:pPr>
+      <w:r>
+        <w:rPr>
+          <w:lang w:val="en-CA"/>
+        </w:rPr>
+      </w:r>
+    </w:p>
+    <w:p>
+      <w:pPr>
+        <w:pStyle w:val="Normal"/>
+        <w:spacing w:lineRule="auto" w:line="480"/>
+        <w:ind w:firstLine="720"/>
+        <w:rPr>
+          <w:lang w:val="en-CA"/>
+        </w:rPr>
+      </w:pPr>
+      <w:r>
+        <w:rPr>
+          <w:lang w:val="en-CA"/>
+        </w:rPr>
+      </w:r>
+    </w:p>
+    <w:p>
+      <w:pPr>
+        <w:pStyle w:val="Normal"/>
+        <w:spacing w:lineRule="auto" w:line="480"/>
+        <w:jc w:val="center"/>
         <w:rPr>
           <w:b/>
         </w:rPr>
-        <w:t>Other Approaches to the Problem</w:t>
-      </w:r>
-    </w:p>
-    <w:p>
-      <w:pPr>
-        <w:pStyle w:val="Normal"/>
-        <w:spacing w:lineRule="auto" w:line="480"/>
-        <w:ind w:firstLine="720"/>
-        <w:rPr>
-          <w:lang w:val="en-CA"/>
-        </w:rPr>
-      </w:pPr>
-      <w:r>
-        <w:rPr/>
-        <w:t>While researching this dataset, we came across other approaches to the Kepler dataset. (</w:t>
-      </w:r>
-      <w:r>
-        <w:rPr>
-          <w:lang w:val="en-CA"/>
-        </w:rPr>
-        <w:t xml:space="preserve">Airlangga, G. 2024) </w:t>
-      </w:r>
-      <w:r>
-        <w:rPr/>
-        <w:t>approach comparing the results of a variety of ML Models.  &lt;</w:t>
-      </w:r>
-      <w:r>
-        <w:rPr/>
-        <w:t xml:space="preserve">describe methods&gt; </w:t>
-      </w:r>
-    </w:p>
-    <w:p>
-      <w:pPr>
-        <w:pStyle w:val="Normal"/>
-        <w:spacing w:lineRule="auto" w:line="480"/>
-        <w:ind w:firstLine="720"/>
-        <w:rPr>
-          <w:lang w:val="en-CA"/>
-        </w:rPr>
-      </w:pPr>
-      <w:r>
-        <w:rPr/>
-      </w:r>
-    </w:p>
-    <w:p>
-      <w:pPr>
-        <w:pStyle w:val="Normal"/>
-        <w:spacing w:lineRule="auto" w:line="480"/>
-        <w:ind w:firstLine="720"/>
-        <w:rPr>
-          <w:lang w:val="en-CA"/>
+      </w:pPr>
+      <w:r>
+        <w:rPr/>
+      </w:r>
+    </w:p>
+    <w:p>
+      <w:pPr>
+        <w:pStyle w:val="Normal"/>
+        <w:spacing w:lineRule="auto" w:line="480"/>
+        <w:jc w:val="center"/>
+        <w:rPr>
+          <w:b/>
         </w:rPr>
       </w:pPr>
       <w:r>
@@ -606,9 +605,6 @@
       <w:r>
         <w:rPr/>
         <w:tab/>
-      </w:r>
-      <w:r>
-        <w:rPr/>
         <w:t>For our initial model, inspired by (</w:t>
       </w:r>
       <w:r>
@@ -627,22 +623,21 @@
         </w:rPr>
       </w:pPr>
       <w:r>
-        <w:rPr/>
-      </w:r>
-    </w:p>
-    <w:p>
-      <w:pPr>
-        <w:pStyle w:val="Normal"/>
-        <w:spacing w:lineRule="auto" w:line="480"/>
-        <w:rPr/>
-      </w:pPr>
-      <w:r>
         <w:rPr>
           <w:lang w:val="en-CA"/>
         </w:rPr>
-        <w:tab/>
-      </w:r>
-      <w:r>
+      </w:r>
+    </w:p>
+    <w:p>
+      <w:pPr>
+        <w:pStyle w:val="Normal"/>
+        <w:spacing w:lineRule="auto" w:line="480"/>
+        <w:rPr/>
+      </w:pPr>
+      <w:r>
+        <w:rPr>
+          <w:lang w:val="en-CA"/>
+        </w:rPr>
         <mc:AlternateContent>
           <mc:Choice Requires="wps">
             <w:drawing>
@@ -661,17 +656,28 @@
                 <a:graphic xmlns:a="http://schemas.openxmlformats.org/drawingml/2006/main">
                   <a:graphicData uri="http://schemas.microsoft.com/office/word/2010/wordprocessingShape">
                     <wps:wsp>
-                      <wps:cNvSpPr txBox="1"/>
+                      <wps:cNvSpPr/>
                       <wps:spPr>
                         <a:xfrm>
                           <a:off x="0" y="0"/>
-                          <a:ext cx="5943600" cy="2360295"/>
+                          <a:ext cx="5943600" cy="2360160"/>
                         </a:xfrm>
-                        <a:prstGeom prst="rect"/>
+                        <a:prstGeom prst="rect">
+                          <a:avLst/>
+                        </a:prstGeom>
                         <a:solidFill>
-                          <a:srgbClr val="FFFFFF"/>
+                          <a:srgbClr val="ffffff"/>
                         </a:solidFill>
+                        <a:ln w="0">
+                          <a:noFill/>
+                        </a:ln>
                       </wps:spPr>
+                      <wps:style>
+                        <a:lnRef idx="0"/>
+                        <a:fillRef idx="0"/>
+                        <a:effectRef idx="0"/>
+                        <a:fontRef idx="minor"/>
+                      </wps:style>
                       <wps:txbx>
                         <w:txbxContent>
                           <w:p>
@@ -686,7 +692,7 @@
                                 <wp:inline distT="0" distB="0" distL="0" distR="0">
                                   <wp:extent cx="5943600" cy="2228850"/>
                                   <wp:effectExtent l="0" t="0" r="0" b="0"/>
-                                  <wp:docPr id="4" name="Image1" descr=""/>
+                                  <wp:docPr id="5" name="Image1" descr=""/>
                                   <wp:cNvGraphicFramePr>
                                     <a:graphicFrameLocks xmlns:a="http://schemas.openxmlformats.org/drawingml/2006/main" noChangeAspect="1"/>
                                   </wp:cNvGraphicFramePr>
@@ -694,7 +700,7 @@
                                     <a:graphicData uri="http://schemas.openxmlformats.org/drawingml/2006/picture">
                                       <pic:pic xmlns:pic="http://schemas.openxmlformats.org/drawingml/2006/picture">
                                         <pic:nvPicPr>
-                                          <pic:cNvPr id="4" name="Image1" descr=""/>
+                                          <pic:cNvPr id="5" name="Image1" descr=""/>
                                           <pic:cNvPicPr>
                                             <a:picLocks noChangeAspect="1" noChangeArrowheads="1"/>
                                           </pic:cNvPicPr>
@@ -719,6 +725,9 @@
                                   </a:graphic>
                                 </wp:inline>
                               </w:drawing>
+                            </w:r>
+                            <w:r>
+                              <w:rPr/>
                               <w:t xml:space="preserve">Figure </w:t>
                             </w:r>
                             <w:r>
@@ -748,7 +757,7 @@
                           </w:p>
                         </w:txbxContent>
                       </wps:txbx>
-                      <wps:bodyPr anchor="t" lIns="0" tIns="0" rIns="0" bIns="0">
+                      <wps:bodyPr lIns="0" rIns="0" tIns="0" bIns="0" anchor="t">
                         <a:noAutofit/>
                       </wps:bodyPr>
                     </wps:wsp>
@@ -759,8 +768,10 @@
           </mc:Choice>
           <mc:Fallback>
             <w:pict>
-              <v:rect style="position:absolute;rotation:-0;width:468pt;height:185.85pt;mso-wrap-distance-left:0pt;mso-wrap-distance-right:0pt;mso-wrap-distance-top:0pt;mso-wrap-distance-bottom:0pt;margin-top:0pt;mso-position-vertical-relative:text;margin-left:2.25pt;mso-position-horizontal-relative:text">
-                <v:textbox inset="0in,0in,0in,0in">
+              <v:rect id="shape_0" ID="Frame1" path="m0,0l-2147483645,0l-2147483645,-2147483646l0,-2147483646xe" fillcolor="white" stroked="f" o:allowincell="f" style="position:absolute;margin-left:2.25pt;margin-top:0.05pt;width:467.95pt;height:185.8pt;mso-wrap-style:square;v-text-anchor:top">
+                <v:fill o:detectmouseclick="t" type="solid" color2="black"/>
+                <v:stroke color="#3465a4" joinstyle="round" endcap="flat"/>
+                <v:textbox>
                   <w:txbxContent>
                     <w:p>
                       <w:pPr>
@@ -774,7 +785,7 @@
                           <wp:inline distT="0" distB="0" distL="0" distR="0">
                             <wp:extent cx="5943600" cy="2228850"/>
                             <wp:effectExtent l="0" t="0" r="0" b="0"/>
-                            <wp:docPr id="5" name="Image1" descr=""/>
+                            <wp:docPr id="6" name="Image1" descr=""/>
                             <wp:cNvGraphicFramePr>
                               <a:graphicFrameLocks xmlns:a="http://schemas.openxmlformats.org/drawingml/2006/main" noChangeAspect="1"/>
                             </wp:cNvGraphicFramePr>
@@ -782,7 +793,7 @@
                               <a:graphicData uri="http://schemas.openxmlformats.org/drawingml/2006/picture">
                                 <pic:pic xmlns:pic="http://schemas.openxmlformats.org/drawingml/2006/picture">
                                   <pic:nvPicPr>
-                                    <pic:cNvPr id="5" name="Image1" descr=""/>
+                                    <pic:cNvPr id="6" name="Image1" descr=""/>
                                     <pic:cNvPicPr>
                                       <a:picLocks noChangeAspect="1" noChangeArrowheads="1"/>
                                     </pic:cNvPicPr>
@@ -807,6 +818,9 @@
                             </a:graphic>
                           </wp:inline>
                         </w:drawing>
+                      </w:r>
+                      <w:r>
+                        <w:rPr/>
                         <w:t xml:space="preserve">Figure </w:t>
                       </w:r>
                       <w:r>
@@ -842,17 +856,25 @@
           </mc:Fallback>
         </mc:AlternateContent>
       </w:r>
-    </w:p>
-    <w:p>
-      <w:pPr>
-        <w:pStyle w:val="Normal"/>
-        <w:spacing w:lineRule="auto" w:line="480"/>
+      <w:r>
         <w:rPr>
           <w:lang w:val="en-CA"/>
         </w:rPr>
-      </w:pPr>
-      <w:r>
-        <w:rPr/>
+        <w:tab/>
+      </w:r>
+    </w:p>
+    <w:p>
+      <w:pPr>
+        <w:pStyle w:val="Normal"/>
+        <w:spacing w:lineRule="auto" w:line="480"/>
+        <w:rPr>
+          <w:lang w:val="en-CA"/>
+        </w:rPr>
+      </w:pPr>
+      <w:r>
+        <w:rPr>
+          <w:lang w:val="en-CA"/>
+        </w:rPr>
       </w:r>
     </w:p>
     <w:p>
@@ -1162,11 +1184,7 @@
       </w:r>
       <w:r>
         <w:rPr/>
-        <w:t xml:space="preserve"> strategy, which ensured each fold maintains the same class distribution as the original dataset. Otherwise, it was possible that some folds might not have any positive examples in the</w:t>
-      </w:r>
-      <w:r>
-        <w:rPr/>
-        <w:t>m.</w:t>
+        <w:t xml:space="preserve"> strategy, which ensured each fold maintains the same class distribution as the original dataset. Otherwise, it was possible that some folds might not have any positive examples in them.</w:t>
       </w:r>
     </w:p>
     <w:p>
@@ -1178,9 +1196,6 @@
       <w:r>
         <w:rPr/>
         <w:tab/>
-      </w:r>
-      <w:r>
-        <w:rPr/>
         <w:t>To keep consistent with how our original model was trained, we instructed GridSearchCV to use balanced class weights for training.</w:t>
       </w:r>
     </w:p>
@@ -1277,15 +1292,7 @@
       </w:pPr>
       <w:r>
         <w:rPr/>
-        <w:t xml:space="preserve">As seen in the final confusion matrix (figure </w:t>
-      </w:r>
-      <w:r>
-        <w:rPr/>
-        <w:t>4</w:t>
-      </w:r>
-      <w:r>
-        <w:rPr/>
-        <w:t>) the system correctly identified all but two of the planets in the “No Planet” category of the test data. For stars with a high probability of having an Exoplanet, the system correctly identified 4 out of 5 data points.</w:t>
+        <w:t>As seen in the final confusion matrix (figure 4) the system correctly identified all but two of the planets in the “No Planet” category of the test data. For stars with a high probability of having an Exoplanet, the system correctly identified 4 out of 5 data points.</w:t>
       </w:r>
     </w:p>
     <w:p>
@@ -1766,7 +1773,7 @@
           <wp:inline distT="0" distB="0" distL="0" distR="0">
             <wp:extent cx="5941060" cy="2226945"/>
             <wp:effectExtent l="0" t="0" r="0" b="0"/>
-            <wp:docPr id="6" name="Picture 1" descr=""/>
+            <wp:docPr id="4" name="Picture 1" descr=""/>
             <wp:cNvGraphicFramePr>
               <a:graphicFrameLocks xmlns:a="http://schemas.openxmlformats.org/drawingml/2006/main" noChangeAspect="1"/>
             </wp:cNvGraphicFramePr>
@@ -1774,7 +1781,7 @@
               <a:graphicData uri="http://schemas.openxmlformats.org/drawingml/2006/picture">
                 <pic:pic xmlns:pic="http://schemas.openxmlformats.org/drawingml/2006/picture">
                   <pic:nvPicPr>
-                    <pic:cNvPr id="6" name="Picture 1" descr=""/>
+                    <pic:cNvPr id="4" name="Picture 1" descr=""/>
                     <pic:cNvPicPr>
                       <a:picLocks noChangeAspect="1" noChangeArrowheads="1"/>
                     </pic:cNvPicPr>
@@ -1809,15 +1816,7 @@
       </w:pPr>
       <w:r>
         <w:rPr/>
-        <w:t xml:space="preserve">Figure </w:t>
-      </w:r>
-      <w:r>
-        <w:rPr/>
-        <w:t>4</w:t>
-      </w:r>
-      <w:r>
-        <w:rPr/>
-        <w:t xml:space="preserve"> Final Confusion Matrix</w:t>
+        <w:t>Figure 4 Final Confusion Matrix</w:t>
       </w:r>
     </w:p>
     <w:p>
@@ -1979,74 +1978,6 @@
           <w:b/>
         </w:rPr>
         <w:t>References</w:t>
-      </w:r>
-    </w:p>
-    <w:p>
-      <w:pPr>
-        <w:pStyle w:val="Normal"/>
-        <w:spacing w:lineRule="auto" w:line="480"/>
-        <w:ind w:left="720"/>
-        <w:rPr>
-          <w:lang w:val="en-CA"/>
-        </w:rPr>
-      </w:pPr>
-      <w:r>
-        <w:rPr>
-          <w:lang w:val="en-CA"/>
-        </w:rPr>
-        <w:t xml:space="preserve">Airlangga, G. (2024). Exoplanet Classification Through Machine Learning: A Comparative Analysis of Algorithms Using Kepler Data. </w:t>
-      </w:r>
-      <w:r>
-        <w:rPr>
-          <w:i/>
-          <w:iCs/>
-          <w:lang w:val="en-CA"/>
-        </w:rPr>
-        <w:t>MALCOM: Indonesian Journal of Machine Learning and Computer Science</w:t>
-      </w:r>
-      <w:r>
-        <w:rPr>
-          <w:lang w:val="en-CA"/>
-        </w:rPr>
-        <w:t xml:space="preserve">, </w:t>
-      </w:r>
-      <w:r>
-        <w:rPr>
-          <w:i/>
-          <w:iCs/>
-          <w:lang w:val="en-CA"/>
-        </w:rPr>
-        <w:t>4</w:t>
-      </w:r>
-      <w:r>
-        <w:rPr>
-          <w:lang w:val="en-CA"/>
-        </w:rPr>
-        <w:t xml:space="preserve">(3), 753-763. </w:t>
-      </w:r>
-      <w:hyperlink r:id="rId7">
-        <w:r>
-          <w:rPr>
-            <w:rStyle w:val="Hyperlink"/>
-            <w:lang w:val="en-CA"/>
-          </w:rPr>
-          <w:t>https://doi.org/10.57152/malcom.v4i3.1303</w:t>
-        </w:r>
-      </w:hyperlink>
-    </w:p>
-    <w:p>
-      <w:pPr>
-        <w:pStyle w:val="Normal"/>
-        <w:spacing w:lineRule="auto" w:line="480"/>
-        <w:ind w:left="720"/>
-        <w:rPr>
-          <w:lang w:val="en-CA"/>
-        </w:rPr>
-      </w:pPr>
-      <w:r>
-        <w:rPr>
-          <w:lang w:val="en-CA"/>
-        </w:rPr>
       </w:r>
     </w:p>
     <w:p>
@@ -2148,7 +2079,7 @@
         <w:rPr/>
         <w:t xml:space="preserve">(90), 297–301. </w:t>
       </w:r>
-      <w:hyperlink r:id="rId8">
+      <w:hyperlink r:id="rId7">
         <w:r>
           <w:rPr>
             <w:rStyle w:val="Hyperlink"/>
@@ -2196,7 +2127,7 @@
         <w:rPr/>
         <w:t xml:space="preserve">, 273-297. </w:t>
       </w:r>
-      <w:hyperlink r:id="rId9">
+      <w:hyperlink r:id="rId8">
         <w:r>
           <w:rPr>
             <w:rStyle w:val="Hyperlink"/>
@@ -2250,7 +2181,7 @@
         <w:t xml:space="preserve">. Department of Computer Science, National Taiwan University. </w:t>
         <w:tab/>
       </w:r>
-      <w:hyperlink r:id="rId10">
+      <w:hyperlink r:id="rId9">
         <w:r>
           <w:rPr>
             <w:rStyle w:val="Hyperlink"/>
@@ -2282,11 +2213,9 @@
           <w:lang w:val="en-CA"/>
         </w:rPr>
       </w:pPr>
-      <w:hyperlink r:id="rId11">
-        <w:r>
-          <w:rPr/>
-        </w:r>
-      </w:hyperlink>
+      <w:r>
+        <w:rPr/>
+      </w:r>
     </w:p>
     <w:p>
       <w:pPr>
@@ -2304,9 +2233,9 @@
       </w:r>
     </w:p>
     <w:sectPr>
-      <w:headerReference w:type="even" r:id="rId12"/>
-      <w:headerReference w:type="default" r:id="rId13"/>
-      <w:headerReference w:type="first" r:id="rId14"/>
+      <w:headerReference w:type="even" r:id="rId10"/>
+      <w:headerReference w:type="default" r:id="rId11"/>
+      <w:headerReference w:type="first" r:id="rId12"/>
       <w:footnotePr>
         <w:numFmt w:val="decimal"/>
       </w:footnotePr>
@@ -2507,7 +2436,7 @@
       <w:rPr>
         <w:color w:val="000000"/>
       </w:rPr>
-      <w:t>11</w:t>
+      <w:t>10</w:t>
     </w:r>
     <w:r>
       <w:rPr>
@@ -2561,7 +2490,7 @@
       <w:rPr>
         <w:color w:val="000000"/>
       </w:rPr>
-      <w:t>11</w:t>
+      <w:t>10</w:t>
     </w:r>
     <w:r>
       <w:rPr>
@@ -3592,6 +3521,13 @@
     <w:pPr/>
     <w:rPr/>
   </w:style>
+  <w:style w:type="paragraph" w:styleId="FrameContents">
+    <w:name w:val="Frame Contents"/>
+    <w:basedOn w:val="Normal"/>
+    <w:qFormat/>
+    <w:pPr/>
+    <w:rPr/>
+  </w:style>
   <w:style w:type="numbering" w:styleId="NoList" w:default="1">
     <w:name w:val="No List"/>
     <w:uiPriority w:val="99"/>

</xml_diff>

<commit_message>
(chore): fix gramitical error
</commit_message>
<xml_diff>
--- a/module_summary.docx
+++ b/module_summary.docx
@@ -339,23 +339,7 @@
         <w:t>Fast Fourier Transform (FFT):</w:t>
       </w:r>
       <w:r>
-        <w:t xml:space="preserve"> We used </w:t>
-      </w:r>
-      <w:proofErr w:type="spellStart"/>
-      <w:r>
-        <w:t>scipy’s</w:t>
-      </w:r>
-      <w:proofErr w:type="spellEnd"/>
-      <w:r>
-        <w:t xml:space="preserve"> </w:t>
-      </w:r>
-      <w:proofErr w:type="spellStart"/>
-      <w:r>
-        <w:t>rfft</w:t>
-      </w:r>
-      <w:proofErr w:type="spellEnd"/>
-      <w:r>
-        <w:t xml:space="preserve"> function to compute a 1-D Fast Fourier Transform (Cooley 1965) for each row. This effectively converted our domain to the frequency domain. The idea here is that a consistent “dip” in flux measurements would show up as change in the frequency response.</w:t>
+        <w:t xml:space="preserve"> We used scipy’s rfft function to compute a 1-D Fast Fourier Transform (Cooley 1965) for each row. This effectively converted our domain to the frequency domain. The idea here is that a consistent “dip” in flux measurements would show up as change in the frequency response.</w:t>
       </w:r>
     </w:p>
     <w:p>
@@ -775,13 +759,8 @@
       </w:r>
       <w:r>
         <w:tab/>
-        <w:t xml:space="preserve"> </w:t>
-      </w:r>
-      <w:proofErr w:type="spellStart"/>
-      <w:r>
-        <w:t>GridSearchCV</w:t>
-      </w:r>
-      <w:proofErr w:type="spellEnd"/>
+        <w:t xml:space="preserve"> GridSearchCV</w:t>
+      </w:r>
       <w:r>
         <w:rPr>
           <w:rStyle w:val="FootnoteReference"/>
@@ -789,13 +768,8 @@
         <w:footnoteReference w:id="1"/>
       </w:r>
       <w:r>
-        <w:t xml:space="preserve"> using a </w:t>
-      </w:r>
-      <w:proofErr w:type="spellStart"/>
-      <w:r>
-        <w:t>StratifiedKFold</w:t>
-      </w:r>
-      <w:proofErr w:type="spellEnd"/>
+        <w:t xml:space="preserve"> using a StratifiedKFold</w:t>
+      </w:r>
       <w:r>
         <w:rPr>
           <w:rStyle w:val="FootnoteReference"/>
@@ -812,15 +786,7 @@
       </w:pPr>
       <w:r>
         <w:tab/>
-        <w:t xml:space="preserve">To keep consistent with how our original model was trained, we instructed </w:t>
-      </w:r>
-      <w:proofErr w:type="spellStart"/>
-      <w:r>
-        <w:t>GridSearchCV</w:t>
-      </w:r>
-      <w:proofErr w:type="spellEnd"/>
-      <w:r>
-        <w:t xml:space="preserve"> to use balanced class weights for training.</w:t>
+        <w:t>To keep consistent with how our original model was trained, we instructed GridSearchCV to use balanced class weights for training.</w:t>
       </w:r>
     </w:p>
     <w:p>
@@ -1295,7 +1261,19 @@
         <w:ind w:firstLine="720"/>
       </w:pPr>
       <w:r>
-        <w:t>We need to be aware of the costs involved with false positives from this model. As each positive result needs to be rechecked to ensure it really is an Exoplanet, if the model produces an abundance of false positives from the observations this will result in a large quantity of wasted time and effort. Presently the false positive rate is quite low on the test dataset (rounding down to 0%) however, there are millions of stars in the sky – scanning every star and then chasing down every positive result could still leave investigators handing check thousands of false positives.</w:t>
+        <w:t>We need to be aware of the costs involved with false positives from this model. As each positive result needs to be rechecked to ensure it really is an Exoplanet, if the model produces an abundance of false positives from the observations this will result in a large quantity of wasted time and effort. Presently the false positive rate is quite low on the test dataset (rounding down to 0%) however, there are millions of stars in the sky – scanning every star and then chasing down every positive result could still leave investigators ha</w:t>
+      </w:r>
+      <w:r>
+        <w:t>v</w:t>
+      </w:r>
+      <w:r>
+        <w:t>ing</w:t>
+      </w:r>
+      <w:r>
+        <w:t xml:space="preserve"> to</w:t>
+      </w:r>
+      <w:r>
+        <w:t xml:space="preserve"> check thousands of false positives.</w:t>
       </w:r>
     </w:p>
     <w:p>
@@ -1337,15 +1315,7 @@
         </w:rPr>
       </w:pPr>
       <w:r>
-        <w:t xml:space="preserve">Cao XH, Stojkovic I, Obradovic Z. A robust data scaling algorithm to improve classification accuracies in biomedical data. BMC Bioinformatics. 2016 Sep 9;17(1):359. </w:t>
-      </w:r>
-      <w:proofErr w:type="spellStart"/>
-      <w:r>
-        <w:t>doi</w:t>
-      </w:r>
-      <w:proofErr w:type="spellEnd"/>
-      <w:r>
-        <w:t>: 10.1186/s12859-016-1236-x. PMID: 27612635; PMCID: PMC5016890.</w:t>
+        <w:t>Cao XH, Stojkovic I, Obradovic Z. A robust data scaling algorithm to improve classification accuracies in biomedical data. BMC Bioinformatics. 2016 Sep 9;17(1):359. doi: 10.1186/s12859-016-1236-x. PMID: 27612635; PMCID: PMC5016890.</w:t>
       </w:r>
     </w:p>
     <w:p>
@@ -1368,21 +1338,7 @@
           <w:lang w:val="en-CA"/>
         </w:rPr>
         <w:tab/>
-        <w:t xml:space="preserve">Chawla, N. V., Bowyer, K. W., Hall, L. O., &amp; </w:t>
-      </w:r>
-      <w:proofErr w:type="spellStart"/>
-      <w:r>
-        <w:rPr>
-          <w:lang w:val="en-CA"/>
-        </w:rPr>
-        <w:t>Kegelmeyer</w:t>
-      </w:r>
-      <w:proofErr w:type="spellEnd"/>
-      <w:r>
-        <w:rPr>
-          <w:lang w:val="en-CA"/>
-        </w:rPr>
-        <w:t xml:space="preserve">, W. P. (2002). SMOTE: </w:t>
+        <w:t xml:space="preserve">Chawla, N. V., Bowyer, K. W., Hall, L. O., &amp; Kegelmeyer, W. P. (2002). SMOTE: </w:t>
       </w:r>
       <w:r>
         <w:rPr>
@@ -1468,15 +1424,7 @@
         </w:rPr>
       </w:pPr>
       <w:r>
-        <w:t xml:space="preserve">Cortes, C., &amp; </w:t>
-      </w:r>
-      <w:proofErr w:type="spellStart"/>
-      <w:r>
-        <w:t>Vapnik</w:t>
-      </w:r>
-      <w:proofErr w:type="spellEnd"/>
-      <w:r>
-        <w:t>, V.N. (1995). Support-Vector Networks. </w:t>
+        <w:t>Cortes, C., &amp; Vapnik, V.N. (1995). Support-Vector Networks. </w:t>
       </w:r>
       <w:r>
         <w:rPr>
@@ -1658,54 +1606,38 @@
         <w:t xml:space="preserve"> </w:t>
       </w:r>
       <w:hyperlink r:id="rId1">
-        <w:proofErr w:type="spellStart"/>
         <w:r>
           <w:rPr>
             <w:rStyle w:val="Hyperlink"/>
           </w:rPr>
-          <w:t>GridSearchCV</w:t>
+          <w:t>GridSearchCV — scikit-learn 1.8.0 documentation</w:t>
         </w:r>
-        <w:proofErr w:type="spellEnd"/>
+      </w:hyperlink>
+    </w:p>
+  </w:footnote>
+  <w:footnote w:id="2">
+    <w:p>
+      <w:pPr>
+        <w:pStyle w:val="FootnoteText"/>
+        <w:rPr>
+          <w:lang w:val="en-CA"/>
+        </w:rPr>
+      </w:pPr>
+      <w:r>
+        <w:rPr>
+          <w:rStyle w:val="FootnoteCharacters"/>
+        </w:rPr>
+        <w:footnoteRef/>
+      </w:r>
+      <w:r>
+        <w:t xml:space="preserve"> </w:t>
+      </w:r>
+      <w:hyperlink r:id="rId2">
         <w:r>
           <w:rPr>
             <w:rStyle w:val="Hyperlink"/>
           </w:rPr>
-          <w:t xml:space="preserve"> — scikit-learn 1.8.0 documentation</w:t>
-        </w:r>
-      </w:hyperlink>
-    </w:p>
-  </w:footnote>
-  <w:footnote w:id="2">
-    <w:p>
-      <w:pPr>
-        <w:pStyle w:val="FootnoteText"/>
-        <w:rPr>
-          <w:lang w:val="en-CA"/>
-        </w:rPr>
-      </w:pPr>
-      <w:r>
-        <w:rPr>
-          <w:rStyle w:val="FootnoteCharacters"/>
-        </w:rPr>
-        <w:footnoteRef/>
-      </w:r>
-      <w:r>
-        <w:t xml:space="preserve"> </w:t>
-      </w:r>
-      <w:hyperlink r:id="rId2">
-        <w:proofErr w:type="spellStart"/>
-        <w:r>
-          <w:rPr>
-            <w:rStyle w:val="Hyperlink"/>
-          </w:rPr>
-          <w:t>StratifiedKFold</w:t>
-        </w:r>
-        <w:proofErr w:type="spellEnd"/>
-        <w:r>
-          <w:rPr>
-            <w:rStyle w:val="Hyperlink"/>
-          </w:rPr>
-          <w:t xml:space="preserve"> — scikit-learn 1.8.0 documentation</w:t>
+          <w:t>StratifiedKFold — scikit-learn 1.8.0 documentation</w:t>
         </w:r>
       </w:hyperlink>
     </w:p>
@@ -2659,6 +2591,7 @@
   <w:style w:type="character" w:default="1" w:styleId="DefaultParagraphFont">
     <w:name w:val="Default Paragraph Font"/>
     <w:uiPriority w:val="1"/>
+    <w:semiHidden/>
     <w:unhideWhenUsed/>
   </w:style>
   <w:style w:type="table" w:default="1" w:styleId="TableNormal">

</xml_diff>